<commit_message>
feat -- D: remove unnecessary files, move others to folders
</commit_message>
<xml_diff>
--- a/42P Praktyka/Щоденник.docx
+++ b/42P Praktyka/Щоденник.docx
@@ -689,7 +689,21 @@
         <w:tab/>
         <w:tab/>
         <w:tab/>
-        <w:t>виробничої</w:t>
+      </w:r>
+      <w:r>
+        <w:rPr>
+          <w:sz w:val="20"/>
+          <w:szCs w:val="20"/>
+          <w:u w:val="single"/>
+        </w:rPr>
+        <w:t>переддипломної</w:t>
+      </w:r>
+      <w:r>
+        <w:rPr>
+          <w:sz w:val="20"/>
+          <w:szCs w:val="20"/>
+          <w:u w:val="single"/>
+        </w:rPr>
         <w:tab/>
         <w:tab/>
         <w:tab/>
@@ -1021,7 +1035,21 @@
           <w:u w:val="single"/>
         </w:rPr>
         <w:tab/>
-        <w:t>3</w:t>
+      </w:r>
+      <w:r>
+        <w:rPr>
+          <w:sz w:val="20"/>
+          <w:szCs w:val="20"/>
+          <w:u w:val="single"/>
+        </w:rPr>
+        <w:t>4</w:t>
+      </w:r>
+      <w:r>
+        <w:rPr>
+          <w:sz w:val="20"/>
+          <w:szCs w:val="20"/>
+          <w:u w:val="single"/>
+        </w:rPr>
         <w:tab/>
       </w:r>
       <w:r>
@@ -1119,22 +1147,7 @@
         <w:tab/>
         <w:tab/>
         <w:tab/>
-      </w:r>
-      <w:r>
-        <w:rPr>
-          <w:sz w:val="20"/>
-          <w:szCs w:val="20"/>
-          <w:u w:val="single"/>
-        </w:rPr>
-        <w:t>Онищенко Олег Антонови</w:t>
-      </w:r>
-      <w:r>
-        <w:rPr>
-          <w:sz w:val="20"/>
-          <w:szCs w:val="20"/>
-          <w:u w:val="single"/>
-        </w:rPr>
-        <w:t>ч</w:t>
+        <w:t>Онищенко Олег Антонович</w:t>
         <w:tab/>
         <w:tab/>
         <w:tab/>
@@ -1286,7 +1299,7 @@
           <w:szCs w:val="20"/>
           <w:u w:val="single"/>
         </w:rPr>
-        <w:t>10</w:t>
+        <w:t>13</w:t>
       </w:r>
       <w:r>
         <w:rPr>
@@ -1303,7 +1316,21 @@
           <w:u w:val="single"/>
         </w:rPr>
         <w:tab/>
-        <w:t>червня</w:t>
+      </w:r>
+      <w:r>
+        <w:rPr>
+          <w:sz w:val="20"/>
+          <w:szCs w:val="20"/>
+          <w:u w:val="single"/>
+        </w:rPr>
+        <w:t>квітня</w:t>
+      </w:r>
+      <w:r>
+        <w:rPr>
+          <w:sz w:val="20"/>
+          <w:szCs w:val="20"/>
+          <w:u w:val="single"/>
+        </w:rPr>
         <w:tab/>
       </w:r>
       <w:r>
@@ -1320,7 +1347,15 @@
           <w:szCs w:val="20"/>
           <w:u w:val="single"/>
         </w:rPr>
-        <w:t>25</w:t>
+        <w:t>2</w:t>
+      </w:r>
+      <w:r>
+        <w:rPr>
+          <w:sz w:val="20"/>
+          <w:szCs w:val="20"/>
+          <w:u w:val="single"/>
+        </w:rPr>
+        <w:t>6</w:t>
       </w:r>
       <w:r>
         <w:rPr>
@@ -1387,7 +1422,43 @@
           <w:szCs w:val="20"/>
           <w:u w:val="single"/>
         </w:rPr>
-        <w:t>Акритова Т. О., менеджер з навчання комп’ютерному програмуванню</w:t>
+        <w:tab/>
+        <w:tab/>
+        <w:t>Никонова</w:t>
+      </w:r>
+      <w:r>
+        <w:rPr>
+          <w:sz w:val="20"/>
+          <w:szCs w:val="20"/>
+          <w:u w:val="single"/>
+        </w:rPr>
+        <w:t xml:space="preserve"> </w:t>
+      </w:r>
+      <w:r>
+        <w:rPr>
+          <w:sz w:val="20"/>
+          <w:szCs w:val="20"/>
+          <w:u w:val="single"/>
+        </w:rPr>
+        <w:t>К.В</w:t>
+      </w:r>
+      <w:r>
+        <w:rPr>
+          <w:sz w:val="20"/>
+          <w:szCs w:val="20"/>
+          <w:u w:val="single"/>
+        </w:rPr>
+        <w:t xml:space="preserve">, менеджер </w:t>
+      </w:r>
+      <w:r>
+        <w:rPr>
+          <w:sz w:val="20"/>
+          <w:szCs w:val="20"/>
+          <w:u w:val="single"/>
+        </w:rPr>
+        <w:t>від компанії</w:t>
+        <w:tab/>
+        <w:tab/>
       </w:r>
     </w:p>
     <w:p>
@@ -2142,23 +2213,7 @@
           <w:szCs w:val="20"/>
           <w:u w:val="none"/>
         </w:rPr>
-        <w:t xml:space="preserve">Відгук, за дозволом </w:t>
-      </w:r>
-      <w:r>
-        <w:rPr>
-          <w:sz w:val="20"/>
-          <w:szCs w:val="20"/>
-          <w:u w:val="none"/>
-        </w:rPr>
-        <w:t>представника університету</w:t>
-      </w:r>
-      <w:r>
-        <w:rPr>
-          <w:sz w:val="20"/>
-          <w:szCs w:val="20"/>
-          <w:u w:val="none"/>
-        </w:rPr>
-        <w:t>, написано студентом.</w:t>
+        <w:t>Відгук, за дозволом представника університету, написано студентом.</w:t>
       </w:r>
     </w:p>
     <w:p>
@@ -2540,21 +2595,7 @@
           <w:u w:val="single"/>
         </w:rPr>
         <w:tab/>
-      </w:r>
-      <w:r>
-        <w:rPr>
-          <w:sz w:val="20"/>
-          <w:szCs w:val="20"/>
-          <w:u w:val="single"/>
-        </w:rPr>
         <w:t>Туленков А.В.</w:t>
-      </w:r>
-      <w:r>
-        <w:rPr>
-          <w:sz w:val="20"/>
-          <w:szCs w:val="20"/>
-          <w:u w:val="single"/>
-        </w:rPr>
         <w:tab/>
         <w:tab/>
       </w:r>
@@ -2792,15 +2833,7 @@
           <w:szCs w:val="20"/>
           <w:u w:val="none"/>
         </w:rPr>
-        <w:t xml:space="preserve">Для самостійної роботи з верстки </w:t>
-      </w:r>
-      <w:r>
-        <w:rPr>
-          <w:sz w:val="20"/>
-          <w:szCs w:val="20"/>
-          <w:u w:val="none"/>
-        </w:rPr>
-        <w:t xml:space="preserve">використані відносні одиниці виміру, для картинок задані альтернативні тексти, сторінка виглядає як в макеті. Результати завантажено у </w:t>
+        <w:t xml:space="preserve">Для самостійної роботи з верстки використані відносні одиниці виміру, для картинок задані альтернативні тексти, сторінка виглядає як в макеті. Результати завантажено у </w:t>
       </w:r>
       <w:r>
         <w:rPr>
@@ -3363,20 +3396,20 @@
         </w:tblCellMar>
       </w:tblPr>
       <w:tblGrid>
-        <w:gridCol w:w="516"/>
+        <w:gridCol w:w="515"/>
         <w:gridCol w:w="4052"/>
         <w:gridCol w:w="436"/>
-        <w:gridCol w:w="436"/>
-        <w:gridCol w:w="436"/>
-        <w:gridCol w:w="436"/>
-        <w:gridCol w:w="436"/>
-        <w:gridCol w:w="963"/>
+        <w:gridCol w:w="437"/>
+        <w:gridCol w:w="435"/>
+        <w:gridCol w:w="437"/>
+        <w:gridCol w:w="435"/>
+        <w:gridCol w:w="964"/>
       </w:tblGrid>
       <w:tr>
         <w:trPr/>
         <w:tc>
           <w:tcPr>
-            <w:tcW w:w="516" w:type="dxa"/>
+            <w:tcW w:w="515" w:type="dxa"/>
             <w:vMerge w:val="restart"/>
             <w:tcBorders>
               <w:top w:val="single" w:sz="4" w:space="0" w:color="000000"/>
@@ -3387,7 +3420,7 @@
           </w:tcPr>
           <w:p>
             <w:pPr>
-              <w:pStyle w:val="Style14"/>
+              <w:pStyle w:val="user2"/>
               <w:spacing w:lineRule="auto" w:line="240" w:before="57" w:after="57"/>
               <w:ind w:hanging="0"/>
               <w:jc w:val="center"/>
@@ -3425,7 +3458,7 @@
           </w:tcPr>
           <w:p>
             <w:pPr>
-              <w:pStyle w:val="Style14"/>
+              <w:pStyle w:val="user2"/>
               <w:spacing w:lineRule="auto" w:line="240" w:before="57" w:after="57"/>
               <w:ind w:hanging="0"/>
               <w:jc w:val="center"/>
@@ -3456,7 +3489,7 @@
           </w:tcPr>
           <w:p>
             <w:pPr>
-              <w:pStyle w:val="Style14"/>
+              <w:pStyle w:val="user2"/>
               <w:spacing w:lineRule="auto" w:line="240" w:before="57" w:after="57"/>
               <w:ind w:hanging="0"/>
               <w:jc w:val="center"/>
@@ -3476,7 +3509,7 @@
         </w:tc>
         <w:tc>
           <w:tcPr>
-            <w:tcW w:w="963" w:type="dxa"/>
+            <w:tcW w:w="964" w:type="dxa"/>
             <w:vMerge w:val="restart"/>
             <w:tcBorders>
               <w:top w:val="single" w:sz="4" w:space="0" w:color="000000"/>
@@ -3488,7 +3521,7 @@
           </w:tcPr>
           <w:p>
             <w:pPr>
-              <w:pStyle w:val="Style14"/>
+              <w:pStyle w:val="user2"/>
               <w:spacing w:lineRule="auto" w:line="240" w:before="57" w:after="57"/>
               <w:ind w:hanging="0"/>
               <w:jc w:val="center"/>
@@ -3511,7 +3544,7 @@
         <w:trPr/>
         <w:tc>
           <w:tcPr>
-            <w:tcW w:w="516" w:type="dxa"/>
+            <w:tcW w:w="515" w:type="dxa"/>
             <w:vMerge w:val="continue"/>
             <w:tcBorders>
               <w:left w:val="single" w:sz="4" w:space="0" w:color="000000"/>
@@ -3574,7 +3607,7 @@
           </w:tcPr>
           <w:p>
             <w:pPr>
-              <w:pStyle w:val="Style14"/>
+              <w:pStyle w:val="user2"/>
               <w:spacing w:lineRule="auto" w:line="240" w:before="57" w:after="57"/>
               <w:ind w:hanging="0"/>
               <w:jc w:val="center"/>
@@ -3594,16 +3627,16 @@
         </w:tc>
         <w:tc>
           <w:tcPr>
-            <w:tcW w:w="436" w:type="dxa"/>
-            <w:tcBorders>
-              <w:left w:val="single" w:sz="4" w:space="0" w:color="000000"/>
-              <w:bottom w:val="single" w:sz="4" w:space="0" w:color="000000"/>
-            </w:tcBorders>
-            <w:vAlign w:val="center"/>
-          </w:tcPr>
-          <w:p>
-            <w:pPr>
-              <w:pStyle w:val="Style14"/>
+            <w:tcW w:w="437" w:type="dxa"/>
+            <w:tcBorders>
+              <w:left w:val="single" w:sz="4" w:space="0" w:color="000000"/>
+              <w:bottom w:val="single" w:sz="4" w:space="0" w:color="000000"/>
+            </w:tcBorders>
+            <w:vAlign w:val="center"/>
+          </w:tcPr>
+          <w:p>
+            <w:pPr>
+              <w:pStyle w:val="user2"/>
               <w:spacing w:lineRule="auto" w:line="240" w:before="57" w:after="57"/>
               <w:ind w:hanging="0"/>
               <w:jc w:val="center"/>
@@ -3623,16 +3656,16 @@
         </w:tc>
         <w:tc>
           <w:tcPr>
-            <w:tcW w:w="436" w:type="dxa"/>
-            <w:tcBorders>
-              <w:left w:val="single" w:sz="4" w:space="0" w:color="000000"/>
-              <w:bottom w:val="single" w:sz="4" w:space="0" w:color="000000"/>
-            </w:tcBorders>
-            <w:vAlign w:val="center"/>
-          </w:tcPr>
-          <w:p>
-            <w:pPr>
-              <w:pStyle w:val="Style14"/>
+            <w:tcW w:w="435" w:type="dxa"/>
+            <w:tcBorders>
+              <w:left w:val="single" w:sz="4" w:space="0" w:color="000000"/>
+              <w:bottom w:val="single" w:sz="4" w:space="0" w:color="000000"/>
+            </w:tcBorders>
+            <w:vAlign w:val="center"/>
+          </w:tcPr>
+          <w:p>
+            <w:pPr>
+              <w:pStyle w:val="user2"/>
               <w:spacing w:lineRule="auto" w:line="240" w:before="57" w:after="57"/>
               <w:ind w:hanging="0"/>
               <w:jc w:val="center"/>
@@ -3652,16 +3685,16 @@
         </w:tc>
         <w:tc>
           <w:tcPr>
-            <w:tcW w:w="436" w:type="dxa"/>
-            <w:tcBorders>
-              <w:left w:val="single" w:sz="4" w:space="0" w:color="000000"/>
-              <w:bottom w:val="single" w:sz="4" w:space="0" w:color="000000"/>
-            </w:tcBorders>
-            <w:vAlign w:val="center"/>
-          </w:tcPr>
-          <w:p>
-            <w:pPr>
-              <w:pStyle w:val="Style14"/>
+            <w:tcW w:w="437" w:type="dxa"/>
+            <w:tcBorders>
+              <w:left w:val="single" w:sz="4" w:space="0" w:color="000000"/>
+              <w:bottom w:val="single" w:sz="4" w:space="0" w:color="000000"/>
+            </w:tcBorders>
+            <w:vAlign w:val="center"/>
+          </w:tcPr>
+          <w:p>
+            <w:pPr>
+              <w:pStyle w:val="user2"/>
               <w:spacing w:lineRule="auto" w:line="240" w:before="57" w:after="57"/>
               <w:ind w:hanging="0"/>
               <w:jc w:val="center"/>
@@ -3681,16 +3714,16 @@
         </w:tc>
         <w:tc>
           <w:tcPr>
-            <w:tcW w:w="436" w:type="dxa"/>
-            <w:tcBorders>
-              <w:left w:val="single" w:sz="4" w:space="0" w:color="000000"/>
-              <w:bottom w:val="single" w:sz="4" w:space="0" w:color="000000"/>
-            </w:tcBorders>
-            <w:vAlign w:val="center"/>
-          </w:tcPr>
-          <w:p>
-            <w:pPr>
-              <w:pStyle w:val="Style14"/>
+            <w:tcW w:w="435" w:type="dxa"/>
+            <w:tcBorders>
+              <w:left w:val="single" w:sz="4" w:space="0" w:color="000000"/>
+              <w:bottom w:val="single" w:sz="4" w:space="0" w:color="000000"/>
+            </w:tcBorders>
+            <w:vAlign w:val="center"/>
+          </w:tcPr>
+          <w:p>
+            <w:pPr>
+              <w:pStyle w:val="user2"/>
               <w:spacing w:lineRule="auto" w:line="240" w:before="57" w:after="57"/>
               <w:ind w:hanging="0"/>
               <w:jc w:val="center"/>
@@ -3710,7 +3743,7 @@
         </w:tc>
         <w:tc>
           <w:tcPr>
-            <w:tcW w:w="963" w:type="dxa"/>
+            <w:tcW w:w="964" w:type="dxa"/>
             <w:vMerge w:val="continue"/>
             <w:tcBorders>
               <w:left w:val="single" w:sz="4" w:space="0" w:color="000000"/>
@@ -3741,16 +3774,16 @@
         <w:trPr/>
         <w:tc>
           <w:tcPr>
-            <w:tcW w:w="516" w:type="dxa"/>
-            <w:tcBorders>
-              <w:left w:val="single" w:sz="4" w:space="0" w:color="000000"/>
-              <w:bottom w:val="single" w:sz="4" w:space="0" w:color="000000"/>
-            </w:tcBorders>
-            <w:vAlign w:val="center"/>
-          </w:tcPr>
-          <w:p>
-            <w:pPr>
-              <w:pStyle w:val="Style14"/>
+            <w:tcW w:w="515" w:type="dxa"/>
+            <w:tcBorders>
+              <w:left w:val="single" w:sz="4" w:space="0" w:color="000000"/>
+              <w:bottom w:val="single" w:sz="4" w:space="0" w:color="000000"/>
+            </w:tcBorders>
+            <w:vAlign w:val="center"/>
+          </w:tcPr>
+          <w:p>
+            <w:pPr>
+              <w:pStyle w:val="user2"/>
               <w:spacing w:lineRule="auto" w:line="240" w:before="57" w:after="57"/>
               <w:ind w:hanging="0"/>
               <w:rPr>
@@ -3778,7 +3811,7 @@
           </w:tcPr>
           <w:p>
             <w:pPr>
-              <w:pStyle w:val="Style14"/>
+              <w:pStyle w:val="user2"/>
               <w:spacing w:lineRule="auto" w:line="240" w:before="57" w:after="57"/>
               <w:ind w:hanging="0"/>
               <w:rPr>
@@ -3808,7 +3841,7 @@
           </w:tcPr>
           <w:p>
             <w:pPr>
-              <w:pStyle w:val="Style14"/>
+              <w:pStyle w:val="user2"/>
               <w:spacing w:lineRule="auto" w:line="240" w:before="57" w:after="57"/>
               <w:ind w:hanging="0"/>
               <w:rPr>
@@ -3827,115 +3860,115 @@
         </w:tc>
         <w:tc>
           <w:tcPr>
-            <w:tcW w:w="436" w:type="dxa"/>
-            <w:tcBorders>
-              <w:left w:val="single" w:sz="4" w:space="0" w:color="000000"/>
-              <w:bottom w:val="single" w:sz="4" w:space="0" w:color="000000"/>
-            </w:tcBorders>
-            <w:vAlign w:val="center"/>
-          </w:tcPr>
-          <w:p>
-            <w:pPr>
-              <w:pStyle w:val="Style14"/>
-              <w:spacing w:lineRule="auto" w:line="240" w:before="57" w:after="57"/>
-              <w:ind w:hanging="0"/>
-              <w:rPr>
-                <w:sz w:val="16"/>
-                <w:szCs w:val="16"/>
-              </w:rPr>
-            </w:pPr>
-            <w:r>
-              <w:rPr>
-                <w:sz w:val="16"/>
-                <w:szCs w:val="16"/>
-              </w:rPr>
-            </w:r>
-          </w:p>
-        </w:tc>
-        <w:tc>
-          <w:tcPr>
-            <w:tcW w:w="436" w:type="dxa"/>
-            <w:tcBorders>
-              <w:left w:val="single" w:sz="4" w:space="0" w:color="000000"/>
-              <w:bottom w:val="single" w:sz="4" w:space="0" w:color="000000"/>
-            </w:tcBorders>
-            <w:vAlign w:val="center"/>
-          </w:tcPr>
-          <w:p>
-            <w:pPr>
-              <w:pStyle w:val="Style14"/>
-              <w:spacing w:lineRule="auto" w:line="240" w:before="57" w:after="57"/>
-              <w:ind w:hanging="0"/>
-              <w:rPr>
-                <w:sz w:val="16"/>
-                <w:szCs w:val="16"/>
-              </w:rPr>
-            </w:pPr>
-            <w:r>
-              <w:rPr>
-                <w:sz w:val="16"/>
-                <w:szCs w:val="16"/>
-              </w:rPr>
-            </w:r>
-          </w:p>
-        </w:tc>
-        <w:tc>
-          <w:tcPr>
-            <w:tcW w:w="436" w:type="dxa"/>
-            <w:tcBorders>
-              <w:left w:val="single" w:sz="4" w:space="0" w:color="000000"/>
-              <w:bottom w:val="single" w:sz="4" w:space="0" w:color="000000"/>
-            </w:tcBorders>
-            <w:vAlign w:val="center"/>
-          </w:tcPr>
-          <w:p>
-            <w:pPr>
-              <w:pStyle w:val="Style14"/>
-              <w:spacing w:lineRule="auto" w:line="240" w:before="57" w:after="57"/>
-              <w:ind w:hanging="0"/>
-              <w:rPr>
-                <w:sz w:val="16"/>
-                <w:szCs w:val="16"/>
-              </w:rPr>
-            </w:pPr>
-            <w:r>
-              <w:rPr>
-                <w:sz w:val="16"/>
-                <w:szCs w:val="16"/>
-              </w:rPr>
-            </w:r>
-          </w:p>
-        </w:tc>
-        <w:tc>
-          <w:tcPr>
-            <w:tcW w:w="436" w:type="dxa"/>
-            <w:tcBorders>
-              <w:left w:val="single" w:sz="4" w:space="0" w:color="000000"/>
-              <w:bottom w:val="single" w:sz="4" w:space="0" w:color="000000"/>
-            </w:tcBorders>
-            <w:vAlign w:val="center"/>
-          </w:tcPr>
-          <w:p>
-            <w:pPr>
-              <w:pStyle w:val="Style14"/>
-              <w:spacing w:lineRule="auto" w:line="240" w:before="57" w:after="57"/>
-              <w:ind w:hanging="0"/>
-              <w:rPr>
-                <w:sz w:val="16"/>
-                <w:szCs w:val="16"/>
-              </w:rPr>
-            </w:pPr>
-            <w:r>
-              <w:rPr>
-                <w:sz w:val="16"/>
-                <w:szCs w:val="16"/>
-              </w:rPr>
-            </w:r>
-          </w:p>
-        </w:tc>
-        <w:tc>
-          <w:tcPr>
-            <w:tcW w:w="963" w:type="dxa"/>
+            <w:tcW w:w="437" w:type="dxa"/>
+            <w:tcBorders>
+              <w:left w:val="single" w:sz="4" w:space="0" w:color="000000"/>
+              <w:bottom w:val="single" w:sz="4" w:space="0" w:color="000000"/>
+            </w:tcBorders>
+            <w:vAlign w:val="center"/>
+          </w:tcPr>
+          <w:p>
+            <w:pPr>
+              <w:pStyle w:val="user2"/>
+              <w:spacing w:lineRule="auto" w:line="240" w:before="57" w:after="57"/>
+              <w:ind w:hanging="0"/>
+              <w:rPr>
+                <w:sz w:val="16"/>
+                <w:szCs w:val="16"/>
+              </w:rPr>
+            </w:pPr>
+            <w:r>
+              <w:rPr>
+                <w:sz w:val="16"/>
+                <w:szCs w:val="16"/>
+              </w:rPr>
+            </w:r>
+          </w:p>
+        </w:tc>
+        <w:tc>
+          <w:tcPr>
+            <w:tcW w:w="435" w:type="dxa"/>
+            <w:tcBorders>
+              <w:left w:val="single" w:sz="4" w:space="0" w:color="000000"/>
+              <w:bottom w:val="single" w:sz="4" w:space="0" w:color="000000"/>
+            </w:tcBorders>
+            <w:vAlign w:val="center"/>
+          </w:tcPr>
+          <w:p>
+            <w:pPr>
+              <w:pStyle w:val="user2"/>
+              <w:spacing w:lineRule="auto" w:line="240" w:before="57" w:after="57"/>
+              <w:ind w:hanging="0"/>
+              <w:rPr>
+                <w:sz w:val="16"/>
+                <w:szCs w:val="16"/>
+              </w:rPr>
+            </w:pPr>
+            <w:r>
+              <w:rPr>
+                <w:sz w:val="16"/>
+                <w:szCs w:val="16"/>
+              </w:rPr>
+            </w:r>
+          </w:p>
+        </w:tc>
+        <w:tc>
+          <w:tcPr>
+            <w:tcW w:w="437" w:type="dxa"/>
+            <w:tcBorders>
+              <w:left w:val="single" w:sz="4" w:space="0" w:color="000000"/>
+              <w:bottom w:val="single" w:sz="4" w:space="0" w:color="000000"/>
+            </w:tcBorders>
+            <w:vAlign w:val="center"/>
+          </w:tcPr>
+          <w:p>
+            <w:pPr>
+              <w:pStyle w:val="user2"/>
+              <w:spacing w:lineRule="auto" w:line="240" w:before="57" w:after="57"/>
+              <w:ind w:hanging="0"/>
+              <w:rPr>
+                <w:sz w:val="16"/>
+                <w:szCs w:val="16"/>
+              </w:rPr>
+            </w:pPr>
+            <w:r>
+              <w:rPr>
+                <w:sz w:val="16"/>
+                <w:szCs w:val="16"/>
+              </w:rPr>
+            </w:r>
+          </w:p>
+        </w:tc>
+        <w:tc>
+          <w:tcPr>
+            <w:tcW w:w="435" w:type="dxa"/>
+            <w:tcBorders>
+              <w:left w:val="single" w:sz="4" w:space="0" w:color="000000"/>
+              <w:bottom w:val="single" w:sz="4" w:space="0" w:color="000000"/>
+            </w:tcBorders>
+            <w:vAlign w:val="center"/>
+          </w:tcPr>
+          <w:p>
+            <w:pPr>
+              <w:pStyle w:val="user2"/>
+              <w:spacing w:lineRule="auto" w:line="240" w:before="57" w:after="57"/>
+              <w:ind w:hanging="0"/>
+              <w:rPr>
+                <w:sz w:val="16"/>
+                <w:szCs w:val="16"/>
+              </w:rPr>
+            </w:pPr>
+            <w:r>
+              <w:rPr>
+                <w:sz w:val="16"/>
+                <w:szCs w:val="16"/>
+              </w:rPr>
+            </w:r>
+          </w:p>
+        </w:tc>
+        <w:tc>
+          <w:tcPr>
+            <w:tcW w:w="964" w:type="dxa"/>
             <w:tcBorders>
               <w:left w:val="single" w:sz="4" w:space="0" w:color="000000"/>
               <w:bottom w:val="single" w:sz="4" w:space="0" w:color="000000"/>
@@ -3945,7 +3978,7 @@
           </w:tcPr>
           <w:p>
             <w:pPr>
-              <w:pStyle w:val="Style14"/>
+              <w:pStyle w:val="user2"/>
               <w:spacing w:lineRule="auto" w:line="240" w:before="57" w:after="57"/>
               <w:ind w:hanging="0"/>
               <w:rPr>
@@ -3967,16 +4000,16 @@
         <w:trPr/>
         <w:tc>
           <w:tcPr>
-            <w:tcW w:w="516" w:type="dxa"/>
-            <w:tcBorders>
-              <w:left w:val="single" w:sz="4" w:space="0" w:color="000000"/>
-              <w:bottom w:val="single" w:sz="4" w:space="0" w:color="000000"/>
-            </w:tcBorders>
-            <w:vAlign w:val="center"/>
-          </w:tcPr>
-          <w:p>
-            <w:pPr>
-              <w:pStyle w:val="Style14"/>
+            <w:tcW w:w="515" w:type="dxa"/>
+            <w:tcBorders>
+              <w:left w:val="single" w:sz="4" w:space="0" w:color="000000"/>
+              <w:bottom w:val="single" w:sz="4" w:space="0" w:color="000000"/>
+            </w:tcBorders>
+            <w:vAlign w:val="center"/>
+          </w:tcPr>
+          <w:p>
+            <w:pPr>
+              <w:pStyle w:val="user2"/>
               <w:spacing w:lineRule="auto" w:line="240" w:before="57" w:after="57"/>
               <w:ind w:hanging="0"/>
               <w:rPr>
@@ -4004,7 +4037,7 @@
           </w:tcPr>
           <w:p>
             <w:pPr>
-              <w:pStyle w:val="Style14"/>
+              <w:pStyle w:val="user2"/>
               <w:spacing w:lineRule="auto" w:line="240" w:before="57" w:after="57"/>
               <w:ind w:hanging="0"/>
               <w:rPr>
@@ -4032,7 +4065,7 @@
           </w:tcPr>
           <w:p>
             <w:pPr>
-              <w:pStyle w:val="Style14"/>
+              <w:pStyle w:val="user2"/>
               <w:spacing w:lineRule="auto" w:line="240" w:before="57" w:after="57"/>
               <w:ind w:hanging="0"/>
               <w:rPr>
@@ -4051,115 +4084,115 @@
         </w:tc>
         <w:tc>
           <w:tcPr>
-            <w:tcW w:w="436" w:type="dxa"/>
-            <w:tcBorders>
-              <w:left w:val="single" w:sz="4" w:space="0" w:color="000000"/>
-              <w:bottom w:val="single" w:sz="4" w:space="0" w:color="000000"/>
-            </w:tcBorders>
-            <w:vAlign w:val="center"/>
-          </w:tcPr>
-          <w:p>
-            <w:pPr>
-              <w:pStyle w:val="Style14"/>
-              <w:spacing w:lineRule="auto" w:line="240" w:before="57" w:after="57"/>
-              <w:ind w:hanging="0"/>
-              <w:rPr>
-                <w:sz w:val="16"/>
-                <w:szCs w:val="16"/>
-              </w:rPr>
-            </w:pPr>
-            <w:r>
-              <w:rPr>
-                <w:sz w:val="16"/>
-                <w:szCs w:val="16"/>
-              </w:rPr>
-            </w:r>
-          </w:p>
-        </w:tc>
-        <w:tc>
-          <w:tcPr>
-            <w:tcW w:w="436" w:type="dxa"/>
-            <w:tcBorders>
-              <w:left w:val="single" w:sz="4" w:space="0" w:color="000000"/>
-              <w:bottom w:val="single" w:sz="4" w:space="0" w:color="000000"/>
-            </w:tcBorders>
-            <w:vAlign w:val="center"/>
-          </w:tcPr>
-          <w:p>
-            <w:pPr>
-              <w:pStyle w:val="Style14"/>
-              <w:spacing w:lineRule="auto" w:line="240" w:before="57" w:after="57"/>
-              <w:ind w:hanging="0"/>
-              <w:rPr>
-                <w:sz w:val="16"/>
-                <w:szCs w:val="16"/>
-              </w:rPr>
-            </w:pPr>
-            <w:r>
-              <w:rPr>
-                <w:sz w:val="16"/>
-                <w:szCs w:val="16"/>
-              </w:rPr>
-            </w:r>
-          </w:p>
-        </w:tc>
-        <w:tc>
-          <w:tcPr>
-            <w:tcW w:w="436" w:type="dxa"/>
-            <w:tcBorders>
-              <w:left w:val="single" w:sz="4" w:space="0" w:color="000000"/>
-              <w:bottom w:val="single" w:sz="4" w:space="0" w:color="000000"/>
-            </w:tcBorders>
-            <w:vAlign w:val="center"/>
-          </w:tcPr>
-          <w:p>
-            <w:pPr>
-              <w:pStyle w:val="Style14"/>
-              <w:spacing w:lineRule="auto" w:line="240" w:before="57" w:after="57"/>
-              <w:ind w:hanging="0"/>
-              <w:rPr>
-                <w:sz w:val="16"/>
-                <w:szCs w:val="16"/>
-              </w:rPr>
-            </w:pPr>
-            <w:r>
-              <w:rPr>
-                <w:sz w:val="16"/>
-                <w:szCs w:val="16"/>
-              </w:rPr>
-            </w:r>
-          </w:p>
-        </w:tc>
-        <w:tc>
-          <w:tcPr>
-            <w:tcW w:w="436" w:type="dxa"/>
-            <w:tcBorders>
-              <w:left w:val="single" w:sz="4" w:space="0" w:color="000000"/>
-              <w:bottom w:val="single" w:sz="4" w:space="0" w:color="000000"/>
-            </w:tcBorders>
-            <w:vAlign w:val="center"/>
-          </w:tcPr>
-          <w:p>
-            <w:pPr>
-              <w:pStyle w:val="Style14"/>
-              <w:spacing w:lineRule="auto" w:line="240" w:before="57" w:after="57"/>
-              <w:ind w:hanging="0"/>
-              <w:rPr>
-                <w:sz w:val="16"/>
-                <w:szCs w:val="16"/>
-              </w:rPr>
-            </w:pPr>
-            <w:r>
-              <w:rPr>
-                <w:sz w:val="16"/>
-                <w:szCs w:val="16"/>
-              </w:rPr>
-            </w:r>
-          </w:p>
-        </w:tc>
-        <w:tc>
-          <w:tcPr>
-            <w:tcW w:w="963" w:type="dxa"/>
+            <w:tcW w:w="437" w:type="dxa"/>
+            <w:tcBorders>
+              <w:left w:val="single" w:sz="4" w:space="0" w:color="000000"/>
+              <w:bottom w:val="single" w:sz="4" w:space="0" w:color="000000"/>
+            </w:tcBorders>
+            <w:vAlign w:val="center"/>
+          </w:tcPr>
+          <w:p>
+            <w:pPr>
+              <w:pStyle w:val="user2"/>
+              <w:spacing w:lineRule="auto" w:line="240" w:before="57" w:after="57"/>
+              <w:ind w:hanging="0"/>
+              <w:rPr>
+                <w:sz w:val="16"/>
+                <w:szCs w:val="16"/>
+              </w:rPr>
+            </w:pPr>
+            <w:r>
+              <w:rPr>
+                <w:sz w:val="16"/>
+                <w:szCs w:val="16"/>
+              </w:rPr>
+            </w:r>
+          </w:p>
+        </w:tc>
+        <w:tc>
+          <w:tcPr>
+            <w:tcW w:w="435" w:type="dxa"/>
+            <w:tcBorders>
+              <w:left w:val="single" w:sz="4" w:space="0" w:color="000000"/>
+              <w:bottom w:val="single" w:sz="4" w:space="0" w:color="000000"/>
+            </w:tcBorders>
+            <w:vAlign w:val="center"/>
+          </w:tcPr>
+          <w:p>
+            <w:pPr>
+              <w:pStyle w:val="user2"/>
+              <w:spacing w:lineRule="auto" w:line="240" w:before="57" w:after="57"/>
+              <w:ind w:hanging="0"/>
+              <w:rPr>
+                <w:sz w:val="16"/>
+                <w:szCs w:val="16"/>
+              </w:rPr>
+            </w:pPr>
+            <w:r>
+              <w:rPr>
+                <w:sz w:val="16"/>
+                <w:szCs w:val="16"/>
+              </w:rPr>
+            </w:r>
+          </w:p>
+        </w:tc>
+        <w:tc>
+          <w:tcPr>
+            <w:tcW w:w="437" w:type="dxa"/>
+            <w:tcBorders>
+              <w:left w:val="single" w:sz="4" w:space="0" w:color="000000"/>
+              <w:bottom w:val="single" w:sz="4" w:space="0" w:color="000000"/>
+            </w:tcBorders>
+            <w:vAlign w:val="center"/>
+          </w:tcPr>
+          <w:p>
+            <w:pPr>
+              <w:pStyle w:val="user2"/>
+              <w:spacing w:lineRule="auto" w:line="240" w:before="57" w:after="57"/>
+              <w:ind w:hanging="0"/>
+              <w:rPr>
+                <w:sz w:val="16"/>
+                <w:szCs w:val="16"/>
+              </w:rPr>
+            </w:pPr>
+            <w:r>
+              <w:rPr>
+                <w:sz w:val="16"/>
+                <w:szCs w:val="16"/>
+              </w:rPr>
+            </w:r>
+          </w:p>
+        </w:tc>
+        <w:tc>
+          <w:tcPr>
+            <w:tcW w:w="435" w:type="dxa"/>
+            <w:tcBorders>
+              <w:left w:val="single" w:sz="4" w:space="0" w:color="000000"/>
+              <w:bottom w:val="single" w:sz="4" w:space="0" w:color="000000"/>
+            </w:tcBorders>
+            <w:vAlign w:val="center"/>
+          </w:tcPr>
+          <w:p>
+            <w:pPr>
+              <w:pStyle w:val="user2"/>
+              <w:spacing w:lineRule="auto" w:line="240" w:before="57" w:after="57"/>
+              <w:ind w:hanging="0"/>
+              <w:rPr>
+                <w:sz w:val="16"/>
+                <w:szCs w:val="16"/>
+              </w:rPr>
+            </w:pPr>
+            <w:r>
+              <w:rPr>
+                <w:sz w:val="16"/>
+                <w:szCs w:val="16"/>
+              </w:rPr>
+            </w:r>
+          </w:p>
+        </w:tc>
+        <w:tc>
+          <w:tcPr>
+            <w:tcW w:w="964" w:type="dxa"/>
             <w:tcBorders>
               <w:left w:val="single" w:sz="4" w:space="0" w:color="000000"/>
               <w:bottom w:val="single" w:sz="4" w:space="0" w:color="000000"/>
@@ -4169,7 +4202,7 @@
           </w:tcPr>
           <w:p>
             <w:pPr>
-              <w:pStyle w:val="Style14"/>
+              <w:pStyle w:val="user2"/>
               <w:spacing w:lineRule="auto" w:line="240" w:before="57" w:after="57"/>
               <w:ind w:hanging="0"/>
               <w:rPr>
@@ -4191,16 +4224,16 @@
         <w:trPr/>
         <w:tc>
           <w:tcPr>
-            <w:tcW w:w="516" w:type="dxa"/>
-            <w:tcBorders>
-              <w:left w:val="single" w:sz="4" w:space="0" w:color="000000"/>
-              <w:bottom w:val="single" w:sz="4" w:space="0" w:color="000000"/>
-            </w:tcBorders>
-            <w:vAlign w:val="center"/>
-          </w:tcPr>
-          <w:p>
-            <w:pPr>
-              <w:pStyle w:val="Style14"/>
+            <w:tcW w:w="515" w:type="dxa"/>
+            <w:tcBorders>
+              <w:left w:val="single" w:sz="4" w:space="0" w:color="000000"/>
+              <w:bottom w:val="single" w:sz="4" w:space="0" w:color="000000"/>
+            </w:tcBorders>
+            <w:vAlign w:val="center"/>
+          </w:tcPr>
+          <w:p>
+            <w:pPr>
+              <w:pStyle w:val="user2"/>
               <w:spacing w:lineRule="auto" w:line="240" w:before="57" w:after="57"/>
               <w:ind w:hanging="0"/>
               <w:rPr>
@@ -4228,7 +4261,7 @@
           </w:tcPr>
           <w:p>
             <w:pPr>
-              <w:pStyle w:val="Style14"/>
+              <w:pStyle w:val="user2"/>
               <w:spacing w:lineRule="auto" w:line="240" w:before="57" w:after="57"/>
               <w:ind w:hanging="0"/>
               <w:rPr>
@@ -4256,7 +4289,7 @@
           </w:tcPr>
           <w:p>
             <w:pPr>
-              <w:pStyle w:val="Style14"/>
+              <w:pStyle w:val="user2"/>
               <w:spacing w:lineRule="auto" w:line="240" w:before="57" w:after="57"/>
               <w:ind w:hanging="0"/>
               <w:rPr>
@@ -4275,115 +4308,115 @@
         </w:tc>
         <w:tc>
           <w:tcPr>
-            <w:tcW w:w="436" w:type="dxa"/>
-            <w:tcBorders>
-              <w:left w:val="single" w:sz="4" w:space="0" w:color="000000"/>
-              <w:bottom w:val="single" w:sz="4" w:space="0" w:color="000000"/>
-            </w:tcBorders>
-            <w:vAlign w:val="center"/>
-          </w:tcPr>
-          <w:p>
-            <w:pPr>
-              <w:pStyle w:val="Style14"/>
-              <w:spacing w:lineRule="auto" w:line="240" w:before="57" w:after="57"/>
-              <w:ind w:hanging="0"/>
-              <w:rPr>
-                <w:sz w:val="16"/>
-                <w:szCs w:val="16"/>
-              </w:rPr>
-            </w:pPr>
-            <w:r>
-              <w:rPr>
-                <w:sz w:val="16"/>
-                <w:szCs w:val="16"/>
-              </w:rPr>
-            </w:r>
-          </w:p>
-        </w:tc>
-        <w:tc>
-          <w:tcPr>
-            <w:tcW w:w="436" w:type="dxa"/>
-            <w:tcBorders>
-              <w:left w:val="single" w:sz="4" w:space="0" w:color="000000"/>
-              <w:bottom w:val="single" w:sz="4" w:space="0" w:color="000000"/>
-            </w:tcBorders>
-            <w:vAlign w:val="center"/>
-          </w:tcPr>
-          <w:p>
-            <w:pPr>
-              <w:pStyle w:val="Style14"/>
-              <w:spacing w:lineRule="auto" w:line="240" w:before="57" w:after="57"/>
-              <w:ind w:hanging="0"/>
-              <w:rPr>
-                <w:sz w:val="16"/>
-                <w:szCs w:val="16"/>
-              </w:rPr>
-            </w:pPr>
-            <w:r>
-              <w:rPr>
-                <w:sz w:val="16"/>
-                <w:szCs w:val="16"/>
-              </w:rPr>
-            </w:r>
-          </w:p>
-        </w:tc>
-        <w:tc>
-          <w:tcPr>
-            <w:tcW w:w="436" w:type="dxa"/>
-            <w:tcBorders>
-              <w:left w:val="single" w:sz="4" w:space="0" w:color="000000"/>
-              <w:bottom w:val="single" w:sz="4" w:space="0" w:color="000000"/>
-            </w:tcBorders>
-            <w:vAlign w:val="center"/>
-          </w:tcPr>
-          <w:p>
-            <w:pPr>
-              <w:pStyle w:val="Style14"/>
-              <w:spacing w:lineRule="auto" w:line="240" w:before="57" w:after="57"/>
-              <w:ind w:hanging="0"/>
-              <w:rPr>
-                <w:sz w:val="16"/>
-                <w:szCs w:val="16"/>
-              </w:rPr>
-            </w:pPr>
-            <w:r>
-              <w:rPr>
-                <w:sz w:val="16"/>
-                <w:szCs w:val="16"/>
-              </w:rPr>
-            </w:r>
-          </w:p>
-        </w:tc>
-        <w:tc>
-          <w:tcPr>
-            <w:tcW w:w="436" w:type="dxa"/>
-            <w:tcBorders>
-              <w:left w:val="single" w:sz="4" w:space="0" w:color="000000"/>
-              <w:bottom w:val="single" w:sz="4" w:space="0" w:color="000000"/>
-            </w:tcBorders>
-            <w:vAlign w:val="center"/>
-          </w:tcPr>
-          <w:p>
-            <w:pPr>
-              <w:pStyle w:val="Style14"/>
-              <w:spacing w:lineRule="auto" w:line="240" w:before="57" w:after="57"/>
-              <w:ind w:hanging="0"/>
-              <w:rPr>
-                <w:sz w:val="16"/>
-                <w:szCs w:val="16"/>
-              </w:rPr>
-            </w:pPr>
-            <w:r>
-              <w:rPr>
-                <w:sz w:val="16"/>
-                <w:szCs w:val="16"/>
-              </w:rPr>
-            </w:r>
-          </w:p>
-        </w:tc>
-        <w:tc>
-          <w:tcPr>
-            <w:tcW w:w="963" w:type="dxa"/>
+            <w:tcW w:w="437" w:type="dxa"/>
+            <w:tcBorders>
+              <w:left w:val="single" w:sz="4" w:space="0" w:color="000000"/>
+              <w:bottom w:val="single" w:sz="4" w:space="0" w:color="000000"/>
+            </w:tcBorders>
+            <w:vAlign w:val="center"/>
+          </w:tcPr>
+          <w:p>
+            <w:pPr>
+              <w:pStyle w:val="user2"/>
+              <w:spacing w:lineRule="auto" w:line="240" w:before="57" w:after="57"/>
+              <w:ind w:hanging="0"/>
+              <w:rPr>
+                <w:sz w:val="16"/>
+                <w:szCs w:val="16"/>
+              </w:rPr>
+            </w:pPr>
+            <w:r>
+              <w:rPr>
+                <w:sz w:val="16"/>
+                <w:szCs w:val="16"/>
+              </w:rPr>
+            </w:r>
+          </w:p>
+        </w:tc>
+        <w:tc>
+          <w:tcPr>
+            <w:tcW w:w="435" w:type="dxa"/>
+            <w:tcBorders>
+              <w:left w:val="single" w:sz="4" w:space="0" w:color="000000"/>
+              <w:bottom w:val="single" w:sz="4" w:space="0" w:color="000000"/>
+            </w:tcBorders>
+            <w:vAlign w:val="center"/>
+          </w:tcPr>
+          <w:p>
+            <w:pPr>
+              <w:pStyle w:val="user2"/>
+              <w:spacing w:lineRule="auto" w:line="240" w:before="57" w:after="57"/>
+              <w:ind w:hanging="0"/>
+              <w:rPr>
+                <w:sz w:val="16"/>
+                <w:szCs w:val="16"/>
+              </w:rPr>
+            </w:pPr>
+            <w:r>
+              <w:rPr>
+                <w:sz w:val="16"/>
+                <w:szCs w:val="16"/>
+              </w:rPr>
+            </w:r>
+          </w:p>
+        </w:tc>
+        <w:tc>
+          <w:tcPr>
+            <w:tcW w:w="437" w:type="dxa"/>
+            <w:tcBorders>
+              <w:left w:val="single" w:sz="4" w:space="0" w:color="000000"/>
+              <w:bottom w:val="single" w:sz="4" w:space="0" w:color="000000"/>
+            </w:tcBorders>
+            <w:vAlign w:val="center"/>
+          </w:tcPr>
+          <w:p>
+            <w:pPr>
+              <w:pStyle w:val="user2"/>
+              <w:spacing w:lineRule="auto" w:line="240" w:before="57" w:after="57"/>
+              <w:ind w:hanging="0"/>
+              <w:rPr>
+                <w:sz w:val="16"/>
+                <w:szCs w:val="16"/>
+              </w:rPr>
+            </w:pPr>
+            <w:r>
+              <w:rPr>
+                <w:sz w:val="16"/>
+                <w:szCs w:val="16"/>
+              </w:rPr>
+            </w:r>
+          </w:p>
+        </w:tc>
+        <w:tc>
+          <w:tcPr>
+            <w:tcW w:w="435" w:type="dxa"/>
+            <w:tcBorders>
+              <w:left w:val="single" w:sz="4" w:space="0" w:color="000000"/>
+              <w:bottom w:val="single" w:sz="4" w:space="0" w:color="000000"/>
+            </w:tcBorders>
+            <w:vAlign w:val="center"/>
+          </w:tcPr>
+          <w:p>
+            <w:pPr>
+              <w:pStyle w:val="user2"/>
+              <w:spacing w:lineRule="auto" w:line="240" w:before="57" w:after="57"/>
+              <w:ind w:hanging="0"/>
+              <w:rPr>
+                <w:sz w:val="16"/>
+                <w:szCs w:val="16"/>
+              </w:rPr>
+            </w:pPr>
+            <w:r>
+              <w:rPr>
+                <w:sz w:val="16"/>
+                <w:szCs w:val="16"/>
+              </w:rPr>
+            </w:r>
+          </w:p>
+        </w:tc>
+        <w:tc>
+          <w:tcPr>
+            <w:tcW w:w="964" w:type="dxa"/>
             <w:tcBorders>
               <w:left w:val="single" w:sz="4" w:space="0" w:color="000000"/>
               <w:bottom w:val="single" w:sz="4" w:space="0" w:color="000000"/>
@@ -4393,7 +4426,7 @@
           </w:tcPr>
           <w:p>
             <w:pPr>
-              <w:pStyle w:val="Style14"/>
+              <w:pStyle w:val="user2"/>
               <w:spacing w:lineRule="auto" w:line="240" w:before="57" w:after="57"/>
               <w:ind w:hanging="0"/>
               <w:rPr>
@@ -4415,16 +4448,16 @@
         <w:trPr/>
         <w:tc>
           <w:tcPr>
-            <w:tcW w:w="516" w:type="dxa"/>
-            <w:tcBorders>
-              <w:left w:val="single" w:sz="4" w:space="0" w:color="000000"/>
-              <w:bottom w:val="single" w:sz="4" w:space="0" w:color="000000"/>
-            </w:tcBorders>
-            <w:vAlign w:val="center"/>
-          </w:tcPr>
-          <w:p>
-            <w:pPr>
-              <w:pStyle w:val="Style14"/>
+            <w:tcW w:w="515" w:type="dxa"/>
+            <w:tcBorders>
+              <w:left w:val="single" w:sz="4" w:space="0" w:color="000000"/>
+              <w:bottom w:val="single" w:sz="4" w:space="0" w:color="000000"/>
+            </w:tcBorders>
+            <w:vAlign w:val="center"/>
+          </w:tcPr>
+          <w:p>
+            <w:pPr>
+              <w:pStyle w:val="user2"/>
               <w:spacing w:lineRule="auto" w:line="240" w:before="57" w:after="57"/>
               <w:ind w:hanging="0"/>
               <w:rPr>
@@ -4452,7 +4485,7 @@
           </w:tcPr>
           <w:p>
             <w:pPr>
-              <w:pStyle w:val="Style14"/>
+              <w:pStyle w:val="user2"/>
               <w:spacing w:lineRule="auto" w:line="240" w:before="57" w:after="57"/>
               <w:ind w:hanging="0"/>
               <w:rPr>
@@ -4480,7 +4513,7 @@
           </w:tcPr>
           <w:p>
             <w:pPr>
-              <w:pStyle w:val="Style14"/>
+              <w:pStyle w:val="user2"/>
               <w:spacing w:lineRule="auto" w:line="240" w:before="57" w:after="57"/>
               <w:ind w:hanging="0"/>
               <w:rPr>
@@ -4499,115 +4532,115 @@
         </w:tc>
         <w:tc>
           <w:tcPr>
-            <w:tcW w:w="436" w:type="dxa"/>
-            <w:tcBorders>
-              <w:left w:val="single" w:sz="4" w:space="0" w:color="000000"/>
-              <w:bottom w:val="single" w:sz="4" w:space="0" w:color="000000"/>
-            </w:tcBorders>
-            <w:vAlign w:val="center"/>
-          </w:tcPr>
-          <w:p>
-            <w:pPr>
-              <w:pStyle w:val="Style14"/>
-              <w:spacing w:lineRule="auto" w:line="240" w:before="57" w:after="57"/>
-              <w:ind w:hanging="0"/>
-              <w:rPr>
-                <w:sz w:val="16"/>
-                <w:szCs w:val="16"/>
-              </w:rPr>
-            </w:pPr>
-            <w:r>
-              <w:rPr>
-                <w:sz w:val="16"/>
-                <w:szCs w:val="16"/>
-              </w:rPr>
-            </w:r>
-          </w:p>
-        </w:tc>
-        <w:tc>
-          <w:tcPr>
-            <w:tcW w:w="436" w:type="dxa"/>
-            <w:tcBorders>
-              <w:left w:val="single" w:sz="4" w:space="0" w:color="000000"/>
-              <w:bottom w:val="single" w:sz="4" w:space="0" w:color="000000"/>
-            </w:tcBorders>
-            <w:vAlign w:val="center"/>
-          </w:tcPr>
-          <w:p>
-            <w:pPr>
-              <w:pStyle w:val="Style14"/>
-              <w:spacing w:lineRule="auto" w:line="240" w:before="57" w:after="57"/>
-              <w:ind w:hanging="0"/>
-              <w:rPr>
-                <w:sz w:val="16"/>
-                <w:szCs w:val="16"/>
-              </w:rPr>
-            </w:pPr>
-            <w:r>
-              <w:rPr>
-                <w:sz w:val="16"/>
-                <w:szCs w:val="16"/>
-              </w:rPr>
-            </w:r>
-          </w:p>
-        </w:tc>
-        <w:tc>
-          <w:tcPr>
-            <w:tcW w:w="436" w:type="dxa"/>
-            <w:tcBorders>
-              <w:left w:val="single" w:sz="4" w:space="0" w:color="000000"/>
-              <w:bottom w:val="single" w:sz="4" w:space="0" w:color="000000"/>
-            </w:tcBorders>
-            <w:vAlign w:val="center"/>
-          </w:tcPr>
-          <w:p>
-            <w:pPr>
-              <w:pStyle w:val="Style14"/>
-              <w:spacing w:lineRule="auto" w:line="240" w:before="57" w:after="57"/>
-              <w:ind w:hanging="0"/>
-              <w:rPr>
-                <w:sz w:val="16"/>
-                <w:szCs w:val="16"/>
-              </w:rPr>
-            </w:pPr>
-            <w:r>
-              <w:rPr>
-                <w:sz w:val="16"/>
-                <w:szCs w:val="16"/>
-              </w:rPr>
-            </w:r>
-          </w:p>
-        </w:tc>
-        <w:tc>
-          <w:tcPr>
-            <w:tcW w:w="436" w:type="dxa"/>
-            <w:tcBorders>
-              <w:left w:val="single" w:sz="4" w:space="0" w:color="000000"/>
-              <w:bottom w:val="single" w:sz="4" w:space="0" w:color="000000"/>
-            </w:tcBorders>
-            <w:vAlign w:val="center"/>
-          </w:tcPr>
-          <w:p>
-            <w:pPr>
-              <w:pStyle w:val="Style14"/>
-              <w:spacing w:lineRule="auto" w:line="240" w:before="57" w:after="57"/>
-              <w:ind w:hanging="0"/>
-              <w:rPr>
-                <w:sz w:val="16"/>
-                <w:szCs w:val="16"/>
-              </w:rPr>
-            </w:pPr>
-            <w:r>
-              <w:rPr>
-                <w:sz w:val="16"/>
-                <w:szCs w:val="16"/>
-              </w:rPr>
-            </w:r>
-          </w:p>
-        </w:tc>
-        <w:tc>
-          <w:tcPr>
-            <w:tcW w:w="963" w:type="dxa"/>
+            <w:tcW w:w="437" w:type="dxa"/>
+            <w:tcBorders>
+              <w:left w:val="single" w:sz="4" w:space="0" w:color="000000"/>
+              <w:bottom w:val="single" w:sz="4" w:space="0" w:color="000000"/>
+            </w:tcBorders>
+            <w:vAlign w:val="center"/>
+          </w:tcPr>
+          <w:p>
+            <w:pPr>
+              <w:pStyle w:val="user2"/>
+              <w:spacing w:lineRule="auto" w:line="240" w:before="57" w:after="57"/>
+              <w:ind w:hanging="0"/>
+              <w:rPr>
+                <w:sz w:val="16"/>
+                <w:szCs w:val="16"/>
+              </w:rPr>
+            </w:pPr>
+            <w:r>
+              <w:rPr>
+                <w:sz w:val="16"/>
+                <w:szCs w:val="16"/>
+              </w:rPr>
+            </w:r>
+          </w:p>
+        </w:tc>
+        <w:tc>
+          <w:tcPr>
+            <w:tcW w:w="435" w:type="dxa"/>
+            <w:tcBorders>
+              <w:left w:val="single" w:sz="4" w:space="0" w:color="000000"/>
+              <w:bottom w:val="single" w:sz="4" w:space="0" w:color="000000"/>
+            </w:tcBorders>
+            <w:vAlign w:val="center"/>
+          </w:tcPr>
+          <w:p>
+            <w:pPr>
+              <w:pStyle w:val="user2"/>
+              <w:spacing w:lineRule="auto" w:line="240" w:before="57" w:after="57"/>
+              <w:ind w:hanging="0"/>
+              <w:rPr>
+                <w:sz w:val="16"/>
+                <w:szCs w:val="16"/>
+              </w:rPr>
+            </w:pPr>
+            <w:r>
+              <w:rPr>
+                <w:sz w:val="16"/>
+                <w:szCs w:val="16"/>
+              </w:rPr>
+            </w:r>
+          </w:p>
+        </w:tc>
+        <w:tc>
+          <w:tcPr>
+            <w:tcW w:w="437" w:type="dxa"/>
+            <w:tcBorders>
+              <w:left w:val="single" w:sz="4" w:space="0" w:color="000000"/>
+              <w:bottom w:val="single" w:sz="4" w:space="0" w:color="000000"/>
+            </w:tcBorders>
+            <w:vAlign w:val="center"/>
+          </w:tcPr>
+          <w:p>
+            <w:pPr>
+              <w:pStyle w:val="user2"/>
+              <w:spacing w:lineRule="auto" w:line="240" w:before="57" w:after="57"/>
+              <w:ind w:hanging="0"/>
+              <w:rPr>
+                <w:sz w:val="16"/>
+                <w:szCs w:val="16"/>
+              </w:rPr>
+            </w:pPr>
+            <w:r>
+              <w:rPr>
+                <w:sz w:val="16"/>
+                <w:szCs w:val="16"/>
+              </w:rPr>
+            </w:r>
+          </w:p>
+        </w:tc>
+        <w:tc>
+          <w:tcPr>
+            <w:tcW w:w="435" w:type="dxa"/>
+            <w:tcBorders>
+              <w:left w:val="single" w:sz="4" w:space="0" w:color="000000"/>
+              <w:bottom w:val="single" w:sz="4" w:space="0" w:color="000000"/>
+            </w:tcBorders>
+            <w:vAlign w:val="center"/>
+          </w:tcPr>
+          <w:p>
+            <w:pPr>
+              <w:pStyle w:val="user2"/>
+              <w:spacing w:lineRule="auto" w:line="240" w:before="57" w:after="57"/>
+              <w:ind w:hanging="0"/>
+              <w:rPr>
+                <w:sz w:val="16"/>
+                <w:szCs w:val="16"/>
+              </w:rPr>
+            </w:pPr>
+            <w:r>
+              <w:rPr>
+                <w:sz w:val="16"/>
+                <w:szCs w:val="16"/>
+              </w:rPr>
+            </w:r>
+          </w:p>
+        </w:tc>
+        <w:tc>
+          <w:tcPr>
+            <w:tcW w:w="964" w:type="dxa"/>
             <w:tcBorders>
               <w:left w:val="single" w:sz="4" w:space="0" w:color="000000"/>
               <w:bottom w:val="single" w:sz="4" w:space="0" w:color="000000"/>
@@ -4617,7 +4650,7 @@
           </w:tcPr>
           <w:p>
             <w:pPr>
-              <w:pStyle w:val="Style14"/>
+              <w:pStyle w:val="user2"/>
               <w:spacing w:lineRule="auto" w:line="240" w:before="57" w:after="57"/>
               <w:ind w:hanging="0"/>
               <w:rPr>
@@ -4639,16 +4672,16 @@
         <w:trPr/>
         <w:tc>
           <w:tcPr>
-            <w:tcW w:w="516" w:type="dxa"/>
-            <w:tcBorders>
-              <w:left w:val="single" w:sz="4" w:space="0" w:color="000000"/>
-              <w:bottom w:val="single" w:sz="4" w:space="0" w:color="000000"/>
-            </w:tcBorders>
-            <w:vAlign w:val="center"/>
-          </w:tcPr>
-          <w:p>
-            <w:pPr>
-              <w:pStyle w:val="Style14"/>
+            <w:tcW w:w="515" w:type="dxa"/>
+            <w:tcBorders>
+              <w:left w:val="single" w:sz="4" w:space="0" w:color="000000"/>
+              <w:bottom w:val="single" w:sz="4" w:space="0" w:color="000000"/>
+            </w:tcBorders>
+            <w:vAlign w:val="center"/>
+          </w:tcPr>
+          <w:p>
+            <w:pPr>
+              <w:pStyle w:val="user2"/>
               <w:spacing w:lineRule="auto" w:line="240" w:before="57" w:after="57"/>
               <w:ind w:hanging="0"/>
               <w:rPr>
@@ -4676,7 +4709,7 @@
           </w:tcPr>
           <w:p>
             <w:pPr>
-              <w:pStyle w:val="Style14"/>
+              <w:pStyle w:val="user2"/>
               <w:spacing w:lineRule="auto" w:line="240" w:before="57" w:after="57"/>
               <w:ind w:hanging="0"/>
               <w:rPr>
@@ -4704,7 +4737,7 @@
           </w:tcPr>
           <w:p>
             <w:pPr>
-              <w:pStyle w:val="Style14"/>
+              <w:pStyle w:val="user2"/>
               <w:spacing w:lineRule="auto" w:line="240" w:before="57" w:after="57"/>
               <w:ind w:hanging="0"/>
               <w:rPr>
@@ -4723,16 +4756,16 @@
         </w:tc>
         <w:tc>
           <w:tcPr>
-            <w:tcW w:w="436" w:type="dxa"/>
-            <w:tcBorders>
-              <w:left w:val="single" w:sz="4" w:space="0" w:color="000000"/>
-              <w:bottom w:val="single" w:sz="4" w:space="0" w:color="000000"/>
-            </w:tcBorders>
-            <w:vAlign w:val="center"/>
-          </w:tcPr>
-          <w:p>
-            <w:pPr>
-              <w:pStyle w:val="Style14"/>
+            <w:tcW w:w="437" w:type="dxa"/>
+            <w:tcBorders>
+              <w:left w:val="single" w:sz="4" w:space="0" w:color="000000"/>
+              <w:bottom w:val="single" w:sz="4" w:space="0" w:color="000000"/>
+            </w:tcBorders>
+            <w:vAlign w:val="center"/>
+          </w:tcPr>
+          <w:p>
+            <w:pPr>
+              <w:pStyle w:val="user2"/>
               <w:spacing w:lineRule="auto" w:line="240" w:before="57" w:after="57"/>
               <w:ind w:hanging="0"/>
               <w:rPr>
@@ -4751,16 +4784,16 @@
         </w:tc>
         <w:tc>
           <w:tcPr>
-            <w:tcW w:w="436" w:type="dxa"/>
-            <w:tcBorders>
-              <w:left w:val="single" w:sz="4" w:space="0" w:color="000000"/>
-              <w:bottom w:val="single" w:sz="4" w:space="0" w:color="000000"/>
-            </w:tcBorders>
-            <w:vAlign w:val="center"/>
-          </w:tcPr>
-          <w:p>
-            <w:pPr>
-              <w:pStyle w:val="Style14"/>
+            <w:tcW w:w="435" w:type="dxa"/>
+            <w:tcBorders>
+              <w:left w:val="single" w:sz="4" w:space="0" w:color="000000"/>
+              <w:bottom w:val="single" w:sz="4" w:space="0" w:color="000000"/>
+            </w:tcBorders>
+            <w:vAlign w:val="center"/>
+          </w:tcPr>
+          <w:p>
+            <w:pPr>
+              <w:pStyle w:val="user2"/>
               <w:spacing w:lineRule="auto" w:line="240" w:before="57" w:after="57"/>
               <w:ind w:hanging="0"/>
               <w:rPr>
@@ -4779,61 +4812,61 @@
         </w:tc>
         <w:tc>
           <w:tcPr>
-            <w:tcW w:w="436" w:type="dxa"/>
-            <w:tcBorders>
-              <w:left w:val="single" w:sz="4" w:space="0" w:color="000000"/>
-              <w:bottom w:val="single" w:sz="4" w:space="0" w:color="000000"/>
-            </w:tcBorders>
-            <w:vAlign w:val="center"/>
-          </w:tcPr>
-          <w:p>
-            <w:pPr>
-              <w:pStyle w:val="Style14"/>
-              <w:spacing w:lineRule="auto" w:line="240" w:before="57" w:after="57"/>
-              <w:ind w:hanging="0"/>
-              <w:rPr>
-                <w:sz w:val="16"/>
-                <w:szCs w:val="16"/>
-              </w:rPr>
-            </w:pPr>
-            <w:r>
-              <w:rPr>
-                <w:sz w:val="16"/>
-                <w:szCs w:val="16"/>
-              </w:rPr>
-            </w:r>
-          </w:p>
-        </w:tc>
-        <w:tc>
-          <w:tcPr>
-            <w:tcW w:w="436" w:type="dxa"/>
-            <w:tcBorders>
-              <w:left w:val="single" w:sz="4" w:space="0" w:color="000000"/>
-              <w:bottom w:val="single" w:sz="4" w:space="0" w:color="000000"/>
-            </w:tcBorders>
-            <w:vAlign w:val="center"/>
-          </w:tcPr>
-          <w:p>
-            <w:pPr>
-              <w:pStyle w:val="Style14"/>
-              <w:spacing w:lineRule="auto" w:line="240" w:before="57" w:after="57"/>
-              <w:ind w:hanging="0"/>
-              <w:rPr>
-                <w:sz w:val="16"/>
-                <w:szCs w:val="16"/>
-              </w:rPr>
-            </w:pPr>
-            <w:r>
-              <w:rPr>
-                <w:sz w:val="16"/>
-                <w:szCs w:val="16"/>
-              </w:rPr>
-            </w:r>
-          </w:p>
-        </w:tc>
-        <w:tc>
-          <w:tcPr>
-            <w:tcW w:w="963" w:type="dxa"/>
+            <w:tcW w:w="437" w:type="dxa"/>
+            <w:tcBorders>
+              <w:left w:val="single" w:sz="4" w:space="0" w:color="000000"/>
+              <w:bottom w:val="single" w:sz="4" w:space="0" w:color="000000"/>
+            </w:tcBorders>
+            <w:vAlign w:val="center"/>
+          </w:tcPr>
+          <w:p>
+            <w:pPr>
+              <w:pStyle w:val="user2"/>
+              <w:spacing w:lineRule="auto" w:line="240" w:before="57" w:after="57"/>
+              <w:ind w:hanging="0"/>
+              <w:rPr>
+                <w:sz w:val="16"/>
+                <w:szCs w:val="16"/>
+              </w:rPr>
+            </w:pPr>
+            <w:r>
+              <w:rPr>
+                <w:sz w:val="16"/>
+                <w:szCs w:val="16"/>
+              </w:rPr>
+            </w:r>
+          </w:p>
+        </w:tc>
+        <w:tc>
+          <w:tcPr>
+            <w:tcW w:w="435" w:type="dxa"/>
+            <w:tcBorders>
+              <w:left w:val="single" w:sz="4" w:space="0" w:color="000000"/>
+              <w:bottom w:val="single" w:sz="4" w:space="0" w:color="000000"/>
+            </w:tcBorders>
+            <w:vAlign w:val="center"/>
+          </w:tcPr>
+          <w:p>
+            <w:pPr>
+              <w:pStyle w:val="user2"/>
+              <w:spacing w:lineRule="auto" w:line="240" w:before="57" w:after="57"/>
+              <w:ind w:hanging="0"/>
+              <w:rPr>
+                <w:sz w:val="16"/>
+                <w:szCs w:val="16"/>
+              </w:rPr>
+            </w:pPr>
+            <w:r>
+              <w:rPr>
+                <w:sz w:val="16"/>
+                <w:szCs w:val="16"/>
+              </w:rPr>
+            </w:r>
+          </w:p>
+        </w:tc>
+        <w:tc>
+          <w:tcPr>
+            <w:tcW w:w="964" w:type="dxa"/>
             <w:tcBorders>
               <w:left w:val="single" w:sz="4" w:space="0" w:color="000000"/>
               <w:bottom w:val="single" w:sz="4" w:space="0" w:color="000000"/>
@@ -4843,7 +4876,7 @@
           </w:tcPr>
           <w:p>
             <w:pPr>
-              <w:pStyle w:val="Style14"/>
+              <w:pStyle w:val="user2"/>
               <w:spacing w:lineRule="auto" w:line="240" w:before="57" w:after="57"/>
               <w:ind w:hanging="0"/>
               <w:rPr>
@@ -4865,16 +4898,16 @@
         <w:trPr/>
         <w:tc>
           <w:tcPr>
-            <w:tcW w:w="516" w:type="dxa"/>
-            <w:tcBorders>
-              <w:left w:val="single" w:sz="4" w:space="0" w:color="000000"/>
-              <w:bottom w:val="single" w:sz="4" w:space="0" w:color="000000"/>
-            </w:tcBorders>
-            <w:vAlign w:val="center"/>
-          </w:tcPr>
-          <w:p>
-            <w:pPr>
-              <w:pStyle w:val="Style14"/>
+            <w:tcW w:w="515" w:type="dxa"/>
+            <w:tcBorders>
+              <w:left w:val="single" w:sz="4" w:space="0" w:color="000000"/>
+              <w:bottom w:val="single" w:sz="4" w:space="0" w:color="000000"/>
+            </w:tcBorders>
+            <w:vAlign w:val="center"/>
+          </w:tcPr>
+          <w:p>
+            <w:pPr>
+              <w:pStyle w:val="user2"/>
               <w:spacing w:lineRule="auto" w:line="240" w:before="57" w:after="57"/>
               <w:ind w:hanging="0"/>
               <w:rPr>
@@ -4902,7 +4935,7 @@
           </w:tcPr>
           <w:p>
             <w:pPr>
-              <w:pStyle w:val="Style14"/>
+              <w:pStyle w:val="user2"/>
               <w:spacing w:lineRule="auto" w:line="240" w:before="57" w:after="57"/>
               <w:ind w:hanging="0"/>
               <w:rPr>
@@ -4930,34 +4963,34 @@
           </w:tcPr>
           <w:p>
             <w:pPr>
-              <w:pStyle w:val="Style14"/>
-              <w:spacing w:lineRule="auto" w:line="240" w:before="57" w:after="57"/>
-              <w:ind w:hanging="0"/>
-              <w:rPr>
-                <w:sz w:val="16"/>
-                <w:szCs w:val="16"/>
-              </w:rPr>
-            </w:pPr>
-            <w:r>
-              <w:rPr>
-                <w:sz w:val="16"/>
-                <w:szCs w:val="16"/>
-              </w:rPr>
-            </w:r>
-          </w:p>
-        </w:tc>
-        <w:tc>
-          <w:tcPr>
-            <w:tcW w:w="436" w:type="dxa"/>
-            <w:tcBorders>
-              <w:left w:val="single" w:sz="4" w:space="0" w:color="000000"/>
-              <w:bottom w:val="single" w:sz="4" w:space="0" w:color="000000"/>
-            </w:tcBorders>
-            <w:vAlign w:val="center"/>
-          </w:tcPr>
-          <w:p>
-            <w:pPr>
-              <w:pStyle w:val="Style14"/>
+              <w:pStyle w:val="user2"/>
+              <w:spacing w:lineRule="auto" w:line="240" w:before="57" w:after="57"/>
+              <w:ind w:hanging="0"/>
+              <w:rPr>
+                <w:sz w:val="16"/>
+                <w:szCs w:val="16"/>
+              </w:rPr>
+            </w:pPr>
+            <w:r>
+              <w:rPr>
+                <w:sz w:val="16"/>
+                <w:szCs w:val="16"/>
+              </w:rPr>
+            </w:r>
+          </w:p>
+        </w:tc>
+        <w:tc>
+          <w:tcPr>
+            <w:tcW w:w="437" w:type="dxa"/>
+            <w:tcBorders>
+              <w:left w:val="single" w:sz="4" w:space="0" w:color="000000"/>
+              <w:bottom w:val="single" w:sz="4" w:space="0" w:color="000000"/>
+            </w:tcBorders>
+            <w:vAlign w:val="center"/>
+          </w:tcPr>
+          <w:p>
+            <w:pPr>
+              <w:pStyle w:val="user2"/>
               <w:spacing w:lineRule="auto" w:line="240" w:before="57" w:after="57"/>
               <w:ind w:hanging="0"/>
               <w:rPr>
@@ -4976,16 +5009,16 @@
         </w:tc>
         <w:tc>
           <w:tcPr>
-            <w:tcW w:w="436" w:type="dxa"/>
-            <w:tcBorders>
-              <w:left w:val="single" w:sz="4" w:space="0" w:color="000000"/>
-              <w:bottom w:val="single" w:sz="4" w:space="0" w:color="000000"/>
-            </w:tcBorders>
-            <w:vAlign w:val="center"/>
-          </w:tcPr>
-          <w:p>
-            <w:pPr>
-              <w:pStyle w:val="Style14"/>
+            <w:tcW w:w="435" w:type="dxa"/>
+            <w:tcBorders>
+              <w:left w:val="single" w:sz="4" w:space="0" w:color="000000"/>
+              <w:bottom w:val="single" w:sz="4" w:space="0" w:color="000000"/>
+            </w:tcBorders>
+            <w:vAlign w:val="center"/>
+          </w:tcPr>
+          <w:p>
+            <w:pPr>
+              <w:pStyle w:val="user2"/>
               <w:spacing w:lineRule="auto" w:line="240" w:before="57" w:after="57"/>
               <w:ind w:hanging="0"/>
               <w:rPr>
@@ -5004,61 +5037,61 @@
         </w:tc>
         <w:tc>
           <w:tcPr>
-            <w:tcW w:w="436" w:type="dxa"/>
-            <w:tcBorders>
-              <w:left w:val="single" w:sz="4" w:space="0" w:color="000000"/>
-              <w:bottom w:val="single" w:sz="4" w:space="0" w:color="000000"/>
-            </w:tcBorders>
-            <w:vAlign w:val="center"/>
-          </w:tcPr>
-          <w:p>
-            <w:pPr>
-              <w:pStyle w:val="Style14"/>
-              <w:spacing w:lineRule="auto" w:line="240" w:before="57" w:after="57"/>
-              <w:ind w:hanging="0"/>
-              <w:rPr>
-                <w:sz w:val="16"/>
-                <w:szCs w:val="16"/>
-              </w:rPr>
-            </w:pPr>
-            <w:r>
-              <w:rPr>
-                <w:sz w:val="16"/>
-                <w:szCs w:val="16"/>
-              </w:rPr>
-            </w:r>
-          </w:p>
-        </w:tc>
-        <w:tc>
-          <w:tcPr>
-            <w:tcW w:w="436" w:type="dxa"/>
-            <w:tcBorders>
-              <w:left w:val="single" w:sz="4" w:space="0" w:color="000000"/>
-              <w:bottom w:val="single" w:sz="4" w:space="0" w:color="000000"/>
-            </w:tcBorders>
-            <w:vAlign w:val="center"/>
-          </w:tcPr>
-          <w:p>
-            <w:pPr>
-              <w:pStyle w:val="Style14"/>
-              <w:spacing w:lineRule="auto" w:line="240" w:before="57" w:after="57"/>
-              <w:ind w:hanging="0"/>
-              <w:rPr>
-                <w:sz w:val="16"/>
-                <w:szCs w:val="16"/>
-              </w:rPr>
-            </w:pPr>
-            <w:r>
-              <w:rPr>
-                <w:sz w:val="16"/>
-                <w:szCs w:val="16"/>
-              </w:rPr>
-            </w:r>
-          </w:p>
-        </w:tc>
-        <w:tc>
-          <w:tcPr>
-            <w:tcW w:w="963" w:type="dxa"/>
+            <w:tcW w:w="437" w:type="dxa"/>
+            <w:tcBorders>
+              <w:left w:val="single" w:sz="4" w:space="0" w:color="000000"/>
+              <w:bottom w:val="single" w:sz="4" w:space="0" w:color="000000"/>
+            </w:tcBorders>
+            <w:vAlign w:val="center"/>
+          </w:tcPr>
+          <w:p>
+            <w:pPr>
+              <w:pStyle w:val="user2"/>
+              <w:spacing w:lineRule="auto" w:line="240" w:before="57" w:after="57"/>
+              <w:ind w:hanging="0"/>
+              <w:rPr>
+                <w:sz w:val="16"/>
+                <w:szCs w:val="16"/>
+              </w:rPr>
+            </w:pPr>
+            <w:r>
+              <w:rPr>
+                <w:sz w:val="16"/>
+                <w:szCs w:val="16"/>
+              </w:rPr>
+            </w:r>
+          </w:p>
+        </w:tc>
+        <w:tc>
+          <w:tcPr>
+            <w:tcW w:w="435" w:type="dxa"/>
+            <w:tcBorders>
+              <w:left w:val="single" w:sz="4" w:space="0" w:color="000000"/>
+              <w:bottom w:val="single" w:sz="4" w:space="0" w:color="000000"/>
+            </w:tcBorders>
+            <w:vAlign w:val="center"/>
+          </w:tcPr>
+          <w:p>
+            <w:pPr>
+              <w:pStyle w:val="user2"/>
+              <w:spacing w:lineRule="auto" w:line="240" w:before="57" w:after="57"/>
+              <w:ind w:hanging="0"/>
+              <w:rPr>
+                <w:sz w:val="16"/>
+                <w:szCs w:val="16"/>
+              </w:rPr>
+            </w:pPr>
+            <w:r>
+              <w:rPr>
+                <w:sz w:val="16"/>
+                <w:szCs w:val="16"/>
+              </w:rPr>
+            </w:r>
+          </w:p>
+        </w:tc>
+        <w:tc>
+          <w:tcPr>
+            <w:tcW w:w="964" w:type="dxa"/>
             <w:tcBorders>
               <w:left w:val="single" w:sz="4" w:space="0" w:color="000000"/>
               <w:bottom w:val="single" w:sz="4" w:space="0" w:color="000000"/>
@@ -5068,7 +5101,7 @@
           </w:tcPr>
           <w:p>
             <w:pPr>
-              <w:pStyle w:val="Style14"/>
+              <w:pStyle w:val="user2"/>
               <w:spacing w:lineRule="auto" w:line="240" w:before="57" w:after="57"/>
               <w:ind w:hanging="0"/>
               <w:rPr>
@@ -5090,16 +5123,16 @@
         <w:trPr/>
         <w:tc>
           <w:tcPr>
-            <w:tcW w:w="516" w:type="dxa"/>
-            <w:tcBorders>
-              <w:left w:val="single" w:sz="4" w:space="0" w:color="000000"/>
-              <w:bottom w:val="single" w:sz="4" w:space="0" w:color="000000"/>
-            </w:tcBorders>
-            <w:vAlign w:val="center"/>
-          </w:tcPr>
-          <w:p>
-            <w:pPr>
-              <w:pStyle w:val="Style14"/>
+            <w:tcW w:w="515" w:type="dxa"/>
+            <w:tcBorders>
+              <w:left w:val="single" w:sz="4" w:space="0" w:color="000000"/>
+              <w:bottom w:val="single" w:sz="4" w:space="0" w:color="000000"/>
+            </w:tcBorders>
+            <w:vAlign w:val="center"/>
+          </w:tcPr>
+          <w:p>
+            <w:pPr>
+              <w:pStyle w:val="user2"/>
               <w:spacing w:lineRule="auto" w:line="240" w:before="57" w:after="57"/>
               <w:ind w:hanging="0"/>
               <w:rPr>
@@ -5127,7 +5160,7 @@
           </w:tcPr>
           <w:p>
             <w:pPr>
-              <w:pStyle w:val="Style14"/>
+              <w:pStyle w:val="user2"/>
               <w:spacing w:lineRule="auto" w:line="240" w:before="57" w:after="57"/>
               <w:ind w:hanging="0"/>
               <w:rPr>
@@ -5155,7 +5188,7 @@
           </w:tcPr>
           <w:p>
             <w:pPr>
-              <w:pStyle w:val="Style14"/>
+              <w:pStyle w:val="user2"/>
               <w:spacing w:lineRule="auto" w:line="240" w:before="57" w:after="57"/>
               <w:ind w:hanging="0"/>
               <w:rPr>
@@ -5174,16 +5207,16 @@
         </w:tc>
         <w:tc>
           <w:tcPr>
-            <w:tcW w:w="436" w:type="dxa"/>
-            <w:tcBorders>
-              <w:left w:val="single" w:sz="4" w:space="0" w:color="000000"/>
-              <w:bottom w:val="single" w:sz="4" w:space="0" w:color="000000"/>
-            </w:tcBorders>
-            <w:vAlign w:val="center"/>
-          </w:tcPr>
-          <w:p>
-            <w:pPr>
-              <w:pStyle w:val="Style14"/>
+            <w:tcW w:w="437" w:type="dxa"/>
+            <w:tcBorders>
+              <w:left w:val="single" w:sz="4" w:space="0" w:color="000000"/>
+              <w:bottom w:val="single" w:sz="4" w:space="0" w:color="000000"/>
+            </w:tcBorders>
+            <w:vAlign w:val="center"/>
+          </w:tcPr>
+          <w:p>
+            <w:pPr>
+              <w:pStyle w:val="user2"/>
               <w:spacing w:lineRule="auto" w:line="240" w:before="57" w:after="57"/>
               <w:ind w:hanging="0"/>
               <w:rPr>
@@ -5202,16 +5235,16 @@
         </w:tc>
         <w:tc>
           <w:tcPr>
-            <w:tcW w:w="436" w:type="dxa"/>
-            <w:tcBorders>
-              <w:left w:val="single" w:sz="4" w:space="0" w:color="000000"/>
-              <w:bottom w:val="single" w:sz="4" w:space="0" w:color="000000"/>
-            </w:tcBorders>
-            <w:vAlign w:val="center"/>
-          </w:tcPr>
-          <w:p>
-            <w:pPr>
-              <w:pStyle w:val="Style14"/>
+            <w:tcW w:w="435" w:type="dxa"/>
+            <w:tcBorders>
+              <w:left w:val="single" w:sz="4" w:space="0" w:color="000000"/>
+              <w:bottom w:val="single" w:sz="4" w:space="0" w:color="000000"/>
+            </w:tcBorders>
+            <w:vAlign w:val="center"/>
+          </w:tcPr>
+          <w:p>
+            <w:pPr>
+              <w:pStyle w:val="user2"/>
               <w:spacing w:lineRule="auto" w:line="240" w:before="57" w:after="57"/>
               <w:ind w:hanging="0"/>
               <w:rPr>
@@ -5230,61 +5263,61 @@
         </w:tc>
         <w:tc>
           <w:tcPr>
-            <w:tcW w:w="436" w:type="dxa"/>
-            <w:tcBorders>
-              <w:left w:val="single" w:sz="4" w:space="0" w:color="000000"/>
-              <w:bottom w:val="single" w:sz="4" w:space="0" w:color="000000"/>
-            </w:tcBorders>
-            <w:vAlign w:val="center"/>
-          </w:tcPr>
-          <w:p>
-            <w:pPr>
-              <w:pStyle w:val="Style14"/>
-              <w:spacing w:lineRule="auto" w:line="240" w:before="57" w:after="57"/>
-              <w:ind w:hanging="0"/>
-              <w:rPr>
-                <w:sz w:val="16"/>
-                <w:szCs w:val="16"/>
-              </w:rPr>
-            </w:pPr>
-            <w:r>
-              <w:rPr>
-                <w:sz w:val="16"/>
-                <w:szCs w:val="16"/>
-              </w:rPr>
-            </w:r>
-          </w:p>
-        </w:tc>
-        <w:tc>
-          <w:tcPr>
-            <w:tcW w:w="436" w:type="dxa"/>
-            <w:tcBorders>
-              <w:left w:val="single" w:sz="4" w:space="0" w:color="000000"/>
-              <w:bottom w:val="single" w:sz="4" w:space="0" w:color="000000"/>
-            </w:tcBorders>
-            <w:vAlign w:val="center"/>
-          </w:tcPr>
-          <w:p>
-            <w:pPr>
-              <w:pStyle w:val="Style14"/>
-              <w:spacing w:lineRule="auto" w:line="240" w:before="57" w:after="57"/>
-              <w:ind w:hanging="0"/>
-              <w:rPr>
-                <w:sz w:val="16"/>
-                <w:szCs w:val="16"/>
-              </w:rPr>
-            </w:pPr>
-            <w:r>
-              <w:rPr>
-                <w:sz w:val="16"/>
-                <w:szCs w:val="16"/>
-              </w:rPr>
-            </w:r>
-          </w:p>
-        </w:tc>
-        <w:tc>
-          <w:tcPr>
-            <w:tcW w:w="963" w:type="dxa"/>
+            <w:tcW w:w="437" w:type="dxa"/>
+            <w:tcBorders>
+              <w:left w:val="single" w:sz="4" w:space="0" w:color="000000"/>
+              <w:bottom w:val="single" w:sz="4" w:space="0" w:color="000000"/>
+            </w:tcBorders>
+            <w:vAlign w:val="center"/>
+          </w:tcPr>
+          <w:p>
+            <w:pPr>
+              <w:pStyle w:val="user2"/>
+              <w:spacing w:lineRule="auto" w:line="240" w:before="57" w:after="57"/>
+              <w:ind w:hanging="0"/>
+              <w:rPr>
+                <w:sz w:val="16"/>
+                <w:szCs w:val="16"/>
+              </w:rPr>
+            </w:pPr>
+            <w:r>
+              <w:rPr>
+                <w:sz w:val="16"/>
+                <w:szCs w:val="16"/>
+              </w:rPr>
+            </w:r>
+          </w:p>
+        </w:tc>
+        <w:tc>
+          <w:tcPr>
+            <w:tcW w:w="435" w:type="dxa"/>
+            <w:tcBorders>
+              <w:left w:val="single" w:sz="4" w:space="0" w:color="000000"/>
+              <w:bottom w:val="single" w:sz="4" w:space="0" w:color="000000"/>
+            </w:tcBorders>
+            <w:vAlign w:val="center"/>
+          </w:tcPr>
+          <w:p>
+            <w:pPr>
+              <w:pStyle w:val="user2"/>
+              <w:spacing w:lineRule="auto" w:line="240" w:before="57" w:after="57"/>
+              <w:ind w:hanging="0"/>
+              <w:rPr>
+                <w:sz w:val="16"/>
+                <w:szCs w:val="16"/>
+              </w:rPr>
+            </w:pPr>
+            <w:r>
+              <w:rPr>
+                <w:sz w:val="16"/>
+                <w:szCs w:val="16"/>
+              </w:rPr>
+            </w:r>
+          </w:p>
+        </w:tc>
+        <w:tc>
+          <w:tcPr>
+            <w:tcW w:w="964" w:type="dxa"/>
             <w:tcBorders>
               <w:left w:val="single" w:sz="4" w:space="0" w:color="000000"/>
               <w:bottom w:val="single" w:sz="4" w:space="0" w:color="000000"/>
@@ -5294,7 +5327,7 @@
           </w:tcPr>
           <w:p>
             <w:pPr>
-              <w:pStyle w:val="Style14"/>
+              <w:pStyle w:val="user2"/>
               <w:spacing w:lineRule="auto" w:line="240" w:before="57" w:after="57"/>
               <w:ind w:hanging="0"/>
               <w:rPr>
@@ -5316,16 +5349,16 @@
         <w:trPr/>
         <w:tc>
           <w:tcPr>
-            <w:tcW w:w="516" w:type="dxa"/>
-            <w:tcBorders>
-              <w:left w:val="single" w:sz="4" w:space="0" w:color="000000"/>
-              <w:bottom w:val="single" w:sz="4" w:space="0" w:color="000000"/>
-            </w:tcBorders>
-            <w:vAlign w:val="center"/>
-          </w:tcPr>
-          <w:p>
-            <w:pPr>
-              <w:pStyle w:val="Style14"/>
+            <w:tcW w:w="515" w:type="dxa"/>
+            <w:tcBorders>
+              <w:left w:val="single" w:sz="4" w:space="0" w:color="000000"/>
+              <w:bottom w:val="single" w:sz="4" w:space="0" w:color="000000"/>
+            </w:tcBorders>
+            <w:vAlign w:val="center"/>
+          </w:tcPr>
+          <w:p>
+            <w:pPr>
+              <w:pStyle w:val="user2"/>
               <w:spacing w:lineRule="auto" w:line="240" w:before="57" w:after="57"/>
               <w:ind w:hanging="0"/>
               <w:rPr>
@@ -5353,7 +5386,7 @@
           </w:tcPr>
           <w:p>
             <w:pPr>
-              <w:pStyle w:val="Style14"/>
+              <w:pStyle w:val="user2"/>
               <w:spacing w:lineRule="auto" w:line="240" w:before="57" w:after="57"/>
               <w:ind w:hanging="0"/>
               <w:rPr>
@@ -5381,34 +5414,34 @@
           </w:tcPr>
           <w:p>
             <w:pPr>
-              <w:pStyle w:val="Style14"/>
-              <w:spacing w:lineRule="auto" w:line="240" w:before="57" w:after="57"/>
-              <w:ind w:hanging="0"/>
-              <w:rPr>
-                <w:sz w:val="16"/>
-                <w:szCs w:val="16"/>
-              </w:rPr>
-            </w:pPr>
-            <w:r>
-              <w:rPr>
-                <w:sz w:val="16"/>
-                <w:szCs w:val="16"/>
-              </w:rPr>
-            </w:r>
-          </w:p>
-        </w:tc>
-        <w:tc>
-          <w:tcPr>
-            <w:tcW w:w="436" w:type="dxa"/>
-            <w:tcBorders>
-              <w:left w:val="single" w:sz="4" w:space="0" w:color="000000"/>
-              <w:bottom w:val="single" w:sz="4" w:space="0" w:color="000000"/>
-            </w:tcBorders>
-            <w:vAlign w:val="center"/>
-          </w:tcPr>
-          <w:p>
-            <w:pPr>
-              <w:pStyle w:val="Style14"/>
+              <w:pStyle w:val="user2"/>
+              <w:spacing w:lineRule="auto" w:line="240" w:before="57" w:after="57"/>
+              <w:ind w:hanging="0"/>
+              <w:rPr>
+                <w:sz w:val="16"/>
+                <w:szCs w:val="16"/>
+              </w:rPr>
+            </w:pPr>
+            <w:r>
+              <w:rPr>
+                <w:sz w:val="16"/>
+                <w:szCs w:val="16"/>
+              </w:rPr>
+            </w:r>
+          </w:p>
+        </w:tc>
+        <w:tc>
+          <w:tcPr>
+            <w:tcW w:w="437" w:type="dxa"/>
+            <w:tcBorders>
+              <w:left w:val="single" w:sz="4" w:space="0" w:color="000000"/>
+              <w:bottom w:val="single" w:sz="4" w:space="0" w:color="000000"/>
+            </w:tcBorders>
+            <w:vAlign w:val="center"/>
+          </w:tcPr>
+          <w:p>
+            <w:pPr>
+              <w:pStyle w:val="user2"/>
               <w:spacing w:lineRule="auto" w:line="240" w:before="57" w:after="57"/>
               <w:ind w:hanging="0"/>
               <w:rPr>
@@ -5427,16 +5460,16 @@
         </w:tc>
         <w:tc>
           <w:tcPr>
-            <w:tcW w:w="436" w:type="dxa"/>
-            <w:tcBorders>
-              <w:left w:val="single" w:sz="4" w:space="0" w:color="000000"/>
-              <w:bottom w:val="single" w:sz="4" w:space="0" w:color="000000"/>
-            </w:tcBorders>
-            <w:vAlign w:val="center"/>
-          </w:tcPr>
-          <w:p>
-            <w:pPr>
-              <w:pStyle w:val="Style14"/>
+            <w:tcW w:w="435" w:type="dxa"/>
+            <w:tcBorders>
+              <w:left w:val="single" w:sz="4" w:space="0" w:color="000000"/>
+              <w:bottom w:val="single" w:sz="4" w:space="0" w:color="000000"/>
+            </w:tcBorders>
+            <w:vAlign w:val="center"/>
+          </w:tcPr>
+          <w:p>
+            <w:pPr>
+              <w:pStyle w:val="user2"/>
               <w:spacing w:lineRule="auto" w:line="240" w:before="57" w:after="57"/>
               <w:ind w:hanging="0"/>
               <w:rPr>
@@ -5455,61 +5488,61 @@
         </w:tc>
         <w:tc>
           <w:tcPr>
-            <w:tcW w:w="436" w:type="dxa"/>
-            <w:tcBorders>
-              <w:left w:val="single" w:sz="4" w:space="0" w:color="000000"/>
-              <w:bottom w:val="single" w:sz="4" w:space="0" w:color="000000"/>
-            </w:tcBorders>
-            <w:vAlign w:val="center"/>
-          </w:tcPr>
-          <w:p>
-            <w:pPr>
-              <w:pStyle w:val="Style14"/>
-              <w:spacing w:lineRule="auto" w:line="240" w:before="57" w:after="57"/>
-              <w:ind w:hanging="0"/>
-              <w:rPr>
-                <w:sz w:val="16"/>
-                <w:szCs w:val="16"/>
-              </w:rPr>
-            </w:pPr>
-            <w:r>
-              <w:rPr>
-                <w:sz w:val="16"/>
-                <w:szCs w:val="16"/>
-              </w:rPr>
-            </w:r>
-          </w:p>
-        </w:tc>
-        <w:tc>
-          <w:tcPr>
-            <w:tcW w:w="436" w:type="dxa"/>
-            <w:tcBorders>
-              <w:left w:val="single" w:sz="4" w:space="0" w:color="000000"/>
-              <w:bottom w:val="single" w:sz="4" w:space="0" w:color="000000"/>
-            </w:tcBorders>
-            <w:vAlign w:val="center"/>
-          </w:tcPr>
-          <w:p>
-            <w:pPr>
-              <w:pStyle w:val="Style14"/>
-              <w:spacing w:lineRule="auto" w:line="240" w:before="57" w:after="57"/>
-              <w:ind w:hanging="0"/>
-              <w:rPr>
-                <w:sz w:val="16"/>
-                <w:szCs w:val="16"/>
-              </w:rPr>
-            </w:pPr>
-            <w:r>
-              <w:rPr>
-                <w:sz w:val="16"/>
-                <w:szCs w:val="16"/>
-              </w:rPr>
-            </w:r>
-          </w:p>
-        </w:tc>
-        <w:tc>
-          <w:tcPr>
-            <w:tcW w:w="963" w:type="dxa"/>
+            <w:tcW w:w="437" w:type="dxa"/>
+            <w:tcBorders>
+              <w:left w:val="single" w:sz="4" w:space="0" w:color="000000"/>
+              <w:bottom w:val="single" w:sz="4" w:space="0" w:color="000000"/>
+            </w:tcBorders>
+            <w:vAlign w:val="center"/>
+          </w:tcPr>
+          <w:p>
+            <w:pPr>
+              <w:pStyle w:val="user2"/>
+              <w:spacing w:lineRule="auto" w:line="240" w:before="57" w:after="57"/>
+              <w:ind w:hanging="0"/>
+              <w:rPr>
+                <w:sz w:val="16"/>
+                <w:szCs w:val="16"/>
+              </w:rPr>
+            </w:pPr>
+            <w:r>
+              <w:rPr>
+                <w:sz w:val="16"/>
+                <w:szCs w:val="16"/>
+              </w:rPr>
+            </w:r>
+          </w:p>
+        </w:tc>
+        <w:tc>
+          <w:tcPr>
+            <w:tcW w:w="435" w:type="dxa"/>
+            <w:tcBorders>
+              <w:left w:val="single" w:sz="4" w:space="0" w:color="000000"/>
+              <w:bottom w:val="single" w:sz="4" w:space="0" w:color="000000"/>
+            </w:tcBorders>
+            <w:vAlign w:val="center"/>
+          </w:tcPr>
+          <w:p>
+            <w:pPr>
+              <w:pStyle w:val="user2"/>
+              <w:spacing w:lineRule="auto" w:line="240" w:before="57" w:after="57"/>
+              <w:ind w:hanging="0"/>
+              <w:rPr>
+                <w:sz w:val="16"/>
+                <w:szCs w:val="16"/>
+              </w:rPr>
+            </w:pPr>
+            <w:r>
+              <w:rPr>
+                <w:sz w:val="16"/>
+                <w:szCs w:val="16"/>
+              </w:rPr>
+            </w:r>
+          </w:p>
+        </w:tc>
+        <w:tc>
+          <w:tcPr>
+            <w:tcW w:w="964" w:type="dxa"/>
             <w:tcBorders>
               <w:left w:val="single" w:sz="4" w:space="0" w:color="000000"/>
               <w:bottom w:val="single" w:sz="4" w:space="0" w:color="000000"/>
@@ -5519,7 +5552,7 @@
           </w:tcPr>
           <w:p>
             <w:pPr>
-              <w:pStyle w:val="Style14"/>
+              <w:pStyle w:val="user2"/>
               <w:spacing w:lineRule="auto" w:line="240" w:before="57" w:after="57"/>
               <w:ind w:hanging="0"/>
               <w:rPr>
@@ -5541,16 +5574,16 @@
         <w:trPr/>
         <w:tc>
           <w:tcPr>
-            <w:tcW w:w="516" w:type="dxa"/>
-            <w:tcBorders>
-              <w:left w:val="single" w:sz="4" w:space="0" w:color="000000"/>
-              <w:bottom w:val="single" w:sz="4" w:space="0" w:color="000000"/>
-            </w:tcBorders>
-            <w:vAlign w:val="center"/>
-          </w:tcPr>
-          <w:p>
-            <w:pPr>
-              <w:pStyle w:val="Style14"/>
+            <w:tcW w:w="515" w:type="dxa"/>
+            <w:tcBorders>
+              <w:left w:val="single" w:sz="4" w:space="0" w:color="000000"/>
+              <w:bottom w:val="single" w:sz="4" w:space="0" w:color="000000"/>
+            </w:tcBorders>
+            <w:vAlign w:val="center"/>
+          </w:tcPr>
+          <w:p>
+            <w:pPr>
+              <w:pStyle w:val="user2"/>
               <w:spacing w:lineRule="auto" w:line="240" w:before="57" w:after="57"/>
               <w:ind w:hanging="0"/>
               <w:rPr>
@@ -5578,7 +5611,7 @@
           </w:tcPr>
           <w:p>
             <w:pPr>
-              <w:pStyle w:val="Style14"/>
+              <w:pStyle w:val="user2"/>
               <w:spacing w:lineRule="auto" w:line="240" w:before="57" w:after="57"/>
               <w:ind w:hanging="0"/>
               <w:rPr>
@@ -5606,7 +5639,7 @@
           </w:tcPr>
           <w:p>
             <w:pPr>
-              <w:pStyle w:val="Style14"/>
+              <w:pStyle w:val="user2"/>
               <w:spacing w:lineRule="auto" w:line="240" w:before="57" w:after="57"/>
               <w:ind w:hanging="0"/>
               <w:rPr>
@@ -5625,16 +5658,16 @@
         </w:tc>
         <w:tc>
           <w:tcPr>
-            <w:tcW w:w="436" w:type="dxa"/>
-            <w:tcBorders>
-              <w:left w:val="single" w:sz="4" w:space="0" w:color="000000"/>
-              <w:bottom w:val="single" w:sz="4" w:space="0" w:color="000000"/>
-            </w:tcBorders>
-            <w:vAlign w:val="center"/>
-          </w:tcPr>
-          <w:p>
-            <w:pPr>
-              <w:pStyle w:val="Style14"/>
+            <w:tcW w:w="437" w:type="dxa"/>
+            <w:tcBorders>
+              <w:left w:val="single" w:sz="4" w:space="0" w:color="000000"/>
+              <w:bottom w:val="single" w:sz="4" w:space="0" w:color="000000"/>
+            </w:tcBorders>
+            <w:vAlign w:val="center"/>
+          </w:tcPr>
+          <w:p>
+            <w:pPr>
+              <w:pStyle w:val="user2"/>
               <w:spacing w:lineRule="auto" w:line="240" w:before="57" w:after="57"/>
               <w:ind w:hanging="0"/>
               <w:rPr>
@@ -5653,16 +5686,16 @@
         </w:tc>
         <w:tc>
           <w:tcPr>
-            <w:tcW w:w="436" w:type="dxa"/>
-            <w:tcBorders>
-              <w:left w:val="single" w:sz="4" w:space="0" w:color="000000"/>
-              <w:bottom w:val="single" w:sz="4" w:space="0" w:color="000000"/>
-            </w:tcBorders>
-            <w:vAlign w:val="center"/>
-          </w:tcPr>
-          <w:p>
-            <w:pPr>
-              <w:pStyle w:val="Style14"/>
+            <w:tcW w:w="435" w:type="dxa"/>
+            <w:tcBorders>
+              <w:left w:val="single" w:sz="4" w:space="0" w:color="000000"/>
+              <w:bottom w:val="single" w:sz="4" w:space="0" w:color="000000"/>
+            </w:tcBorders>
+            <w:vAlign w:val="center"/>
+          </w:tcPr>
+          <w:p>
+            <w:pPr>
+              <w:pStyle w:val="user2"/>
               <w:spacing w:lineRule="auto" w:line="240" w:before="57" w:after="57"/>
               <w:ind w:hanging="0"/>
               <w:rPr>
@@ -5681,61 +5714,61 @@
         </w:tc>
         <w:tc>
           <w:tcPr>
-            <w:tcW w:w="436" w:type="dxa"/>
-            <w:tcBorders>
-              <w:left w:val="single" w:sz="4" w:space="0" w:color="000000"/>
-              <w:bottom w:val="single" w:sz="4" w:space="0" w:color="000000"/>
-            </w:tcBorders>
-            <w:vAlign w:val="center"/>
-          </w:tcPr>
-          <w:p>
-            <w:pPr>
-              <w:pStyle w:val="Style14"/>
-              <w:spacing w:lineRule="auto" w:line="240" w:before="57" w:after="57"/>
-              <w:ind w:hanging="0"/>
-              <w:rPr>
-                <w:sz w:val="16"/>
-                <w:szCs w:val="16"/>
-              </w:rPr>
-            </w:pPr>
-            <w:r>
-              <w:rPr>
-                <w:sz w:val="16"/>
-                <w:szCs w:val="16"/>
-              </w:rPr>
-            </w:r>
-          </w:p>
-        </w:tc>
-        <w:tc>
-          <w:tcPr>
-            <w:tcW w:w="436" w:type="dxa"/>
-            <w:tcBorders>
-              <w:left w:val="single" w:sz="4" w:space="0" w:color="000000"/>
-              <w:bottom w:val="single" w:sz="4" w:space="0" w:color="000000"/>
-            </w:tcBorders>
-            <w:vAlign w:val="center"/>
-          </w:tcPr>
-          <w:p>
-            <w:pPr>
-              <w:pStyle w:val="Style14"/>
-              <w:spacing w:lineRule="auto" w:line="240" w:before="57" w:after="57"/>
-              <w:ind w:hanging="0"/>
-              <w:rPr>
-                <w:sz w:val="16"/>
-                <w:szCs w:val="16"/>
-              </w:rPr>
-            </w:pPr>
-            <w:r>
-              <w:rPr>
-                <w:sz w:val="16"/>
-                <w:szCs w:val="16"/>
-              </w:rPr>
-            </w:r>
-          </w:p>
-        </w:tc>
-        <w:tc>
-          <w:tcPr>
-            <w:tcW w:w="963" w:type="dxa"/>
+            <w:tcW w:w="437" w:type="dxa"/>
+            <w:tcBorders>
+              <w:left w:val="single" w:sz="4" w:space="0" w:color="000000"/>
+              <w:bottom w:val="single" w:sz="4" w:space="0" w:color="000000"/>
+            </w:tcBorders>
+            <w:vAlign w:val="center"/>
+          </w:tcPr>
+          <w:p>
+            <w:pPr>
+              <w:pStyle w:val="user2"/>
+              <w:spacing w:lineRule="auto" w:line="240" w:before="57" w:after="57"/>
+              <w:ind w:hanging="0"/>
+              <w:rPr>
+                <w:sz w:val="16"/>
+                <w:szCs w:val="16"/>
+              </w:rPr>
+            </w:pPr>
+            <w:r>
+              <w:rPr>
+                <w:sz w:val="16"/>
+                <w:szCs w:val="16"/>
+              </w:rPr>
+            </w:r>
+          </w:p>
+        </w:tc>
+        <w:tc>
+          <w:tcPr>
+            <w:tcW w:w="435" w:type="dxa"/>
+            <w:tcBorders>
+              <w:left w:val="single" w:sz="4" w:space="0" w:color="000000"/>
+              <w:bottom w:val="single" w:sz="4" w:space="0" w:color="000000"/>
+            </w:tcBorders>
+            <w:vAlign w:val="center"/>
+          </w:tcPr>
+          <w:p>
+            <w:pPr>
+              <w:pStyle w:val="user2"/>
+              <w:spacing w:lineRule="auto" w:line="240" w:before="57" w:after="57"/>
+              <w:ind w:hanging="0"/>
+              <w:rPr>
+                <w:sz w:val="16"/>
+                <w:szCs w:val="16"/>
+              </w:rPr>
+            </w:pPr>
+            <w:r>
+              <w:rPr>
+                <w:sz w:val="16"/>
+                <w:szCs w:val="16"/>
+              </w:rPr>
+            </w:r>
+          </w:p>
+        </w:tc>
+        <w:tc>
+          <w:tcPr>
+            <w:tcW w:w="964" w:type="dxa"/>
             <w:tcBorders>
               <w:left w:val="single" w:sz="4" w:space="0" w:color="000000"/>
               <w:bottom w:val="single" w:sz="4" w:space="0" w:color="000000"/>
@@ -5745,7 +5778,7 @@
           </w:tcPr>
           <w:p>
             <w:pPr>
-              <w:pStyle w:val="Style14"/>
+              <w:pStyle w:val="user2"/>
               <w:spacing w:lineRule="auto" w:line="240" w:before="57" w:after="57"/>
               <w:ind w:hanging="0"/>
               <w:rPr>
@@ -5767,16 +5800,16 @@
         <w:trPr/>
         <w:tc>
           <w:tcPr>
-            <w:tcW w:w="516" w:type="dxa"/>
-            <w:tcBorders>
-              <w:left w:val="single" w:sz="4" w:space="0" w:color="000000"/>
-              <w:bottom w:val="single" w:sz="4" w:space="0" w:color="000000"/>
-            </w:tcBorders>
-            <w:vAlign w:val="center"/>
-          </w:tcPr>
-          <w:p>
-            <w:pPr>
-              <w:pStyle w:val="Style14"/>
+            <w:tcW w:w="515" w:type="dxa"/>
+            <w:tcBorders>
+              <w:left w:val="single" w:sz="4" w:space="0" w:color="000000"/>
+              <w:bottom w:val="single" w:sz="4" w:space="0" w:color="000000"/>
+            </w:tcBorders>
+            <w:vAlign w:val="center"/>
+          </w:tcPr>
+          <w:p>
+            <w:pPr>
+              <w:pStyle w:val="user2"/>
               <w:spacing w:lineRule="auto" w:line="240" w:before="57" w:after="57"/>
               <w:ind w:hanging="0"/>
               <w:rPr>
@@ -5804,7 +5837,7 @@
           </w:tcPr>
           <w:p>
             <w:pPr>
-              <w:pStyle w:val="Style14"/>
+              <w:pStyle w:val="user2"/>
               <w:spacing w:lineRule="auto" w:line="240" w:before="57" w:after="57"/>
               <w:ind w:hanging="0"/>
               <w:rPr>
@@ -5832,61 +5865,61 @@
           </w:tcPr>
           <w:p>
             <w:pPr>
-              <w:pStyle w:val="Style14"/>
-              <w:spacing w:lineRule="auto" w:line="240" w:before="57" w:after="57"/>
-              <w:ind w:hanging="0"/>
-              <w:rPr>
-                <w:sz w:val="16"/>
-                <w:szCs w:val="16"/>
-              </w:rPr>
-            </w:pPr>
-            <w:r>
-              <w:rPr>
-                <w:sz w:val="16"/>
-                <w:szCs w:val="16"/>
-              </w:rPr>
-            </w:r>
-          </w:p>
-        </w:tc>
-        <w:tc>
-          <w:tcPr>
-            <w:tcW w:w="436" w:type="dxa"/>
-            <w:tcBorders>
-              <w:left w:val="single" w:sz="4" w:space="0" w:color="000000"/>
-              <w:bottom w:val="single" w:sz="4" w:space="0" w:color="000000"/>
-            </w:tcBorders>
-            <w:vAlign w:val="center"/>
-          </w:tcPr>
-          <w:p>
-            <w:pPr>
-              <w:pStyle w:val="Style14"/>
-              <w:spacing w:lineRule="auto" w:line="240" w:before="57" w:after="57"/>
-              <w:ind w:hanging="0"/>
-              <w:rPr>
-                <w:sz w:val="16"/>
-                <w:szCs w:val="16"/>
-              </w:rPr>
-            </w:pPr>
-            <w:r>
-              <w:rPr>
-                <w:sz w:val="16"/>
-                <w:szCs w:val="16"/>
-              </w:rPr>
-            </w:r>
-          </w:p>
-        </w:tc>
-        <w:tc>
-          <w:tcPr>
-            <w:tcW w:w="436" w:type="dxa"/>
-            <w:tcBorders>
-              <w:left w:val="single" w:sz="4" w:space="0" w:color="000000"/>
-              <w:bottom w:val="single" w:sz="4" w:space="0" w:color="000000"/>
-            </w:tcBorders>
-            <w:vAlign w:val="center"/>
-          </w:tcPr>
-          <w:p>
-            <w:pPr>
-              <w:pStyle w:val="Style14"/>
+              <w:pStyle w:val="user2"/>
+              <w:spacing w:lineRule="auto" w:line="240" w:before="57" w:after="57"/>
+              <w:ind w:hanging="0"/>
+              <w:rPr>
+                <w:sz w:val="16"/>
+                <w:szCs w:val="16"/>
+              </w:rPr>
+            </w:pPr>
+            <w:r>
+              <w:rPr>
+                <w:sz w:val="16"/>
+                <w:szCs w:val="16"/>
+              </w:rPr>
+            </w:r>
+          </w:p>
+        </w:tc>
+        <w:tc>
+          <w:tcPr>
+            <w:tcW w:w="437" w:type="dxa"/>
+            <w:tcBorders>
+              <w:left w:val="single" w:sz="4" w:space="0" w:color="000000"/>
+              <w:bottom w:val="single" w:sz="4" w:space="0" w:color="000000"/>
+            </w:tcBorders>
+            <w:vAlign w:val="center"/>
+          </w:tcPr>
+          <w:p>
+            <w:pPr>
+              <w:pStyle w:val="user2"/>
+              <w:spacing w:lineRule="auto" w:line="240" w:before="57" w:after="57"/>
+              <w:ind w:hanging="0"/>
+              <w:rPr>
+                <w:sz w:val="16"/>
+                <w:szCs w:val="16"/>
+              </w:rPr>
+            </w:pPr>
+            <w:r>
+              <w:rPr>
+                <w:sz w:val="16"/>
+                <w:szCs w:val="16"/>
+              </w:rPr>
+            </w:r>
+          </w:p>
+        </w:tc>
+        <w:tc>
+          <w:tcPr>
+            <w:tcW w:w="435" w:type="dxa"/>
+            <w:tcBorders>
+              <w:left w:val="single" w:sz="4" w:space="0" w:color="000000"/>
+              <w:bottom w:val="single" w:sz="4" w:space="0" w:color="000000"/>
+            </w:tcBorders>
+            <w:vAlign w:val="center"/>
+          </w:tcPr>
+          <w:p>
+            <w:pPr>
+              <w:pStyle w:val="user2"/>
               <w:spacing w:lineRule="auto" w:line="240" w:before="57" w:after="57"/>
               <w:ind w:hanging="0"/>
               <w:rPr>
@@ -5905,61 +5938,61 @@
         </w:tc>
         <w:tc>
           <w:tcPr>
-            <w:tcW w:w="436" w:type="dxa"/>
-            <w:tcBorders>
-              <w:left w:val="single" w:sz="4" w:space="0" w:color="000000"/>
-              <w:bottom w:val="single" w:sz="4" w:space="0" w:color="000000"/>
-            </w:tcBorders>
-            <w:vAlign w:val="center"/>
-          </w:tcPr>
-          <w:p>
-            <w:pPr>
-              <w:pStyle w:val="Style14"/>
-              <w:spacing w:lineRule="auto" w:line="240" w:before="57" w:after="57"/>
-              <w:ind w:hanging="0"/>
-              <w:rPr>
-                <w:sz w:val="16"/>
-                <w:szCs w:val="16"/>
-              </w:rPr>
-            </w:pPr>
-            <w:r>
-              <w:rPr>
-                <w:sz w:val="16"/>
-                <w:szCs w:val="16"/>
-              </w:rPr>
-            </w:r>
-          </w:p>
-        </w:tc>
-        <w:tc>
-          <w:tcPr>
-            <w:tcW w:w="436" w:type="dxa"/>
-            <w:tcBorders>
-              <w:left w:val="single" w:sz="4" w:space="0" w:color="000000"/>
-              <w:bottom w:val="single" w:sz="4" w:space="0" w:color="000000"/>
-            </w:tcBorders>
-            <w:vAlign w:val="center"/>
-          </w:tcPr>
-          <w:p>
-            <w:pPr>
-              <w:pStyle w:val="Style14"/>
-              <w:spacing w:lineRule="auto" w:line="240" w:before="57" w:after="57"/>
-              <w:ind w:hanging="0"/>
-              <w:rPr>
-                <w:sz w:val="16"/>
-                <w:szCs w:val="16"/>
-              </w:rPr>
-            </w:pPr>
-            <w:r>
-              <w:rPr>
-                <w:sz w:val="16"/>
-                <w:szCs w:val="16"/>
-              </w:rPr>
-            </w:r>
-          </w:p>
-        </w:tc>
-        <w:tc>
-          <w:tcPr>
-            <w:tcW w:w="963" w:type="dxa"/>
+            <w:tcW w:w="437" w:type="dxa"/>
+            <w:tcBorders>
+              <w:left w:val="single" w:sz="4" w:space="0" w:color="000000"/>
+              <w:bottom w:val="single" w:sz="4" w:space="0" w:color="000000"/>
+            </w:tcBorders>
+            <w:vAlign w:val="center"/>
+          </w:tcPr>
+          <w:p>
+            <w:pPr>
+              <w:pStyle w:val="user2"/>
+              <w:spacing w:lineRule="auto" w:line="240" w:before="57" w:after="57"/>
+              <w:ind w:hanging="0"/>
+              <w:rPr>
+                <w:sz w:val="16"/>
+                <w:szCs w:val="16"/>
+              </w:rPr>
+            </w:pPr>
+            <w:r>
+              <w:rPr>
+                <w:sz w:val="16"/>
+                <w:szCs w:val="16"/>
+              </w:rPr>
+            </w:r>
+          </w:p>
+        </w:tc>
+        <w:tc>
+          <w:tcPr>
+            <w:tcW w:w="435" w:type="dxa"/>
+            <w:tcBorders>
+              <w:left w:val="single" w:sz="4" w:space="0" w:color="000000"/>
+              <w:bottom w:val="single" w:sz="4" w:space="0" w:color="000000"/>
+            </w:tcBorders>
+            <w:vAlign w:val="center"/>
+          </w:tcPr>
+          <w:p>
+            <w:pPr>
+              <w:pStyle w:val="user2"/>
+              <w:spacing w:lineRule="auto" w:line="240" w:before="57" w:after="57"/>
+              <w:ind w:hanging="0"/>
+              <w:rPr>
+                <w:sz w:val="16"/>
+                <w:szCs w:val="16"/>
+              </w:rPr>
+            </w:pPr>
+            <w:r>
+              <w:rPr>
+                <w:sz w:val="16"/>
+                <w:szCs w:val="16"/>
+              </w:rPr>
+            </w:r>
+          </w:p>
+        </w:tc>
+        <w:tc>
+          <w:tcPr>
+            <w:tcW w:w="964" w:type="dxa"/>
             <w:tcBorders>
               <w:left w:val="single" w:sz="4" w:space="0" w:color="000000"/>
               <w:bottom w:val="single" w:sz="4" w:space="0" w:color="000000"/>
@@ -5969,7 +6002,7 @@
           </w:tcPr>
           <w:p>
             <w:pPr>
-              <w:pStyle w:val="Style14"/>
+              <w:pStyle w:val="user2"/>
               <w:spacing w:lineRule="auto" w:line="240" w:before="57" w:after="57"/>
               <w:ind w:hanging="0"/>
               <w:rPr>
@@ -5990,16 +6023,16 @@
         <w:trPr/>
         <w:tc>
           <w:tcPr>
-            <w:tcW w:w="516" w:type="dxa"/>
-            <w:tcBorders>
-              <w:left w:val="single" w:sz="4" w:space="0" w:color="000000"/>
-              <w:bottom w:val="single" w:sz="4" w:space="0" w:color="000000"/>
-            </w:tcBorders>
-            <w:vAlign w:val="center"/>
-          </w:tcPr>
-          <w:p>
-            <w:pPr>
-              <w:pStyle w:val="Style14"/>
+            <w:tcW w:w="515" w:type="dxa"/>
+            <w:tcBorders>
+              <w:left w:val="single" w:sz="4" w:space="0" w:color="000000"/>
+              <w:bottom w:val="single" w:sz="4" w:space="0" w:color="000000"/>
+            </w:tcBorders>
+            <w:vAlign w:val="center"/>
+          </w:tcPr>
+          <w:p>
+            <w:pPr>
+              <w:pStyle w:val="user2"/>
               <w:spacing w:lineRule="auto" w:line="240" w:before="57" w:after="57"/>
               <w:ind w:hanging="0"/>
               <w:rPr>
@@ -6027,7 +6060,7 @@
           </w:tcPr>
           <w:p>
             <w:pPr>
-              <w:pStyle w:val="Style14"/>
+              <w:pStyle w:val="user2"/>
               <w:spacing w:lineRule="auto" w:line="240" w:before="57" w:after="57"/>
               <w:ind w:hanging="0"/>
               <w:rPr>
@@ -6055,61 +6088,61 @@
           </w:tcPr>
           <w:p>
             <w:pPr>
-              <w:pStyle w:val="Style14"/>
-              <w:spacing w:lineRule="auto" w:line="240" w:before="57" w:after="57"/>
-              <w:ind w:hanging="0"/>
-              <w:rPr>
-                <w:sz w:val="16"/>
-                <w:szCs w:val="16"/>
-              </w:rPr>
-            </w:pPr>
-            <w:r>
-              <w:rPr>
-                <w:sz w:val="16"/>
-                <w:szCs w:val="16"/>
-              </w:rPr>
-            </w:r>
-          </w:p>
-        </w:tc>
-        <w:tc>
-          <w:tcPr>
-            <w:tcW w:w="436" w:type="dxa"/>
-            <w:tcBorders>
-              <w:left w:val="single" w:sz="4" w:space="0" w:color="000000"/>
-              <w:bottom w:val="single" w:sz="4" w:space="0" w:color="000000"/>
-            </w:tcBorders>
-            <w:vAlign w:val="center"/>
-          </w:tcPr>
-          <w:p>
-            <w:pPr>
-              <w:pStyle w:val="Style14"/>
-              <w:spacing w:lineRule="auto" w:line="240" w:before="57" w:after="57"/>
-              <w:ind w:hanging="0"/>
-              <w:rPr>
-                <w:sz w:val="16"/>
-                <w:szCs w:val="16"/>
-              </w:rPr>
-            </w:pPr>
-            <w:r>
-              <w:rPr>
-                <w:sz w:val="16"/>
-                <w:szCs w:val="16"/>
-              </w:rPr>
-            </w:r>
-          </w:p>
-        </w:tc>
-        <w:tc>
-          <w:tcPr>
-            <w:tcW w:w="436" w:type="dxa"/>
-            <w:tcBorders>
-              <w:left w:val="single" w:sz="4" w:space="0" w:color="000000"/>
-              <w:bottom w:val="single" w:sz="4" w:space="0" w:color="000000"/>
-            </w:tcBorders>
-            <w:vAlign w:val="center"/>
-          </w:tcPr>
-          <w:p>
-            <w:pPr>
-              <w:pStyle w:val="Style14"/>
+              <w:pStyle w:val="user2"/>
+              <w:spacing w:lineRule="auto" w:line="240" w:before="57" w:after="57"/>
+              <w:ind w:hanging="0"/>
+              <w:rPr>
+                <w:sz w:val="16"/>
+                <w:szCs w:val="16"/>
+              </w:rPr>
+            </w:pPr>
+            <w:r>
+              <w:rPr>
+                <w:sz w:val="16"/>
+                <w:szCs w:val="16"/>
+              </w:rPr>
+            </w:r>
+          </w:p>
+        </w:tc>
+        <w:tc>
+          <w:tcPr>
+            <w:tcW w:w="437" w:type="dxa"/>
+            <w:tcBorders>
+              <w:left w:val="single" w:sz="4" w:space="0" w:color="000000"/>
+              <w:bottom w:val="single" w:sz="4" w:space="0" w:color="000000"/>
+            </w:tcBorders>
+            <w:vAlign w:val="center"/>
+          </w:tcPr>
+          <w:p>
+            <w:pPr>
+              <w:pStyle w:val="user2"/>
+              <w:spacing w:lineRule="auto" w:line="240" w:before="57" w:after="57"/>
+              <w:ind w:hanging="0"/>
+              <w:rPr>
+                <w:sz w:val="16"/>
+                <w:szCs w:val="16"/>
+              </w:rPr>
+            </w:pPr>
+            <w:r>
+              <w:rPr>
+                <w:sz w:val="16"/>
+                <w:szCs w:val="16"/>
+              </w:rPr>
+            </w:r>
+          </w:p>
+        </w:tc>
+        <w:tc>
+          <w:tcPr>
+            <w:tcW w:w="435" w:type="dxa"/>
+            <w:tcBorders>
+              <w:left w:val="single" w:sz="4" w:space="0" w:color="000000"/>
+              <w:bottom w:val="single" w:sz="4" w:space="0" w:color="000000"/>
+            </w:tcBorders>
+            <w:vAlign w:val="center"/>
+          </w:tcPr>
+          <w:p>
+            <w:pPr>
+              <w:pStyle w:val="user2"/>
               <w:spacing w:lineRule="auto" w:line="240" w:before="57" w:after="57"/>
               <w:ind w:hanging="0"/>
               <w:rPr>
@@ -6128,61 +6161,61 @@
         </w:tc>
         <w:tc>
           <w:tcPr>
-            <w:tcW w:w="436" w:type="dxa"/>
-            <w:tcBorders>
-              <w:left w:val="single" w:sz="4" w:space="0" w:color="000000"/>
-              <w:bottom w:val="single" w:sz="4" w:space="0" w:color="000000"/>
-            </w:tcBorders>
-            <w:vAlign w:val="center"/>
-          </w:tcPr>
-          <w:p>
-            <w:pPr>
-              <w:pStyle w:val="Style14"/>
-              <w:spacing w:lineRule="auto" w:line="240" w:before="57" w:after="57"/>
-              <w:ind w:hanging="0"/>
-              <w:rPr>
-                <w:sz w:val="16"/>
-                <w:szCs w:val="16"/>
-              </w:rPr>
-            </w:pPr>
-            <w:r>
-              <w:rPr>
-                <w:sz w:val="16"/>
-                <w:szCs w:val="16"/>
-              </w:rPr>
-            </w:r>
-          </w:p>
-        </w:tc>
-        <w:tc>
-          <w:tcPr>
-            <w:tcW w:w="436" w:type="dxa"/>
-            <w:tcBorders>
-              <w:left w:val="single" w:sz="4" w:space="0" w:color="000000"/>
-              <w:bottom w:val="single" w:sz="4" w:space="0" w:color="000000"/>
-            </w:tcBorders>
-            <w:vAlign w:val="center"/>
-          </w:tcPr>
-          <w:p>
-            <w:pPr>
-              <w:pStyle w:val="Style14"/>
-              <w:spacing w:lineRule="auto" w:line="240" w:before="57" w:after="57"/>
-              <w:ind w:hanging="0"/>
-              <w:rPr>
-                <w:sz w:val="16"/>
-                <w:szCs w:val="16"/>
-              </w:rPr>
-            </w:pPr>
-            <w:r>
-              <w:rPr>
-                <w:sz w:val="16"/>
-                <w:szCs w:val="16"/>
-              </w:rPr>
-            </w:r>
-          </w:p>
-        </w:tc>
-        <w:tc>
-          <w:tcPr>
-            <w:tcW w:w="963" w:type="dxa"/>
+            <w:tcW w:w="437" w:type="dxa"/>
+            <w:tcBorders>
+              <w:left w:val="single" w:sz="4" w:space="0" w:color="000000"/>
+              <w:bottom w:val="single" w:sz="4" w:space="0" w:color="000000"/>
+            </w:tcBorders>
+            <w:vAlign w:val="center"/>
+          </w:tcPr>
+          <w:p>
+            <w:pPr>
+              <w:pStyle w:val="user2"/>
+              <w:spacing w:lineRule="auto" w:line="240" w:before="57" w:after="57"/>
+              <w:ind w:hanging="0"/>
+              <w:rPr>
+                <w:sz w:val="16"/>
+                <w:szCs w:val="16"/>
+              </w:rPr>
+            </w:pPr>
+            <w:r>
+              <w:rPr>
+                <w:sz w:val="16"/>
+                <w:szCs w:val="16"/>
+              </w:rPr>
+            </w:r>
+          </w:p>
+        </w:tc>
+        <w:tc>
+          <w:tcPr>
+            <w:tcW w:w="435" w:type="dxa"/>
+            <w:tcBorders>
+              <w:left w:val="single" w:sz="4" w:space="0" w:color="000000"/>
+              <w:bottom w:val="single" w:sz="4" w:space="0" w:color="000000"/>
+            </w:tcBorders>
+            <w:vAlign w:val="center"/>
+          </w:tcPr>
+          <w:p>
+            <w:pPr>
+              <w:pStyle w:val="user2"/>
+              <w:spacing w:lineRule="auto" w:line="240" w:before="57" w:after="57"/>
+              <w:ind w:hanging="0"/>
+              <w:rPr>
+                <w:sz w:val="16"/>
+                <w:szCs w:val="16"/>
+              </w:rPr>
+            </w:pPr>
+            <w:r>
+              <w:rPr>
+                <w:sz w:val="16"/>
+                <w:szCs w:val="16"/>
+              </w:rPr>
+            </w:r>
+          </w:p>
+        </w:tc>
+        <w:tc>
+          <w:tcPr>
+            <w:tcW w:w="964" w:type="dxa"/>
             <w:tcBorders>
               <w:left w:val="single" w:sz="4" w:space="0" w:color="000000"/>
               <w:bottom w:val="single" w:sz="4" w:space="0" w:color="000000"/>
@@ -6192,7 +6225,7 @@
           </w:tcPr>
           <w:p>
             <w:pPr>
-              <w:pStyle w:val="Style14"/>
+              <w:pStyle w:val="user2"/>
               <w:spacing w:lineRule="auto" w:line="240" w:before="57" w:after="57"/>
               <w:ind w:hanging="0"/>
               <w:rPr>
@@ -6213,16 +6246,16 @@
         <w:trPr/>
         <w:tc>
           <w:tcPr>
-            <w:tcW w:w="516" w:type="dxa"/>
-            <w:tcBorders>
-              <w:left w:val="single" w:sz="4" w:space="0" w:color="000000"/>
-              <w:bottom w:val="single" w:sz="4" w:space="0" w:color="000000"/>
-            </w:tcBorders>
-            <w:vAlign w:val="center"/>
-          </w:tcPr>
-          <w:p>
-            <w:pPr>
-              <w:pStyle w:val="Style14"/>
+            <w:tcW w:w="515" w:type="dxa"/>
+            <w:tcBorders>
+              <w:left w:val="single" w:sz="4" w:space="0" w:color="000000"/>
+              <w:bottom w:val="single" w:sz="4" w:space="0" w:color="000000"/>
+            </w:tcBorders>
+            <w:vAlign w:val="center"/>
+          </w:tcPr>
+          <w:p>
+            <w:pPr>
+              <w:pStyle w:val="user2"/>
               <w:spacing w:lineRule="auto" w:line="240" w:before="57" w:after="57"/>
               <w:ind w:hanging="0"/>
               <w:rPr>
@@ -6250,7 +6283,7 @@
           </w:tcPr>
           <w:p>
             <w:pPr>
-              <w:pStyle w:val="Style14"/>
+              <w:pStyle w:val="user2"/>
               <w:spacing w:lineRule="auto" w:line="240" w:before="57" w:after="57"/>
               <w:ind w:hanging="0"/>
               <w:rPr>
@@ -6278,61 +6311,61 @@
           </w:tcPr>
           <w:p>
             <w:pPr>
-              <w:pStyle w:val="Style14"/>
-              <w:spacing w:lineRule="auto" w:line="240" w:before="57" w:after="57"/>
-              <w:ind w:hanging="0"/>
-              <w:rPr>
-                <w:sz w:val="16"/>
-                <w:szCs w:val="16"/>
-              </w:rPr>
-            </w:pPr>
-            <w:r>
-              <w:rPr>
-                <w:sz w:val="16"/>
-                <w:szCs w:val="16"/>
-              </w:rPr>
-            </w:r>
-          </w:p>
-        </w:tc>
-        <w:tc>
-          <w:tcPr>
-            <w:tcW w:w="436" w:type="dxa"/>
-            <w:tcBorders>
-              <w:left w:val="single" w:sz="4" w:space="0" w:color="000000"/>
-              <w:bottom w:val="single" w:sz="4" w:space="0" w:color="000000"/>
-            </w:tcBorders>
-            <w:vAlign w:val="center"/>
-          </w:tcPr>
-          <w:p>
-            <w:pPr>
-              <w:pStyle w:val="Style14"/>
-              <w:spacing w:lineRule="auto" w:line="240" w:before="57" w:after="57"/>
-              <w:ind w:hanging="0"/>
-              <w:rPr>
-                <w:sz w:val="16"/>
-                <w:szCs w:val="16"/>
-              </w:rPr>
-            </w:pPr>
-            <w:r>
-              <w:rPr>
-                <w:sz w:val="16"/>
-                <w:szCs w:val="16"/>
-              </w:rPr>
-            </w:r>
-          </w:p>
-        </w:tc>
-        <w:tc>
-          <w:tcPr>
-            <w:tcW w:w="436" w:type="dxa"/>
-            <w:tcBorders>
-              <w:left w:val="single" w:sz="4" w:space="0" w:color="000000"/>
-              <w:bottom w:val="single" w:sz="4" w:space="0" w:color="000000"/>
-            </w:tcBorders>
-            <w:vAlign w:val="center"/>
-          </w:tcPr>
-          <w:p>
-            <w:pPr>
-              <w:pStyle w:val="Style14"/>
+              <w:pStyle w:val="user2"/>
+              <w:spacing w:lineRule="auto" w:line="240" w:before="57" w:after="57"/>
+              <w:ind w:hanging="0"/>
+              <w:rPr>
+                <w:sz w:val="16"/>
+                <w:szCs w:val="16"/>
+              </w:rPr>
+            </w:pPr>
+            <w:r>
+              <w:rPr>
+                <w:sz w:val="16"/>
+                <w:szCs w:val="16"/>
+              </w:rPr>
+            </w:r>
+          </w:p>
+        </w:tc>
+        <w:tc>
+          <w:tcPr>
+            <w:tcW w:w="437" w:type="dxa"/>
+            <w:tcBorders>
+              <w:left w:val="single" w:sz="4" w:space="0" w:color="000000"/>
+              <w:bottom w:val="single" w:sz="4" w:space="0" w:color="000000"/>
+            </w:tcBorders>
+            <w:vAlign w:val="center"/>
+          </w:tcPr>
+          <w:p>
+            <w:pPr>
+              <w:pStyle w:val="user2"/>
+              <w:spacing w:lineRule="auto" w:line="240" w:before="57" w:after="57"/>
+              <w:ind w:hanging="0"/>
+              <w:rPr>
+                <w:sz w:val="16"/>
+                <w:szCs w:val="16"/>
+              </w:rPr>
+            </w:pPr>
+            <w:r>
+              <w:rPr>
+                <w:sz w:val="16"/>
+                <w:szCs w:val="16"/>
+              </w:rPr>
+            </w:r>
+          </w:p>
+        </w:tc>
+        <w:tc>
+          <w:tcPr>
+            <w:tcW w:w="435" w:type="dxa"/>
+            <w:tcBorders>
+              <w:left w:val="single" w:sz="4" w:space="0" w:color="000000"/>
+              <w:bottom w:val="single" w:sz="4" w:space="0" w:color="000000"/>
+            </w:tcBorders>
+            <w:vAlign w:val="center"/>
+          </w:tcPr>
+          <w:p>
+            <w:pPr>
+              <w:pStyle w:val="user2"/>
               <w:spacing w:lineRule="auto" w:line="240" w:before="57" w:after="57"/>
               <w:ind w:hanging="0"/>
               <w:rPr>
@@ -6351,61 +6384,61 @@
         </w:tc>
         <w:tc>
           <w:tcPr>
-            <w:tcW w:w="436" w:type="dxa"/>
-            <w:tcBorders>
-              <w:left w:val="single" w:sz="4" w:space="0" w:color="000000"/>
-              <w:bottom w:val="single" w:sz="4" w:space="0" w:color="000000"/>
-            </w:tcBorders>
-            <w:vAlign w:val="center"/>
-          </w:tcPr>
-          <w:p>
-            <w:pPr>
-              <w:pStyle w:val="Style14"/>
-              <w:spacing w:lineRule="auto" w:line="240" w:before="57" w:after="57"/>
-              <w:ind w:hanging="0"/>
-              <w:rPr>
-                <w:sz w:val="16"/>
-                <w:szCs w:val="16"/>
-              </w:rPr>
-            </w:pPr>
-            <w:r>
-              <w:rPr>
-                <w:sz w:val="16"/>
-                <w:szCs w:val="16"/>
-              </w:rPr>
-            </w:r>
-          </w:p>
-        </w:tc>
-        <w:tc>
-          <w:tcPr>
-            <w:tcW w:w="436" w:type="dxa"/>
-            <w:tcBorders>
-              <w:left w:val="single" w:sz="4" w:space="0" w:color="000000"/>
-              <w:bottom w:val="single" w:sz="4" w:space="0" w:color="000000"/>
-            </w:tcBorders>
-            <w:vAlign w:val="center"/>
-          </w:tcPr>
-          <w:p>
-            <w:pPr>
-              <w:pStyle w:val="Style14"/>
-              <w:spacing w:lineRule="auto" w:line="240" w:before="57" w:after="57"/>
-              <w:ind w:hanging="0"/>
-              <w:rPr>
-                <w:sz w:val="16"/>
-                <w:szCs w:val="16"/>
-              </w:rPr>
-            </w:pPr>
-            <w:r>
-              <w:rPr>
-                <w:sz w:val="16"/>
-                <w:szCs w:val="16"/>
-              </w:rPr>
-            </w:r>
-          </w:p>
-        </w:tc>
-        <w:tc>
-          <w:tcPr>
-            <w:tcW w:w="963" w:type="dxa"/>
+            <w:tcW w:w="437" w:type="dxa"/>
+            <w:tcBorders>
+              <w:left w:val="single" w:sz="4" w:space="0" w:color="000000"/>
+              <w:bottom w:val="single" w:sz="4" w:space="0" w:color="000000"/>
+            </w:tcBorders>
+            <w:vAlign w:val="center"/>
+          </w:tcPr>
+          <w:p>
+            <w:pPr>
+              <w:pStyle w:val="user2"/>
+              <w:spacing w:lineRule="auto" w:line="240" w:before="57" w:after="57"/>
+              <w:ind w:hanging="0"/>
+              <w:rPr>
+                <w:sz w:val="16"/>
+                <w:szCs w:val="16"/>
+              </w:rPr>
+            </w:pPr>
+            <w:r>
+              <w:rPr>
+                <w:sz w:val="16"/>
+                <w:szCs w:val="16"/>
+              </w:rPr>
+            </w:r>
+          </w:p>
+        </w:tc>
+        <w:tc>
+          <w:tcPr>
+            <w:tcW w:w="435" w:type="dxa"/>
+            <w:tcBorders>
+              <w:left w:val="single" w:sz="4" w:space="0" w:color="000000"/>
+              <w:bottom w:val="single" w:sz="4" w:space="0" w:color="000000"/>
+            </w:tcBorders>
+            <w:vAlign w:val="center"/>
+          </w:tcPr>
+          <w:p>
+            <w:pPr>
+              <w:pStyle w:val="user2"/>
+              <w:spacing w:lineRule="auto" w:line="240" w:before="57" w:after="57"/>
+              <w:ind w:hanging="0"/>
+              <w:rPr>
+                <w:sz w:val="16"/>
+                <w:szCs w:val="16"/>
+              </w:rPr>
+            </w:pPr>
+            <w:r>
+              <w:rPr>
+                <w:sz w:val="16"/>
+                <w:szCs w:val="16"/>
+              </w:rPr>
+            </w:r>
+          </w:p>
+        </w:tc>
+        <w:tc>
+          <w:tcPr>
+            <w:tcW w:w="964" w:type="dxa"/>
             <w:tcBorders>
               <w:left w:val="single" w:sz="4" w:space="0" w:color="000000"/>
               <w:bottom w:val="single" w:sz="4" w:space="0" w:color="000000"/>
@@ -6415,7 +6448,7 @@
           </w:tcPr>
           <w:p>
             <w:pPr>
-              <w:pStyle w:val="Style14"/>
+              <w:pStyle w:val="user2"/>
               <w:spacing w:lineRule="auto" w:line="240" w:before="57" w:after="57"/>
               <w:ind w:hanging="0"/>
               <w:rPr>
@@ -6436,16 +6469,16 @@
         <w:trPr/>
         <w:tc>
           <w:tcPr>
-            <w:tcW w:w="516" w:type="dxa"/>
-            <w:tcBorders>
-              <w:left w:val="single" w:sz="4" w:space="0" w:color="000000"/>
-              <w:bottom w:val="single" w:sz="4" w:space="0" w:color="000000"/>
-            </w:tcBorders>
-            <w:vAlign w:val="center"/>
-          </w:tcPr>
-          <w:p>
-            <w:pPr>
-              <w:pStyle w:val="Style14"/>
+            <w:tcW w:w="515" w:type="dxa"/>
+            <w:tcBorders>
+              <w:left w:val="single" w:sz="4" w:space="0" w:color="000000"/>
+              <w:bottom w:val="single" w:sz="4" w:space="0" w:color="000000"/>
+            </w:tcBorders>
+            <w:vAlign w:val="center"/>
+          </w:tcPr>
+          <w:p>
+            <w:pPr>
+              <w:pStyle w:val="user2"/>
               <w:spacing w:lineRule="auto" w:line="240" w:before="57" w:after="57"/>
               <w:ind w:hanging="0"/>
               <w:rPr>
@@ -6472,7 +6505,7 @@
           </w:tcPr>
           <w:p>
             <w:pPr>
-              <w:pStyle w:val="Style14"/>
+              <w:pStyle w:val="user2"/>
               <w:spacing w:lineRule="auto" w:line="240" w:before="57" w:after="57"/>
               <w:ind w:hanging="0"/>
               <w:rPr>
@@ -6499,133 +6532,133 @@
           </w:tcPr>
           <w:p>
             <w:pPr>
-              <w:pStyle w:val="Style14"/>
-              <w:spacing w:lineRule="auto" w:line="240" w:before="57" w:after="57"/>
-              <w:ind w:hanging="0"/>
-              <w:rPr>
-                <w:sz w:val="16"/>
-                <w:szCs w:val="16"/>
-              </w:rPr>
-            </w:pPr>
-            <w:r>
-              <w:rPr>
-                <w:sz w:val="16"/>
-                <w:szCs w:val="16"/>
-              </w:rPr>
-            </w:r>
-          </w:p>
-        </w:tc>
-        <w:tc>
-          <w:tcPr>
-            <w:tcW w:w="436" w:type="dxa"/>
-            <w:tcBorders>
-              <w:left w:val="single" w:sz="4" w:space="0" w:color="000000"/>
-              <w:bottom w:val="single" w:sz="4" w:space="0" w:color="000000"/>
-            </w:tcBorders>
-            <w:vAlign w:val="center"/>
-          </w:tcPr>
-          <w:p>
-            <w:pPr>
-              <w:pStyle w:val="Style14"/>
-              <w:spacing w:lineRule="auto" w:line="240" w:before="57" w:after="57"/>
-              <w:ind w:hanging="0"/>
-              <w:rPr>
-                <w:sz w:val="16"/>
-                <w:szCs w:val="16"/>
-              </w:rPr>
-            </w:pPr>
-            <w:r>
-              <w:rPr>
-                <w:sz w:val="16"/>
-                <w:szCs w:val="16"/>
-              </w:rPr>
-            </w:r>
-          </w:p>
-        </w:tc>
-        <w:tc>
-          <w:tcPr>
-            <w:tcW w:w="436" w:type="dxa"/>
-            <w:tcBorders>
-              <w:left w:val="single" w:sz="4" w:space="0" w:color="000000"/>
-              <w:bottom w:val="single" w:sz="4" w:space="0" w:color="000000"/>
-            </w:tcBorders>
-            <w:vAlign w:val="center"/>
-          </w:tcPr>
-          <w:p>
-            <w:pPr>
-              <w:pStyle w:val="Style14"/>
-              <w:spacing w:lineRule="auto" w:line="240" w:before="57" w:after="57"/>
-              <w:ind w:hanging="0"/>
-              <w:rPr>
-                <w:sz w:val="16"/>
-                <w:szCs w:val="16"/>
-              </w:rPr>
-            </w:pPr>
-            <w:r>
-              <w:rPr>
-                <w:sz w:val="16"/>
-                <w:szCs w:val="16"/>
-              </w:rPr>
-            </w:r>
-          </w:p>
-        </w:tc>
-        <w:tc>
-          <w:tcPr>
-            <w:tcW w:w="436" w:type="dxa"/>
-            <w:tcBorders>
-              <w:left w:val="single" w:sz="4" w:space="0" w:color="000000"/>
-              <w:bottom w:val="single" w:sz="4" w:space="0" w:color="000000"/>
-            </w:tcBorders>
-            <w:vAlign w:val="center"/>
-          </w:tcPr>
-          <w:p>
-            <w:pPr>
-              <w:pStyle w:val="Style14"/>
-              <w:spacing w:lineRule="auto" w:line="240" w:before="57" w:after="57"/>
-              <w:ind w:hanging="0"/>
-              <w:rPr>
-                <w:sz w:val="16"/>
-                <w:szCs w:val="16"/>
-              </w:rPr>
-            </w:pPr>
-            <w:r>
-              <w:rPr>
-                <w:sz w:val="16"/>
-                <w:szCs w:val="16"/>
-              </w:rPr>
-            </w:r>
-          </w:p>
-        </w:tc>
-        <w:tc>
-          <w:tcPr>
-            <w:tcW w:w="436" w:type="dxa"/>
-            <w:tcBorders>
-              <w:left w:val="single" w:sz="4" w:space="0" w:color="000000"/>
-              <w:bottom w:val="single" w:sz="4" w:space="0" w:color="000000"/>
-            </w:tcBorders>
-            <w:vAlign w:val="center"/>
-          </w:tcPr>
-          <w:p>
-            <w:pPr>
-              <w:pStyle w:val="Style14"/>
-              <w:spacing w:lineRule="auto" w:line="240" w:before="57" w:after="57"/>
-              <w:ind w:hanging="0"/>
-              <w:rPr>
-                <w:sz w:val="16"/>
-                <w:szCs w:val="16"/>
-              </w:rPr>
-            </w:pPr>
-            <w:r>
-              <w:rPr>
-                <w:sz w:val="16"/>
-                <w:szCs w:val="16"/>
-              </w:rPr>
-            </w:r>
-          </w:p>
-        </w:tc>
-        <w:tc>
-          <w:tcPr>
-            <w:tcW w:w="963" w:type="dxa"/>
+              <w:pStyle w:val="user2"/>
+              <w:spacing w:lineRule="auto" w:line="240" w:before="57" w:after="57"/>
+              <w:ind w:hanging="0"/>
+              <w:rPr>
+                <w:sz w:val="16"/>
+                <w:szCs w:val="16"/>
+              </w:rPr>
+            </w:pPr>
+            <w:r>
+              <w:rPr>
+                <w:sz w:val="16"/>
+                <w:szCs w:val="16"/>
+              </w:rPr>
+            </w:r>
+          </w:p>
+        </w:tc>
+        <w:tc>
+          <w:tcPr>
+            <w:tcW w:w="437" w:type="dxa"/>
+            <w:tcBorders>
+              <w:left w:val="single" w:sz="4" w:space="0" w:color="000000"/>
+              <w:bottom w:val="single" w:sz="4" w:space="0" w:color="000000"/>
+            </w:tcBorders>
+            <w:vAlign w:val="center"/>
+          </w:tcPr>
+          <w:p>
+            <w:pPr>
+              <w:pStyle w:val="user2"/>
+              <w:spacing w:lineRule="auto" w:line="240" w:before="57" w:after="57"/>
+              <w:ind w:hanging="0"/>
+              <w:rPr>
+                <w:sz w:val="16"/>
+                <w:szCs w:val="16"/>
+              </w:rPr>
+            </w:pPr>
+            <w:r>
+              <w:rPr>
+                <w:sz w:val="16"/>
+                <w:szCs w:val="16"/>
+              </w:rPr>
+            </w:r>
+          </w:p>
+        </w:tc>
+        <w:tc>
+          <w:tcPr>
+            <w:tcW w:w="435" w:type="dxa"/>
+            <w:tcBorders>
+              <w:left w:val="single" w:sz="4" w:space="0" w:color="000000"/>
+              <w:bottom w:val="single" w:sz="4" w:space="0" w:color="000000"/>
+            </w:tcBorders>
+            <w:vAlign w:val="center"/>
+          </w:tcPr>
+          <w:p>
+            <w:pPr>
+              <w:pStyle w:val="user2"/>
+              <w:spacing w:lineRule="auto" w:line="240" w:before="57" w:after="57"/>
+              <w:ind w:hanging="0"/>
+              <w:rPr>
+                <w:sz w:val="16"/>
+                <w:szCs w:val="16"/>
+              </w:rPr>
+            </w:pPr>
+            <w:r>
+              <w:rPr>
+                <w:sz w:val="16"/>
+                <w:szCs w:val="16"/>
+              </w:rPr>
+            </w:r>
+          </w:p>
+        </w:tc>
+        <w:tc>
+          <w:tcPr>
+            <w:tcW w:w="437" w:type="dxa"/>
+            <w:tcBorders>
+              <w:left w:val="single" w:sz="4" w:space="0" w:color="000000"/>
+              <w:bottom w:val="single" w:sz="4" w:space="0" w:color="000000"/>
+            </w:tcBorders>
+            <w:vAlign w:val="center"/>
+          </w:tcPr>
+          <w:p>
+            <w:pPr>
+              <w:pStyle w:val="user2"/>
+              <w:spacing w:lineRule="auto" w:line="240" w:before="57" w:after="57"/>
+              <w:ind w:hanging="0"/>
+              <w:rPr>
+                <w:sz w:val="16"/>
+                <w:szCs w:val="16"/>
+              </w:rPr>
+            </w:pPr>
+            <w:r>
+              <w:rPr>
+                <w:sz w:val="16"/>
+                <w:szCs w:val="16"/>
+              </w:rPr>
+            </w:r>
+          </w:p>
+        </w:tc>
+        <w:tc>
+          <w:tcPr>
+            <w:tcW w:w="435" w:type="dxa"/>
+            <w:tcBorders>
+              <w:left w:val="single" w:sz="4" w:space="0" w:color="000000"/>
+              <w:bottom w:val="single" w:sz="4" w:space="0" w:color="000000"/>
+            </w:tcBorders>
+            <w:vAlign w:val="center"/>
+          </w:tcPr>
+          <w:p>
+            <w:pPr>
+              <w:pStyle w:val="user2"/>
+              <w:spacing w:lineRule="auto" w:line="240" w:before="57" w:after="57"/>
+              <w:ind w:hanging="0"/>
+              <w:rPr>
+                <w:sz w:val="16"/>
+                <w:szCs w:val="16"/>
+              </w:rPr>
+            </w:pPr>
+            <w:r>
+              <w:rPr>
+                <w:sz w:val="16"/>
+                <w:szCs w:val="16"/>
+              </w:rPr>
+            </w:r>
+          </w:p>
+        </w:tc>
+        <w:tc>
+          <w:tcPr>
+            <w:tcW w:w="964" w:type="dxa"/>
             <w:tcBorders>
               <w:left w:val="single" w:sz="4" w:space="0" w:color="000000"/>
               <w:bottom w:val="single" w:sz="4" w:space="0" w:color="000000"/>
@@ -6635,7 +6668,7 @@
           </w:tcPr>
           <w:p>
             <w:pPr>
-              <w:pStyle w:val="Style14"/>
+              <w:pStyle w:val="user2"/>
               <w:spacing w:lineRule="auto" w:line="240" w:before="57" w:after="57"/>
               <w:ind w:hanging="0"/>
               <w:rPr>
@@ -6656,16 +6689,16 @@
         <w:trPr/>
         <w:tc>
           <w:tcPr>
-            <w:tcW w:w="516" w:type="dxa"/>
-            <w:tcBorders>
-              <w:left w:val="single" w:sz="4" w:space="0" w:color="000000"/>
-              <w:bottom w:val="single" w:sz="4" w:space="0" w:color="000000"/>
-            </w:tcBorders>
-            <w:vAlign w:val="center"/>
-          </w:tcPr>
-          <w:p>
-            <w:pPr>
-              <w:pStyle w:val="Style14"/>
+            <w:tcW w:w="515" w:type="dxa"/>
+            <w:tcBorders>
+              <w:left w:val="single" w:sz="4" w:space="0" w:color="000000"/>
+              <w:bottom w:val="single" w:sz="4" w:space="0" w:color="000000"/>
+            </w:tcBorders>
+            <w:vAlign w:val="center"/>
+          </w:tcPr>
+          <w:p>
+            <w:pPr>
+              <w:pStyle w:val="user2"/>
               <w:spacing w:lineRule="auto" w:line="240" w:before="57" w:after="57"/>
               <w:ind w:hanging="0"/>
               <w:rPr>
@@ -6692,7 +6725,7 @@
           </w:tcPr>
           <w:p>
             <w:pPr>
-              <w:pStyle w:val="Style14"/>
+              <w:pStyle w:val="user2"/>
               <w:spacing w:lineRule="auto" w:line="240" w:before="57" w:after="57"/>
               <w:ind w:hanging="0"/>
               <w:rPr>
@@ -6719,129 +6752,129 @@
           </w:tcPr>
           <w:p>
             <w:pPr>
-              <w:pStyle w:val="Style14"/>
-              <w:spacing w:lineRule="auto" w:line="240" w:before="57" w:after="57"/>
-              <w:ind w:hanging="0"/>
-              <w:rPr>
-                <w:sz w:val="16"/>
-                <w:szCs w:val="16"/>
-              </w:rPr>
-            </w:pPr>
-            <w:r>
-              <w:rPr>
-                <w:sz w:val="16"/>
-                <w:szCs w:val="16"/>
-              </w:rPr>
-            </w:r>
-          </w:p>
-        </w:tc>
-        <w:tc>
-          <w:tcPr>
-            <w:tcW w:w="436" w:type="dxa"/>
-            <w:tcBorders>
-              <w:left w:val="single" w:sz="4" w:space="0" w:color="000000"/>
-              <w:bottom w:val="single" w:sz="4" w:space="0" w:color="000000"/>
-            </w:tcBorders>
-            <w:vAlign w:val="center"/>
-          </w:tcPr>
-          <w:p>
-            <w:pPr>
-              <w:pStyle w:val="Style14"/>
-              <w:spacing w:lineRule="auto" w:line="240" w:before="57" w:after="57"/>
-              <w:rPr>
-                <w:sz w:val="16"/>
-                <w:szCs w:val="16"/>
-              </w:rPr>
-            </w:pPr>
-            <w:r>
-              <w:rPr>
-                <w:sz w:val="16"/>
-                <w:szCs w:val="16"/>
-              </w:rPr>
-            </w:r>
-          </w:p>
-        </w:tc>
-        <w:tc>
-          <w:tcPr>
-            <w:tcW w:w="436" w:type="dxa"/>
-            <w:tcBorders>
-              <w:left w:val="single" w:sz="4" w:space="0" w:color="000000"/>
-              <w:bottom w:val="single" w:sz="4" w:space="0" w:color="000000"/>
-            </w:tcBorders>
-            <w:vAlign w:val="center"/>
-          </w:tcPr>
-          <w:p>
-            <w:pPr>
-              <w:pStyle w:val="Style14"/>
-              <w:spacing w:lineRule="auto" w:line="240" w:before="57" w:after="57"/>
-              <w:rPr>
-                <w:sz w:val="16"/>
-                <w:szCs w:val="16"/>
-              </w:rPr>
-            </w:pPr>
-            <w:r>
-              <w:rPr>
-                <w:sz w:val="16"/>
-                <w:szCs w:val="16"/>
-              </w:rPr>
-            </w:r>
-          </w:p>
-        </w:tc>
-        <w:tc>
-          <w:tcPr>
-            <w:tcW w:w="436" w:type="dxa"/>
-            <w:tcBorders>
-              <w:left w:val="single" w:sz="4" w:space="0" w:color="000000"/>
-              <w:bottom w:val="single" w:sz="4" w:space="0" w:color="000000"/>
-            </w:tcBorders>
-            <w:vAlign w:val="center"/>
-          </w:tcPr>
-          <w:p>
-            <w:pPr>
-              <w:pStyle w:val="Style14"/>
-              <w:spacing w:lineRule="auto" w:line="240" w:before="57" w:after="57"/>
-              <w:rPr>
-                <w:sz w:val="16"/>
-                <w:szCs w:val="16"/>
-              </w:rPr>
-            </w:pPr>
-            <w:r>
-              <w:rPr>
-                <w:sz w:val="16"/>
-                <w:szCs w:val="16"/>
-              </w:rPr>
-            </w:r>
-          </w:p>
-        </w:tc>
-        <w:tc>
-          <w:tcPr>
-            <w:tcW w:w="436" w:type="dxa"/>
-            <w:tcBorders>
-              <w:left w:val="single" w:sz="4" w:space="0" w:color="000000"/>
-              <w:bottom w:val="single" w:sz="4" w:space="0" w:color="000000"/>
-            </w:tcBorders>
-            <w:vAlign w:val="center"/>
-          </w:tcPr>
-          <w:p>
-            <w:pPr>
-              <w:pStyle w:val="Style14"/>
-              <w:spacing w:lineRule="auto" w:line="240" w:before="57" w:after="57"/>
-              <w:rPr>
-                <w:sz w:val="16"/>
-                <w:szCs w:val="16"/>
-              </w:rPr>
-            </w:pPr>
-            <w:r>
-              <w:rPr>
-                <w:sz w:val="16"/>
-                <w:szCs w:val="16"/>
-              </w:rPr>
-            </w:r>
-          </w:p>
-        </w:tc>
-        <w:tc>
-          <w:tcPr>
-            <w:tcW w:w="963" w:type="dxa"/>
+              <w:pStyle w:val="user2"/>
+              <w:spacing w:lineRule="auto" w:line="240" w:before="57" w:after="57"/>
+              <w:ind w:hanging="0"/>
+              <w:rPr>
+                <w:sz w:val="16"/>
+                <w:szCs w:val="16"/>
+              </w:rPr>
+            </w:pPr>
+            <w:r>
+              <w:rPr>
+                <w:sz w:val="16"/>
+                <w:szCs w:val="16"/>
+              </w:rPr>
+            </w:r>
+          </w:p>
+        </w:tc>
+        <w:tc>
+          <w:tcPr>
+            <w:tcW w:w="437" w:type="dxa"/>
+            <w:tcBorders>
+              <w:left w:val="single" w:sz="4" w:space="0" w:color="000000"/>
+              <w:bottom w:val="single" w:sz="4" w:space="0" w:color="000000"/>
+            </w:tcBorders>
+            <w:vAlign w:val="center"/>
+          </w:tcPr>
+          <w:p>
+            <w:pPr>
+              <w:pStyle w:val="user2"/>
+              <w:spacing w:lineRule="auto" w:line="240" w:before="57" w:after="57"/>
+              <w:rPr>
+                <w:sz w:val="16"/>
+                <w:szCs w:val="16"/>
+              </w:rPr>
+            </w:pPr>
+            <w:r>
+              <w:rPr>
+                <w:sz w:val="16"/>
+                <w:szCs w:val="16"/>
+              </w:rPr>
+            </w:r>
+          </w:p>
+        </w:tc>
+        <w:tc>
+          <w:tcPr>
+            <w:tcW w:w="435" w:type="dxa"/>
+            <w:tcBorders>
+              <w:left w:val="single" w:sz="4" w:space="0" w:color="000000"/>
+              <w:bottom w:val="single" w:sz="4" w:space="0" w:color="000000"/>
+            </w:tcBorders>
+            <w:vAlign w:val="center"/>
+          </w:tcPr>
+          <w:p>
+            <w:pPr>
+              <w:pStyle w:val="user2"/>
+              <w:spacing w:lineRule="auto" w:line="240" w:before="57" w:after="57"/>
+              <w:rPr>
+                <w:sz w:val="16"/>
+                <w:szCs w:val="16"/>
+              </w:rPr>
+            </w:pPr>
+            <w:r>
+              <w:rPr>
+                <w:sz w:val="16"/>
+                <w:szCs w:val="16"/>
+              </w:rPr>
+            </w:r>
+          </w:p>
+        </w:tc>
+        <w:tc>
+          <w:tcPr>
+            <w:tcW w:w="437" w:type="dxa"/>
+            <w:tcBorders>
+              <w:left w:val="single" w:sz="4" w:space="0" w:color="000000"/>
+              <w:bottom w:val="single" w:sz="4" w:space="0" w:color="000000"/>
+            </w:tcBorders>
+            <w:vAlign w:val="center"/>
+          </w:tcPr>
+          <w:p>
+            <w:pPr>
+              <w:pStyle w:val="user2"/>
+              <w:spacing w:lineRule="auto" w:line="240" w:before="57" w:after="57"/>
+              <w:rPr>
+                <w:sz w:val="16"/>
+                <w:szCs w:val="16"/>
+              </w:rPr>
+            </w:pPr>
+            <w:r>
+              <w:rPr>
+                <w:sz w:val="16"/>
+                <w:szCs w:val="16"/>
+              </w:rPr>
+            </w:r>
+          </w:p>
+        </w:tc>
+        <w:tc>
+          <w:tcPr>
+            <w:tcW w:w="435" w:type="dxa"/>
+            <w:tcBorders>
+              <w:left w:val="single" w:sz="4" w:space="0" w:color="000000"/>
+              <w:bottom w:val="single" w:sz="4" w:space="0" w:color="000000"/>
+            </w:tcBorders>
+            <w:vAlign w:val="center"/>
+          </w:tcPr>
+          <w:p>
+            <w:pPr>
+              <w:pStyle w:val="user2"/>
+              <w:spacing w:lineRule="auto" w:line="240" w:before="57" w:after="57"/>
+              <w:rPr>
+                <w:sz w:val="16"/>
+                <w:szCs w:val="16"/>
+              </w:rPr>
+            </w:pPr>
+            <w:r>
+              <w:rPr>
+                <w:sz w:val="16"/>
+                <w:szCs w:val="16"/>
+              </w:rPr>
+            </w:r>
+          </w:p>
+        </w:tc>
+        <w:tc>
+          <w:tcPr>
+            <w:tcW w:w="964" w:type="dxa"/>
             <w:tcBorders>
               <w:left w:val="single" w:sz="4" w:space="0" w:color="000000"/>
               <w:bottom w:val="single" w:sz="4" w:space="0" w:color="000000"/>
@@ -6851,7 +6884,7 @@
           </w:tcPr>
           <w:p>
             <w:pPr>
-              <w:pStyle w:val="Style14"/>
+              <w:pStyle w:val="user2"/>
               <w:spacing w:lineRule="auto" w:line="240" w:before="57" w:after="57"/>
               <w:rPr>
                 <w:sz w:val="16"/>
@@ -6955,21 +6988,7 @@
           <w:u w:val="single"/>
         </w:rPr>
         <w:tab/>
-      </w:r>
-      <w:r>
-        <w:rPr>
-          <w:sz w:val="20"/>
-          <w:szCs w:val="20"/>
-          <w:u w:val="single"/>
-        </w:rPr>
         <w:t>Туленков А.В.</w:t>
-      </w:r>
-      <w:r>
-        <w:rPr>
-          <w:sz w:val="20"/>
-          <w:szCs w:val="20"/>
-          <w:u w:val="single"/>
-        </w:rPr>
         <w:tab/>
         <w:tab/>
       </w:r>
@@ -7448,9 +7467,7 @@
     <w:pPr>
       <w:widowControl/>
       <w:suppressAutoHyphens w:val="true"/>
-      <w:kinsoku w:val="true"/>
-      <w:overflowPunct w:val="true"/>
-      <w:autoSpaceDE w:val="true"/>
+      <w:overflowPunct w:val="false"/>
       <w:bidi w:val="0"/>
       <w:spacing w:lineRule="auto" w:line="360" w:before="0" w:after="0"/>
       <w:ind w:firstLine="851"/>
@@ -7474,10 +7491,6 @@
     <w:pPr>
       <w:keepNext w:val="true"/>
       <w:keepLines/>
-      <w:numPr>
-        <w:ilvl w:val="0"/>
-        <w:numId w:val="0"/>
-      </w:numPr>
       <w:ind w:firstLine="851"/>
       <w:outlineLvl w:val="0"/>
     </w:pPr>
@@ -7497,10 +7510,6 @@
     <w:pPr>
       <w:keepNext w:val="true"/>
       <w:keepLines/>
-      <w:numPr>
-        <w:ilvl w:val="0"/>
-        <w:numId w:val="0"/>
-      </w:numPr>
       <w:spacing w:before="40" w:after="0"/>
       <w:ind w:firstLine="851"/>
       <w:outlineLvl w:val="1"/>
@@ -7521,10 +7530,6 @@
     <w:pPr>
       <w:keepNext w:val="true"/>
       <w:keepLines/>
-      <w:numPr>
-        <w:ilvl w:val="0"/>
-        <w:numId w:val="0"/>
-      </w:numPr>
       <w:spacing w:before="40" w:after="0"/>
       <w:ind w:firstLine="851"/>
       <w:outlineLvl w:val="2"/>
@@ -7575,7 +7580,7 @@
       <w:b/>
       <w:bCs/>
       <w:smallCaps/>
-      <w:color w:themeColor="dark1" w:val="000000"/>
+      <w:color w:themeColor="text1" w:val="000000"/>
       <w:sz w:val="28"/>
       <w:szCs w:val="28"/>
       <w:lang w:eastAsia="uk-UA"/>
@@ -7590,7 +7595,7 @@
       <w:rFonts w:ascii="Times New Roman" w:hAnsi="Times New Roman" w:eastAsia="Calibri" w:cs="Times New Roman"/>
       <w:b/>
       <w:bCs/>
-      <w:color w:themeColor="dark1" w:val="000000"/>
+      <w:color w:themeColor="text1" w:val="000000"/>
       <w:sz w:val="28"/>
       <w:szCs w:val="26"/>
       <w:lang w:eastAsia="uk-UA"/>
@@ -7641,7 +7646,7 @@
       <w:rFonts w:ascii="Times New Roman" w:hAnsi="Times New Roman" w:eastAsia="Times New Roman" w:cs="Times New Roman"/>
       <w:i/>
       <w:iCs/>
-      <w:color w:themeColor="dark1" w:themeTint="bf" w:val="404040"/>
+      <w:color w:themeColor="text1" w:themeTint="bf" w:val="404040"/>
       <w:sz w:val="28"/>
       <w:szCs w:val="28"/>
       <w:lang w:eastAsia="uk-UA"/>
@@ -7666,7 +7671,7 @@
       <w:b/>
       <w:bCs/>
       <w:i/>
-      <w:color w:themeColor="dark1" w:val="000000"/>
+      <w:color w:themeColor="text1" w:val="000000"/>
       <w:sz w:val="28"/>
       <w:szCs w:val="24"/>
       <w:lang w:eastAsia="uk-UA"/>
@@ -7765,7 +7770,7 @@
       <w:bCs/>
       <w:i/>
       <w:smallCaps/>
-      <w:color w:themeColor="dark1" w:val="000000"/>
+      <w:color w:themeColor="text1" w:val="000000"/>
       <w:sz w:val="28"/>
       <w:szCs w:val="24"/>
       <w:lang w:eastAsia="uk-UA"/>
@@ -7889,7 +7894,7 @@
   </w:style>
   <w:style w:type="paragraph" w:styleId="IndexHeading">
     <w:name w:val="index heading"/>
-    <w:basedOn w:val="user"/>
+    <w:basedOn w:val="Style12"/>
     <w:pPr/>
     <w:rPr/>
   </w:style>
@@ -7963,7 +7968,7 @@
       <w:b/>
       <w:bCs/>
       <w:smallCaps/>
-      <w:color w:themeColor="dark1" w:val="000000"/>
+      <w:color w:themeColor="text1" w:val="000000"/>
       <w:sz w:val="28"/>
       <w:szCs w:val="28"/>
     </w:rPr>
@@ -7979,7 +7984,7 @@
       <w:rFonts w:ascii="Times New Roman" w:hAnsi="Times New Roman" w:cs="Times New Roman"/>
       <w:b/>
       <w:bCs/>
-      <w:color w:themeColor="dark1" w:val="000000"/>
+      <w:color w:themeColor="text1" w:val="000000"/>
       <w:sz w:val="28"/>
     </w:rPr>
   </w:style>
@@ -8023,7 +8028,7 @@
     <w:rPr>
       <w:i/>
       <w:iCs/>
-      <w:color w:themeColor="dark1" w:themeTint="bf" w:val="404040"/>
+      <w:color w:themeColor="text1" w:themeTint="bf" w:val="404040"/>
     </w:rPr>
   </w:style>
   <w:style w:type="paragraph" w:styleId="H41">
@@ -8033,10 +8038,6 @@
     <w:link w:val="H4"/>
     <w:qFormat/>
     <w:pPr>
-      <w:numPr>
-        <w:ilvl w:val="0"/>
-        <w:numId w:val="0"/>
-      </w:numPr>
       <w:ind w:firstLine="851"/>
       <w:outlineLvl w:val="3"/>
     </w:pPr>
@@ -8094,10 +8095,6 @@
     <w:link w:val="H5"/>
     <w:qFormat/>
     <w:pPr>
-      <w:numPr>
-        <w:ilvl w:val="0"/>
-        <w:numId w:val="0"/>
-      </w:numPr>
       <w:ind w:firstLine="851"/>
       <w:outlineLvl w:val="4"/>
     </w:pPr>
@@ -8112,10 +8109,6 @@
     <w:link w:val="H6"/>
     <w:qFormat/>
     <w:pPr>
-      <w:numPr>
-        <w:ilvl w:val="0"/>
-        <w:numId w:val="0"/>
-      </w:numPr>
       <w:ind w:firstLine="851"/>
       <w:outlineLvl w:val="5"/>
     </w:pPr>
@@ -8142,8 +8135,8 @@
       <w:lang w:val="en-US"/>
     </w:rPr>
   </w:style>
-  <w:style w:type="paragraph" w:styleId="Style14">
-    <w:name w:val="Вміст таблиці"/>
+  <w:style w:type="paragraph" w:styleId="user2">
+    <w:name w:val="Вміст таблиці (user)"/>
     <w:basedOn w:val="Normal"/>
     <w:qFormat/>
     <w:pPr>
@@ -8152,8 +8145,8 @@
     </w:pPr>
     <w:rPr/>
   </w:style>
-  <w:style w:type="numbering" w:styleId="user2">
-    <w:name w:val="Без маркерів (user)"/>
+  <w:style w:type="numbering" w:styleId="Style14">
+    <w:name w:val="Без маркерів"/>
     <w:qFormat/>
   </w:style>
 </w:styles>

</xml_diff>

<commit_message>
feat -- NI: preparing to start lab 3
</commit_message>
<xml_diff>
--- a/42P Praktyka/Щоденник.docx
+++ b/42P Praktyka/Щоденник.docx
@@ -1609,8 +1609,9 @@
           <w:sz w:val="20"/>
           <w:szCs w:val="20"/>
           <w:u w:val="single"/>
-        </w:rPr>
-        <w:t>24</w:t>
+          <w:lang w:val="en-US"/>
+        </w:rPr>
+        <w:t>3</w:t>
       </w:r>
       <w:r>
         <w:rPr>
@@ -1627,7 +1628,21 @@
           <w:u w:val="single"/>
         </w:rPr>
         <w:tab/>
-        <w:t>червня</w:t>
+      </w:r>
+      <w:r>
+        <w:rPr>
+          <w:sz w:val="20"/>
+          <w:szCs w:val="20"/>
+          <w:u w:val="single"/>
+        </w:rPr>
+        <w:t>травня</w:t>
+      </w:r>
+      <w:r>
+        <w:rPr>
+          <w:sz w:val="20"/>
+          <w:szCs w:val="20"/>
+          <w:u w:val="single"/>
+        </w:rPr>
         <w:tab/>
       </w:r>
       <w:r>
@@ -1644,7 +1659,15 @@
           <w:szCs w:val="20"/>
           <w:u w:val="single"/>
         </w:rPr>
-        <w:t>25</w:t>
+        <w:t>2</w:t>
+      </w:r>
+      <w:r>
+        <w:rPr>
+          <w:sz w:val="20"/>
+          <w:szCs w:val="20"/>
+          <w:u w:val="single"/>
+        </w:rPr>
+        <w:t>6</w:t>
       </w:r>
       <w:r>
         <w:rPr>
@@ -1711,7 +1734,35 @@
           <w:szCs w:val="20"/>
           <w:u w:val="single"/>
         </w:rPr>
-        <w:t>Акритова Т. О., менеджер з навчання комп’ютерному програмуванню</w:t>
+        <w:t xml:space="preserve"> </w:t>
+      </w:r>
+      <w:r>
+        <w:rPr>
+          <w:sz w:val="20"/>
+          <w:szCs w:val="20"/>
+          <w:u w:val="single"/>
+        </w:rPr>
+        <w:tab/>
+        <w:tab/>
+        <w:t>Никонова К.В.</w:t>
+      </w:r>
+      <w:r>
+        <w:rPr>
+          <w:sz w:val="20"/>
+          <w:szCs w:val="20"/>
+          <w:u w:val="single"/>
+        </w:rPr>
+        <w:t xml:space="preserve"> менеджер </w:t>
+      </w:r>
+      <w:r>
+        <w:rPr>
+          <w:sz w:val="20"/>
+          <w:szCs w:val="20"/>
+          <w:u w:val="single"/>
+        </w:rPr>
+        <w:t>від компанії</w:t>
+        <w:tab/>
+        <w:tab/>
       </w:r>
     </w:p>
     <w:p>
@@ -2101,29 +2152,15 @@
           <w:szCs w:val="20"/>
           <w:u w:val="none"/>
         </w:rPr>
-        <w:t>Відгук, за дозволом підприємства, написано студентом.</w:t>
-      </w:r>
-    </w:p>
-    <w:p>
-      <w:pPr>
-        <w:pStyle w:val="Normal"/>
-        <w:spacing w:before="0" w:after="0"/>
-        <w:ind w:hanging="0"/>
-        <w:contextualSpacing/>
-        <w:jc w:val="left"/>
-        <w:rPr>
-          <w:sz w:val="20"/>
-          <w:szCs w:val="20"/>
-          <w:u w:val="none"/>
-        </w:rPr>
-      </w:pPr>
-      <w:r>
-        <w:rPr>
-          <w:sz w:val="20"/>
-          <w:szCs w:val="20"/>
-          <w:u w:val="none"/>
-        </w:rPr>
-        <w:t>Практику студент пройшов вчасно, виконав усі проміжні етапи (тести на платформі) і завантажив необхідні самостійні завдання. Задачі були виконані самостійно (окрім необхідного пункту використати штучний інтелект, щоб зробити ту саму роботу, що на курсі з менеджменту), якість роботи задовільна.</w:t>
+        <w:t>В</w:t>
+      </w:r>
+      <w:r>
+        <w:rPr>
+          <w:sz w:val="20"/>
+          <w:szCs w:val="20"/>
+          <w:u w:val="none"/>
+        </w:rPr>
+        <w:t>ідгук тут.</w:t>
       </w:r>
     </w:p>
     <w:p>
@@ -2213,29 +2250,15 @@
           <w:szCs w:val="20"/>
           <w:u w:val="none"/>
         </w:rPr>
-        <w:t>Відгук, за дозволом представника університету, написано студентом.</w:t>
-      </w:r>
-    </w:p>
-    <w:p>
-      <w:pPr>
-        <w:pStyle w:val="Normal"/>
-        <w:spacing w:before="0" w:after="0"/>
-        <w:ind w:hanging="0"/>
-        <w:contextualSpacing/>
-        <w:jc w:val="left"/>
-        <w:rPr>
-          <w:sz w:val="20"/>
-          <w:szCs w:val="20"/>
-          <w:u w:val="none"/>
-        </w:rPr>
-      </w:pPr>
-      <w:r>
-        <w:rPr>
-          <w:sz w:val="20"/>
-          <w:szCs w:val="20"/>
-          <w:u w:val="none"/>
-        </w:rPr>
-        <w:t>Студент вчасно виконав всі завданні, повністю зробив практичну частину. Щоденник оформив згідно шаблону, правильно заповнив календарний графік і дотримався його.</w:t>
+        <w:t xml:space="preserve">Відгук </w:t>
+      </w:r>
+      <w:r>
+        <w:rPr>
+          <w:sz w:val="20"/>
+          <w:szCs w:val="20"/>
+          <w:u w:val="none"/>
+        </w:rPr>
+        <w:t>тут.</w:t>
       </w:r>
     </w:p>
     <w:p>
@@ -2286,7 +2309,7 @@
           <w:szCs w:val="20"/>
           <w:u w:val="single"/>
         </w:rPr>
-        <w:t>24</w:t>
+        <w:t>3</w:t>
       </w:r>
       <w:r>
         <w:rPr>
@@ -2303,7 +2326,21 @@
           <w:u w:val="single"/>
         </w:rPr>
         <w:tab/>
-        <w:t>червня</w:t>
+      </w:r>
+      <w:r>
+        <w:rPr>
+          <w:sz w:val="20"/>
+          <w:szCs w:val="20"/>
+          <w:u w:val="single"/>
+        </w:rPr>
+        <w:t>травня</w:t>
+      </w:r>
+      <w:r>
+        <w:rPr>
+          <w:sz w:val="20"/>
+          <w:szCs w:val="20"/>
+          <w:u w:val="single"/>
+        </w:rPr>
         <w:tab/>
       </w:r>
       <w:r>
@@ -2320,7 +2357,15 @@
           <w:szCs w:val="20"/>
           <w:u w:val="single"/>
         </w:rPr>
-        <w:t>25</w:t>
+        <w:t>2</w:t>
+      </w:r>
+      <w:r>
+        <w:rPr>
+          <w:sz w:val="20"/>
+          <w:szCs w:val="20"/>
+          <w:u w:val="single"/>
+        </w:rPr>
+        <w:t>6</w:t>
       </w:r>
       <w:r>
         <w:rPr>
@@ -2595,7 +2640,21 @@
           <w:u w:val="single"/>
         </w:rPr>
         <w:tab/>
-        <w:t>Туленков А.В.</w:t>
+      </w:r>
+      <w:r>
+        <w:rPr>
+          <w:sz w:val="20"/>
+          <w:szCs w:val="20"/>
+          <w:u w:val="single"/>
+        </w:rPr>
+        <w:t>Степаненко О.О.</w:t>
+      </w:r>
+      <w:r>
+        <w:rPr>
+          <w:sz w:val="20"/>
+          <w:szCs w:val="20"/>
+          <w:u w:val="single"/>
+        </w:rPr>
         <w:tab/>
         <w:tab/>
       </w:r>
@@ -2783,100 +2842,15 @@
           <w:szCs w:val="20"/>
           <w:u w:val="none"/>
         </w:rPr>
-        <w:t>Відгук, за дозволом підприємства, написано студентом.</w:t>
-      </w:r>
-    </w:p>
-    <w:p>
-      <w:pPr>
-        <w:pStyle w:val="Normal"/>
-        <w:widowControl/>
-        <w:suppressAutoHyphens w:val="true"/>
-        <w:bidi w:val="0"/>
-        <w:spacing w:lineRule="auto" w:line="360" w:before="0" w:after="0"/>
-        <w:ind w:firstLine="283" w:left="567" w:right="0"/>
-        <w:contextualSpacing/>
-        <w:jc w:val="left"/>
-        <w:rPr>
-          <w:sz w:val="20"/>
-          <w:szCs w:val="20"/>
-          <w:u w:val="none"/>
-        </w:rPr>
-      </w:pPr>
-      <w:r>
-        <w:rPr>
-          <w:sz w:val="20"/>
-          <w:szCs w:val="20"/>
-          <w:u w:val="none"/>
-        </w:rPr>
-        <w:t xml:space="preserve">Студент пройшов практику вчасно, здав всі роботи. Було обрано курси веб-верстки та менеджменту. Для обох студент продивився всі відео-матеріали та виконав практичні завдання. </w:t>
-      </w:r>
-    </w:p>
-    <w:p>
-      <w:pPr>
-        <w:pStyle w:val="Normal"/>
-        <w:widowControl/>
-        <w:suppressAutoHyphens w:val="true"/>
-        <w:bidi w:val="0"/>
-        <w:spacing w:lineRule="auto" w:line="360" w:before="0" w:after="0"/>
-        <w:ind w:firstLine="283" w:left="567" w:right="0"/>
-        <w:contextualSpacing/>
-        <w:jc w:val="left"/>
-        <w:rPr>
-          <w:sz w:val="20"/>
-          <w:szCs w:val="20"/>
-          <w:u w:val="none"/>
-        </w:rPr>
-      </w:pPr>
-      <w:r>
-        <w:rPr>
-          <w:sz w:val="20"/>
-          <w:szCs w:val="20"/>
-          <w:u w:val="none"/>
-        </w:rPr>
-        <w:t xml:space="preserve">Для самостійної роботи з верстки використані відносні одиниці виміру, для картинок задані альтернативні тексти, сторінка виглядає як в макеті. Результати завантажено у </w:t>
-      </w:r>
-      <w:r>
-        <w:rPr>
-          <w:sz w:val="20"/>
-          <w:szCs w:val="20"/>
-          <w:u w:val="none"/>
-          <w:lang w:val="en-US"/>
-        </w:rPr>
-        <w:t xml:space="preserve">ZIP </w:t>
-      </w:r>
-      <w:r>
-        <w:rPr>
-          <w:sz w:val="20"/>
-          <w:szCs w:val="20"/>
-          <w:u w:val="none"/>
-          <w:lang w:val="uk-UA"/>
-        </w:rPr>
-        <w:t>архіві, рівень виконання — якісний.</w:t>
-      </w:r>
-    </w:p>
-    <w:p>
-      <w:pPr>
-        <w:pStyle w:val="Normal"/>
-        <w:widowControl/>
-        <w:suppressAutoHyphens w:val="true"/>
-        <w:bidi w:val="0"/>
-        <w:spacing w:lineRule="auto" w:line="360" w:before="0" w:after="0"/>
-        <w:ind w:firstLine="283" w:left="567" w:right="0"/>
-        <w:contextualSpacing/>
-        <w:jc w:val="left"/>
-        <w:rPr>
-          <w:sz w:val="20"/>
-          <w:szCs w:val="20"/>
-          <w:u w:val="none"/>
-        </w:rPr>
-      </w:pPr>
-      <w:r>
-        <w:rPr>
-          <w:sz w:val="20"/>
-          <w:szCs w:val="20"/>
-          <w:u w:val="none"/>
-        </w:rPr>
-        <w:t>Для самостійної роботи з менеджменту завдання виконано самостійно і записано у звіті. Всі задачі виконано майже як у прикладі, порівняння з роботою штучного інтелекту виконано зрозуміло в таблиці, але бракує текстових висновків.</w:t>
+        <w:t xml:space="preserve">Відгук </w:t>
+      </w:r>
+      <w:r>
+        <w:rPr>
+          <w:sz w:val="20"/>
+          <w:szCs w:val="20"/>
+          <w:u w:val="none"/>
+        </w:rPr>
+        <w:t>тут.</w:t>
       </w:r>
     </w:p>
     <w:p>
@@ -2993,7 +2967,37 @@
           <w:u w:val="single"/>
         </w:rPr>
         <w:tab/>
-        <w:t>Акритова Т. О.</w:t>
+      </w:r>
+      <w:r>
+        <w:rPr>
+          <w:sz w:val="20"/>
+          <w:szCs w:val="20"/>
+          <w:u w:val="single"/>
+        </w:rPr>
+        <w:t>Никонова</w:t>
+      </w:r>
+      <w:r>
+        <w:rPr>
+          <w:sz w:val="20"/>
+          <w:szCs w:val="20"/>
+          <w:u w:val="single"/>
+        </w:rPr>
+        <w:t xml:space="preserve"> </w:t>
+      </w:r>
+      <w:r>
+        <w:rPr>
+          <w:sz w:val="20"/>
+          <w:szCs w:val="20"/>
+          <w:u w:val="single"/>
+        </w:rPr>
+        <w:t>К.В.</w:t>
+      </w:r>
+      <w:r>
+        <w:rPr>
+          <w:sz w:val="20"/>
+          <w:szCs w:val="20"/>
+          <w:u w:val="single"/>
+        </w:rPr>
         <w:tab/>
         <w:tab/>
       </w:r>
@@ -3102,7 +3106,7 @@
           <w:szCs w:val="20"/>
           <w:u w:val="single"/>
         </w:rPr>
-        <w:t>24</w:t>
+        <w:t>3</w:t>
       </w:r>
       <w:r>
         <w:rPr>
@@ -3119,7 +3123,21 @@
           <w:u w:val="single"/>
         </w:rPr>
         <w:tab/>
-        <w:t>червня</w:t>
+      </w:r>
+      <w:r>
+        <w:rPr>
+          <w:sz w:val="20"/>
+          <w:szCs w:val="20"/>
+          <w:u w:val="single"/>
+        </w:rPr>
+        <w:t>травня</w:t>
+      </w:r>
+      <w:r>
+        <w:rPr>
+          <w:sz w:val="20"/>
+          <w:szCs w:val="20"/>
+          <w:u w:val="single"/>
+        </w:rPr>
         <w:tab/>
         <w:tab/>
       </w:r>
@@ -3137,7 +3155,15 @@
           <w:szCs w:val="20"/>
           <w:u w:val="single"/>
         </w:rPr>
-        <w:t>25</w:t>
+        <w:t>2</w:t>
+      </w:r>
+      <w:r>
+        <w:rPr>
+          <w:sz w:val="20"/>
+          <w:szCs w:val="20"/>
+          <w:u w:val="single"/>
+        </w:rPr>
+        <w:t>6</w:t>
       </w:r>
       <w:r>
         <w:rPr>
@@ -3281,6 +3307,195 @@
         <w:ind w:hanging="0"/>
         <w:contextualSpacing/>
         <w:jc w:val="left"/>
+        <w:rPr>
+          <w:sz w:val="20"/>
+          <w:szCs w:val="20"/>
+          <w:u w:val="none"/>
+        </w:rPr>
+      </w:pPr>
+      <w:r>
+        <w:rPr>
+          <w:sz w:val="20"/>
+          <w:szCs w:val="20"/>
+          <w:u w:val="none"/>
+        </w:rPr>
+      </w:r>
+    </w:p>
+    <w:p>
+      <w:pPr>
+        <w:pStyle w:val="Normal"/>
+        <w:spacing w:before="0" w:after="0"/>
+        <w:ind w:hanging="0"/>
+        <w:contextualSpacing/>
+        <w:jc w:val="center"/>
+        <w:rPr>
+          <w:sz w:val="20"/>
+          <w:szCs w:val="20"/>
+          <w:u w:val="none"/>
+        </w:rPr>
+      </w:pPr>
+      <w:r>
+        <w:rPr>
+          <w:sz w:val="20"/>
+          <w:szCs w:val="20"/>
+          <w:u w:val="none"/>
+        </w:rPr>
+      </w:r>
+    </w:p>
+    <w:p>
+      <w:pPr>
+        <w:pStyle w:val="Normal"/>
+        <w:spacing w:before="0" w:after="0"/>
+        <w:ind w:hanging="0"/>
+        <w:contextualSpacing/>
+        <w:jc w:val="center"/>
+        <w:rPr>
+          <w:sz w:val="20"/>
+          <w:szCs w:val="20"/>
+          <w:u w:val="none"/>
+        </w:rPr>
+      </w:pPr>
+      <w:r>
+        <w:rPr>
+          <w:sz w:val="20"/>
+          <w:szCs w:val="20"/>
+          <w:u w:val="none"/>
+        </w:rPr>
+      </w:r>
+    </w:p>
+    <w:p>
+      <w:pPr>
+        <w:pStyle w:val="Normal"/>
+        <w:spacing w:before="0" w:after="0"/>
+        <w:ind w:hanging="0"/>
+        <w:contextualSpacing/>
+        <w:jc w:val="center"/>
+        <w:rPr>
+          <w:sz w:val="20"/>
+          <w:szCs w:val="20"/>
+          <w:u w:val="none"/>
+        </w:rPr>
+      </w:pPr>
+      <w:r>
+        <w:rPr>
+          <w:sz w:val="20"/>
+          <w:szCs w:val="20"/>
+          <w:u w:val="none"/>
+        </w:rPr>
+      </w:r>
+    </w:p>
+    <w:p>
+      <w:pPr>
+        <w:pStyle w:val="Normal"/>
+        <w:spacing w:before="0" w:after="0"/>
+        <w:ind w:hanging="0"/>
+        <w:contextualSpacing/>
+        <w:jc w:val="center"/>
+        <w:rPr>
+          <w:sz w:val="20"/>
+          <w:szCs w:val="20"/>
+          <w:u w:val="none"/>
+        </w:rPr>
+      </w:pPr>
+      <w:r>
+        <w:rPr>
+          <w:sz w:val="20"/>
+          <w:szCs w:val="20"/>
+          <w:u w:val="none"/>
+        </w:rPr>
+      </w:r>
+    </w:p>
+    <w:p>
+      <w:pPr>
+        <w:pStyle w:val="Normal"/>
+        <w:spacing w:before="0" w:after="0"/>
+        <w:ind w:hanging="0"/>
+        <w:contextualSpacing/>
+        <w:jc w:val="center"/>
+        <w:rPr>
+          <w:sz w:val="20"/>
+          <w:szCs w:val="20"/>
+          <w:u w:val="none"/>
+        </w:rPr>
+      </w:pPr>
+      <w:r>
+        <w:rPr>
+          <w:sz w:val="20"/>
+          <w:szCs w:val="20"/>
+          <w:u w:val="none"/>
+        </w:rPr>
+      </w:r>
+    </w:p>
+    <w:p>
+      <w:pPr>
+        <w:pStyle w:val="Normal"/>
+        <w:spacing w:before="0" w:after="0"/>
+        <w:ind w:hanging="0"/>
+        <w:contextualSpacing/>
+        <w:jc w:val="center"/>
+        <w:rPr>
+          <w:sz w:val="20"/>
+          <w:szCs w:val="20"/>
+          <w:u w:val="none"/>
+        </w:rPr>
+      </w:pPr>
+      <w:r>
+        <w:rPr>
+          <w:sz w:val="20"/>
+          <w:szCs w:val="20"/>
+          <w:u w:val="none"/>
+        </w:rPr>
+      </w:r>
+    </w:p>
+    <w:p>
+      <w:pPr>
+        <w:pStyle w:val="Normal"/>
+        <w:spacing w:before="0" w:after="0"/>
+        <w:ind w:hanging="0"/>
+        <w:contextualSpacing/>
+        <w:jc w:val="center"/>
+        <w:rPr>
+          <w:sz w:val="20"/>
+          <w:szCs w:val="20"/>
+          <w:u w:val="none"/>
+        </w:rPr>
+      </w:pPr>
+      <w:r>
+        <w:rPr>
+          <w:sz w:val="20"/>
+          <w:szCs w:val="20"/>
+          <w:u w:val="none"/>
+        </w:rPr>
+      </w:r>
+    </w:p>
+    <w:p>
+      <w:pPr>
+        <w:pStyle w:val="Normal"/>
+        <w:spacing w:before="0" w:after="0"/>
+        <w:ind w:hanging="0"/>
+        <w:contextualSpacing/>
+        <w:jc w:val="center"/>
+        <w:rPr>
+          <w:sz w:val="20"/>
+          <w:szCs w:val="20"/>
+          <w:u w:val="none"/>
+        </w:rPr>
+      </w:pPr>
+      <w:r>
+        <w:rPr>
+          <w:sz w:val="20"/>
+          <w:szCs w:val="20"/>
+          <w:u w:val="none"/>
+        </w:rPr>
+      </w:r>
+    </w:p>
+    <w:p>
+      <w:pPr>
+        <w:pStyle w:val="Normal"/>
+        <w:spacing w:before="0" w:after="0"/>
+        <w:ind w:hanging="0"/>
+        <w:contextualSpacing/>
+        <w:jc w:val="center"/>
         <w:rPr>
           <w:sz w:val="20"/>
           <w:szCs w:val="20"/>
@@ -3384,7 +3599,7 @@
     </w:p>
     <w:tbl>
       <w:tblPr>
-        <w:tblW w:w="7711" w:type="dxa"/>
+        <w:tblW w:w="7771" w:type="dxa"/>
         <w:jc w:val="left"/>
         <w:tblInd w:w="-5" w:type="dxa"/>
         <w:tblLayout w:type="fixed"/>
@@ -3396,20 +3611,18 @@
         </w:tblCellMar>
       </w:tblPr>
       <w:tblGrid>
-        <w:gridCol w:w="515"/>
-        <w:gridCol w:w="4052"/>
-        <w:gridCol w:w="436"/>
-        <w:gridCol w:w="437"/>
-        <w:gridCol w:w="435"/>
-        <w:gridCol w:w="437"/>
-        <w:gridCol w:w="435"/>
-        <w:gridCol w:w="964"/>
+        <w:gridCol w:w="516"/>
+        <w:gridCol w:w="3780"/>
+        <w:gridCol w:w="748"/>
+        <w:gridCol w:w="737"/>
+        <w:gridCol w:w="695"/>
+        <w:gridCol w:w="1295"/>
       </w:tblGrid>
       <w:tr>
         <w:trPr/>
         <w:tc>
           <w:tcPr>
-            <w:tcW w:w="515" w:type="dxa"/>
+            <w:tcW w:w="516" w:type="dxa"/>
             <w:vMerge w:val="restart"/>
             <w:tcBorders>
               <w:top w:val="single" w:sz="4" w:space="0" w:color="000000"/>
@@ -3447,7 +3660,7 @@
         </w:tc>
         <w:tc>
           <w:tcPr>
-            <w:tcW w:w="4052" w:type="dxa"/>
+            <w:tcW w:w="3780" w:type="dxa"/>
             <w:vMerge w:val="restart"/>
             <w:tcBorders>
               <w:top w:val="single" w:sz="4" w:space="0" w:color="000000"/>
@@ -3479,7 +3692,7 @@
         <w:tc>
           <w:tcPr>
             <w:tcW w:w="2180" w:type="dxa"/>
-            <w:gridSpan w:val="5"/>
+            <w:gridSpan w:val="3"/>
             <w:tcBorders>
               <w:top w:val="single" w:sz="4" w:space="0" w:color="000000"/>
               <w:left w:val="single" w:sz="4" w:space="0" w:color="000000"/>
@@ -3509,7 +3722,7 @@
         </w:tc>
         <w:tc>
           <w:tcPr>
-            <w:tcW w:w="964" w:type="dxa"/>
+            <w:tcW w:w="1295" w:type="dxa"/>
             <w:vMerge w:val="restart"/>
             <w:tcBorders>
               <w:top w:val="single" w:sz="4" w:space="0" w:color="000000"/>
@@ -3544,7 +3757,7 @@
         <w:trPr/>
         <w:tc>
           <w:tcPr>
-            <w:tcW w:w="515" w:type="dxa"/>
+            <w:tcW w:w="516" w:type="dxa"/>
             <w:vMerge w:val="continue"/>
             <w:tcBorders>
               <w:left w:val="single" w:sz="4" w:space="0" w:color="000000"/>
@@ -3571,7 +3784,7 @@
         </w:tc>
         <w:tc>
           <w:tcPr>
-            <w:tcW w:w="4052" w:type="dxa"/>
+            <w:tcW w:w="3780" w:type="dxa"/>
             <w:vMerge w:val="continue"/>
             <w:tcBorders>
               <w:left w:val="single" w:sz="4" w:space="0" w:color="000000"/>
@@ -3598,7 +3811,7 @@
         </w:tc>
         <w:tc>
           <w:tcPr>
-            <w:tcW w:w="436" w:type="dxa"/>
+            <w:tcW w:w="748" w:type="dxa"/>
             <w:tcBorders>
               <w:left w:val="single" w:sz="4" w:space="0" w:color="000000"/>
               <w:bottom w:val="single" w:sz="4" w:space="0" w:color="000000"/>
@@ -3627,7 +3840,7 @@
         </w:tc>
         <w:tc>
           <w:tcPr>
-            <w:tcW w:w="437" w:type="dxa"/>
+            <w:tcW w:w="737" w:type="dxa"/>
             <w:tcBorders>
               <w:left w:val="single" w:sz="4" w:space="0" w:color="000000"/>
               <w:bottom w:val="single" w:sz="4" w:space="0" w:color="000000"/>
@@ -3656,7 +3869,7 @@
         </w:tc>
         <w:tc>
           <w:tcPr>
-            <w:tcW w:w="435" w:type="dxa"/>
+            <w:tcW w:w="695" w:type="dxa"/>
             <w:tcBorders>
               <w:left w:val="single" w:sz="4" w:space="0" w:color="000000"/>
               <w:bottom w:val="single" w:sz="4" w:space="0" w:color="000000"/>
@@ -3685,65 +3898,7 @@
         </w:tc>
         <w:tc>
           <w:tcPr>
-            <w:tcW w:w="437" w:type="dxa"/>
-            <w:tcBorders>
-              <w:left w:val="single" w:sz="4" w:space="0" w:color="000000"/>
-              <w:bottom w:val="single" w:sz="4" w:space="0" w:color="000000"/>
-            </w:tcBorders>
-            <w:vAlign w:val="center"/>
-          </w:tcPr>
-          <w:p>
-            <w:pPr>
-              <w:pStyle w:val="user2"/>
-              <w:spacing w:lineRule="auto" w:line="240" w:before="57" w:after="57"/>
-              <w:ind w:hanging="0"/>
-              <w:jc w:val="center"/>
-              <w:rPr>
-                <w:sz w:val="16"/>
-                <w:szCs w:val="16"/>
-              </w:rPr>
-            </w:pPr>
-            <w:r>
-              <w:rPr>
-                <w:sz w:val="16"/>
-                <w:szCs w:val="16"/>
-              </w:rPr>
-              <w:t>4</w:t>
-            </w:r>
-          </w:p>
-        </w:tc>
-        <w:tc>
-          <w:tcPr>
-            <w:tcW w:w="435" w:type="dxa"/>
-            <w:tcBorders>
-              <w:left w:val="single" w:sz="4" w:space="0" w:color="000000"/>
-              <w:bottom w:val="single" w:sz="4" w:space="0" w:color="000000"/>
-            </w:tcBorders>
-            <w:vAlign w:val="center"/>
-          </w:tcPr>
-          <w:p>
-            <w:pPr>
-              <w:pStyle w:val="user2"/>
-              <w:spacing w:lineRule="auto" w:line="240" w:before="57" w:after="57"/>
-              <w:ind w:hanging="0"/>
-              <w:jc w:val="center"/>
-              <w:rPr>
-                <w:sz w:val="16"/>
-                <w:szCs w:val="16"/>
-              </w:rPr>
-            </w:pPr>
-            <w:r>
-              <w:rPr>
-                <w:sz w:val="16"/>
-                <w:szCs w:val="16"/>
-              </w:rPr>
-              <w:t>5</w:t>
-            </w:r>
-          </w:p>
-        </w:tc>
-        <w:tc>
-          <w:tcPr>
-            <w:tcW w:w="964" w:type="dxa"/>
+            <w:tcW w:w="1295" w:type="dxa"/>
             <w:vMerge w:val="continue"/>
             <w:tcBorders>
               <w:left w:val="single" w:sz="4" w:space="0" w:color="000000"/>
@@ -3774,7 +3929,7 @@
         <w:trPr/>
         <w:tc>
           <w:tcPr>
-            <w:tcW w:w="515" w:type="dxa"/>
+            <w:tcW w:w="516" w:type="dxa"/>
             <w:tcBorders>
               <w:left w:val="single" w:sz="4" w:space="0" w:color="000000"/>
               <w:bottom w:val="single" w:sz="4" w:space="0" w:color="000000"/>
@@ -3802,7 +3957,7 @@
         </w:tc>
         <w:tc>
           <w:tcPr>
-            <w:tcW w:w="4052" w:type="dxa"/>
+            <w:tcW w:w="3780" w:type="dxa"/>
             <w:tcBorders>
               <w:left w:val="single" w:sz="4" w:space="0" w:color="000000"/>
               <w:bottom w:val="single" w:sz="4" w:space="0" w:color="000000"/>
@@ -3832,143 +3987,85 @@
         </w:tc>
         <w:tc>
           <w:tcPr>
-            <w:tcW w:w="436" w:type="dxa"/>
-            <w:tcBorders>
-              <w:left w:val="single" w:sz="4" w:space="0" w:color="000000"/>
-              <w:bottom w:val="single" w:sz="4" w:space="0" w:color="000000"/>
-            </w:tcBorders>
-            <w:vAlign w:val="center"/>
-          </w:tcPr>
-          <w:p>
-            <w:pPr>
-              <w:pStyle w:val="user2"/>
-              <w:spacing w:lineRule="auto" w:line="240" w:before="57" w:after="57"/>
-              <w:ind w:hanging="0"/>
-              <w:rPr>
-                <w:sz w:val="16"/>
-                <w:szCs w:val="16"/>
-              </w:rPr>
-            </w:pPr>
-            <w:r>
-              <w:rPr>
-                <w:sz w:val="16"/>
-                <w:szCs w:val="16"/>
-              </w:rPr>
-              <w:t>+</w:t>
-            </w:r>
-          </w:p>
-        </w:tc>
-        <w:tc>
-          <w:tcPr>
-            <w:tcW w:w="437" w:type="dxa"/>
-            <w:tcBorders>
-              <w:left w:val="single" w:sz="4" w:space="0" w:color="000000"/>
-              <w:bottom w:val="single" w:sz="4" w:space="0" w:color="000000"/>
-            </w:tcBorders>
-            <w:vAlign w:val="center"/>
-          </w:tcPr>
-          <w:p>
-            <w:pPr>
-              <w:pStyle w:val="user2"/>
-              <w:spacing w:lineRule="auto" w:line="240" w:before="57" w:after="57"/>
-              <w:ind w:hanging="0"/>
-              <w:rPr>
-                <w:sz w:val="16"/>
-                <w:szCs w:val="16"/>
-              </w:rPr>
-            </w:pPr>
-            <w:r>
-              <w:rPr>
-                <w:sz w:val="16"/>
-                <w:szCs w:val="16"/>
-              </w:rPr>
-            </w:r>
-          </w:p>
-        </w:tc>
-        <w:tc>
-          <w:tcPr>
-            <w:tcW w:w="435" w:type="dxa"/>
-            <w:tcBorders>
-              <w:left w:val="single" w:sz="4" w:space="0" w:color="000000"/>
-              <w:bottom w:val="single" w:sz="4" w:space="0" w:color="000000"/>
-            </w:tcBorders>
-            <w:vAlign w:val="center"/>
-          </w:tcPr>
-          <w:p>
-            <w:pPr>
-              <w:pStyle w:val="user2"/>
-              <w:spacing w:lineRule="auto" w:line="240" w:before="57" w:after="57"/>
-              <w:ind w:hanging="0"/>
-              <w:rPr>
-                <w:sz w:val="16"/>
-                <w:szCs w:val="16"/>
-              </w:rPr>
-            </w:pPr>
-            <w:r>
-              <w:rPr>
-                <w:sz w:val="16"/>
-                <w:szCs w:val="16"/>
-              </w:rPr>
-            </w:r>
-          </w:p>
-        </w:tc>
-        <w:tc>
-          <w:tcPr>
-            <w:tcW w:w="437" w:type="dxa"/>
-            <w:tcBorders>
-              <w:left w:val="single" w:sz="4" w:space="0" w:color="000000"/>
-              <w:bottom w:val="single" w:sz="4" w:space="0" w:color="000000"/>
-            </w:tcBorders>
-            <w:vAlign w:val="center"/>
-          </w:tcPr>
-          <w:p>
-            <w:pPr>
-              <w:pStyle w:val="user2"/>
-              <w:spacing w:lineRule="auto" w:line="240" w:before="57" w:after="57"/>
-              <w:ind w:hanging="0"/>
-              <w:rPr>
-                <w:sz w:val="16"/>
-                <w:szCs w:val="16"/>
-              </w:rPr>
-            </w:pPr>
-            <w:r>
-              <w:rPr>
-                <w:sz w:val="16"/>
-                <w:szCs w:val="16"/>
-              </w:rPr>
-            </w:r>
-          </w:p>
-        </w:tc>
-        <w:tc>
-          <w:tcPr>
-            <w:tcW w:w="435" w:type="dxa"/>
-            <w:tcBorders>
-              <w:left w:val="single" w:sz="4" w:space="0" w:color="000000"/>
-              <w:bottom w:val="single" w:sz="4" w:space="0" w:color="000000"/>
-            </w:tcBorders>
-            <w:vAlign w:val="center"/>
-          </w:tcPr>
-          <w:p>
-            <w:pPr>
-              <w:pStyle w:val="user2"/>
-              <w:spacing w:lineRule="auto" w:line="240" w:before="57" w:after="57"/>
-              <w:ind w:hanging="0"/>
-              <w:rPr>
-                <w:sz w:val="16"/>
-                <w:szCs w:val="16"/>
-              </w:rPr>
-            </w:pPr>
-            <w:r>
-              <w:rPr>
-                <w:sz w:val="16"/>
-                <w:szCs w:val="16"/>
-              </w:rPr>
-            </w:r>
-          </w:p>
-        </w:tc>
-        <w:tc>
-          <w:tcPr>
-            <w:tcW w:w="964" w:type="dxa"/>
+            <w:tcW w:w="748" w:type="dxa"/>
+            <w:tcBorders>
+              <w:left w:val="single" w:sz="4" w:space="0" w:color="000000"/>
+              <w:bottom w:val="single" w:sz="4" w:space="0" w:color="000000"/>
+            </w:tcBorders>
+            <w:vAlign w:val="center"/>
+          </w:tcPr>
+          <w:p>
+            <w:pPr>
+              <w:pStyle w:val="user2"/>
+              <w:spacing w:lineRule="auto" w:line="240" w:before="57" w:after="57"/>
+              <w:ind w:hanging="0"/>
+              <w:rPr>
+                <w:sz w:val="16"/>
+                <w:szCs w:val="16"/>
+              </w:rPr>
+            </w:pPr>
+            <w:r>
+              <w:rPr/>
+            </w:r>
+          </w:p>
+        </w:tc>
+        <w:tc>
+          <w:tcPr>
+            <w:tcW w:w="737" w:type="dxa"/>
+            <w:tcBorders>
+              <w:left w:val="single" w:sz="4" w:space="0" w:color="000000"/>
+              <w:bottom w:val="single" w:sz="4" w:space="0" w:color="000000"/>
+            </w:tcBorders>
+            <w:vAlign w:val="center"/>
+          </w:tcPr>
+          <w:p>
+            <w:pPr>
+              <w:pStyle w:val="user2"/>
+              <w:spacing w:lineRule="auto" w:line="240" w:before="57" w:after="57"/>
+              <w:ind w:hanging="0"/>
+              <w:rPr>
+                <w:sz w:val="16"/>
+                <w:szCs w:val="16"/>
+              </w:rPr>
+            </w:pPr>
+            <w:r>
+              <w:rPr>
+                <w:sz w:val="16"/>
+                <w:szCs w:val="16"/>
+              </w:rPr>
+            </w:r>
+          </w:p>
+        </w:tc>
+        <w:tc>
+          <w:tcPr>
+            <w:tcW w:w="695" w:type="dxa"/>
+            <w:tcBorders>
+              <w:left w:val="single" w:sz="4" w:space="0" w:color="000000"/>
+              <w:bottom w:val="single" w:sz="4" w:space="0" w:color="000000"/>
+            </w:tcBorders>
+            <w:vAlign w:val="center"/>
+          </w:tcPr>
+          <w:p>
+            <w:pPr>
+              <w:pStyle w:val="user2"/>
+              <w:spacing w:lineRule="auto" w:line="240" w:before="57" w:after="57"/>
+              <w:ind w:hanging="0"/>
+              <w:rPr>
+                <w:sz w:val="16"/>
+                <w:szCs w:val="16"/>
+              </w:rPr>
+            </w:pPr>
+            <w:r>
+              <w:rPr>
+                <w:sz w:val="16"/>
+                <w:szCs w:val="16"/>
+              </w:rPr>
+            </w:r>
+          </w:p>
+        </w:tc>
+        <w:tc>
+          <w:tcPr>
+            <w:tcW w:w="1295" w:type="dxa"/>
             <w:tcBorders>
               <w:left w:val="single" w:sz="4" w:space="0" w:color="000000"/>
               <w:bottom w:val="single" w:sz="4" w:space="0" w:color="000000"/>
@@ -3987,11 +4084,7 @@
               </w:rPr>
             </w:pPr>
             <w:r>
-              <w:rPr>
-                <w:sz w:val="16"/>
-                <w:szCs w:val="16"/>
-              </w:rPr>
-              <w:t>+</w:t>
+              <w:rPr/>
             </w:r>
           </w:p>
         </w:tc>
@@ -4000,7 +4093,7 @@
         <w:trPr/>
         <w:tc>
           <w:tcPr>
-            <w:tcW w:w="515" w:type="dxa"/>
+            <w:tcW w:w="516" w:type="dxa"/>
             <w:tcBorders>
               <w:left w:val="single" w:sz="4" w:space="0" w:color="000000"/>
               <w:bottom w:val="single" w:sz="4" w:space="0" w:color="000000"/>
@@ -4028,7 +4121,7 @@
         </w:tc>
         <w:tc>
           <w:tcPr>
-            <w:tcW w:w="4052" w:type="dxa"/>
+            <w:tcW w:w="3780" w:type="dxa"/>
             <w:tcBorders>
               <w:left w:val="single" w:sz="4" w:space="0" w:color="000000"/>
               <w:bottom w:val="single" w:sz="4" w:space="0" w:color="000000"/>
@@ -4056,143 +4149,85 @@
         </w:tc>
         <w:tc>
           <w:tcPr>
-            <w:tcW w:w="436" w:type="dxa"/>
-            <w:tcBorders>
-              <w:left w:val="single" w:sz="4" w:space="0" w:color="000000"/>
-              <w:bottom w:val="single" w:sz="4" w:space="0" w:color="000000"/>
-            </w:tcBorders>
-            <w:vAlign w:val="center"/>
-          </w:tcPr>
-          <w:p>
-            <w:pPr>
-              <w:pStyle w:val="user2"/>
-              <w:spacing w:lineRule="auto" w:line="240" w:before="57" w:after="57"/>
-              <w:ind w:hanging="0"/>
-              <w:rPr>
-                <w:sz w:val="16"/>
-                <w:szCs w:val="16"/>
-              </w:rPr>
-            </w:pPr>
-            <w:r>
-              <w:rPr>
-                <w:sz w:val="16"/>
-                <w:szCs w:val="16"/>
-              </w:rPr>
-              <w:t>+</w:t>
-            </w:r>
-          </w:p>
-        </w:tc>
-        <w:tc>
-          <w:tcPr>
-            <w:tcW w:w="437" w:type="dxa"/>
-            <w:tcBorders>
-              <w:left w:val="single" w:sz="4" w:space="0" w:color="000000"/>
-              <w:bottom w:val="single" w:sz="4" w:space="0" w:color="000000"/>
-            </w:tcBorders>
-            <w:vAlign w:val="center"/>
-          </w:tcPr>
-          <w:p>
-            <w:pPr>
-              <w:pStyle w:val="user2"/>
-              <w:spacing w:lineRule="auto" w:line="240" w:before="57" w:after="57"/>
-              <w:ind w:hanging="0"/>
-              <w:rPr>
-                <w:sz w:val="16"/>
-                <w:szCs w:val="16"/>
-              </w:rPr>
-            </w:pPr>
-            <w:r>
-              <w:rPr>
-                <w:sz w:val="16"/>
-                <w:szCs w:val="16"/>
-              </w:rPr>
-            </w:r>
-          </w:p>
-        </w:tc>
-        <w:tc>
-          <w:tcPr>
-            <w:tcW w:w="435" w:type="dxa"/>
-            <w:tcBorders>
-              <w:left w:val="single" w:sz="4" w:space="0" w:color="000000"/>
-              <w:bottom w:val="single" w:sz="4" w:space="0" w:color="000000"/>
-            </w:tcBorders>
-            <w:vAlign w:val="center"/>
-          </w:tcPr>
-          <w:p>
-            <w:pPr>
-              <w:pStyle w:val="user2"/>
-              <w:spacing w:lineRule="auto" w:line="240" w:before="57" w:after="57"/>
-              <w:ind w:hanging="0"/>
-              <w:rPr>
-                <w:sz w:val="16"/>
-                <w:szCs w:val="16"/>
-              </w:rPr>
-            </w:pPr>
-            <w:r>
-              <w:rPr>
-                <w:sz w:val="16"/>
-                <w:szCs w:val="16"/>
-              </w:rPr>
-            </w:r>
-          </w:p>
-        </w:tc>
-        <w:tc>
-          <w:tcPr>
-            <w:tcW w:w="437" w:type="dxa"/>
-            <w:tcBorders>
-              <w:left w:val="single" w:sz="4" w:space="0" w:color="000000"/>
-              <w:bottom w:val="single" w:sz="4" w:space="0" w:color="000000"/>
-            </w:tcBorders>
-            <w:vAlign w:val="center"/>
-          </w:tcPr>
-          <w:p>
-            <w:pPr>
-              <w:pStyle w:val="user2"/>
-              <w:spacing w:lineRule="auto" w:line="240" w:before="57" w:after="57"/>
-              <w:ind w:hanging="0"/>
-              <w:rPr>
-                <w:sz w:val="16"/>
-                <w:szCs w:val="16"/>
-              </w:rPr>
-            </w:pPr>
-            <w:r>
-              <w:rPr>
-                <w:sz w:val="16"/>
-                <w:szCs w:val="16"/>
-              </w:rPr>
-            </w:r>
-          </w:p>
-        </w:tc>
-        <w:tc>
-          <w:tcPr>
-            <w:tcW w:w="435" w:type="dxa"/>
-            <w:tcBorders>
-              <w:left w:val="single" w:sz="4" w:space="0" w:color="000000"/>
-              <w:bottom w:val="single" w:sz="4" w:space="0" w:color="000000"/>
-            </w:tcBorders>
-            <w:vAlign w:val="center"/>
-          </w:tcPr>
-          <w:p>
-            <w:pPr>
-              <w:pStyle w:val="user2"/>
-              <w:spacing w:lineRule="auto" w:line="240" w:before="57" w:after="57"/>
-              <w:ind w:hanging="0"/>
-              <w:rPr>
-                <w:sz w:val="16"/>
-                <w:szCs w:val="16"/>
-              </w:rPr>
-            </w:pPr>
-            <w:r>
-              <w:rPr>
-                <w:sz w:val="16"/>
-                <w:szCs w:val="16"/>
-              </w:rPr>
-            </w:r>
-          </w:p>
-        </w:tc>
-        <w:tc>
-          <w:tcPr>
-            <w:tcW w:w="964" w:type="dxa"/>
+            <w:tcW w:w="748" w:type="dxa"/>
+            <w:tcBorders>
+              <w:left w:val="single" w:sz="4" w:space="0" w:color="000000"/>
+              <w:bottom w:val="single" w:sz="4" w:space="0" w:color="000000"/>
+            </w:tcBorders>
+            <w:vAlign w:val="center"/>
+          </w:tcPr>
+          <w:p>
+            <w:pPr>
+              <w:pStyle w:val="user2"/>
+              <w:spacing w:lineRule="auto" w:line="240" w:before="57" w:after="57"/>
+              <w:ind w:hanging="0"/>
+              <w:rPr>
+                <w:sz w:val="16"/>
+                <w:szCs w:val="16"/>
+              </w:rPr>
+            </w:pPr>
+            <w:r>
+              <w:rPr/>
+            </w:r>
+          </w:p>
+        </w:tc>
+        <w:tc>
+          <w:tcPr>
+            <w:tcW w:w="737" w:type="dxa"/>
+            <w:tcBorders>
+              <w:left w:val="single" w:sz="4" w:space="0" w:color="000000"/>
+              <w:bottom w:val="single" w:sz="4" w:space="0" w:color="000000"/>
+            </w:tcBorders>
+            <w:vAlign w:val="center"/>
+          </w:tcPr>
+          <w:p>
+            <w:pPr>
+              <w:pStyle w:val="user2"/>
+              <w:spacing w:lineRule="auto" w:line="240" w:before="57" w:after="57"/>
+              <w:ind w:hanging="0"/>
+              <w:rPr>
+                <w:sz w:val="16"/>
+                <w:szCs w:val="16"/>
+              </w:rPr>
+            </w:pPr>
+            <w:r>
+              <w:rPr>
+                <w:sz w:val="16"/>
+                <w:szCs w:val="16"/>
+              </w:rPr>
+            </w:r>
+          </w:p>
+        </w:tc>
+        <w:tc>
+          <w:tcPr>
+            <w:tcW w:w="695" w:type="dxa"/>
+            <w:tcBorders>
+              <w:left w:val="single" w:sz="4" w:space="0" w:color="000000"/>
+              <w:bottom w:val="single" w:sz="4" w:space="0" w:color="000000"/>
+            </w:tcBorders>
+            <w:vAlign w:val="center"/>
+          </w:tcPr>
+          <w:p>
+            <w:pPr>
+              <w:pStyle w:val="user2"/>
+              <w:spacing w:lineRule="auto" w:line="240" w:before="57" w:after="57"/>
+              <w:ind w:hanging="0"/>
+              <w:rPr>
+                <w:sz w:val="16"/>
+                <w:szCs w:val="16"/>
+              </w:rPr>
+            </w:pPr>
+            <w:r>
+              <w:rPr>
+                <w:sz w:val="16"/>
+                <w:szCs w:val="16"/>
+              </w:rPr>
+            </w:r>
+          </w:p>
+        </w:tc>
+        <w:tc>
+          <w:tcPr>
+            <w:tcW w:w="1295" w:type="dxa"/>
             <w:tcBorders>
               <w:left w:val="single" w:sz="4" w:space="0" w:color="000000"/>
               <w:bottom w:val="single" w:sz="4" w:space="0" w:color="000000"/>
@@ -4211,11 +4246,7 @@
               </w:rPr>
             </w:pPr>
             <w:r>
-              <w:rPr>
-                <w:sz w:val="16"/>
-                <w:szCs w:val="16"/>
-              </w:rPr>
-              <w:t>+</w:t>
+              <w:rPr/>
             </w:r>
           </w:p>
         </w:tc>
@@ -4224,7 +4255,7 @@
         <w:trPr/>
         <w:tc>
           <w:tcPr>
-            <w:tcW w:w="515" w:type="dxa"/>
+            <w:tcW w:w="516" w:type="dxa"/>
             <w:tcBorders>
               <w:left w:val="single" w:sz="4" w:space="0" w:color="000000"/>
               <w:bottom w:val="single" w:sz="4" w:space="0" w:color="000000"/>
@@ -4252,7 +4283,7 @@
         </w:tc>
         <w:tc>
           <w:tcPr>
-            <w:tcW w:w="4052" w:type="dxa"/>
+            <w:tcW w:w="3780" w:type="dxa"/>
             <w:tcBorders>
               <w:left w:val="single" w:sz="4" w:space="0" w:color="000000"/>
               <w:bottom w:val="single" w:sz="4" w:space="0" w:color="000000"/>
@@ -4280,143 +4311,85 @@
         </w:tc>
         <w:tc>
           <w:tcPr>
-            <w:tcW w:w="436" w:type="dxa"/>
-            <w:tcBorders>
-              <w:left w:val="single" w:sz="4" w:space="0" w:color="000000"/>
-              <w:bottom w:val="single" w:sz="4" w:space="0" w:color="000000"/>
-            </w:tcBorders>
-            <w:vAlign w:val="center"/>
-          </w:tcPr>
-          <w:p>
-            <w:pPr>
-              <w:pStyle w:val="user2"/>
-              <w:spacing w:lineRule="auto" w:line="240" w:before="57" w:after="57"/>
-              <w:ind w:hanging="0"/>
-              <w:rPr>
-                <w:sz w:val="16"/>
-                <w:szCs w:val="16"/>
-              </w:rPr>
-            </w:pPr>
-            <w:r>
-              <w:rPr>
-                <w:sz w:val="16"/>
-                <w:szCs w:val="16"/>
-              </w:rPr>
-              <w:t>+</w:t>
-            </w:r>
-          </w:p>
-        </w:tc>
-        <w:tc>
-          <w:tcPr>
-            <w:tcW w:w="437" w:type="dxa"/>
-            <w:tcBorders>
-              <w:left w:val="single" w:sz="4" w:space="0" w:color="000000"/>
-              <w:bottom w:val="single" w:sz="4" w:space="0" w:color="000000"/>
-            </w:tcBorders>
-            <w:vAlign w:val="center"/>
-          </w:tcPr>
-          <w:p>
-            <w:pPr>
-              <w:pStyle w:val="user2"/>
-              <w:spacing w:lineRule="auto" w:line="240" w:before="57" w:after="57"/>
-              <w:ind w:hanging="0"/>
-              <w:rPr>
-                <w:sz w:val="16"/>
-                <w:szCs w:val="16"/>
-              </w:rPr>
-            </w:pPr>
-            <w:r>
-              <w:rPr>
-                <w:sz w:val="16"/>
-                <w:szCs w:val="16"/>
-              </w:rPr>
-            </w:r>
-          </w:p>
-        </w:tc>
-        <w:tc>
-          <w:tcPr>
-            <w:tcW w:w="435" w:type="dxa"/>
-            <w:tcBorders>
-              <w:left w:val="single" w:sz="4" w:space="0" w:color="000000"/>
-              <w:bottom w:val="single" w:sz="4" w:space="0" w:color="000000"/>
-            </w:tcBorders>
-            <w:vAlign w:val="center"/>
-          </w:tcPr>
-          <w:p>
-            <w:pPr>
-              <w:pStyle w:val="user2"/>
-              <w:spacing w:lineRule="auto" w:line="240" w:before="57" w:after="57"/>
-              <w:ind w:hanging="0"/>
-              <w:rPr>
-                <w:sz w:val="16"/>
-                <w:szCs w:val="16"/>
-              </w:rPr>
-            </w:pPr>
-            <w:r>
-              <w:rPr>
-                <w:sz w:val="16"/>
-                <w:szCs w:val="16"/>
-              </w:rPr>
-            </w:r>
-          </w:p>
-        </w:tc>
-        <w:tc>
-          <w:tcPr>
-            <w:tcW w:w="437" w:type="dxa"/>
-            <w:tcBorders>
-              <w:left w:val="single" w:sz="4" w:space="0" w:color="000000"/>
-              <w:bottom w:val="single" w:sz="4" w:space="0" w:color="000000"/>
-            </w:tcBorders>
-            <w:vAlign w:val="center"/>
-          </w:tcPr>
-          <w:p>
-            <w:pPr>
-              <w:pStyle w:val="user2"/>
-              <w:spacing w:lineRule="auto" w:line="240" w:before="57" w:after="57"/>
-              <w:ind w:hanging="0"/>
-              <w:rPr>
-                <w:sz w:val="16"/>
-                <w:szCs w:val="16"/>
-              </w:rPr>
-            </w:pPr>
-            <w:r>
-              <w:rPr>
-                <w:sz w:val="16"/>
-                <w:szCs w:val="16"/>
-              </w:rPr>
-            </w:r>
-          </w:p>
-        </w:tc>
-        <w:tc>
-          <w:tcPr>
-            <w:tcW w:w="435" w:type="dxa"/>
-            <w:tcBorders>
-              <w:left w:val="single" w:sz="4" w:space="0" w:color="000000"/>
-              <w:bottom w:val="single" w:sz="4" w:space="0" w:color="000000"/>
-            </w:tcBorders>
-            <w:vAlign w:val="center"/>
-          </w:tcPr>
-          <w:p>
-            <w:pPr>
-              <w:pStyle w:val="user2"/>
-              <w:spacing w:lineRule="auto" w:line="240" w:before="57" w:after="57"/>
-              <w:ind w:hanging="0"/>
-              <w:rPr>
-                <w:sz w:val="16"/>
-                <w:szCs w:val="16"/>
-              </w:rPr>
-            </w:pPr>
-            <w:r>
-              <w:rPr>
-                <w:sz w:val="16"/>
-                <w:szCs w:val="16"/>
-              </w:rPr>
-            </w:r>
-          </w:p>
-        </w:tc>
-        <w:tc>
-          <w:tcPr>
-            <w:tcW w:w="964" w:type="dxa"/>
+            <w:tcW w:w="748" w:type="dxa"/>
+            <w:tcBorders>
+              <w:left w:val="single" w:sz="4" w:space="0" w:color="000000"/>
+              <w:bottom w:val="single" w:sz="4" w:space="0" w:color="000000"/>
+            </w:tcBorders>
+            <w:vAlign w:val="center"/>
+          </w:tcPr>
+          <w:p>
+            <w:pPr>
+              <w:pStyle w:val="user2"/>
+              <w:spacing w:lineRule="auto" w:line="240" w:before="57" w:after="57"/>
+              <w:ind w:hanging="0"/>
+              <w:rPr>
+                <w:sz w:val="16"/>
+                <w:szCs w:val="16"/>
+              </w:rPr>
+            </w:pPr>
+            <w:r>
+              <w:rPr/>
+            </w:r>
+          </w:p>
+        </w:tc>
+        <w:tc>
+          <w:tcPr>
+            <w:tcW w:w="737" w:type="dxa"/>
+            <w:tcBorders>
+              <w:left w:val="single" w:sz="4" w:space="0" w:color="000000"/>
+              <w:bottom w:val="single" w:sz="4" w:space="0" w:color="000000"/>
+            </w:tcBorders>
+            <w:vAlign w:val="center"/>
+          </w:tcPr>
+          <w:p>
+            <w:pPr>
+              <w:pStyle w:val="user2"/>
+              <w:spacing w:lineRule="auto" w:line="240" w:before="57" w:after="57"/>
+              <w:ind w:hanging="0"/>
+              <w:rPr>
+                <w:sz w:val="16"/>
+                <w:szCs w:val="16"/>
+              </w:rPr>
+            </w:pPr>
+            <w:r>
+              <w:rPr>
+                <w:sz w:val="16"/>
+                <w:szCs w:val="16"/>
+              </w:rPr>
+            </w:r>
+          </w:p>
+        </w:tc>
+        <w:tc>
+          <w:tcPr>
+            <w:tcW w:w="695" w:type="dxa"/>
+            <w:tcBorders>
+              <w:left w:val="single" w:sz="4" w:space="0" w:color="000000"/>
+              <w:bottom w:val="single" w:sz="4" w:space="0" w:color="000000"/>
+            </w:tcBorders>
+            <w:vAlign w:val="center"/>
+          </w:tcPr>
+          <w:p>
+            <w:pPr>
+              <w:pStyle w:val="user2"/>
+              <w:spacing w:lineRule="auto" w:line="240" w:before="57" w:after="57"/>
+              <w:ind w:hanging="0"/>
+              <w:rPr>
+                <w:sz w:val="16"/>
+                <w:szCs w:val="16"/>
+              </w:rPr>
+            </w:pPr>
+            <w:r>
+              <w:rPr>
+                <w:sz w:val="16"/>
+                <w:szCs w:val="16"/>
+              </w:rPr>
+            </w:r>
+          </w:p>
+        </w:tc>
+        <w:tc>
+          <w:tcPr>
+            <w:tcW w:w="1295" w:type="dxa"/>
             <w:tcBorders>
               <w:left w:val="single" w:sz="4" w:space="0" w:color="000000"/>
               <w:bottom w:val="single" w:sz="4" w:space="0" w:color="000000"/>
@@ -4435,11 +4408,7 @@
               </w:rPr>
             </w:pPr>
             <w:r>
-              <w:rPr>
-                <w:sz w:val="16"/>
-                <w:szCs w:val="16"/>
-              </w:rPr>
-              <w:t>+</w:t>
+              <w:rPr/>
             </w:r>
           </w:p>
         </w:tc>
@@ -4448,7 +4417,7 @@
         <w:trPr/>
         <w:tc>
           <w:tcPr>
-            <w:tcW w:w="515" w:type="dxa"/>
+            <w:tcW w:w="516" w:type="dxa"/>
             <w:tcBorders>
               <w:left w:val="single" w:sz="4" w:space="0" w:color="000000"/>
               <w:bottom w:val="single" w:sz="4" w:space="0" w:color="000000"/>
@@ -4476,7 +4445,7 @@
         </w:tc>
         <w:tc>
           <w:tcPr>
-            <w:tcW w:w="4052" w:type="dxa"/>
+            <w:tcW w:w="3780" w:type="dxa"/>
             <w:tcBorders>
               <w:left w:val="single" w:sz="4" w:space="0" w:color="000000"/>
               <w:bottom w:val="single" w:sz="4" w:space="0" w:color="000000"/>
@@ -4504,143 +4473,85 @@
         </w:tc>
         <w:tc>
           <w:tcPr>
-            <w:tcW w:w="436" w:type="dxa"/>
-            <w:tcBorders>
-              <w:left w:val="single" w:sz="4" w:space="0" w:color="000000"/>
-              <w:bottom w:val="single" w:sz="4" w:space="0" w:color="000000"/>
-            </w:tcBorders>
-            <w:vAlign w:val="center"/>
-          </w:tcPr>
-          <w:p>
-            <w:pPr>
-              <w:pStyle w:val="user2"/>
-              <w:spacing w:lineRule="auto" w:line="240" w:before="57" w:after="57"/>
-              <w:ind w:hanging="0"/>
-              <w:rPr>
-                <w:sz w:val="16"/>
-                <w:szCs w:val="16"/>
-              </w:rPr>
-            </w:pPr>
-            <w:r>
-              <w:rPr>
-                <w:sz w:val="16"/>
-                <w:szCs w:val="16"/>
-              </w:rPr>
-              <w:t>+</w:t>
-            </w:r>
-          </w:p>
-        </w:tc>
-        <w:tc>
-          <w:tcPr>
-            <w:tcW w:w="437" w:type="dxa"/>
-            <w:tcBorders>
-              <w:left w:val="single" w:sz="4" w:space="0" w:color="000000"/>
-              <w:bottom w:val="single" w:sz="4" w:space="0" w:color="000000"/>
-            </w:tcBorders>
-            <w:vAlign w:val="center"/>
-          </w:tcPr>
-          <w:p>
-            <w:pPr>
-              <w:pStyle w:val="user2"/>
-              <w:spacing w:lineRule="auto" w:line="240" w:before="57" w:after="57"/>
-              <w:ind w:hanging="0"/>
-              <w:rPr>
-                <w:sz w:val="16"/>
-                <w:szCs w:val="16"/>
-              </w:rPr>
-            </w:pPr>
-            <w:r>
-              <w:rPr>
-                <w:sz w:val="16"/>
-                <w:szCs w:val="16"/>
-              </w:rPr>
-            </w:r>
-          </w:p>
-        </w:tc>
-        <w:tc>
-          <w:tcPr>
-            <w:tcW w:w="435" w:type="dxa"/>
-            <w:tcBorders>
-              <w:left w:val="single" w:sz="4" w:space="0" w:color="000000"/>
-              <w:bottom w:val="single" w:sz="4" w:space="0" w:color="000000"/>
-            </w:tcBorders>
-            <w:vAlign w:val="center"/>
-          </w:tcPr>
-          <w:p>
-            <w:pPr>
-              <w:pStyle w:val="user2"/>
-              <w:spacing w:lineRule="auto" w:line="240" w:before="57" w:after="57"/>
-              <w:ind w:hanging="0"/>
-              <w:rPr>
-                <w:sz w:val="16"/>
-                <w:szCs w:val="16"/>
-              </w:rPr>
-            </w:pPr>
-            <w:r>
-              <w:rPr>
-                <w:sz w:val="16"/>
-                <w:szCs w:val="16"/>
-              </w:rPr>
-            </w:r>
-          </w:p>
-        </w:tc>
-        <w:tc>
-          <w:tcPr>
-            <w:tcW w:w="437" w:type="dxa"/>
-            <w:tcBorders>
-              <w:left w:val="single" w:sz="4" w:space="0" w:color="000000"/>
-              <w:bottom w:val="single" w:sz="4" w:space="0" w:color="000000"/>
-            </w:tcBorders>
-            <w:vAlign w:val="center"/>
-          </w:tcPr>
-          <w:p>
-            <w:pPr>
-              <w:pStyle w:val="user2"/>
-              <w:spacing w:lineRule="auto" w:line="240" w:before="57" w:after="57"/>
-              <w:ind w:hanging="0"/>
-              <w:rPr>
-                <w:sz w:val="16"/>
-                <w:szCs w:val="16"/>
-              </w:rPr>
-            </w:pPr>
-            <w:r>
-              <w:rPr>
-                <w:sz w:val="16"/>
-                <w:szCs w:val="16"/>
-              </w:rPr>
-            </w:r>
-          </w:p>
-        </w:tc>
-        <w:tc>
-          <w:tcPr>
-            <w:tcW w:w="435" w:type="dxa"/>
-            <w:tcBorders>
-              <w:left w:val="single" w:sz="4" w:space="0" w:color="000000"/>
-              <w:bottom w:val="single" w:sz="4" w:space="0" w:color="000000"/>
-            </w:tcBorders>
-            <w:vAlign w:val="center"/>
-          </w:tcPr>
-          <w:p>
-            <w:pPr>
-              <w:pStyle w:val="user2"/>
-              <w:spacing w:lineRule="auto" w:line="240" w:before="57" w:after="57"/>
-              <w:ind w:hanging="0"/>
-              <w:rPr>
-                <w:sz w:val="16"/>
-                <w:szCs w:val="16"/>
-              </w:rPr>
-            </w:pPr>
-            <w:r>
-              <w:rPr>
-                <w:sz w:val="16"/>
-                <w:szCs w:val="16"/>
-              </w:rPr>
-            </w:r>
-          </w:p>
-        </w:tc>
-        <w:tc>
-          <w:tcPr>
-            <w:tcW w:w="964" w:type="dxa"/>
+            <w:tcW w:w="748" w:type="dxa"/>
+            <w:tcBorders>
+              <w:left w:val="single" w:sz="4" w:space="0" w:color="000000"/>
+              <w:bottom w:val="single" w:sz="4" w:space="0" w:color="000000"/>
+            </w:tcBorders>
+            <w:vAlign w:val="center"/>
+          </w:tcPr>
+          <w:p>
+            <w:pPr>
+              <w:pStyle w:val="user2"/>
+              <w:spacing w:lineRule="auto" w:line="240" w:before="57" w:after="57"/>
+              <w:ind w:hanging="0"/>
+              <w:rPr>
+                <w:sz w:val="16"/>
+                <w:szCs w:val="16"/>
+              </w:rPr>
+            </w:pPr>
+            <w:r>
+              <w:rPr/>
+            </w:r>
+          </w:p>
+        </w:tc>
+        <w:tc>
+          <w:tcPr>
+            <w:tcW w:w="737" w:type="dxa"/>
+            <w:tcBorders>
+              <w:left w:val="single" w:sz="4" w:space="0" w:color="000000"/>
+              <w:bottom w:val="single" w:sz="4" w:space="0" w:color="000000"/>
+            </w:tcBorders>
+            <w:vAlign w:val="center"/>
+          </w:tcPr>
+          <w:p>
+            <w:pPr>
+              <w:pStyle w:val="user2"/>
+              <w:spacing w:lineRule="auto" w:line="240" w:before="57" w:after="57"/>
+              <w:ind w:hanging="0"/>
+              <w:rPr>
+                <w:sz w:val="16"/>
+                <w:szCs w:val="16"/>
+              </w:rPr>
+            </w:pPr>
+            <w:r>
+              <w:rPr>
+                <w:sz w:val="16"/>
+                <w:szCs w:val="16"/>
+              </w:rPr>
+            </w:r>
+          </w:p>
+        </w:tc>
+        <w:tc>
+          <w:tcPr>
+            <w:tcW w:w="695" w:type="dxa"/>
+            <w:tcBorders>
+              <w:left w:val="single" w:sz="4" w:space="0" w:color="000000"/>
+              <w:bottom w:val="single" w:sz="4" w:space="0" w:color="000000"/>
+            </w:tcBorders>
+            <w:vAlign w:val="center"/>
+          </w:tcPr>
+          <w:p>
+            <w:pPr>
+              <w:pStyle w:val="user2"/>
+              <w:spacing w:lineRule="auto" w:line="240" w:before="57" w:after="57"/>
+              <w:ind w:hanging="0"/>
+              <w:rPr>
+                <w:sz w:val="16"/>
+                <w:szCs w:val="16"/>
+              </w:rPr>
+            </w:pPr>
+            <w:r>
+              <w:rPr>
+                <w:sz w:val="16"/>
+                <w:szCs w:val="16"/>
+              </w:rPr>
+            </w:r>
+          </w:p>
+        </w:tc>
+        <w:tc>
+          <w:tcPr>
+            <w:tcW w:w="1295" w:type="dxa"/>
             <w:tcBorders>
               <w:left w:val="single" w:sz="4" w:space="0" w:color="000000"/>
               <w:bottom w:val="single" w:sz="4" w:space="0" w:color="000000"/>
@@ -4659,11 +4570,7 @@
               </w:rPr>
             </w:pPr>
             <w:r>
-              <w:rPr>
-                <w:sz w:val="16"/>
-                <w:szCs w:val="16"/>
-              </w:rPr>
-              <w:t>+</w:t>
+              <w:rPr/>
             </w:r>
           </w:p>
         </w:tc>
@@ -4672,7 +4579,7 @@
         <w:trPr/>
         <w:tc>
           <w:tcPr>
-            <w:tcW w:w="515" w:type="dxa"/>
+            <w:tcW w:w="516" w:type="dxa"/>
             <w:tcBorders>
               <w:left w:val="single" w:sz="4" w:space="0" w:color="000000"/>
               <w:bottom w:val="single" w:sz="4" w:space="0" w:color="000000"/>
@@ -4700,173 +4607,103 @@
         </w:tc>
         <w:tc>
           <w:tcPr>
-            <w:tcW w:w="4052" w:type="dxa"/>
-            <w:tcBorders>
-              <w:left w:val="single" w:sz="4" w:space="0" w:color="000000"/>
-              <w:bottom w:val="single" w:sz="4" w:space="0" w:color="000000"/>
-            </w:tcBorders>
-            <w:vAlign w:val="center"/>
-          </w:tcPr>
-          <w:p>
-            <w:pPr>
-              <w:pStyle w:val="user2"/>
-              <w:spacing w:lineRule="auto" w:line="240" w:before="57" w:after="57"/>
-              <w:ind w:hanging="0"/>
-              <w:rPr>
-                <w:sz w:val="16"/>
-                <w:szCs w:val="16"/>
-              </w:rPr>
-            </w:pPr>
-            <w:r>
-              <w:rPr>
-                <w:sz w:val="16"/>
-                <w:szCs w:val="16"/>
-              </w:rPr>
-              <w:t>Перегляд курсу з верстки</w:t>
-            </w:r>
-          </w:p>
-        </w:tc>
-        <w:tc>
-          <w:tcPr>
-            <w:tcW w:w="436" w:type="dxa"/>
-            <w:tcBorders>
-              <w:left w:val="single" w:sz="4" w:space="0" w:color="000000"/>
-              <w:bottom w:val="single" w:sz="4" w:space="0" w:color="000000"/>
-            </w:tcBorders>
-            <w:vAlign w:val="center"/>
-          </w:tcPr>
-          <w:p>
-            <w:pPr>
-              <w:pStyle w:val="user2"/>
-              <w:spacing w:lineRule="auto" w:line="240" w:before="57" w:after="57"/>
-              <w:ind w:hanging="0"/>
-              <w:rPr>
-                <w:sz w:val="16"/>
-                <w:szCs w:val="16"/>
-              </w:rPr>
-            </w:pPr>
-            <w:r>
-              <w:rPr>
-                <w:sz w:val="16"/>
-                <w:szCs w:val="16"/>
-              </w:rPr>
-              <w:t>+</w:t>
-            </w:r>
-          </w:p>
-        </w:tc>
-        <w:tc>
-          <w:tcPr>
-            <w:tcW w:w="437" w:type="dxa"/>
-            <w:tcBorders>
-              <w:left w:val="single" w:sz="4" w:space="0" w:color="000000"/>
-              <w:bottom w:val="single" w:sz="4" w:space="0" w:color="000000"/>
-            </w:tcBorders>
-            <w:vAlign w:val="center"/>
-          </w:tcPr>
-          <w:p>
-            <w:pPr>
-              <w:pStyle w:val="user2"/>
-              <w:spacing w:lineRule="auto" w:line="240" w:before="57" w:after="57"/>
-              <w:ind w:hanging="0"/>
-              <w:rPr>
-                <w:sz w:val="16"/>
-                <w:szCs w:val="16"/>
-              </w:rPr>
-            </w:pPr>
-            <w:r>
-              <w:rPr>
-                <w:sz w:val="16"/>
-                <w:szCs w:val="16"/>
-              </w:rPr>
-              <w:t>+</w:t>
-            </w:r>
-          </w:p>
-        </w:tc>
-        <w:tc>
-          <w:tcPr>
-            <w:tcW w:w="435" w:type="dxa"/>
-            <w:tcBorders>
-              <w:left w:val="single" w:sz="4" w:space="0" w:color="000000"/>
-              <w:bottom w:val="single" w:sz="4" w:space="0" w:color="000000"/>
-            </w:tcBorders>
-            <w:vAlign w:val="center"/>
-          </w:tcPr>
-          <w:p>
-            <w:pPr>
-              <w:pStyle w:val="user2"/>
-              <w:spacing w:lineRule="auto" w:line="240" w:before="57" w:after="57"/>
-              <w:ind w:hanging="0"/>
-              <w:rPr>
-                <w:sz w:val="16"/>
-                <w:szCs w:val="16"/>
-              </w:rPr>
-            </w:pPr>
-            <w:r>
-              <w:rPr>
-                <w:sz w:val="16"/>
-                <w:szCs w:val="16"/>
-              </w:rPr>
-              <w:t>+</w:t>
-            </w:r>
-          </w:p>
-        </w:tc>
-        <w:tc>
-          <w:tcPr>
-            <w:tcW w:w="437" w:type="dxa"/>
-            <w:tcBorders>
-              <w:left w:val="single" w:sz="4" w:space="0" w:color="000000"/>
-              <w:bottom w:val="single" w:sz="4" w:space="0" w:color="000000"/>
-            </w:tcBorders>
-            <w:vAlign w:val="center"/>
-          </w:tcPr>
-          <w:p>
-            <w:pPr>
-              <w:pStyle w:val="user2"/>
-              <w:spacing w:lineRule="auto" w:line="240" w:before="57" w:after="57"/>
-              <w:ind w:hanging="0"/>
-              <w:rPr>
-                <w:sz w:val="16"/>
-                <w:szCs w:val="16"/>
-              </w:rPr>
-            </w:pPr>
-            <w:r>
-              <w:rPr>
-                <w:sz w:val="16"/>
-                <w:szCs w:val="16"/>
-              </w:rPr>
-            </w:r>
-          </w:p>
-        </w:tc>
-        <w:tc>
-          <w:tcPr>
-            <w:tcW w:w="435" w:type="dxa"/>
-            <w:tcBorders>
-              <w:left w:val="single" w:sz="4" w:space="0" w:color="000000"/>
-              <w:bottom w:val="single" w:sz="4" w:space="0" w:color="000000"/>
-            </w:tcBorders>
-            <w:vAlign w:val="center"/>
-          </w:tcPr>
-          <w:p>
-            <w:pPr>
-              <w:pStyle w:val="user2"/>
-              <w:spacing w:lineRule="auto" w:line="240" w:before="57" w:after="57"/>
-              <w:ind w:hanging="0"/>
-              <w:rPr>
-                <w:sz w:val="16"/>
-                <w:szCs w:val="16"/>
-              </w:rPr>
-            </w:pPr>
-            <w:r>
-              <w:rPr>
-                <w:sz w:val="16"/>
-                <w:szCs w:val="16"/>
-              </w:rPr>
-            </w:r>
-          </w:p>
-        </w:tc>
-        <w:tc>
-          <w:tcPr>
-            <w:tcW w:w="964" w:type="dxa"/>
+            <w:tcW w:w="3780" w:type="dxa"/>
+            <w:tcBorders>
+              <w:left w:val="single" w:sz="4" w:space="0" w:color="000000"/>
+              <w:bottom w:val="single" w:sz="4" w:space="0" w:color="000000"/>
+            </w:tcBorders>
+            <w:vAlign w:val="center"/>
+          </w:tcPr>
+          <w:p>
+            <w:pPr>
+              <w:pStyle w:val="user2"/>
+              <w:spacing w:lineRule="auto" w:line="240" w:before="57" w:after="57"/>
+              <w:ind w:hanging="0"/>
+              <w:rPr>
+                <w:sz w:val="16"/>
+                <w:szCs w:val="16"/>
+              </w:rPr>
+            </w:pPr>
+            <w:r>
+              <w:rPr/>
+            </w:r>
+          </w:p>
+        </w:tc>
+        <w:tc>
+          <w:tcPr>
+            <w:tcW w:w="748" w:type="dxa"/>
+            <w:tcBorders>
+              <w:left w:val="single" w:sz="4" w:space="0" w:color="000000"/>
+              <w:bottom w:val="single" w:sz="4" w:space="0" w:color="000000"/>
+            </w:tcBorders>
+            <w:vAlign w:val="center"/>
+          </w:tcPr>
+          <w:p>
+            <w:pPr>
+              <w:pStyle w:val="user2"/>
+              <w:spacing w:lineRule="auto" w:line="240" w:before="57" w:after="57"/>
+              <w:ind w:hanging="0"/>
+              <w:rPr>
+                <w:sz w:val="16"/>
+                <w:szCs w:val="16"/>
+              </w:rPr>
+            </w:pPr>
+            <w:r>
+              <w:rPr/>
+            </w:r>
+          </w:p>
+        </w:tc>
+        <w:tc>
+          <w:tcPr>
+            <w:tcW w:w="737" w:type="dxa"/>
+            <w:tcBorders>
+              <w:left w:val="single" w:sz="4" w:space="0" w:color="000000"/>
+              <w:bottom w:val="single" w:sz="4" w:space="0" w:color="000000"/>
+            </w:tcBorders>
+            <w:vAlign w:val="center"/>
+          </w:tcPr>
+          <w:p>
+            <w:pPr>
+              <w:pStyle w:val="user2"/>
+              <w:spacing w:lineRule="auto" w:line="240" w:before="57" w:after="57"/>
+              <w:ind w:hanging="0"/>
+              <w:rPr>
+                <w:sz w:val="16"/>
+                <w:szCs w:val="16"/>
+              </w:rPr>
+            </w:pPr>
+            <w:r>
+              <w:rPr/>
+            </w:r>
+          </w:p>
+        </w:tc>
+        <w:tc>
+          <w:tcPr>
+            <w:tcW w:w="695" w:type="dxa"/>
+            <w:tcBorders>
+              <w:left w:val="single" w:sz="4" w:space="0" w:color="000000"/>
+              <w:bottom w:val="single" w:sz="4" w:space="0" w:color="000000"/>
+            </w:tcBorders>
+            <w:vAlign w:val="center"/>
+          </w:tcPr>
+          <w:p>
+            <w:pPr>
+              <w:pStyle w:val="user2"/>
+              <w:spacing w:lineRule="auto" w:line="240" w:before="57" w:after="57"/>
+              <w:ind w:hanging="0"/>
+              <w:rPr>
+                <w:sz w:val="16"/>
+                <w:szCs w:val="16"/>
+              </w:rPr>
+            </w:pPr>
+            <w:r>
+              <w:rPr/>
+            </w:r>
+          </w:p>
+        </w:tc>
+        <w:tc>
+          <w:tcPr>
+            <w:tcW w:w="1295" w:type="dxa"/>
             <w:tcBorders>
               <w:left w:val="single" w:sz="4" w:space="0" w:color="000000"/>
               <w:bottom w:val="single" w:sz="4" w:space="0" w:color="000000"/>
@@ -4885,11 +4722,7 @@
               </w:rPr>
             </w:pPr>
             <w:r>
-              <w:rPr>
-                <w:sz w:val="16"/>
-                <w:szCs w:val="16"/>
-              </w:rPr>
-              <w:t>+</w:t>
+              <w:rPr/>
             </w:r>
           </w:p>
         </w:tc>
@@ -4898,7 +4731,7 @@
         <w:trPr/>
         <w:tc>
           <w:tcPr>
-            <w:tcW w:w="515" w:type="dxa"/>
+            <w:tcW w:w="516" w:type="dxa"/>
             <w:tcBorders>
               <w:left w:val="single" w:sz="4" w:space="0" w:color="000000"/>
               <w:bottom w:val="single" w:sz="4" w:space="0" w:color="000000"/>
@@ -4926,172 +4759,106 @@
         </w:tc>
         <w:tc>
           <w:tcPr>
-            <w:tcW w:w="4052" w:type="dxa"/>
-            <w:tcBorders>
-              <w:left w:val="single" w:sz="4" w:space="0" w:color="000000"/>
-              <w:bottom w:val="single" w:sz="4" w:space="0" w:color="000000"/>
-            </w:tcBorders>
-            <w:vAlign w:val="center"/>
-          </w:tcPr>
-          <w:p>
-            <w:pPr>
-              <w:pStyle w:val="user2"/>
-              <w:spacing w:lineRule="auto" w:line="240" w:before="57" w:after="57"/>
-              <w:ind w:hanging="0"/>
-              <w:rPr>
-                <w:sz w:val="16"/>
-                <w:szCs w:val="16"/>
-              </w:rPr>
-            </w:pPr>
-            <w:r>
-              <w:rPr>
-                <w:sz w:val="16"/>
-                <w:szCs w:val="16"/>
-              </w:rPr>
-              <w:t>Виконання індивідуального завдання з верстки</w:t>
-            </w:r>
-          </w:p>
-        </w:tc>
-        <w:tc>
-          <w:tcPr>
-            <w:tcW w:w="436" w:type="dxa"/>
-            <w:tcBorders>
-              <w:left w:val="single" w:sz="4" w:space="0" w:color="000000"/>
-              <w:bottom w:val="single" w:sz="4" w:space="0" w:color="000000"/>
-            </w:tcBorders>
-            <w:vAlign w:val="center"/>
-          </w:tcPr>
-          <w:p>
-            <w:pPr>
-              <w:pStyle w:val="user2"/>
-              <w:spacing w:lineRule="auto" w:line="240" w:before="57" w:after="57"/>
-              <w:ind w:hanging="0"/>
-              <w:rPr>
-                <w:sz w:val="16"/>
-                <w:szCs w:val="16"/>
-              </w:rPr>
-            </w:pPr>
-            <w:r>
-              <w:rPr>
-                <w:sz w:val="16"/>
-                <w:szCs w:val="16"/>
-              </w:rPr>
-            </w:r>
-          </w:p>
-        </w:tc>
-        <w:tc>
-          <w:tcPr>
-            <w:tcW w:w="437" w:type="dxa"/>
-            <w:tcBorders>
-              <w:left w:val="single" w:sz="4" w:space="0" w:color="000000"/>
-              <w:bottom w:val="single" w:sz="4" w:space="0" w:color="000000"/>
-            </w:tcBorders>
-            <w:vAlign w:val="center"/>
-          </w:tcPr>
-          <w:p>
-            <w:pPr>
-              <w:pStyle w:val="user2"/>
-              <w:spacing w:lineRule="auto" w:line="240" w:before="57" w:after="57"/>
-              <w:ind w:hanging="0"/>
-              <w:rPr>
-                <w:sz w:val="16"/>
-                <w:szCs w:val="16"/>
-              </w:rPr>
-            </w:pPr>
-            <w:r>
-              <w:rPr>
-                <w:sz w:val="16"/>
-                <w:szCs w:val="16"/>
-              </w:rPr>
-              <w:t>+</w:t>
-            </w:r>
-          </w:p>
-        </w:tc>
-        <w:tc>
-          <w:tcPr>
-            <w:tcW w:w="435" w:type="dxa"/>
-            <w:tcBorders>
-              <w:left w:val="single" w:sz="4" w:space="0" w:color="000000"/>
-              <w:bottom w:val="single" w:sz="4" w:space="0" w:color="000000"/>
-            </w:tcBorders>
-            <w:vAlign w:val="center"/>
-          </w:tcPr>
-          <w:p>
-            <w:pPr>
-              <w:pStyle w:val="user2"/>
-              <w:spacing w:lineRule="auto" w:line="240" w:before="57" w:after="57"/>
-              <w:ind w:hanging="0"/>
-              <w:rPr>
-                <w:sz w:val="16"/>
-                <w:szCs w:val="16"/>
-              </w:rPr>
-            </w:pPr>
-            <w:r>
-              <w:rPr>
-                <w:sz w:val="16"/>
-                <w:szCs w:val="16"/>
-              </w:rPr>
-              <w:t>+</w:t>
-            </w:r>
-          </w:p>
-        </w:tc>
-        <w:tc>
-          <w:tcPr>
-            <w:tcW w:w="437" w:type="dxa"/>
-            <w:tcBorders>
-              <w:left w:val="single" w:sz="4" w:space="0" w:color="000000"/>
-              <w:bottom w:val="single" w:sz="4" w:space="0" w:color="000000"/>
-            </w:tcBorders>
-            <w:vAlign w:val="center"/>
-          </w:tcPr>
-          <w:p>
-            <w:pPr>
-              <w:pStyle w:val="user2"/>
-              <w:spacing w:lineRule="auto" w:line="240" w:before="57" w:after="57"/>
-              <w:ind w:hanging="0"/>
-              <w:rPr>
-                <w:sz w:val="16"/>
-                <w:szCs w:val="16"/>
-              </w:rPr>
-            </w:pPr>
-            <w:r>
-              <w:rPr>
-                <w:sz w:val="16"/>
-                <w:szCs w:val="16"/>
-              </w:rPr>
-            </w:r>
-          </w:p>
-        </w:tc>
-        <w:tc>
-          <w:tcPr>
-            <w:tcW w:w="435" w:type="dxa"/>
-            <w:tcBorders>
-              <w:left w:val="single" w:sz="4" w:space="0" w:color="000000"/>
-              <w:bottom w:val="single" w:sz="4" w:space="0" w:color="000000"/>
-            </w:tcBorders>
-            <w:vAlign w:val="center"/>
-          </w:tcPr>
-          <w:p>
-            <w:pPr>
-              <w:pStyle w:val="user2"/>
-              <w:spacing w:lineRule="auto" w:line="240" w:before="57" w:after="57"/>
-              <w:ind w:hanging="0"/>
-              <w:rPr>
-                <w:sz w:val="16"/>
-                <w:szCs w:val="16"/>
-              </w:rPr>
-            </w:pPr>
-            <w:r>
-              <w:rPr>
-                <w:sz w:val="16"/>
-                <w:szCs w:val="16"/>
-              </w:rPr>
-            </w:r>
-          </w:p>
-        </w:tc>
-        <w:tc>
-          <w:tcPr>
-            <w:tcW w:w="964" w:type="dxa"/>
+            <w:tcW w:w="3780" w:type="dxa"/>
+            <w:tcBorders>
+              <w:left w:val="single" w:sz="4" w:space="0" w:color="000000"/>
+              <w:bottom w:val="single" w:sz="4" w:space="0" w:color="000000"/>
+            </w:tcBorders>
+            <w:vAlign w:val="center"/>
+          </w:tcPr>
+          <w:p>
+            <w:pPr>
+              <w:pStyle w:val="user2"/>
+              <w:spacing w:lineRule="auto" w:line="240" w:before="57" w:after="57"/>
+              <w:ind w:hanging="0"/>
+              <w:rPr>
+                <w:sz w:val="16"/>
+                <w:szCs w:val="16"/>
+              </w:rPr>
+            </w:pPr>
+            <w:r>
+              <w:rPr/>
+            </w:r>
+          </w:p>
+        </w:tc>
+        <w:tc>
+          <w:tcPr>
+            <w:tcW w:w="748" w:type="dxa"/>
+            <w:tcBorders>
+              <w:left w:val="single" w:sz="4" w:space="0" w:color="000000"/>
+              <w:bottom w:val="single" w:sz="4" w:space="0" w:color="000000"/>
+            </w:tcBorders>
+            <w:vAlign w:val="center"/>
+          </w:tcPr>
+          <w:p>
+            <w:pPr>
+              <w:pStyle w:val="user2"/>
+              <w:spacing w:lineRule="auto" w:line="240" w:before="57" w:after="57"/>
+              <w:ind w:hanging="0"/>
+              <w:rPr>
+                <w:sz w:val="16"/>
+                <w:szCs w:val="16"/>
+              </w:rPr>
+            </w:pPr>
+            <w:r>
+              <w:rPr>
+                <w:sz w:val="16"/>
+                <w:szCs w:val="16"/>
+              </w:rPr>
+            </w:r>
+          </w:p>
+        </w:tc>
+        <w:tc>
+          <w:tcPr>
+            <w:tcW w:w="737" w:type="dxa"/>
+            <w:tcBorders>
+              <w:left w:val="single" w:sz="4" w:space="0" w:color="000000"/>
+              <w:bottom w:val="single" w:sz="4" w:space="0" w:color="000000"/>
+            </w:tcBorders>
+            <w:vAlign w:val="center"/>
+          </w:tcPr>
+          <w:p>
+            <w:pPr>
+              <w:pStyle w:val="user2"/>
+              <w:spacing w:lineRule="auto" w:line="240" w:before="57" w:after="57"/>
+              <w:ind w:hanging="0"/>
+              <w:rPr>
+                <w:sz w:val="16"/>
+                <w:szCs w:val="16"/>
+              </w:rPr>
+            </w:pPr>
+            <w:r>
+              <w:rPr/>
+            </w:r>
+          </w:p>
+        </w:tc>
+        <w:tc>
+          <w:tcPr>
+            <w:tcW w:w="695" w:type="dxa"/>
+            <w:tcBorders>
+              <w:left w:val="single" w:sz="4" w:space="0" w:color="000000"/>
+              <w:bottom w:val="single" w:sz="4" w:space="0" w:color="000000"/>
+            </w:tcBorders>
+            <w:vAlign w:val="center"/>
+          </w:tcPr>
+          <w:p>
+            <w:pPr>
+              <w:pStyle w:val="user2"/>
+              <w:spacing w:lineRule="auto" w:line="240" w:before="57" w:after="57"/>
+              <w:ind w:hanging="0"/>
+              <w:rPr>
+                <w:sz w:val="16"/>
+                <w:szCs w:val="16"/>
+              </w:rPr>
+            </w:pPr>
+            <w:r>
+              <w:rPr/>
+            </w:r>
+          </w:p>
+        </w:tc>
+        <w:tc>
+          <w:tcPr>
+            <w:tcW w:w="1295" w:type="dxa"/>
             <w:tcBorders>
               <w:left w:val="single" w:sz="4" w:space="0" w:color="000000"/>
               <w:bottom w:val="single" w:sz="4" w:space="0" w:color="000000"/>
@@ -5110,11 +4877,7 @@
               </w:rPr>
             </w:pPr>
             <w:r>
-              <w:rPr>
-                <w:sz w:val="16"/>
-                <w:szCs w:val="16"/>
-              </w:rPr>
-              <w:t>+</w:t>
+              <w:rPr/>
             </w:r>
           </w:p>
         </w:tc>
@@ -5123,7 +4886,7 @@
         <w:trPr/>
         <w:tc>
           <w:tcPr>
-            <w:tcW w:w="515" w:type="dxa"/>
+            <w:tcW w:w="516" w:type="dxa"/>
             <w:tcBorders>
               <w:left w:val="single" w:sz="4" w:space="0" w:color="000000"/>
               <w:bottom w:val="single" w:sz="4" w:space="0" w:color="000000"/>
@@ -5151,173 +4914,103 @@
         </w:tc>
         <w:tc>
           <w:tcPr>
-            <w:tcW w:w="4052" w:type="dxa"/>
-            <w:tcBorders>
-              <w:left w:val="single" w:sz="4" w:space="0" w:color="000000"/>
-              <w:bottom w:val="single" w:sz="4" w:space="0" w:color="000000"/>
-            </w:tcBorders>
-            <w:vAlign w:val="center"/>
-          </w:tcPr>
-          <w:p>
-            <w:pPr>
-              <w:pStyle w:val="user2"/>
-              <w:spacing w:lineRule="auto" w:line="240" w:before="57" w:after="57"/>
-              <w:ind w:hanging="0"/>
-              <w:rPr>
-                <w:sz w:val="16"/>
-                <w:szCs w:val="16"/>
-              </w:rPr>
-            </w:pPr>
-            <w:r>
-              <w:rPr>
-                <w:sz w:val="16"/>
-                <w:szCs w:val="16"/>
-              </w:rPr>
-              <w:t>Перегляд курсу з менеджменту</w:t>
-            </w:r>
-          </w:p>
-        </w:tc>
-        <w:tc>
-          <w:tcPr>
-            <w:tcW w:w="436" w:type="dxa"/>
-            <w:tcBorders>
-              <w:left w:val="single" w:sz="4" w:space="0" w:color="000000"/>
-              <w:bottom w:val="single" w:sz="4" w:space="0" w:color="000000"/>
-            </w:tcBorders>
-            <w:vAlign w:val="center"/>
-          </w:tcPr>
-          <w:p>
-            <w:pPr>
-              <w:pStyle w:val="user2"/>
-              <w:spacing w:lineRule="auto" w:line="240" w:before="57" w:after="57"/>
-              <w:ind w:hanging="0"/>
-              <w:rPr>
-                <w:sz w:val="16"/>
-                <w:szCs w:val="16"/>
-              </w:rPr>
-            </w:pPr>
-            <w:r>
-              <w:rPr>
-                <w:sz w:val="16"/>
-                <w:szCs w:val="16"/>
-              </w:rPr>
-              <w:t>+</w:t>
-            </w:r>
-          </w:p>
-        </w:tc>
-        <w:tc>
-          <w:tcPr>
-            <w:tcW w:w="437" w:type="dxa"/>
-            <w:tcBorders>
-              <w:left w:val="single" w:sz="4" w:space="0" w:color="000000"/>
-              <w:bottom w:val="single" w:sz="4" w:space="0" w:color="000000"/>
-            </w:tcBorders>
-            <w:vAlign w:val="center"/>
-          </w:tcPr>
-          <w:p>
-            <w:pPr>
-              <w:pStyle w:val="user2"/>
-              <w:spacing w:lineRule="auto" w:line="240" w:before="57" w:after="57"/>
-              <w:ind w:hanging="0"/>
-              <w:rPr>
-                <w:sz w:val="16"/>
-                <w:szCs w:val="16"/>
-              </w:rPr>
-            </w:pPr>
-            <w:r>
-              <w:rPr>
-                <w:sz w:val="16"/>
-                <w:szCs w:val="16"/>
-              </w:rPr>
-              <w:t>+</w:t>
-            </w:r>
-          </w:p>
-        </w:tc>
-        <w:tc>
-          <w:tcPr>
-            <w:tcW w:w="435" w:type="dxa"/>
-            <w:tcBorders>
-              <w:left w:val="single" w:sz="4" w:space="0" w:color="000000"/>
-              <w:bottom w:val="single" w:sz="4" w:space="0" w:color="000000"/>
-            </w:tcBorders>
-            <w:vAlign w:val="center"/>
-          </w:tcPr>
-          <w:p>
-            <w:pPr>
-              <w:pStyle w:val="user2"/>
-              <w:spacing w:lineRule="auto" w:line="240" w:before="57" w:after="57"/>
-              <w:ind w:hanging="0"/>
-              <w:rPr>
-                <w:sz w:val="16"/>
-                <w:szCs w:val="16"/>
-              </w:rPr>
-            </w:pPr>
-            <w:r>
-              <w:rPr>
-                <w:sz w:val="16"/>
-                <w:szCs w:val="16"/>
-              </w:rPr>
-              <w:t>+</w:t>
-            </w:r>
-          </w:p>
-        </w:tc>
-        <w:tc>
-          <w:tcPr>
-            <w:tcW w:w="437" w:type="dxa"/>
-            <w:tcBorders>
-              <w:left w:val="single" w:sz="4" w:space="0" w:color="000000"/>
-              <w:bottom w:val="single" w:sz="4" w:space="0" w:color="000000"/>
-            </w:tcBorders>
-            <w:vAlign w:val="center"/>
-          </w:tcPr>
-          <w:p>
-            <w:pPr>
-              <w:pStyle w:val="user2"/>
-              <w:spacing w:lineRule="auto" w:line="240" w:before="57" w:after="57"/>
-              <w:ind w:hanging="0"/>
-              <w:rPr>
-                <w:sz w:val="16"/>
-                <w:szCs w:val="16"/>
-              </w:rPr>
-            </w:pPr>
-            <w:r>
-              <w:rPr>
-                <w:sz w:val="16"/>
-                <w:szCs w:val="16"/>
-              </w:rPr>
-            </w:r>
-          </w:p>
-        </w:tc>
-        <w:tc>
-          <w:tcPr>
-            <w:tcW w:w="435" w:type="dxa"/>
-            <w:tcBorders>
-              <w:left w:val="single" w:sz="4" w:space="0" w:color="000000"/>
-              <w:bottom w:val="single" w:sz="4" w:space="0" w:color="000000"/>
-            </w:tcBorders>
-            <w:vAlign w:val="center"/>
-          </w:tcPr>
-          <w:p>
-            <w:pPr>
-              <w:pStyle w:val="user2"/>
-              <w:spacing w:lineRule="auto" w:line="240" w:before="57" w:after="57"/>
-              <w:ind w:hanging="0"/>
-              <w:rPr>
-                <w:sz w:val="16"/>
-                <w:szCs w:val="16"/>
-              </w:rPr>
-            </w:pPr>
-            <w:r>
-              <w:rPr>
-                <w:sz w:val="16"/>
-                <w:szCs w:val="16"/>
-              </w:rPr>
-            </w:r>
-          </w:p>
-        </w:tc>
-        <w:tc>
-          <w:tcPr>
-            <w:tcW w:w="964" w:type="dxa"/>
+            <w:tcW w:w="3780" w:type="dxa"/>
+            <w:tcBorders>
+              <w:left w:val="single" w:sz="4" w:space="0" w:color="000000"/>
+              <w:bottom w:val="single" w:sz="4" w:space="0" w:color="000000"/>
+            </w:tcBorders>
+            <w:vAlign w:val="center"/>
+          </w:tcPr>
+          <w:p>
+            <w:pPr>
+              <w:pStyle w:val="user2"/>
+              <w:spacing w:lineRule="auto" w:line="240" w:before="57" w:after="57"/>
+              <w:ind w:hanging="0"/>
+              <w:rPr>
+                <w:sz w:val="16"/>
+                <w:szCs w:val="16"/>
+              </w:rPr>
+            </w:pPr>
+            <w:r>
+              <w:rPr/>
+            </w:r>
+          </w:p>
+        </w:tc>
+        <w:tc>
+          <w:tcPr>
+            <w:tcW w:w="748" w:type="dxa"/>
+            <w:tcBorders>
+              <w:left w:val="single" w:sz="4" w:space="0" w:color="000000"/>
+              <w:bottom w:val="single" w:sz="4" w:space="0" w:color="000000"/>
+            </w:tcBorders>
+            <w:vAlign w:val="center"/>
+          </w:tcPr>
+          <w:p>
+            <w:pPr>
+              <w:pStyle w:val="user2"/>
+              <w:spacing w:lineRule="auto" w:line="240" w:before="57" w:after="57"/>
+              <w:ind w:hanging="0"/>
+              <w:rPr>
+                <w:sz w:val="16"/>
+                <w:szCs w:val="16"/>
+              </w:rPr>
+            </w:pPr>
+            <w:r>
+              <w:rPr/>
+            </w:r>
+          </w:p>
+        </w:tc>
+        <w:tc>
+          <w:tcPr>
+            <w:tcW w:w="737" w:type="dxa"/>
+            <w:tcBorders>
+              <w:left w:val="single" w:sz="4" w:space="0" w:color="000000"/>
+              <w:bottom w:val="single" w:sz="4" w:space="0" w:color="000000"/>
+            </w:tcBorders>
+            <w:vAlign w:val="center"/>
+          </w:tcPr>
+          <w:p>
+            <w:pPr>
+              <w:pStyle w:val="user2"/>
+              <w:spacing w:lineRule="auto" w:line="240" w:before="57" w:after="57"/>
+              <w:ind w:hanging="0"/>
+              <w:rPr>
+                <w:sz w:val="16"/>
+                <w:szCs w:val="16"/>
+              </w:rPr>
+            </w:pPr>
+            <w:r>
+              <w:rPr/>
+            </w:r>
+          </w:p>
+        </w:tc>
+        <w:tc>
+          <w:tcPr>
+            <w:tcW w:w="695" w:type="dxa"/>
+            <w:tcBorders>
+              <w:left w:val="single" w:sz="4" w:space="0" w:color="000000"/>
+              <w:bottom w:val="single" w:sz="4" w:space="0" w:color="000000"/>
+            </w:tcBorders>
+            <w:vAlign w:val="center"/>
+          </w:tcPr>
+          <w:p>
+            <w:pPr>
+              <w:pStyle w:val="user2"/>
+              <w:spacing w:lineRule="auto" w:line="240" w:before="57" w:after="57"/>
+              <w:ind w:hanging="0"/>
+              <w:rPr>
+                <w:sz w:val="16"/>
+                <w:szCs w:val="16"/>
+              </w:rPr>
+            </w:pPr>
+            <w:r>
+              <w:rPr/>
+            </w:r>
+          </w:p>
+        </w:tc>
+        <w:tc>
+          <w:tcPr>
+            <w:tcW w:w="1295" w:type="dxa"/>
             <w:tcBorders>
               <w:left w:val="single" w:sz="4" w:space="0" w:color="000000"/>
               <w:bottom w:val="single" w:sz="4" w:space="0" w:color="000000"/>
@@ -5336,11 +5029,7 @@
               </w:rPr>
             </w:pPr>
             <w:r>
-              <w:rPr>
-                <w:sz w:val="16"/>
-                <w:szCs w:val="16"/>
-              </w:rPr>
-              <w:t>+</w:t>
+              <w:rPr/>
             </w:r>
           </w:p>
         </w:tc>
@@ -5349,7 +5038,7 @@
         <w:trPr/>
         <w:tc>
           <w:tcPr>
-            <w:tcW w:w="515" w:type="dxa"/>
+            <w:tcW w:w="516" w:type="dxa"/>
             <w:tcBorders>
               <w:left w:val="single" w:sz="4" w:space="0" w:color="000000"/>
               <w:bottom w:val="single" w:sz="4" w:space="0" w:color="000000"/>
@@ -5377,172 +5066,106 @@
         </w:tc>
         <w:tc>
           <w:tcPr>
-            <w:tcW w:w="4052" w:type="dxa"/>
-            <w:tcBorders>
-              <w:left w:val="single" w:sz="4" w:space="0" w:color="000000"/>
-              <w:bottom w:val="single" w:sz="4" w:space="0" w:color="000000"/>
-            </w:tcBorders>
-            <w:vAlign w:val="center"/>
-          </w:tcPr>
-          <w:p>
-            <w:pPr>
-              <w:pStyle w:val="user2"/>
-              <w:spacing w:lineRule="auto" w:line="240" w:before="57" w:after="57"/>
-              <w:ind w:hanging="0"/>
-              <w:rPr>
-                <w:sz w:val="16"/>
-                <w:szCs w:val="16"/>
-              </w:rPr>
-            </w:pPr>
-            <w:r>
-              <w:rPr>
-                <w:sz w:val="16"/>
-                <w:szCs w:val="16"/>
-              </w:rPr>
-              <w:t>Виконання індивідуального завдання з менеджменту</w:t>
-            </w:r>
-          </w:p>
-        </w:tc>
-        <w:tc>
-          <w:tcPr>
-            <w:tcW w:w="436" w:type="dxa"/>
-            <w:tcBorders>
-              <w:left w:val="single" w:sz="4" w:space="0" w:color="000000"/>
-              <w:bottom w:val="single" w:sz="4" w:space="0" w:color="000000"/>
-            </w:tcBorders>
-            <w:vAlign w:val="center"/>
-          </w:tcPr>
-          <w:p>
-            <w:pPr>
-              <w:pStyle w:val="user2"/>
-              <w:spacing w:lineRule="auto" w:line="240" w:before="57" w:after="57"/>
-              <w:ind w:hanging="0"/>
-              <w:rPr>
-                <w:sz w:val="16"/>
-                <w:szCs w:val="16"/>
-              </w:rPr>
-            </w:pPr>
-            <w:r>
-              <w:rPr>
-                <w:sz w:val="16"/>
-                <w:szCs w:val="16"/>
-              </w:rPr>
-            </w:r>
-          </w:p>
-        </w:tc>
-        <w:tc>
-          <w:tcPr>
-            <w:tcW w:w="437" w:type="dxa"/>
-            <w:tcBorders>
-              <w:left w:val="single" w:sz="4" w:space="0" w:color="000000"/>
-              <w:bottom w:val="single" w:sz="4" w:space="0" w:color="000000"/>
-            </w:tcBorders>
-            <w:vAlign w:val="center"/>
-          </w:tcPr>
-          <w:p>
-            <w:pPr>
-              <w:pStyle w:val="user2"/>
-              <w:spacing w:lineRule="auto" w:line="240" w:before="57" w:after="57"/>
-              <w:ind w:hanging="0"/>
-              <w:rPr>
-                <w:sz w:val="16"/>
-                <w:szCs w:val="16"/>
-              </w:rPr>
-            </w:pPr>
-            <w:r>
-              <w:rPr>
-                <w:sz w:val="16"/>
-                <w:szCs w:val="16"/>
-              </w:rPr>
-              <w:t>+</w:t>
-            </w:r>
-          </w:p>
-        </w:tc>
-        <w:tc>
-          <w:tcPr>
-            <w:tcW w:w="435" w:type="dxa"/>
-            <w:tcBorders>
-              <w:left w:val="single" w:sz="4" w:space="0" w:color="000000"/>
-              <w:bottom w:val="single" w:sz="4" w:space="0" w:color="000000"/>
-            </w:tcBorders>
-            <w:vAlign w:val="center"/>
-          </w:tcPr>
-          <w:p>
-            <w:pPr>
-              <w:pStyle w:val="user2"/>
-              <w:spacing w:lineRule="auto" w:line="240" w:before="57" w:after="57"/>
-              <w:ind w:hanging="0"/>
-              <w:rPr>
-                <w:sz w:val="16"/>
-                <w:szCs w:val="16"/>
-              </w:rPr>
-            </w:pPr>
-            <w:r>
-              <w:rPr>
-                <w:sz w:val="16"/>
-                <w:szCs w:val="16"/>
-              </w:rPr>
-              <w:t>+</w:t>
-            </w:r>
-          </w:p>
-        </w:tc>
-        <w:tc>
-          <w:tcPr>
-            <w:tcW w:w="437" w:type="dxa"/>
-            <w:tcBorders>
-              <w:left w:val="single" w:sz="4" w:space="0" w:color="000000"/>
-              <w:bottom w:val="single" w:sz="4" w:space="0" w:color="000000"/>
-            </w:tcBorders>
-            <w:vAlign w:val="center"/>
-          </w:tcPr>
-          <w:p>
-            <w:pPr>
-              <w:pStyle w:val="user2"/>
-              <w:spacing w:lineRule="auto" w:line="240" w:before="57" w:after="57"/>
-              <w:ind w:hanging="0"/>
-              <w:rPr>
-                <w:sz w:val="16"/>
-                <w:szCs w:val="16"/>
-              </w:rPr>
-            </w:pPr>
-            <w:r>
-              <w:rPr>
-                <w:sz w:val="16"/>
-                <w:szCs w:val="16"/>
-              </w:rPr>
-            </w:r>
-          </w:p>
-        </w:tc>
-        <w:tc>
-          <w:tcPr>
-            <w:tcW w:w="435" w:type="dxa"/>
-            <w:tcBorders>
-              <w:left w:val="single" w:sz="4" w:space="0" w:color="000000"/>
-              <w:bottom w:val="single" w:sz="4" w:space="0" w:color="000000"/>
-            </w:tcBorders>
-            <w:vAlign w:val="center"/>
-          </w:tcPr>
-          <w:p>
-            <w:pPr>
-              <w:pStyle w:val="user2"/>
-              <w:spacing w:lineRule="auto" w:line="240" w:before="57" w:after="57"/>
-              <w:ind w:hanging="0"/>
-              <w:rPr>
-                <w:sz w:val="16"/>
-                <w:szCs w:val="16"/>
-              </w:rPr>
-            </w:pPr>
-            <w:r>
-              <w:rPr>
-                <w:sz w:val="16"/>
-                <w:szCs w:val="16"/>
-              </w:rPr>
-            </w:r>
-          </w:p>
-        </w:tc>
-        <w:tc>
-          <w:tcPr>
-            <w:tcW w:w="964" w:type="dxa"/>
+            <w:tcW w:w="3780" w:type="dxa"/>
+            <w:tcBorders>
+              <w:left w:val="single" w:sz="4" w:space="0" w:color="000000"/>
+              <w:bottom w:val="single" w:sz="4" w:space="0" w:color="000000"/>
+            </w:tcBorders>
+            <w:vAlign w:val="center"/>
+          </w:tcPr>
+          <w:p>
+            <w:pPr>
+              <w:pStyle w:val="user2"/>
+              <w:spacing w:lineRule="auto" w:line="240" w:before="57" w:after="57"/>
+              <w:ind w:hanging="0"/>
+              <w:rPr>
+                <w:sz w:val="16"/>
+                <w:szCs w:val="16"/>
+              </w:rPr>
+            </w:pPr>
+            <w:r>
+              <w:rPr/>
+            </w:r>
+          </w:p>
+        </w:tc>
+        <w:tc>
+          <w:tcPr>
+            <w:tcW w:w="748" w:type="dxa"/>
+            <w:tcBorders>
+              <w:left w:val="single" w:sz="4" w:space="0" w:color="000000"/>
+              <w:bottom w:val="single" w:sz="4" w:space="0" w:color="000000"/>
+            </w:tcBorders>
+            <w:vAlign w:val="center"/>
+          </w:tcPr>
+          <w:p>
+            <w:pPr>
+              <w:pStyle w:val="user2"/>
+              <w:spacing w:lineRule="auto" w:line="240" w:before="57" w:after="57"/>
+              <w:ind w:hanging="0"/>
+              <w:rPr>
+                <w:sz w:val="16"/>
+                <w:szCs w:val="16"/>
+              </w:rPr>
+            </w:pPr>
+            <w:r>
+              <w:rPr>
+                <w:sz w:val="16"/>
+                <w:szCs w:val="16"/>
+              </w:rPr>
+            </w:r>
+          </w:p>
+        </w:tc>
+        <w:tc>
+          <w:tcPr>
+            <w:tcW w:w="737" w:type="dxa"/>
+            <w:tcBorders>
+              <w:left w:val="single" w:sz="4" w:space="0" w:color="000000"/>
+              <w:bottom w:val="single" w:sz="4" w:space="0" w:color="000000"/>
+            </w:tcBorders>
+            <w:vAlign w:val="center"/>
+          </w:tcPr>
+          <w:p>
+            <w:pPr>
+              <w:pStyle w:val="user2"/>
+              <w:spacing w:lineRule="auto" w:line="240" w:before="57" w:after="57"/>
+              <w:ind w:hanging="0"/>
+              <w:rPr>
+                <w:sz w:val="16"/>
+                <w:szCs w:val="16"/>
+              </w:rPr>
+            </w:pPr>
+            <w:r>
+              <w:rPr/>
+            </w:r>
+          </w:p>
+        </w:tc>
+        <w:tc>
+          <w:tcPr>
+            <w:tcW w:w="695" w:type="dxa"/>
+            <w:tcBorders>
+              <w:left w:val="single" w:sz="4" w:space="0" w:color="000000"/>
+              <w:bottom w:val="single" w:sz="4" w:space="0" w:color="000000"/>
+            </w:tcBorders>
+            <w:vAlign w:val="center"/>
+          </w:tcPr>
+          <w:p>
+            <w:pPr>
+              <w:pStyle w:val="user2"/>
+              <w:spacing w:lineRule="auto" w:line="240" w:before="57" w:after="57"/>
+              <w:ind w:hanging="0"/>
+              <w:rPr>
+                <w:sz w:val="16"/>
+                <w:szCs w:val="16"/>
+              </w:rPr>
+            </w:pPr>
+            <w:r>
+              <w:rPr/>
+            </w:r>
+          </w:p>
+        </w:tc>
+        <w:tc>
+          <w:tcPr>
+            <w:tcW w:w="1295" w:type="dxa"/>
             <w:tcBorders>
               <w:left w:val="single" w:sz="4" w:space="0" w:color="000000"/>
               <w:bottom w:val="single" w:sz="4" w:space="0" w:color="000000"/>
@@ -5561,11 +5184,7 @@
               </w:rPr>
             </w:pPr>
             <w:r>
-              <w:rPr>
-                <w:sz w:val="16"/>
-                <w:szCs w:val="16"/>
-              </w:rPr>
-              <w:t>+</w:t>
+              <w:rPr/>
             </w:r>
           </w:p>
         </w:tc>
@@ -5574,7 +5193,7 @@
         <w:trPr/>
         <w:tc>
           <w:tcPr>
-            <w:tcW w:w="515" w:type="dxa"/>
+            <w:tcW w:w="516" w:type="dxa"/>
             <w:tcBorders>
               <w:left w:val="single" w:sz="4" w:space="0" w:color="000000"/>
               <w:bottom w:val="single" w:sz="4" w:space="0" w:color="000000"/>
@@ -5602,7 +5221,7 @@
         </w:tc>
         <w:tc>
           <w:tcPr>
-            <w:tcW w:w="4052" w:type="dxa"/>
+            <w:tcW w:w="3780" w:type="dxa"/>
             <w:tcBorders>
               <w:left w:val="single" w:sz="4" w:space="0" w:color="000000"/>
               <w:bottom w:val="single" w:sz="4" w:space="0" w:color="000000"/>
@@ -5630,145 +5249,79 @@
         </w:tc>
         <w:tc>
           <w:tcPr>
-            <w:tcW w:w="436" w:type="dxa"/>
-            <w:tcBorders>
-              <w:left w:val="single" w:sz="4" w:space="0" w:color="000000"/>
-              <w:bottom w:val="single" w:sz="4" w:space="0" w:color="000000"/>
-            </w:tcBorders>
-            <w:vAlign w:val="center"/>
-          </w:tcPr>
-          <w:p>
-            <w:pPr>
-              <w:pStyle w:val="user2"/>
-              <w:spacing w:lineRule="auto" w:line="240" w:before="57" w:after="57"/>
-              <w:ind w:hanging="0"/>
-              <w:rPr>
-                <w:sz w:val="16"/>
-                <w:szCs w:val="16"/>
-              </w:rPr>
-            </w:pPr>
-            <w:r>
-              <w:rPr>
-                <w:sz w:val="16"/>
-                <w:szCs w:val="16"/>
-              </w:rPr>
-              <w:t>+</w:t>
-            </w:r>
-          </w:p>
-        </w:tc>
-        <w:tc>
-          <w:tcPr>
-            <w:tcW w:w="437" w:type="dxa"/>
-            <w:tcBorders>
-              <w:left w:val="single" w:sz="4" w:space="0" w:color="000000"/>
-              <w:bottom w:val="single" w:sz="4" w:space="0" w:color="000000"/>
-            </w:tcBorders>
-            <w:vAlign w:val="center"/>
-          </w:tcPr>
-          <w:p>
-            <w:pPr>
-              <w:pStyle w:val="user2"/>
-              <w:spacing w:lineRule="auto" w:line="240" w:before="57" w:after="57"/>
-              <w:ind w:hanging="0"/>
-              <w:rPr>
-                <w:sz w:val="16"/>
-                <w:szCs w:val="16"/>
-              </w:rPr>
-            </w:pPr>
-            <w:r>
-              <w:rPr>
-                <w:sz w:val="16"/>
-                <w:szCs w:val="16"/>
-              </w:rPr>
-              <w:t>+</w:t>
-            </w:r>
-          </w:p>
-        </w:tc>
-        <w:tc>
-          <w:tcPr>
-            <w:tcW w:w="435" w:type="dxa"/>
-            <w:tcBorders>
-              <w:left w:val="single" w:sz="4" w:space="0" w:color="000000"/>
-              <w:bottom w:val="single" w:sz="4" w:space="0" w:color="000000"/>
-            </w:tcBorders>
-            <w:vAlign w:val="center"/>
-          </w:tcPr>
-          <w:p>
-            <w:pPr>
-              <w:pStyle w:val="user2"/>
-              <w:spacing w:lineRule="auto" w:line="240" w:before="57" w:after="57"/>
-              <w:ind w:hanging="0"/>
-              <w:rPr>
-                <w:sz w:val="16"/>
-                <w:szCs w:val="16"/>
-              </w:rPr>
-            </w:pPr>
-            <w:r>
-              <w:rPr>
-                <w:sz w:val="16"/>
-                <w:szCs w:val="16"/>
-              </w:rPr>
-              <w:t>+</w:t>
-            </w:r>
-          </w:p>
-        </w:tc>
-        <w:tc>
-          <w:tcPr>
-            <w:tcW w:w="437" w:type="dxa"/>
-            <w:tcBorders>
-              <w:left w:val="single" w:sz="4" w:space="0" w:color="000000"/>
-              <w:bottom w:val="single" w:sz="4" w:space="0" w:color="000000"/>
-            </w:tcBorders>
-            <w:vAlign w:val="center"/>
-          </w:tcPr>
-          <w:p>
-            <w:pPr>
-              <w:pStyle w:val="user2"/>
-              <w:spacing w:lineRule="auto" w:line="240" w:before="57" w:after="57"/>
-              <w:ind w:hanging="0"/>
-              <w:rPr>
-                <w:sz w:val="16"/>
-                <w:szCs w:val="16"/>
-              </w:rPr>
-            </w:pPr>
-            <w:r>
-              <w:rPr>
-                <w:sz w:val="16"/>
-                <w:szCs w:val="16"/>
-              </w:rPr>
-            </w:r>
-          </w:p>
-        </w:tc>
-        <w:tc>
-          <w:tcPr>
-            <w:tcW w:w="435" w:type="dxa"/>
-            <w:tcBorders>
-              <w:left w:val="single" w:sz="4" w:space="0" w:color="000000"/>
-              <w:bottom w:val="single" w:sz="4" w:space="0" w:color="000000"/>
-            </w:tcBorders>
-            <w:vAlign w:val="center"/>
-          </w:tcPr>
-          <w:p>
-            <w:pPr>
-              <w:pStyle w:val="user2"/>
-              <w:spacing w:lineRule="auto" w:line="240" w:before="57" w:after="57"/>
-              <w:ind w:hanging="0"/>
-              <w:rPr>
-                <w:sz w:val="16"/>
-                <w:szCs w:val="16"/>
-              </w:rPr>
-            </w:pPr>
-            <w:r>
-              <w:rPr>
-                <w:sz w:val="16"/>
-                <w:szCs w:val="16"/>
-              </w:rPr>
-            </w:r>
-          </w:p>
-        </w:tc>
-        <w:tc>
-          <w:tcPr>
-            <w:tcW w:w="964" w:type="dxa"/>
+            <w:tcW w:w="748" w:type="dxa"/>
+            <w:tcBorders>
+              <w:left w:val="single" w:sz="4" w:space="0" w:color="000000"/>
+              <w:bottom w:val="single" w:sz="4" w:space="0" w:color="000000"/>
+            </w:tcBorders>
+            <w:vAlign w:val="center"/>
+          </w:tcPr>
+          <w:p>
+            <w:pPr>
+              <w:pStyle w:val="user2"/>
+              <w:spacing w:lineRule="auto" w:line="240" w:before="57" w:after="57"/>
+              <w:ind w:hanging="0"/>
+              <w:rPr>
+                <w:sz w:val="16"/>
+                <w:szCs w:val="16"/>
+              </w:rPr>
+            </w:pPr>
+            <w:r>
+              <w:rPr/>
+            </w:r>
+          </w:p>
+        </w:tc>
+        <w:tc>
+          <w:tcPr>
+            <w:tcW w:w="737" w:type="dxa"/>
+            <w:tcBorders>
+              <w:left w:val="single" w:sz="4" w:space="0" w:color="000000"/>
+              <w:bottom w:val="single" w:sz="4" w:space="0" w:color="000000"/>
+            </w:tcBorders>
+            <w:vAlign w:val="center"/>
+          </w:tcPr>
+          <w:p>
+            <w:pPr>
+              <w:pStyle w:val="user2"/>
+              <w:spacing w:lineRule="auto" w:line="240" w:before="57" w:after="57"/>
+              <w:ind w:hanging="0"/>
+              <w:rPr>
+                <w:sz w:val="16"/>
+                <w:szCs w:val="16"/>
+              </w:rPr>
+            </w:pPr>
+            <w:r>
+              <w:rPr/>
+            </w:r>
+          </w:p>
+        </w:tc>
+        <w:tc>
+          <w:tcPr>
+            <w:tcW w:w="695" w:type="dxa"/>
+            <w:tcBorders>
+              <w:left w:val="single" w:sz="4" w:space="0" w:color="000000"/>
+              <w:bottom w:val="single" w:sz="4" w:space="0" w:color="000000"/>
+            </w:tcBorders>
+            <w:vAlign w:val="center"/>
+          </w:tcPr>
+          <w:p>
+            <w:pPr>
+              <w:pStyle w:val="user2"/>
+              <w:spacing w:lineRule="auto" w:line="240" w:before="57" w:after="57"/>
+              <w:ind w:hanging="0"/>
+              <w:rPr>
+                <w:sz w:val="16"/>
+                <w:szCs w:val="16"/>
+              </w:rPr>
+            </w:pPr>
+            <w:r>
+              <w:rPr/>
+            </w:r>
+          </w:p>
+        </w:tc>
+        <w:tc>
+          <w:tcPr>
+            <w:tcW w:w="1295" w:type="dxa"/>
             <w:tcBorders>
               <w:left w:val="single" w:sz="4" w:space="0" w:color="000000"/>
               <w:bottom w:val="single" w:sz="4" w:space="0" w:color="000000"/>
@@ -5787,11 +5340,7 @@
               </w:rPr>
             </w:pPr>
             <w:r>
-              <w:rPr>
-                <w:sz w:val="16"/>
-                <w:szCs w:val="16"/>
-              </w:rPr>
-              <w:t>+</w:t>
+              <w:rPr/>
             </w:r>
           </w:p>
         </w:tc>
@@ -5800,7 +5349,7 @@
         <w:trPr/>
         <w:tc>
           <w:tcPr>
-            <w:tcW w:w="515" w:type="dxa"/>
+            <w:tcW w:w="516" w:type="dxa"/>
             <w:tcBorders>
               <w:left w:val="single" w:sz="4" w:space="0" w:color="000000"/>
               <w:bottom w:val="single" w:sz="4" w:space="0" w:color="000000"/>
@@ -5828,7 +5377,7 @@
         </w:tc>
         <w:tc>
           <w:tcPr>
-            <w:tcW w:w="4052" w:type="dxa"/>
+            <w:tcW w:w="3780" w:type="dxa"/>
             <w:tcBorders>
               <w:left w:val="single" w:sz="4" w:space="0" w:color="000000"/>
               <w:bottom w:val="single" w:sz="4" w:space="0" w:color="000000"/>
@@ -5856,143 +5405,85 @@
         </w:tc>
         <w:tc>
           <w:tcPr>
-            <w:tcW w:w="436" w:type="dxa"/>
-            <w:tcBorders>
-              <w:left w:val="single" w:sz="4" w:space="0" w:color="000000"/>
-              <w:bottom w:val="single" w:sz="4" w:space="0" w:color="000000"/>
-            </w:tcBorders>
-            <w:vAlign w:val="center"/>
-          </w:tcPr>
-          <w:p>
-            <w:pPr>
-              <w:pStyle w:val="user2"/>
-              <w:spacing w:lineRule="auto" w:line="240" w:before="57" w:after="57"/>
-              <w:ind w:hanging="0"/>
-              <w:rPr>
-                <w:sz w:val="16"/>
-                <w:szCs w:val="16"/>
-              </w:rPr>
-            </w:pPr>
-            <w:r>
-              <w:rPr>
-                <w:sz w:val="16"/>
-                <w:szCs w:val="16"/>
-              </w:rPr>
-            </w:r>
-          </w:p>
-        </w:tc>
-        <w:tc>
-          <w:tcPr>
-            <w:tcW w:w="437" w:type="dxa"/>
-            <w:tcBorders>
-              <w:left w:val="single" w:sz="4" w:space="0" w:color="000000"/>
-              <w:bottom w:val="single" w:sz="4" w:space="0" w:color="000000"/>
-            </w:tcBorders>
-            <w:vAlign w:val="center"/>
-          </w:tcPr>
-          <w:p>
-            <w:pPr>
-              <w:pStyle w:val="user2"/>
-              <w:spacing w:lineRule="auto" w:line="240" w:before="57" w:after="57"/>
-              <w:ind w:hanging="0"/>
-              <w:rPr>
-                <w:sz w:val="16"/>
-                <w:szCs w:val="16"/>
-              </w:rPr>
-            </w:pPr>
-            <w:r>
-              <w:rPr>
-                <w:sz w:val="16"/>
-                <w:szCs w:val="16"/>
-              </w:rPr>
-            </w:r>
-          </w:p>
-        </w:tc>
-        <w:tc>
-          <w:tcPr>
-            <w:tcW w:w="435" w:type="dxa"/>
-            <w:tcBorders>
-              <w:left w:val="single" w:sz="4" w:space="0" w:color="000000"/>
-              <w:bottom w:val="single" w:sz="4" w:space="0" w:color="000000"/>
-            </w:tcBorders>
-            <w:vAlign w:val="center"/>
-          </w:tcPr>
-          <w:p>
-            <w:pPr>
-              <w:pStyle w:val="user2"/>
-              <w:spacing w:lineRule="auto" w:line="240" w:before="57" w:after="57"/>
-              <w:ind w:hanging="0"/>
-              <w:rPr>
-                <w:sz w:val="16"/>
-                <w:szCs w:val="16"/>
-              </w:rPr>
-            </w:pPr>
-            <w:r>
-              <w:rPr>
-                <w:sz w:val="16"/>
-                <w:szCs w:val="16"/>
-              </w:rPr>
-              <w:t>+</w:t>
-            </w:r>
-          </w:p>
-        </w:tc>
-        <w:tc>
-          <w:tcPr>
-            <w:tcW w:w="437" w:type="dxa"/>
-            <w:tcBorders>
-              <w:left w:val="single" w:sz="4" w:space="0" w:color="000000"/>
-              <w:bottom w:val="single" w:sz="4" w:space="0" w:color="000000"/>
-            </w:tcBorders>
-            <w:vAlign w:val="center"/>
-          </w:tcPr>
-          <w:p>
-            <w:pPr>
-              <w:pStyle w:val="user2"/>
-              <w:spacing w:lineRule="auto" w:line="240" w:before="57" w:after="57"/>
-              <w:ind w:hanging="0"/>
-              <w:rPr>
-                <w:sz w:val="16"/>
-                <w:szCs w:val="16"/>
-              </w:rPr>
-            </w:pPr>
-            <w:r>
-              <w:rPr>
-                <w:sz w:val="16"/>
-                <w:szCs w:val="16"/>
-              </w:rPr>
-            </w:r>
-          </w:p>
-        </w:tc>
-        <w:tc>
-          <w:tcPr>
-            <w:tcW w:w="435" w:type="dxa"/>
-            <w:tcBorders>
-              <w:left w:val="single" w:sz="4" w:space="0" w:color="000000"/>
-              <w:bottom w:val="single" w:sz="4" w:space="0" w:color="000000"/>
-            </w:tcBorders>
-            <w:vAlign w:val="center"/>
-          </w:tcPr>
-          <w:p>
-            <w:pPr>
-              <w:pStyle w:val="user2"/>
-              <w:spacing w:lineRule="auto" w:line="240" w:before="57" w:after="57"/>
-              <w:ind w:hanging="0"/>
-              <w:rPr>
-                <w:sz w:val="16"/>
-                <w:szCs w:val="16"/>
-              </w:rPr>
-            </w:pPr>
-            <w:r>
-              <w:rPr>
-                <w:sz w:val="16"/>
-                <w:szCs w:val="16"/>
-              </w:rPr>
-            </w:r>
-          </w:p>
-        </w:tc>
-        <w:tc>
-          <w:tcPr>
-            <w:tcW w:w="964" w:type="dxa"/>
+            <w:tcW w:w="748" w:type="dxa"/>
+            <w:tcBorders>
+              <w:left w:val="single" w:sz="4" w:space="0" w:color="000000"/>
+              <w:bottom w:val="single" w:sz="4" w:space="0" w:color="000000"/>
+            </w:tcBorders>
+            <w:vAlign w:val="center"/>
+          </w:tcPr>
+          <w:p>
+            <w:pPr>
+              <w:pStyle w:val="user2"/>
+              <w:spacing w:lineRule="auto" w:line="240" w:before="57" w:after="57"/>
+              <w:ind w:hanging="0"/>
+              <w:rPr>
+                <w:sz w:val="16"/>
+                <w:szCs w:val="16"/>
+              </w:rPr>
+            </w:pPr>
+            <w:r>
+              <w:rPr>
+                <w:sz w:val="16"/>
+                <w:szCs w:val="16"/>
+              </w:rPr>
+            </w:r>
+          </w:p>
+        </w:tc>
+        <w:tc>
+          <w:tcPr>
+            <w:tcW w:w="737" w:type="dxa"/>
+            <w:tcBorders>
+              <w:left w:val="single" w:sz="4" w:space="0" w:color="000000"/>
+              <w:bottom w:val="single" w:sz="4" w:space="0" w:color="000000"/>
+            </w:tcBorders>
+            <w:vAlign w:val="center"/>
+          </w:tcPr>
+          <w:p>
+            <w:pPr>
+              <w:pStyle w:val="user2"/>
+              <w:spacing w:lineRule="auto" w:line="240" w:before="57" w:after="57"/>
+              <w:ind w:hanging="0"/>
+              <w:rPr>
+                <w:sz w:val="16"/>
+                <w:szCs w:val="16"/>
+              </w:rPr>
+            </w:pPr>
+            <w:r>
+              <w:rPr>
+                <w:sz w:val="16"/>
+                <w:szCs w:val="16"/>
+              </w:rPr>
+            </w:r>
+          </w:p>
+        </w:tc>
+        <w:tc>
+          <w:tcPr>
+            <w:tcW w:w="695" w:type="dxa"/>
+            <w:tcBorders>
+              <w:left w:val="single" w:sz="4" w:space="0" w:color="000000"/>
+              <w:bottom w:val="single" w:sz="4" w:space="0" w:color="000000"/>
+            </w:tcBorders>
+            <w:vAlign w:val="center"/>
+          </w:tcPr>
+          <w:p>
+            <w:pPr>
+              <w:pStyle w:val="user2"/>
+              <w:spacing w:lineRule="auto" w:line="240" w:before="57" w:after="57"/>
+              <w:ind w:hanging="0"/>
+              <w:rPr>
+                <w:sz w:val="16"/>
+                <w:szCs w:val="16"/>
+              </w:rPr>
+            </w:pPr>
+            <w:r>
+              <w:rPr/>
+            </w:r>
+          </w:p>
+        </w:tc>
+        <w:tc>
+          <w:tcPr>
+            <w:tcW w:w="1295" w:type="dxa"/>
             <w:tcBorders>
               <w:left w:val="single" w:sz="4" w:space="0" w:color="000000"/>
               <w:bottom w:val="single" w:sz="4" w:space="0" w:color="000000"/>
@@ -6023,7 +5514,7 @@
         <w:trPr/>
         <w:tc>
           <w:tcPr>
-            <w:tcW w:w="515" w:type="dxa"/>
+            <w:tcW w:w="516" w:type="dxa"/>
             <w:tcBorders>
               <w:left w:val="single" w:sz="4" w:space="0" w:color="000000"/>
               <w:bottom w:val="single" w:sz="4" w:space="0" w:color="000000"/>
@@ -6051,7 +5542,7 @@
         </w:tc>
         <w:tc>
           <w:tcPr>
-            <w:tcW w:w="4052" w:type="dxa"/>
+            <w:tcW w:w="3780" w:type="dxa"/>
             <w:tcBorders>
               <w:left w:val="single" w:sz="4" w:space="0" w:color="000000"/>
               <w:bottom w:val="single" w:sz="4" w:space="0" w:color="000000"/>
@@ -6079,143 +5570,85 @@
         </w:tc>
         <w:tc>
           <w:tcPr>
-            <w:tcW w:w="436" w:type="dxa"/>
-            <w:tcBorders>
-              <w:left w:val="single" w:sz="4" w:space="0" w:color="000000"/>
-              <w:bottom w:val="single" w:sz="4" w:space="0" w:color="000000"/>
-            </w:tcBorders>
-            <w:vAlign w:val="center"/>
-          </w:tcPr>
-          <w:p>
-            <w:pPr>
-              <w:pStyle w:val="user2"/>
-              <w:spacing w:lineRule="auto" w:line="240" w:before="57" w:after="57"/>
-              <w:ind w:hanging="0"/>
-              <w:rPr>
-                <w:sz w:val="16"/>
-                <w:szCs w:val="16"/>
-              </w:rPr>
-            </w:pPr>
-            <w:r>
-              <w:rPr>
-                <w:sz w:val="16"/>
-                <w:szCs w:val="16"/>
-              </w:rPr>
-            </w:r>
-          </w:p>
-        </w:tc>
-        <w:tc>
-          <w:tcPr>
-            <w:tcW w:w="437" w:type="dxa"/>
-            <w:tcBorders>
-              <w:left w:val="single" w:sz="4" w:space="0" w:color="000000"/>
-              <w:bottom w:val="single" w:sz="4" w:space="0" w:color="000000"/>
-            </w:tcBorders>
-            <w:vAlign w:val="center"/>
-          </w:tcPr>
-          <w:p>
-            <w:pPr>
-              <w:pStyle w:val="user2"/>
-              <w:spacing w:lineRule="auto" w:line="240" w:before="57" w:after="57"/>
-              <w:ind w:hanging="0"/>
-              <w:rPr>
-                <w:sz w:val="16"/>
-                <w:szCs w:val="16"/>
-              </w:rPr>
-            </w:pPr>
-            <w:r>
-              <w:rPr>
-                <w:sz w:val="16"/>
-                <w:szCs w:val="16"/>
-              </w:rPr>
-            </w:r>
-          </w:p>
-        </w:tc>
-        <w:tc>
-          <w:tcPr>
-            <w:tcW w:w="435" w:type="dxa"/>
-            <w:tcBorders>
-              <w:left w:val="single" w:sz="4" w:space="0" w:color="000000"/>
-              <w:bottom w:val="single" w:sz="4" w:space="0" w:color="000000"/>
-            </w:tcBorders>
-            <w:vAlign w:val="center"/>
-          </w:tcPr>
-          <w:p>
-            <w:pPr>
-              <w:pStyle w:val="user2"/>
-              <w:spacing w:lineRule="auto" w:line="240" w:before="57" w:after="57"/>
-              <w:ind w:hanging="0"/>
-              <w:rPr>
-                <w:sz w:val="16"/>
-                <w:szCs w:val="16"/>
-              </w:rPr>
-            </w:pPr>
-            <w:r>
-              <w:rPr>
-                <w:sz w:val="16"/>
-                <w:szCs w:val="16"/>
-              </w:rPr>
-              <w:t>+</w:t>
-            </w:r>
-          </w:p>
-        </w:tc>
-        <w:tc>
-          <w:tcPr>
-            <w:tcW w:w="437" w:type="dxa"/>
-            <w:tcBorders>
-              <w:left w:val="single" w:sz="4" w:space="0" w:color="000000"/>
-              <w:bottom w:val="single" w:sz="4" w:space="0" w:color="000000"/>
-            </w:tcBorders>
-            <w:vAlign w:val="center"/>
-          </w:tcPr>
-          <w:p>
-            <w:pPr>
-              <w:pStyle w:val="user2"/>
-              <w:spacing w:lineRule="auto" w:line="240" w:before="57" w:after="57"/>
-              <w:ind w:hanging="0"/>
-              <w:rPr>
-                <w:sz w:val="16"/>
-                <w:szCs w:val="16"/>
-              </w:rPr>
-            </w:pPr>
-            <w:r>
-              <w:rPr>
-                <w:sz w:val="16"/>
-                <w:szCs w:val="16"/>
-              </w:rPr>
-            </w:r>
-          </w:p>
-        </w:tc>
-        <w:tc>
-          <w:tcPr>
-            <w:tcW w:w="435" w:type="dxa"/>
-            <w:tcBorders>
-              <w:left w:val="single" w:sz="4" w:space="0" w:color="000000"/>
-              <w:bottom w:val="single" w:sz="4" w:space="0" w:color="000000"/>
-            </w:tcBorders>
-            <w:vAlign w:val="center"/>
-          </w:tcPr>
-          <w:p>
-            <w:pPr>
-              <w:pStyle w:val="user2"/>
-              <w:spacing w:lineRule="auto" w:line="240" w:before="57" w:after="57"/>
-              <w:ind w:hanging="0"/>
-              <w:rPr>
-                <w:sz w:val="16"/>
-                <w:szCs w:val="16"/>
-              </w:rPr>
-            </w:pPr>
-            <w:r>
-              <w:rPr>
-                <w:sz w:val="16"/>
-                <w:szCs w:val="16"/>
-              </w:rPr>
-            </w:r>
-          </w:p>
-        </w:tc>
-        <w:tc>
-          <w:tcPr>
-            <w:tcW w:w="964" w:type="dxa"/>
+            <w:tcW w:w="748" w:type="dxa"/>
+            <w:tcBorders>
+              <w:left w:val="single" w:sz="4" w:space="0" w:color="000000"/>
+              <w:bottom w:val="single" w:sz="4" w:space="0" w:color="000000"/>
+            </w:tcBorders>
+            <w:vAlign w:val="center"/>
+          </w:tcPr>
+          <w:p>
+            <w:pPr>
+              <w:pStyle w:val="user2"/>
+              <w:spacing w:lineRule="auto" w:line="240" w:before="57" w:after="57"/>
+              <w:ind w:hanging="0"/>
+              <w:rPr>
+                <w:sz w:val="16"/>
+                <w:szCs w:val="16"/>
+              </w:rPr>
+            </w:pPr>
+            <w:r>
+              <w:rPr>
+                <w:sz w:val="16"/>
+                <w:szCs w:val="16"/>
+              </w:rPr>
+            </w:r>
+          </w:p>
+        </w:tc>
+        <w:tc>
+          <w:tcPr>
+            <w:tcW w:w="737" w:type="dxa"/>
+            <w:tcBorders>
+              <w:left w:val="single" w:sz="4" w:space="0" w:color="000000"/>
+              <w:bottom w:val="single" w:sz="4" w:space="0" w:color="000000"/>
+            </w:tcBorders>
+            <w:vAlign w:val="center"/>
+          </w:tcPr>
+          <w:p>
+            <w:pPr>
+              <w:pStyle w:val="user2"/>
+              <w:spacing w:lineRule="auto" w:line="240" w:before="57" w:after="57"/>
+              <w:ind w:hanging="0"/>
+              <w:rPr>
+                <w:sz w:val="16"/>
+                <w:szCs w:val="16"/>
+              </w:rPr>
+            </w:pPr>
+            <w:r>
+              <w:rPr>
+                <w:sz w:val="16"/>
+                <w:szCs w:val="16"/>
+              </w:rPr>
+            </w:r>
+          </w:p>
+        </w:tc>
+        <w:tc>
+          <w:tcPr>
+            <w:tcW w:w="695" w:type="dxa"/>
+            <w:tcBorders>
+              <w:left w:val="single" w:sz="4" w:space="0" w:color="000000"/>
+              <w:bottom w:val="single" w:sz="4" w:space="0" w:color="000000"/>
+            </w:tcBorders>
+            <w:vAlign w:val="center"/>
+          </w:tcPr>
+          <w:p>
+            <w:pPr>
+              <w:pStyle w:val="user2"/>
+              <w:spacing w:lineRule="auto" w:line="240" w:before="57" w:after="57"/>
+              <w:ind w:hanging="0"/>
+              <w:rPr>
+                <w:sz w:val="16"/>
+                <w:szCs w:val="16"/>
+              </w:rPr>
+            </w:pPr>
+            <w:r>
+              <w:rPr/>
+            </w:r>
+          </w:p>
+        </w:tc>
+        <w:tc>
+          <w:tcPr>
+            <w:tcW w:w="1295" w:type="dxa"/>
             <w:tcBorders>
               <w:left w:val="single" w:sz="4" w:space="0" w:color="000000"/>
               <w:bottom w:val="single" w:sz="4" w:space="0" w:color="000000"/>
@@ -6246,7 +5679,7 @@
         <w:trPr/>
         <w:tc>
           <w:tcPr>
-            <w:tcW w:w="515" w:type="dxa"/>
+            <w:tcW w:w="516" w:type="dxa"/>
             <w:tcBorders>
               <w:left w:val="single" w:sz="4" w:space="0" w:color="000000"/>
               <w:bottom w:val="single" w:sz="4" w:space="0" w:color="000000"/>
@@ -6274,7 +5707,7 @@
         </w:tc>
         <w:tc>
           <w:tcPr>
-            <w:tcW w:w="4052" w:type="dxa"/>
+            <w:tcW w:w="3780" w:type="dxa"/>
             <w:tcBorders>
               <w:left w:val="single" w:sz="4" w:space="0" w:color="000000"/>
               <w:bottom w:val="single" w:sz="4" w:space="0" w:color="000000"/>
@@ -6302,143 +5735,85 @@
         </w:tc>
         <w:tc>
           <w:tcPr>
-            <w:tcW w:w="436" w:type="dxa"/>
-            <w:tcBorders>
-              <w:left w:val="single" w:sz="4" w:space="0" w:color="000000"/>
-              <w:bottom w:val="single" w:sz="4" w:space="0" w:color="000000"/>
-            </w:tcBorders>
-            <w:vAlign w:val="center"/>
-          </w:tcPr>
-          <w:p>
-            <w:pPr>
-              <w:pStyle w:val="user2"/>
-              <w:spacing w:lineRule="auto" w:line="240" w:before="57" w:after="57"/>
-              <w:ind w:hanging="0"/>
-              <w:rPr>
-                <w:sz w:val="16"/>
-                <w:szCs w:val="16"/>
-              </w:rPr>
-            </w:pPr>
-            <w:r>
-              <w:rPr>
-                <w:sz w:val="16"/>
-                <w:szCs w:val="16"/>
-              </w:rPr>
-            </w:r>
-          </w:p>
-        </w:tc>
-        <w:tc>
-          <w:tcPr>
-            <w:tcW w:w="437" w:type="dxa"/>
-            <w:tcBorders>
-              <w:left w:val="single" w:sz="4" w:space="0" w:color="000000"/>
-              <w:bottom w:val="single" w:sz="4" w:space="0" w:color="000000"/>
-            </w:tcBorders>
-            <w:vAlign w:val="center"/>
-          </w:tcPr>
-          <w:p>
-            <w:pPr>
-              <w:pStyle w:val="user2"/>
-              <w:spacing w:lineRule="auto" w:line="240" w:before="57" w:after="57"/>
-              <w:ind w:hanging="0"/>
-              <w:rPr>
-                <w:sz w:val="16"/>
-                <w:szCs w:val="16"/>
-              </w:rPr>
-            </w:pPr>
-            <w:r>
-              <w:rPr>
-                <w:sz w:val="16"/>
-                <w:szCs w:val="16"/>
-              </w:rPr>
-            </w:r>
-          </w:p>
-        </w:tc>
-        <w:tc>
-          <w:tcPr>
-            <w:tcW w:w="435" w:type="dxa"/>
-            <w:tcBorders>
-              <w:left w:val="single" w:sz="4" w:space="0" w:color="000000"/>
-              <w:bottom w:val="single" w:sz="4" w:space="0" w:color="000000"/>
-            </w:tcBorders>
-            <w:vAlign w:val="center"/>
-          </w:tcPr>
-          <w:p>
-            <w:pPr>
-              <w:pStyle w:val="user2"/>
-              <w:spacing w:lineRule="auto" w:line="240" w:before="57" w:after="57"/>
-              <w:ind w:hanging="0"/>
-              <w:rPr>
-                <w:sz w:val="16"/>
-                <w:szCs w:val="16"/>
-              </w:rPr>
-            </w:pPr>
-            <w:r>
-              <w:rPr>
-                <w:sz w:val="16"/>
-                <w:szCs w:val="16"/>
-              </w:rPr>
-              <w:t>+</w:t>
-            </w:r>
-          </w:p>
-        </w:tc>
-        <w:tc>
-          <w:tcPr>
-            <w:tcW w:w="437" w:type="dxa"/>
-            <w:tcBorders>
-              <w:left w:val="single" w:sz="4" w:space="0" w:color="000000"/>
-              <w:bottom w:val="single" w:sz="4" w:space="0" w:color="000000"/>
-            </w:tcBorders>
-            <w:vAlign w:val="center"/>
-          </w:tcPr>
-          <w:p>
-            <w:pPr>
-              <w:pStyle w:val="user2"/>
-              <w:spacing w:lineRule="auto" w:line="240" w:before="57" w:after="57"/>
-              <w:ind w:hanging="0"/>
-              <w:rPr>
-                <w:sz w:val="16"/>
-                <w:szCs w:val="16"/>
-              </w:rPr>
-            </w:pPr>
-            <w:r>
-              <w:rPr>
-                <w:sz w:val="16"/>
-                <w:szCs w:val="16"/>
-              </w:rPr>
-            </w:r>
-          </w:p>
-        </w:tc>
-        <w:tc>
-          <w:tcPr>
-            <w:tcW w:w="435" w:type="dxa"/>
-            <w:tcBorders>
-              <w:left w:val="single" w:sz="4" w:space="0" w:color="000000"/>
-              <w:bottom w:val="single" w:sz="4" w:space="0" w:color="000000"/>
-            </w:tcBorders>
-            <w:vAlign w:val="center"/>
-          </w:tcPr>
-          <w:p>
-            <w:pPr>
-              <w:pStyle w:val="user2"/>
-              <w:spacing w:lineRule="auto" w:line="240" w:before="57" w:after="57"/>
-              <w:ind w:hanging="0"/>
-              <w:rPr>
-                <w:sz w:val="16"/>
-                <w:szCs w:val="16"/>
-              </w:rPr>
-            </w:pPr>
-            <w:r>
-              <w:rPr>
-                <w:sz w:val="16"/>
-                <w:szCs w:val="16"/>
-              </w:rPr>
-            </w:r>
-          </w:p>
-        </w:tc>
-        <w:tc>
-          <w:tcPr>
-            <w:tcW w:w="964" w:type="dxa"/>
+            <w:tcW w:w="748" w:type="dxa"/>
+            <w:tcBorders>
+              <w:left w:val="single" w:sz="4" w:space="0" w:color="000000"/>
+              <w:bottom w:val="single" w:sz="4" w:space="0" w:color="000000"/>
+            </w:tcBorders>
+            <w:vAlign w:val="center"/>
+          </w:tcPr>
+          <w:p>
+            <w:pPr>
+              <w:pStyle w:val="user2"/>
+              <w:spacing w:lineRule="auto" w:line="240" w:before="57" w:after="57"/>
+              <w:ind w:hanging="0"/>
+              <w:rPr>
+                <w:sz w:val="16"/>
+                <w:szCs w:val="16"/>
+              </w:rPr>
+            </w:pPr>
+            <w:r>
+              <w:rPr>
+                <w:sz w:val="16"/>
+                <w:szCs w:val="16"/>
+              </w:rPr>
+            </w:r>
+          </w:p>
+        </w:tc>
+        <w:tc>
+          <w:tcPr>
+            <w:tcW w:w="737" w:type="dxa"/>
+            <w:tcBorders>
+              <w:left w:val="single" w:sz="4" w:space="0" w:color="000000"/>
+              <w:bottom w:val="single" w:sz="4" w:space="0" w:color="000000"/>
+            </w:tcBorders>
+            <w:vAlign w:val="center"/>
+          </w:tcPr>
+          <w:p>
+            <w:pPr>
+              <w:pStyle w:val="user2"/>
+              <w:spacing w:lineRule="auto" w:line="240" w:before="57" w:after="57"/>
+              <w:ind w:hanging="0"/>
+              <w:rPr>
+                <w:sz w:val="16"/>
+                <w:szCs w:val="16"/>
+              </w:rPr>
+            </w:pPr>
+            <w:r>
+              <w:rPr>
+                <w:sz w:val="16"/>
+                <w:szCs w:val="16"/>
+              </w:rPr>
+            </w:r>
+          </w:p>
+        </w:tc>
+        <w:tc>
+          <w:tcPr>
+            <w:tcW w:w="695" w:type="dxa"/>
+            <w:tcBorders>
+              <w:left w:val="single" w:sz="4" w:space="0" w:color="000000"/>
+              <w:bottom w:val="single" w:sz="4" w:space="0" w:color="000000"/>
+            </w:tcBorders>
+            <w:vAlign w:val="center"/>
+          </w:tcPr>
+          <w:p>
+            <w:pPr>
+              <w:pStyle w:val="user2"/>
+              <w:spacing w:lineRule="auto" w:line="240" w:before="57" w:after="57"/>
+              <w:ind w:hanging="0"/>
+              <w:rPr>
+                <w:sz w:val="16"/>
+                <w:szCs w:val="16"/>
+              </w:rPr>
+            </w:pPr>
+            <w:r>
+              <w:rPr/>
+            </w:r>
+          </w:p>
+        </w:tc>
+        <w:tc>
+          <w:tcPr>
+            <w:tcW w:w="1295" w:type="dxa"/>
             <w:tcBorders>
               <w:left w:val="single" w:sz="4" w:space="0" w:color="000000"/>
               <w:bottom w:val="single" w:sz="4" w:space="0" w:color="000000"/>
@@ -6469,196 +5844,142 @@
         <w:trPr/>
         <w:tc>
           <w:tcPr>
-            <w:tcW w:w="515" w:type="dxa"/>
-            <w:tcBorders>
-              <w:left w:val="single" w:sz="4" w:space="0" w:color="000000"/>
-              <w:bottom w:val="single" w:sz="4" w:space="0" w:color="000000"/>
-            </w:tcBorders>
-            <w:vAlign w:val="center"/>
-          </w:tcPr>
-          <w:p>
-            <w:pPr>
-              <w:pStyle w:val="user2"/>
-              <w:spacing w:lineRule="auto" w:line="240" w:before="57" w:after="57"/>
-              <w:ind w:hanging="0"/>
-              <w:rPr>
-                <w:sz w:val="16"/>
-                <w:szCs w:val="16"/>
-              </w:rPr>
-            </w:pPr>
-            <w:r>
-              <w:rPr>
-                <w:sz w:val="16"/>
-                <w:szCs w:val="16"/>
-              </w:rPr>
-            </w:r>
-          </w:p>
-        </w:tc>
-        <w:tc>
-          <w:tcPr>
-            <w:tcW w:w="4052" w:type="dxa"/>
-            <w:tcBorders>
-              <w:left w:val="single" w:sz="4" w:space="0" w:color="000000"/>
-              <w:bottom w:val="single" w:sz="4" w:space="0" w:color="000000"/>
-            </w:tcBorders>
-            <w:vAlign w:val="center"/>
-          </w:tcPr>
-          <w:p>
-            <w:pPr>
-              <w:pStyle w:val="user2"/>
-              <w:spacing w:lineRule="auto" w:line="240" w:before="57" w:after="57"/>
-              <w:ind w:hanging="0"/>
-              <w:rPr>
-                <w:sz w:val="16"/>
-                <w:szCs w:val="16"/>
-              </w:rPr>
-            </w:pPr>
-            <w:r>
-              <w:rPr>
-                <w:sz w:val="16"/>
-                <w:szCs w:val="16"/>
-              </w:rPr>
-            </w:r>
-          </w:p>
-        </w:tc>
-        <w:tc>
-          <w:tcPr>
-            <w:tcW w:w="436" w:type="dxa"/>
-            <w:tcBorders>
-              <w:left w:val="single" w:sz="4" w:space="0" w:color="000000"/>
-              <w:bottom w:val="single" w:sz="4" w:space="0" w:color="000000"/>
-            </w:tcBorders>
-            <w:vAlign w:val="center"/>
-          </w:tcPr>
-          <w:p>
-            <w:pPr>
-              <w:pStyle w:val="user2"/>
-              <w:spacing w:lineRule="auto" w:line="240" w:before="57" w:after="57"/>
-              <w:ind w:hanging="0"/>
-              <w:rPr>
-                <w:sz w:val="16"/>
-                <w:szCs w:val="16"/>
-              </w:rPr>
-            </w:pPr>
-            <w:r>
-              <w:rPr>
-                <w:sz w:val="16"/>
-                <w:szCs w:val="16"/>
-              </w:rPr>
-            </w:r>
-          </w:p>
-        </w:tc>
-        <w:tc>
-          <w:tcPr>
-            <w:tcW w:w="437" w:type="dxa"/>
-            <w:tcBorders>
-              <w:left w:val="single" w:sz="4" w:space="0" w:color="000000"/>
-              <w:bottom w:val="single" w:sz="4" w:space="0" w:color="000000"/>
-            </w:tcBorders>
-            <w:vAlign w:val="center"/>
-          </w:tcPr>
-          <w:p>
-            <w:pPr>
-              <w:pStyle w:val="user2"/>
-              <w:spacing w:lineRule="auto" w:line="240" w:before="57" w:after="57"/>
-              <w:ind w:hanging="0"/>
-              <w:rPr>
-                <w:sz w:val="16"/>
-                <w:szCs w:val="16"/>
-              </w:rPr>
-            </w:pPr>
-            <w:r>
-              <w:rPr>
-                <w:sz w:val="16"/>
-                <w:szCs w:val="16"/>
-              </w:rPr>
-            </w:r>
-          </w:p>
-        </w:tc>
-        <w:tc>
-          <w:tcPr>
-            <w:tcW w:w="435" w:type="dxa"/>
-            <w:tcBorders>
-              <w:left w:val="single" w:sz="4" w:space="0" w:color="000000"/>
-              <w:bottom w:val="single" w:sz="4" w:space="0" w:color="000000"/>
-            </w:tcBorders>
-            <w:vAlign w:val="center"/>
-          </w:tcPr>
-          <w:p>
-            <w:pPr>
-              <w:pStyle w:val="user2"/>
-              <w:spacing w:lineRule="auto" w:line="240" w:before="57" w:after="57"/>
-              <w:ind w:hanging="0"/>
-              <w:rPr>
-                <w:sz w:val="16"/>
-                <w:szCs w:val="16"/>
-              </w:rPr>
-            </w:pPr>
-            <w:r>
-              <w:rPr>
-                <w:sz w:val="16"/>
-                <w:szCs w:val="16"/>
-              </w:rPr>
-            </w:r>
-          </w:p>
-        </w:tc>
-        <w:tc>
-          <w:tcPr>
-            <w:tcW w:w="437" w:type="dxa"/>
-            <w:tcBorders>
-              <w:left w:val="single" w:sz="4" w:space="0" w:color="000000"/>
-              <w:bottom w:val="single" w:sz="4" w:space="0" w:color="000000"/>
-            </w:tcBorders>
-            <w:vAlign w:val="center"/>
-          </w:tcPr>
-          <w:p>
-            <w:pPr>
-              <w:pStyle w:val="user2"/>
-              <w:spacing w:lineRule="auto" w:line="240" w:before="57" w:after="57"/>
-              <w:ind w:hanging="0"/>
-              <w:rPr>
-                <w:sz w:val="16"/>
-                <w:szCs w:val="16"/>
-              </w:rPr>
-            </w:pPr>
-            <w:r>
-              <w:rPr>
-                <w:sz w:val="16"/>
-                <w:szCs w:val="16"/>
-              </w:rPr>
-            </w:r>
-          </w:p>
-        </w:tc>
-        <w:tc>
-          <w:tcPr>
-            <w:tcW w:w="435" w:type="dxa"/>
-            <w:tcBorders>
-              <w:left w:val="single" w:sz="4" w:space="0" w:color="000000"/>
-              <w:bottom w:val="single" w:sz="4" w:space="0" w:color="000000"/>
-            </w:tcBorders>
-            <w:vAlign w:val="center"/>
-          </w:tcPr>
-          <w:p>
-            <w:pPr>
-              <w:pStyle w:val="user2"/>
-              <w:spacing w:lineRule="auto" w:line="240" w:before="57" w:after="57"/>
-              <w:ind w:hanging="0"/>
-              <w:rPr>
-                <w:sz w:val="16"/>
-                <w:szCs w:val="16"/>
-              </w:rPr>
-            </w:pPr>
-            <w:r>
-              <w:rPr>
-                <w:sz w:val="16"/>
-                <w:szCs w:val="16"/>
-              </w:rPr>
-            </w:r>
-          </w:p>
-        </w:tc>
-        <w:tc>
-          <w:tcPr>
-            <w:tcW w:w="964" w:type="dxa"/>
+            <w:tcW w:w="516" w:type="dxa"/>
+            <w:tcBorders>
+              <w:left w:val="single" w:sz="4" w:space="0" w:color="000000"/>
+              <w:bottom w:val="single" w:sz="4" w:space="0" w:color="000000"/>
+            </w:tcBorders>
+            <w:vAlign w:val="center"/>
+          </w:tcPr>
+          <w:p>
+            <w:pPr>
+              <w:pStyle w:val="user2"/>
+              <w:spacing w:lineRule="auto" w:line="240" w:before="57" w:after="57"/>
+              <w:ind w:hanging="0"/>
+              <w:rPr>
+                <w:sz w:val="16"/>
+                <w:szCs w:val="16"/>
+              </w:rPr>
+            </w:pPr>
+            <w:r>
+              <w:rPr>
+                <w:sz w:val="16"/>
+                <w:szCs w:val="16"/>
+              </w:rPr>
+            </w:r>
+          </w:p>
+        </w:tc>
+        <w:tc>
+          <w:tcPr>
+            <w:tcW w:w="3780" w:type="dxa"/>
+            <w:tcBorders>
+              <w:left w:val="single" w:sz="4" w:space="0" w:color="000000"/>
+              <w:bottom w:val="single" w:sz="4" w:space="0" w:color="000000"/>
+            </w:tcBorders>
+            <w:vAlign w:val="center"/>
+          </w:tcPr>
+          <w:p>
+            <w:pPr>
+              <w:pStyle w:val="user2"/>
+              <w:spacing w:lineRule="auto" w:line="240" w:before="57" w:after="57"/>
+              <w:ind w:hanging="0"/>
+              <w:rPr>
+                <w:sz w:val="16"/>
+                <w:szCs w:val="16"/>
+              </w:rPr>
+            </w:pPr>
+            <w:r>
+              <w:rPr>
+                <w:sz w:val="16"/>
+                <w:szCs w:val="16"/>
+              </w:rPr>
+            </w:r>
+          </w:p>
+        </w:tc>
+        <w:tc>
+          <w:tcPr>
+            <w:tcW w:w="748" w:type="dxa"/>
+            <w:tcBorders>
+              <w:left w:val="single" w:sz="4" w:space="0" w:color="000000"/>
+              <w:bottom w:val="single" w:sz="4" w:space="0" w:color="000000"/>
+            </w:tcBorders>
+            <w:vAlign w:val="center"/>
+          </w:tcPr>
+          <w:p>
+            <w:pPr>
+              <w:pStyle w:val="user2"/>
+              <w:spacing w:lineRule="auto" w:line="240" w:before="57" w:after="57"/>
+              <w:ind w:hanging="0"/>
+              <w:rPr>
+                <w:sz w:val="16"/>
+                <w:szCs w:val="16"/>
+              </w:rPr>
+            </w:pPr>
+            <w:r>
+              <w:rPr>
+                <w:sz w:val="16"/>
+                <w:szCs w:val="16"/>
+              </w:rPr>
+            </w:r>
+          </w:p>
+        </w:tc>
+        <w:tc>
+          <w:tcPr>
+            <w:tcW w:w="737" w:type="dxa"/>
+            <w:tcBorders>
+              <w:left w:val="single" w:sz="4" w:space="0" w:color="000000"/>
+              <w:bottom w:val="single" w:sz="4" w:space="0" w:color="000000"/>
+            </w:tcBorders>
+            <w:vAlign w:val="center"/>
+          </w:tcPr>
+          <w:p>
+            <w:pPr>
+              <w:pStyle w:val="user2"/>
+              <w:spacing w:lineRule="auto" w:line="240" w:before="57" w:after="57"/>
+              <w:ind w:hanging="0"/>
+              <w:rPr>
+                <w:sz w:val="16"/>
+                <w:szCs w:val="16"/>
+              </w:rPr>
+            </w:pPr>
+            <w:r>
+              <w:rPr>
+                <w:sz w:val="16"/>
+                <w:szCs w:val="16"/>
+              </w:rPr>
+            </w:r>
+          </w:p>
+        </w:tc>
+        <w:tc>
+          <w:tcPr>
+            <w:tcW w:w="695" w:type="dxa"/>
+            <w:tcBorders>
+              <w:left w:val="single" w:sz="4" w:space="0" w:color="000000"/>
+              <w:bottom w:val="single" w:sz="4" w:space="0" w:color="000000"/>
+            </w:tcBorders>
+            <w:vAlign w:val="center"/>
+          </w:tcPr>
+          <w:p>
+            <w:pPr>
+              <w:pStyle w:val="user2"/>
+              <w:spacing w:lineRule="auto" w:line="240" w:before="57" w:after="57"/>
+              <w:ind w:hanging="0"/>
+              <w:rPr>
+                <w:sz w:val="16"/>
+                <w:szCs w:val="16"/>
+              </w:rPr>
+            </w:pPr>
+            <w:r>
+              <w:rPr>
+                <w:sz w:val="16"/>
+                <w:szCs w:val="16"/>
+              </w:rPr>
+            </w:r>
+          </w:p>
+        </w:tc>
+        <w:tc>
+          <w:tcPr>
+            <w:tcW w:w="1295" w:type="dxa"/>
             <w:tcBorders>
               <w:left w:val="single" w:sz="4" w:space="0" w:color="000000"/>
               <w:bottom w:val="single" w:sz="4" w:space="0" w:color="000000"/>
@@ -6689,192 +6010,140 @@
         <w:trPr/>
         <w:tc>
           <w:tcPr>
-            <w:tcW w:w="515" w:type="dxa"/>
-            <w:tcBorders>
-              <w:left w:val="single" w:sz="4" w:space="0" w:color="000000"/>
-              <w:bottom w:val="single" w:sz="4" w:space="0" w:color="000000"/>
-            </w:tcBorders>
-            <w:vAlign w:val="center"/>
-          </w:tcPr>
-          <w:p>
-            <w:pPr>
-              <w:pStyle w:val="user2"/>
-              <w:spacing w:lineRule="auto" w:line="240" w:before="57" w:after="57"/>
-              <w:ind w:hanging="0"/>
-              <w:rPr>
-                <w:sz w:val="16"/>
-                <w:szCs w:val="16"/>
-              </w:rPr>
-            </w:pPr>
-            <w:r>
-              <w:rPr>
-                <w:sz w:val="16"/>
-                <w:szCs w:val="16"/>
-              </w:rPr>
-            </w:r>
-          </w:p>
-        </w:tc>
-        <w:tc>
-          <w:tcPr>
-            <w:tcW w:w="4052" w:type="dxa"/>
-            <w:tcBorders>
-              <w:left w:val="single" w:sz="4" w:space="0" w:color="000000"/>
-              <w:bottom w:val="single" w:sz="4" w:space="0" w:color="000000"/>
-            </w:tcBorders>
-            <w:vAlign w:val="center"/>
-          </w:tcPr>
-          <w:p>
-            <w:pPr>
-              <w:pStyle w:val="user2"/>
-              <w:spacing w:lineRule="auto" w:line="240" w:before="57" w:after="57"/>
-              <w:ind w:hanging="0"/>
-              <w:rPr>
-                <w:sz w:val="16"/>
-                <w:szCs w:val="16"/>
-              </w:rPr>
-            </w:pPr>
-            <w:r>
-              <w:rPr>
-                <w:sz w:val="16"/>
-                <w:szCs w:val="16"/>
-              </w:rPr>
-            </w:r>
-          </w:p>
-        </w:tc>
-        <w:tc>
-          <w:tcPr>
-            <w:tcW w:w="436" w:type="dxa"/>
-            <w:tcBorders>
-              <w:left w:val="single" w:sz="4" w:space="0" w:color="000000"/>
-              <w:bottom w:val="single" w:sz="4" w:space="0" w:color="000000"/>
-            </w:tcBorders>
-            <w:vAlign w:val="center"/>
-          </w:tcPr>
-          <w:p>
-            <w:pPr>
-              <w:pStyle w:val="user2"/>
-              <w:spacing w:lineRule="auto" w:line="240" w:before="57" w:after="57"/>
-              <w:ind w:hanging="0"/>
-              <w:rPr>
-                <w:sz w:val="16"/>
-                <w:szCs w:val="16"/>
-              </w:rPr>
-            </w:pPr>
-            <w:r>
-              <w:rPr>
-                <w:sz w:val="16"/>
-                <w:szCs w:val="16"/>
-              </w:rPr>
-            </w:r>
-          </w:p>
-        </w:tc>
-        <w:tc>
-          <w:tcPr>
-            <w:tcW w:w="437" w:type="dxa"/>
-            <w:tcBorders>
-              <w:left w:val="single" w:sz="4" w:space="0" w:color="000000"/>
-              <w:bottom w:val="single" w:sz="4" w:space="0" w:color="000000"/>
-            </w:tcBorders>
-            <w:vAlign w:val="center"/>
-          </w:tcPr>
-          <w:p>
-            <w:pPr>
-              <w:pStyle w:val="user2"/>
-              <w:spacing w:lineRule="auto" w:line="240" w:before="57" w:after="57"/>
-              <w:rPr>
-                <w:sz w:val="16"/>
-                <w:szCs w:val="16"/>
-              </w:rPr>
-            </w:pPr>
-            <w:r>
-              <w:rPr>
-                <w:sz w:val="16"/>
-                <w:szCs w:val="16"/>
-              </w:rPr>
-            </w:r>
-          </w:p>
-        </w:tc>
-        <w:tc>
-          <w:tcPr>
-            <w:tcW w:w="435" w:type="dxa"/>
-            <w:tcBorders>
-              <w:left w:val="single" w:sz="4" w:space="0" w:color="000000"/>
-              <w:bottom w:val="single" w:sz="4" w:space="0" w:color="000000"/>
-            </w:tcBorders>
-            <w:vAlign w:val="center"/>
-          </w:tcPr>
-          <w:p>
-            <w:pPr>
-              <w:pStyle w:val="user2"/>
-              <w:spacing w:lineRule="auto" w:line="240" w:before="57" w:after="57"/>
-              <w:rPr>
-                <w:sz w:val="16"/>
-                <w:szCs w:val="16"/>
-              </w:rPr>
-            </w:pPr>
-            <w:r>
-              <w:rPr>
-                <w:sz w:val="16"/>
-                <w:szCs w:val="16"/>
-              </w:rPr>
-            </w:r>
-          </w:p>
-        </w:tc>
-        <w:tc>
-          <w:tcPr>
-            <w:tcW w:w="437" w:type="dxa"/>
-            <w:tcBorders>
-              <w:left w:val="single" w:sz="4" w:space="0" w:color="000000"/>
-              <w:bottom w:val="single" w:sz="4" w:space="0" w:color="000000"/>
-            </w:tcBorders>
-            <w:vAlign w:val="center"/>
-          </w:tcPr>
-          <w:p>
-            <w:pPr>
-              <w:pStyle w:val="user2"/>
-              <w:spacing w:lineRule="auto" w:line="240" w:before="57" w:after="57"/>
-              <w:rPr>
-                <w:sz w:val="16"/>
-                <w:szCs w:val="16"/>
-              </w:rPr>
-            </w:pPr>
-            <w:r>
-              <w:rPr>
-                <w:sz w:val="16"/>
-                <w:szCs w:val="16"/>
-              </w:rPr>
-            </w:r>
-          </w:p>
-        </w:tc>
-        <w:tc>
-          <w:tcPr>
-            <w:tcW w:w="435" w:type="dxa"/>
-            <w:tcBorders>
-              <w:left w:val="single" w:sz="4" w:space="0" w:color="000000"/>
-              <w:bottom w:val="single" w:sz="4" w:space="0" w:color="000000"/>
-            </w:tcBorders>
-            <w:vAlign w:val="center"/>
-          </w:tcPr>
-          <w:p>
-            <w:pPr>
-              <w:pStyle w:val="user2"/>
-              <w:spacing w:lineRule="auto" w:line="240" w:before="57" w:after="57"/>
-              <w:rPr>
-                <w:sz w:val="16"/>
-                <w:szCs w:val="16"/>
-              </w:rPr>
-            </w:pPr>
-            <w:r>
-              <w:rPr>
-                <w:sz w:val="16"/>
-                <w:szCs w:val="16"/>
-              </w:rPr>
-            </w:r>
-          </w:p>
-        </w:tc>
-        <w:tc>
-          <w:tcPr>
-            <w:tcW w:w="964" w:type="dxa"/>
+            <w:tcW w:w="516" w:type="dxa"/>
+            <w:tcBorders>
+              <w:left w:val="single" w:sz="4" w:space="0" w:color="000000"/>
+              <w:bottom w:val="single" w:sz="4" w:space="0" w:color="000000"/>
+            </w:tcBorders>
+            <w:vAlign w:val="center"/>
+          </w:tcPr>
+          <w:p>
+            <w:pPr>
+              <w:pStyle w:val="user2"/>
+              <w:spacing w:lineRule="auto" w:line="240" w:before="57" w:after="57"/>
+              <w:ind w:hanging="0"/>
+              <w:rPr>
+                <w:sz w:val="16"/>
+                <w:szCs w:val="16"/>
+              </w:rPr>
+            </w:pPr>
+            <w:r>
+              <w:rPr>
+                <w:sz w:val="16"/>
+                <w:szCs w:val="16"/>
+              </w:rPr>
+            </w:r>
+          </w:p>
+        </w:tc>
+        <w:tc>
+          <w:tcPr>
+            <w:tcW w:w="3780" w:type="dxa"/>
+            <w:tcBorders>
+              <w:left w:val="single" w:sz="4" w:space="0" w:color="000000"/>
+              <w:bottom w:val="single" w:sz="4" w:space="0" w:color="000000"/>
+            </w:tcBorders>
+            <w:vAlign w:val="center"/>
+          </w:tcPr>
+          <w:p>
+            <w:pPr>
+              <w:pStyle w:val="user2"/>
+              <w:spacing w:lineRule="auto" w:line="240" w:before="57" w:after="57"/>
+              <w:ind w:hanging="0"/>
+              <w:rPr>
+                <w:sz w:val="16"/>
+                <w:szCs w:val="16"/>
+              </w:rPr>
+            </w:pPr>
+            <w:r>
+              <w:rPr>
+                <w:sz w:val="16"/>
+                <w:szCs w:val="16"/>
+              </w:rPr>
+            </w:r>
+          </w:p>
+        </w:tc>
+        <w:tc>
+          <w:tcPr>
+            <w:tcW w:w="748" w:type="dxa"/>
+            <w:tcBorders>
+              <w:left w:val="single" w:sz="4" w:space="0" w:color="000000"/>
+              <w:bottom w:val="single" w:sz="4" w:space="0" w:color="000000"/>
+            </w:tcBorders>
+            <w:vAlign w:val="center"/>
+          </w:tcPr>
+          <w:p>
+            <w:pPr>
+              <w:pStyle w:val="user2"/>
+              <w:spacing w:lineRule="auto" w:line="240" w:before="57" w:after="57"/>
+              <w:ind w:hanging="0"/>
+              <w:rPr>
+                <w:sz w:val="16"/>
+                <w:szCs w:val="16"/>
+              </w:rPr>
+            </w:pPr>
+            <w:r>
+              <w:rPr>
+                <w:sz w:val="16"/>
+                <w:szCs w:val="16"/>
+              </w:rPr>
+            </w:r>
+          </w:p>
+        </w:tc>
+        <w:tc>
+          <w:tcPr>
+            <w:tcW w:w="737" w:type="dxa"/>
+            <w:tcBorders>
+              <w:left w:val="single" w:sz="4" w:space="0" w:color="000000"/>
+              <w:bottom w:val="single" w:sz="4" w:space="0" w:color="000000"/>
+            </w:tcBorders>
+            <w:vAlign w:val="center"/>
+          </w:tcPr>
+          <w:p>
+            <w:pPr>
+              <w:pStyle w:val="user2"/>
+              <w:spacing w:lineRule="auto" w:line="240" w:before="57" w:after="57"/>
+              <w:rPr>
+                <w:sz w:val="16"/>
+                <w:szCs w:val="16"/>
+              </w:rPr>
+            </w:pPr>
+            <w:r>
+              <w:rPr>
+                <w:sz w:val="16"/>
+                <w:szCs w:val="16"/>
+              </w:rPr>
+            </w:r>
+          </w:p>
+        </w:tc>
+        <w:tc>
+          <w:tcPr>
+            <w:tcW w:w="695" w:type="dxa"/>
+            <w:tcBorders>
+              <w:left w:val="single" w:sz="4" w:space="0" w:color="000000"/>
+              <w:bottom w:val="single" w:sz="4" w:space="0" w:color="000000"/>
+            </w:tcBorders>
+            <w:vAlign w:val="center"/>
+          </w:tcPr>
+          <w:p>
+            <w:pPr>
+              <w:pStyle w:val="user2"/>
+              <w:spacing w:lineRule="auto" w:line="240" w:before="57" w:after="57"/>
+              <w:rPr>
+                <w:sz w:val="16"/>
+                <w:szCs w:val="16"/>
+              </w:rPr>
+            </w:pPr>
+            <w:r>
+              <w:rPr>
+                <w:sz w:val="16"/>
+                <w:szCs w:val="16"/>
+              </w:rPr>
+            </w:r>
+          </w:p>
+        </w:tc>
+        <w:tc>
+          <w:tcPr>
+            <w:tcW w:w="1295" w:type="dxa"/>
             <w:tcBorders>
               <w:left w:val="single" w:sz="4" w:space="0" w:color="000000"/>
               <w:bottom w:val="single" w:sz="4" w:space="0" w:color="000000"/>
@@ -6988,7 +6257,21 @@
           <w:u w:val="single"/>
         </w:rPr>
         <w:tab/>
-        <w:t>Туленков А.В.</w:t>
+      </w:r>
+      <w:r>
+        <w:rPr>
+          <w:sz w:val="20"/>
+          <w:szCs w:val="20"/>
+          <w:u w:val="single"/>
+        </w:rPr>
+        <w:t>Степаненко О.О.</w:t>
+      </w:r>
+      <w:r>
+        <w:rPr>
+          <w:sz w:val="20"/>
+          <w:szCs w:val="20"/>
+          <w:u w:val="single"/>
+        </w:rPr>
         <w:tab/>
         <w:tab/>
       </w:r>
@@ -7089,7 +6372,7 @@
           <w:u w:val="single"/>
         </w:rPr>
         <w:tab/>
-        <w:t>Акритова Т. О.</w:t>
+        <w:t>Никонова К.В.</w:t>
         <w:tab/>
       </w:r>
     </w:p>
@@ -7216,219 +6499,23 @@
         <w:suppressAutoHyphens w:val="true"/>
         <w:bidi w:val="0"/>
         <w:spacing w:lineRule="auto" w:line="360" w:before="0" w:after="0"/>
-        <w:ind w:firstLine="340" w:left="0" w:right="0"/>
-        <w:contextualSpacing/>
-        <w:jc w:val="left"/>
-        <w:rPr>
-          <w:sz w:val="20"/>
-          <w:szCs w:val="20"/>
-          <w:u w:val="none"/>
-        </w:rPr>
-      </w:pPr>
-      <w:r>
-        <w:rPr>
-          <w:sz w:val="20"/>
-          <w:szCs w:val="20"/>
-          <w:u w:val="none"/>
-        </w:rPr>
-        <w:t>Ознайомився з курсами. Курс з верстки містить матеріали з курсів веб програмування. Курс з менеджменту дуже нагадує дисципліну управління проєктами.</w:t>
-      </w:r>
-    </w:p>
-    <w:p>
-      <w:pPr>
-        <w:pStyle w:val="Normal"/>
-        <w:widowControl/>
-        <w:suppressAutoHyphens w:val="true"/>
-        <w:bidi w:val="0"/>
-        <w:spacing w:lineRule="auto" w:line="360" w:before="0" w:after="0"/>
-        <w:ind w:firstLine="340" w:left="0" w:right="0"/>
-        <w:contextualSpacing/>
-        <w:jc w:val="left"/>
-        <w:rPr>
-          <w:sz w:val="20"/>
-          <w:szCs w:val="20"/>
-          <w:u w:val="none"/>
-          <w:lang w:val="uk-UA"/>
-        </w:rPr>
-      </w:pPr>
-      <w:r>
-        <w:rPr>
-          <w:sz w:val="20"/>
-          <w:szCs w:val="20"/>
-          <w:u w:val="none"/>
-        </w:rPr>
-        <w:t xml:space="preserve">Аби зробити елемент липким до гори екрану потрібно вказати йому властивість </w:t>
-      </w:r>
-      <w:r>
-        <w:rPr>
-          <w:sz w:val="20"/>
-          <w:szCs w:val="20"/>
-          <w:u w:val="none"/>
-          <w:lang w:val="en-US"/>
-        </w:rPr>
-        <w:t xml:space="preserve">top </w:t>
-      </w:r>
-      <w:r>
-        <w:rPr>
-          <w:sz w:val="20"/>
-          <w:szCs w:val="20"/>
-          <w:u w:val="none"/>
-          <w:lang w:val="uk-UA"/>
-        </w:rPr>
-        <w:t>значенням 0.</w:t>
-      </w:r>
-    </w:p>
-    <w:p>
-      <w:pPr>
-        <w:pStyle w:val="Normal"/>
-        <w:widowControl/>
-        <w:suppressAutoHyphens w:val="true"/>
-        <w:bidi w:val="0"/>
-        <w:spacing w:lineRule="auto" w:line="360" w:before="0" w:after="0"/>
-        <w:ind w:firstLine="340" w:left="0" w:right="0"/>
-        <w:contextualSpacing/>
-        <w:jc w:val="left"/>
-        <w:rPr>
-          <w:sz w:val="20"/>
-          <w:szCs w:val="20"/>
-          <w:u w:val="none"/>
-          <w:lang w:val="en-US"/>
-        </w:rPr>
-      </w:pPr>
-      <w:r>
-        <w:rPr>
-          <w:sz w:val="20"/>
-          <w:szCs w:val="20"/>
-          <w:u w:val="none"/>
-          <w:lang w:val="uk-UA"/>
-        </w:rPr>
-        <w:t xml:space="preserve">Щоб поставити елемент поза потоком на сторінці потрібно для нього вказати позицію </w:t>
-      </w:r>
-      <w:r>
-        <w:rPr>
-          <w:sz w:val="20"/>
-          <w:szCs w:val="20"/>
-          <w:u w:val="none"/>
-          <w:lang w:val="en-US"/>
-        </w:rPr>
-        <w:t xml:space="preserve">absolute, </w:t>
-      </w:r>
-      <w:r>
-        <w:rPr>
-          <w:sz w:val="20"/>
-          <w:szCs w:val="20"/>
-          <w:u w:val="none"/>
-          <w:lang w:val="uk-UA"/>
-        </w:rPr>
-        <w:t xml:space="preserve">а для батьківського елементу позицію </w:t>
-      </w:r>
-      <w:r>
-        <w:rPr>
-          <w:sz w:val="20"/>
-          <w:szCs w:val="20"/>
-          <w:u w:val="none"/>
-          <w:lang w:val="en-US"/>
-        </w:rPr>
-        <w:t>relative.</w:t>
-      </w:r>
-    </w:p>
-    <w:p>
-      <w:pPr>
-        <w:pStyle w:val="Normal"/>
-        <w:widowControl/>
-        <w:suppressAutoHyphens w:val="true"/>
-        <w:bidi w:val="0"/>
-        <w:spacing w:lineRule="auto" w:line="360" w:before="0" w:after="0"/>
-        <w:ind w:firstLine="340" w:left="0" w:right="0"/>
-        <w:contextualSpacing/>
-        <w:jc w:val="left"/>
-        <w:rPr>
-          <w:sz w:val="20"/>
-          <w:szCs w:val="20"/>
-          <w:u w:val="none"/>
-          <w:lang w:val="uk-UA"/>
-        </w:rPr>
-      </w:pPr>
-      <w:r>
-        <w:rPr>
-          <w:sz w:val="20"/>
-          <w:szCs w:val="20"/>
-          <w:u w:val="none"/>
-          <w:lang w:val="uk-UA"/>
-        </w:rPr>
-        <w:t xml:space="preserve">На діаграмі Гантта в інструменті </w:t>
-      </w:r>
-      <w:r>
-        <w:rPr>
-          <w:sz w:val="20"/>
-          <w:szCs w:val="20"/>
-          <w:u w:val="none"/>
-          <w:lang w:val="en-US"/>
-        </w:rPr>
-        <w:t xml:space="preserve">GanttPRO </w:t>
-      </w:r>
-      <w:r>
-        <w:rPr>
-          <w:sz w:val="20"/>
-          <w:szCs w:val="20"/>
-          <w:u w:val="none"/>
-          <w:lang w:val="uk-UA"/>
-        </w:rPr>
-        <w:t xml:space="preserve">біля кожної задачі на кінцях є кружечки, через які можна додати різні типи залежностей. Також в цьому інструменті можна додати і призначити віртуальні ресурси — людей команди. </w:t>
-      </w:r>
-    </w:p>
-    <w:p>
-      <w:pPr>
-        <w:pStyle w:val="Normal"/>
-        <w:widowControl/>
-        <w:suppressAutoHyphens w:val="true"/>
-        <w:bidi w:val="0"/>
-        <w:spacing w:lineRule="auto" w:line="360" w:before="0" w:after="0"/>
-        <w:ind w:firstLine="340" w:left="0" w:right="0"/>
-        <w:contextualSpacing/>
-        <w:jc w:val="left"/>
-        <w:rPr>
-          <w:sz w:val="20"/>
-          <w:szCs w:val="20"/>
-          <w:u w:val="none"/>
-          <w:lang w:val="uk-UA"/>
-        </w:rPr>
-      </w:pPr>
-      <w:r>
-        <w:rPr>
-          <w:sz w:val="20"/>
-          <w:szCs w:val="20"/>
-          <w:u w:val="none"/>
-          <w:lang w:val="uk-UA"/>
-        </w:rPr>
-        <w:t xml:space="preserve">Для індивідуального завдання з верстки використано трохи інший логотип і підлаштовано основний колір кнопок під нього для кращої однорідності. </w:t>
-      </w:r>
-    </w:p>
-    <w:p>
-      <w:pPr>
-        <w:pStyle w:val="Normal"/>
-        <w:widowControl/>
-        <w:suppressAutoHyphens w:val="true"/>
-        <w:bidi w:val="0"/>
-        <w:spacing w:lineRule="auto" w:line="360" w:before="0" w:after="0"/>
-        <w:ind w:firstLine="340" w:left="0" w:right="0"/>
-        <w:contextualSpacing/>
-        <w:jc w:val="left"/>
-        <w:rPr>
-          <w:sz w:val="20"/>
-          <w:szCs w:val="20"/>
-          <w:u w:val="none"/>
-          <w:lang w:val="uk-UA"/>
-        </w:rPr>
-      </w:pPr>
-      <w:r>
-        <w:rPr>
-          <w:sz w:val="20"/>
-          <w:szCs w:val="20"/>
-          <w:u w:val="none"/>
-          <w:lang w:val="uk-UA"/>
-        </w:rPr>
-        <w:t>Для індивідуального завдання з менеджменту виконано такі самі завдання, як на курсі, самостійно і з використанням штучного інтелекту, за завданням.</w:t>
+        <w:ind w:hanging="0" w:left="0" w:right="0"/>
+        <w:contextualSpacing/>
+        <w:jc w:val="left"/>
+        <w:rPr>
+          <w:sz w:val="20"/>
+          <w:szCs w:val="20"/>
+          <w:u w:val="none"/>
+        </w:rPr>
+      </w:pPr>
+      <w:r>
+        <w:rPr>
+          <w:sz w:val="20"/>
+          <w:szCs w:val="20"/>
+          <w:u w:val="none"/>
+        </w:rPr>
+        <w:tab/>
+        <w:t>Спершу зв’язався з ментором від компанії. Сказали використовувати застосунок диплому для практики.</w:t>
       </w:r>
     </w:p>
     <w:sectPr>

</xml_diff>

<commit_message>
docs -- NI: more exam prep, prepare for 3rd lab
</commit_message>
<xml_diff>
--- a/42P Praktyka/Щоденник.docx
+++ b/42P Praktyka/Щоденник.docx
@@ -3999,13 +3999,15 @@
               <w:pStyle w:val="user2"/>
               <w:spacing w:lineRule="auto" w:line="240" w:before="57" w:after="57"/>
               <w:ind w:hanging="0"/>
-              <w:rPr>
-                <w:sz w:val="16"/>
-                <w:szCs w:val="16"/>
-              </w:rPr>
-            </w:pPr>
-            <w:r>
+              <w:jc w:val="center"/>
               <w:rPr/>
+            </w:pPr>
+            <w:r>
+              <w:rPr>
+                <w:sz w:val="16"/>
+                <w:szCs w:val="16"/>
+              </w:rPr>
+              <w:t>+</w:t>
             </w:r>
           </w:p>
         </w:tc>
@@ -4023,6 +4025,7 @@
               <w:pStyle w:val="user2"/>
               <w:spacing w:lineRule="auto" w:line="240" w:before="57" w:after="57"/>
               <w:ind w:hanging="0"/>
+              <w:jc w:val="center"/>
               <w:rPr>
                 <w:sz w:val="16"/>
                 <w:szCs w:val="16"/>
@@ -4050,6 +4053,7 @@
               <w:pStyle w:val="user2"/>
               <w:spacing w:lineRule="auto" w:line="240" w:before="57" w:after="57"/>
               <w:ind w:hanging="0"/>
+              <w:jc w:val="center"/>
               <w:rPr>
                 <w:sz w:val="16"/>
                 <w:szCs w:val="16"/>
@@ -4161,13 +4165,15 @@
               <w:pStyle w:val="user2"/>
               <w:spacing w:lineRule="auto" w:line="240" w:before="57" w:after="57"/>
               <w:ind w:hanging="0"/>
-              <w:rPr>
-                <w:sz w:val="16"/>
-                <w:szCs w:val="16"/>
-              </w:rPr>
-            </w:pPr>
-            <w:r>
+              <w:jc w:val="center"/>
               <w:rPr/>
+            </w:pPr>
+            <w:r>
+              <w:rPr>
+                <w:sz w:val="16"/>
+                <w:szCs w:val="16"/>
+              </w:rPr>
+              <w:t>+</w:t>
             </w:r>
           </w:p>
         </w:tc>
@@ -4185,6 +4191,7 @@
               <w:pStyle w:val="user2"/>
               <w:spacing w:lineRule="auto" w:line="240" w:before="57" w:after="57"/>
               <w:ind w:hanging="0"/>
+              <w:jc w:val="center"/>
               <w:rPr>
                 <w:sz w:val="16"/>
                 <w:szCs w:val="16"/>
@@ -4212,6 +4219,7 @@
               <w:pStyle w:val="user2"/>
               <w:spacing w:lineRule="auto" w:line="240" w:before="57" w:after="57"/>
               <w:ind w:hanging="0"/>
+              <w:jc w:val="center"/>
               <w:rPr>
                 <w:sz w:val="16"/>
                 <w:szCs w:val="16"/>
@@ -4323,13 +4331,15 @@
               <w:pStyle w:val="user2"/>
               <w:spacing w:lineRule="auto" w:line="240" w:before="57" w:after="57"/>
               <w:ind w:hanging="0"/>
-              <w:rPr>
-                <w:sz w:val="16"/>
-                <w:szCs w:val="16"/>
-              </w:rPr>
-            </w:pPr>
-            <w:r>
+              <w:jc w:val="center"/>
               <w:rPr/>
+            </w:pPr>
+            <w:r>
+              <w:rPr>
+                <w:sz w:val="16"/>
+                <w:szCs w:val="16"/>
+              </w:rPr>
+              <w:t>+</w:t>
             </w:r>
           </w:p>
         </w:tc>
@@ -4347,6 +4357,7 @@
               <w:pStyle w:val="user2"/>
               <w:spacing w:lineRule="auto" w:line="240" w:before="57" w:after="57"/>
               <w:ind w:hanging="0"/>
+              <w:jc w:val="center"/>
               <w:rPr>
                 <w:sz w:val="16"/>
                 <w:szCs w:val="16"/>
@@ -4374,6 +4385,7 @@
               <w:pStyle w:val="user2"/>
               <w:spacing w:lineRule="auto" w:line="240" w:before="57" w:after="57"/>
               <w:ind w:hanging="0"/>
+              <w:jc w:val="center"/>
               <w:rPr>
                 <w:sz w:val="16"/>
                 <w:szCs w:val="16"/>
@@ -4485,13 +4497,15 @@
               <w:pStyle w:val="user2"/>
               <w:spacing w:lineRule="auto" w:line="240" w:before="57" w:after="57"/>
               <w:ind w:hanging="0"/>
-              <w:rPr>
-                <w:sz w:val="16"/>
-                <w:szCs w:val="16"/>
-              </w:rPr>
-            </w:pPr>
-            <w:r>
+              <w:jc w:val="center"/>
               <w:rPr/>
+            </w:pPr>
+            <w:r>
+              <w:rPr>
+                <w:sz w:val="16"/>
+                <w:szCs w:val="16"/>
+              </w:rPr>
+              <w:t>+</w:t>
             </w:r>
           </w:p>
         </w:tc>
@@ -4509,16 +4523,18 @@
               <w:pStyle w:val="user2"/>
               <w:spacing w:lineRule="auto" w:line="240" w:before="57" w:after="57"/>
               <w:ind w:hanging="0"/>
-              <w:rPr>
-                <w:sz w:val="16"/>
-                <w:szCs w:val="16"/>
-              </w:rPr>
-            </w:pPr>
-            <w:r>
-              <w:rPr>
-                <w:sz w:val="16"/>
-                <w:szCs w:val="16"/>
-              </w:rPr>
+              <w:jc w:val="center"/>
+              <w:rPr>
+                <w:sz w:val="16"/>
+                <w:szCs w:val="16"/>
+              </w:rPr>
+            </w:pPr>
+            <w:r>
+              <w:rPr>
+                <w:sz w:val="16"/>
+                <w:szCs w:val="16"/>
+              </w:rPr>
+              <w:t>+</w:t>
             </w:r>
           </w:p>
         </w:tc>
@@ -4536,6 +4552,7 @@
               <w:pStyle w:val="user2"/>
               <w:spacing w:lineRule="auto" w:line="240" w:before="57" w:after="57"/>
               <w:ind w:hanging="0"/>
+              <w:jc w:val="center"/>
               <w:rPr>
                 <w:sz w:val="16"/>
                 <w:szCs w:val="16"/>
@@ -4625,28 +4642,30 @@
               </w:rPr>
             </w:pPr>
             <w:r>
+              <w:rPr>
+                <w:sz w:val="16"/>
+                <w:szCs w:val="16"/>
+              </w:rPr>
+              <w:t>Виконання завдання</w:t>
+            </w:r>
+          </w:p>
+        </w:tc>
+        <w:tc>
+          <w:tcPr>
+            <w:tcW w:w="748" w:type="dxa"/>
+            <w:tcBorders>
+              <w:left w:val="single" w:sz="4" w:space="0" w:color="000000"/>
+              <w:bottom w:val="single" w:sz="4" w:space="0" w:color="000000"/>
+            </w:tcBorders>
+            <w:vAlign w:val="center"/>
+          </w:tcPr>
+          <w:p>
+            <w:pPr>
+              <w:pStyle w:val="user2"/>
+              <w:spacing w:lineRule="auto" w:line="240" w:before="57" w:after="57"/>
+              <w:ind w:hanging="0"/>
+              <w:jc w:val="center"/>
               <w:rPr/>
-            </w:r>
-          </w:p>
-        </w:tc>
-        <w:tc>
-          <w:tcPr>
-            <w:tcW w:w="748" w:type="dxa"/>
-            <w:tcBorders>
-              <w:left w:val="single" w:sz="4" w:space="0" w:color="000000"/>
-              <w:bottom w:val="single" w:sz="4" w:space="0" w:color="000000"/>
-            </w:tcBorders>
-            <w:vAlign w:val="center"/>
-          </w:tcPr>
-          <w:p>
-            <w:pPr>
-              <w:pStyle w:val="user2"/>
-              <w:spacing w:lineRule="auto" w:line="240" w:before="57" w:after="57"/>
-              <w:ind w:hanging="0"/>
-              <w:rPr>
-                <w:sz w:val="16"/>
-                <w:szCs w:val="16"/>
-              </w:rPr>
             </w:pPr>
             <w:r>
               <w:rPr/>
@@ -4667,13 +4686,15 @@
               <w:pStyle w:val="user2"/>
               <w:spacing w:lineRule="auto" w:line="240" w:before="57" w:after="57"/>
               <w:ind w:hanging="0"/>
-              <w:rPr>
-                <w:sz w:val="16"/>
-                <w:szCs w:val="16"/>
-              </w:rPr>
-            </w:pPr>
-            <w:r>
+              <w:jc w:val="center"/>
               <w:rPr/>
+            </w:pPr>
+            <w:r>
+              <w:rPr>
+                <w:sz w:val="16"/>
+                <w:szCs w:val="16"/>
+              </w:rPr>
+              <w:t>+</w:t>
             </w:r>
           </w:p>
         </w:tc>
@@ -4691,13 +4712,15 @@
               <w:pStyle w:val="user2"/>
               <w:spacing w:lineRule="auto" w:line="240" w:before="57" w:after="57"/>
               <w:ind w:hanging="0"/>
-              <w:rPr>
-                <w:sz w:val="16"/>
-                <w:szCs w:val="16"/>
-              </w:rPr>
-            </w:pPr>
-            <w:r>
+              <w:jc w:val="center"/>
               <w:rPr/>
+            </w:pPr>
+            <w:r>
+              <w:rPr>
+                <w:sz w:val="16"/>
+                <w:szCs w:val="16"/>
+              </w:rPr>
+              <w:t>+</w:t>
             </w:r>
           </w:p>
         </w:tc>
@@ -4777,82 +4800,92 @@
               </w:rPr>
             </w:pPr>
             <w:r>
+              <w:rPr>
+                <w:sz w:val="16"/>
+                <w:szCs w:val="16"/>
+              </w:rPr>
+              <w:t>Заповнення щоденника</w:t>
+            </w:r>
+          </w:p>
+        </w:tc>
+        <w:tc>
+          <w:tcPr>
+            <w:tcW w:w="748" w:type="dxa"/>
+            <w:tcBorders>
+              <w:left w:val="single" w:sz="4" w:space="0" w:color="000000"/>
+              <w:bottom w:val="single" w:sz="4" w:space="0" w:color="000000"/>
+            </w:tcBorders>
+            <w:vAlign w:val="center"/>
+          </w:tcPr>
+          <w:p>
+            <w:pPr>
+              <w:pStyle w:val="user2"/>
+              <w:spacing w:lineRule="auto" w:line="240" w:before="57" w:after="57"/>
+              <w:ind w:hanging="0"/>
+              <w:jc w:val="center"/>
+              <w:rPr>
+                <w:sz w:val="16"/>
+                <w:szCs w:val="16"/>
+              </w:rPr>
+            </w:pPr>
+            <w:r>
+              <w:rPr>
+                <w:sz w:val="16"/>
+                <w:szCs w:val="16"/>
+              </w:rPr>
+              <w:t>+</w:t>
+            </w:r>
+          </w:p>
+        </w:tc>
+        <w:tc>
+          <w:tcPr>
+            <w:tcW w:w="737" w:type="dxa"/>
+            <w:tcBorders>
+              <w:left w:val="single" w:sz="4" w:space="0" w:color="000000"/>
+              <w:bottom w:val="single" w:sz="4" w:space="0" w:color="000000"/>
+            </w:tcBorders>
+            <w:vAlign w:val="center"/>
+          </w:tcPr>
+          <w:p>
+            <w:pPr>
+              <w:pStyle w:val="user2"/>
+              <w:spacing w:lineRule="auto" w:line="240" w:before="57" w:after="57"/>
+              <w:ind w:hanging="0"/>
+              <w:jc w:val="center"/>
               <w:rPr/>
-            </w:r>
-          </w:p>
-        </w:tc>
-        <w:tc>
-          <w:tcPr>
-            <w:tcW w:w="748" w:type="dxa"/>
-            <w:tcBorders>
-              <w:left w:val="single" w:sz="4" w:space="0" w:color="000000"/>
-              <w:bottom w:val="single" w:sz="4" w:space="0" w:color="000000"/>
-            </w:tcBorders>
-            <w:vAlign w:val="center"/>
-          </w:tcPr>
-          <w:p>
-            <w:pPr>
-              <w:pStyle w:val="user2"/>
-              <w:spacing w:lineRule="auto" w:line="240" w:before="57" w:after="57"/>
-              <w:ind w:hanging="0"/>
-              <w:rPr>
-                <w:sz w:val="16"/>
-                <w:szCs w:val="16"/>
-              </w:rPr>
-            </w:pPr>
-            <w:r>
-              <w:rPr>
-                <w:sz w:val="16"/>
-                <w:szCs w:val="16"/>
-              </w:rPr>
-            </w:r>
-          </w:p>
-        </w:tc>
-        <w:tc>
-          <w:tcPr>
-            <w:tcW w:w="737" w:type="dxa"/>
-            <w:tcBorders>
-              <w:left w:val="single" w:sz="4" w:space="0" w:color="000000"/>
-              <w:bottom w:val="single" w:sz="4" w:space="0" w:color="000000"/>
-            </w:tcBorders>
-            <w:vAlign w:val="center"/>
-          </w:tcPr>
-          <w:p>
-            <w:pPr>
-              <w:pStyle w:val="user2"/>
-              <w:spacing w:lineRule="auto" w:line="240" w:before="57" w:after="57"/>
-              <w:ind w:hanging="0"/>
-              <w:rPr>
-                <w:sz w:val="16"/>
-                <w:szCs w:val="16"/>
-              </w:rPr>
-            </w:pPr>
-            <w:r>
+            </w:pPr>
+            <w:r>
+              <w:rPr>
+                <w:sz w:val="16"/>
+                <w:szCs w:val="16"/>
+              </w:rPr>
+              <w:t>+</w:t>
+            </w:r>
+          </w:p>
+        </w:tc>
+        <w:tc>
+          <w:tcPr>
+            <w:tcW w:w="695" w:type="dxa"/>
+            <w:tcBorders>
+              <w:left w:val="single" w:sz="4" w:space="0" w:color="000000"/>
+              <w:bottom w:val="single" w:sz="4" w:space="0" w:color="000000"/>
+            </w:tcBorders>
+            <w:vAlign w:val="center"/>
+          </w:tcPr>
+          <w:p>
+            <w:pPr>
+              <w:pStyle w:val="user2"/>
+              <w:spacing w:lineRule="auto" w:line="240" w:before="57" w:after="57"/>
+              <w:ind w:hanging="0"/>
+              <w:jc w:val="center"/>
               <w:rPr/>
-            </w:r>
-          </w:p>
-        </w:tc>
-        <w:tc>
-          <w:tcPr>
-            <w:tcW w:w="695" w:type="dxa"/>
-            <w:tcBorders>
-              <w:left w:val="single" w:sz="4" w:space="0" w:color="000000"/>
-              <w:bottom w:val="single" w:sz="4" w:space="0" w:color="000000"/>
-            </w:tcBorders>
-            <w:vAlign w:val="center"/>
-          </w:tcPr>
-          <w:p>
-            <w:pPr>
-              <w:pStyle w:val="user2"/>
-              <w:spacing w:lineRule="auto" w:line="240" w:before="57" w:after="57"/>
-              <w:ind w:hanging="0"/>
-              <w:rPr>
-                <w:sz w:val="16"/>
-                <w:szCs w:val="16"/>
-              </w:rPr>
-            </w:pPr>
-            <w:r>
-              <w:rPr/>
+            </w:pPr>
+            <w:r>
+              <w:rPr>
+                <w:sz w:val="16"/>
+                <w:szCs w:val="16"/>
+              </w:rPr>
+              <w:t>+</w:t>
             </w:r>
           </w:p>
         </w:tc>
@@ -4932,79 +4965,89 @@
               </w:rPr>
             </w:pPr>
             <w:r>
+              <w:rPr>
+                <w:sz w:val="16"/>
+                <w:szCs w:val="16"/>
+              </w:rPr>
+              <w:t>Написання звіту</w:t>
+            </w:r>
+          </w:p>
+        </w:tc>
+        <w:tc>
+          <w:tcPr>
+            <w:tcW w:w="748" w:type="dxa"/>
+            <w:tcBorders>
+              <w:left w:val="single" w:sz="4" w:space="0" w:color="000000"/>
+              <w:bottom w:val="single" w:sz="4" w:space="0" w:color="000000"/>
+            </w:tcBorders>
+            <w:vAlign w:val="center"/>
+          </w:tcPr>
+          <w:p>
+            <w:pPr>
+              <w:pStyle w:val="user2"/>
+              <w:spacing w:lineRule="auto" w:line="240" w:before="57" w:after="57"/>
+              <w:ind w:hanging="0"/>
+              <w:jc w:val="center"/>
               <w:rPr/>
-            </w:r>
-          </w:p>
-        </w:tc>
-        <w:tc>
-          <w:tcPr>
-            <w:tcW w:w="748" w:type="dxa"/>
-            <w:tcBorders>
-              <w:left w:val="single" w:sz="4" w:space="0" w:color="000000"/>
-              <w:bottom w:val="single" w:sz="4" w:space="0" w:color="000000"/>
-            </w:tcBorders>
-            <w:vAlign w:val="center"/>
-          </w:tcPr>
-          <w:p>
-            <w:pPr>
-              <w:pStyle w:val="user2"/>
-              <w:spacing w:lineRule="auto" w:line="240" w:before="57" w:after="57"/>
-              <w:ind w:hanging="0"/>
-              <w:rPr>
-                <w:sz w:val="16"/>
-                <w:szCs w:val="16"/>
-              </w:rPr>
-            </w:pPr>
-            <w:r>
+            </w:pPr>
+            <w:r>
+              <w:rPr>
+                <w:sz w:val="16"/>
+                <w:szCs w:val="16"/>
+              </w:rPr>
+              <w:t>+</w:t>
+            </w:r>
+          </w:p>
+        </w:tc>
+        <w:tc>
+          <w:tcPr>
+            <w:tcW w:w="737" w:type="dxa"/>
+            <w:tcBorders>
+              <w:left w:val="single" w:sz="4" w:space="0" w:color="000000"/>
+              <w:bottom w:val="single" w:sz="4" w:space="0" w:color="000000"/>
+            </w:tcBorders>
+            <w:vAlign w:val="center"/>
+          </w:tcPr>
+          <w:p>
+            <w:pPr>
+              <w:pStyle w:val="user2"/>
+              <w:spacing w:lineRule="auto" w:line="240" w:before="57" w:after="57"/>
+              <w:ind w:hanging="0"/>
+              <w:jc w:val="center"/>
               <w:rPr/>
-            </w:r>
-          </w:p>
-        </w:tc>
-        <w:tc>
-          <w:tcPr>
-            <w:tcW w:w="737" w:type="dxa"/>
-            <w:tcBorders>
-              <w:left w:val="single" w:sz="4" w:space="0" w:color="000000"/>
-              <w:bottom w:val="single" w:sz="4" w:space="0" w:color="000000"/>
-            </w:tcBorders>
-            <w:vAlign w:val="center"/>
-          </w:tcPr>
-          <w:p>
-            <w:pPr>
-              <w:pStyle w:val="user2"/>
-              <w:spacing w:lineRule="auto" w:line="240" w:before="57" w:after="57"/>
-              <w:ind w:hanging="0"/>
-              <w:rPr>
-                <w:sz w:val="16"/>
-                <w:szCs w:val="16"/>
-              </w:rPr>
-            </w:pPr>
-            <w:r>
+            </w:pPr>
+            <w:r>
+              <w:rPr>
+                <w:sz w:val="16"/>
+                <w:szCs w:val="16"/>
+              </w:rPr>
+              <w:t>+</w:t>
+            </w:r>
+          </w:p>
+        </w:tc>
+        <w:tc>
+          <w:tcPr>
+            <w:tcW w:w="695" w:type="dxa"/>
+            <w:tcBorders>
+              <w:left w:val="single" w:sz="4" w:space="0" w:color="000000"/>
+              <w:bottom w:val="single" w:sz="4" w:space="0" w:color="000000"/>
+            </w:tcBorders>
+            <w:vAlign w:val="center"/>
+          </w:tcPr>
+          <w:p>
+            <w:pPr>
+              <w:pStyle w:val="user2"/>
+              <w:spacing w:lineRule="auto" w:line="240" w:before="57" w:after="57"/>
+              <w:ind w:hanging="0"/>
+              <w:jc w:val="center"/>
               <w:rPr/>
-            </w:r>
-          </w:p>
-        </w:tc>
-        <w:tc>
-          <w:tcPr>
-            <w:tcW w:w="695" w:type="dxa"/>
-            <w:tcBorders>
-              <w:left w:val="single" w:sz="4" w:space="0" w:color="000000"/>
-              <w:bottom w:val="single" w:sz="4" w:space="0" w:color="000000"/>
-            </w:tcBorders>
-            <w:vAlign w:val="center"/>
-          </w:tcPr>
-          <w:p>
-            <w:pPr>
-              <w:pStyle w:val="user2"/>
-              <w:spacing w:lineRule="auto" w:line="240" w:before="57" w:after="57"/>
-              <w:ind w:hanging="0"/>
-              <w:rPr>
-                <w:sz w:val="16"/>
-                <w:szCs w:val="16"/>
-              </w:rPr>
-            </w:pPr>
-            <w:r>
-              <w:rPr/>
+            </w:pPr>
+            <w:r>
+              <w:rPr>
+                <w:sz w:val="16"/>
+                <w:szCs w:val="16"/>
+              </w:rPr>
+              <w:t>+</w:t>
             </w:r>
           </w:p>
         </w:tc>
@@ -5084,55 +5127,58 @@
               </w:rPr>
             </w:pPr>
             <w:r>
+              <w:rPr>
+                <w:sz w:val="16"/>
+                <w:szCs w:val="16"/>
+              </w:rPr>
+              <w:t>Надіслати щоденник на перевірку керівнику від університету</w:t>
+            </w:r>
+          </w:p>
+        </w:tc>
+        <w:tc>
+          <w:tcPr>
+            <w:tcW w:w="748" w:type="dxa"/>
+            <w:tcBorders>
+              <w:left w:val="single" w:sz="4" w:space="0" w:color="000000"/>
+              <w:bottom w:val="single" w:sz="4" w:space="0" w:color="000000"/>
+            </w:tcBorders>
+            <w:vAlign w:val="center"/>
+          </w:tcPr>
+          <w:p>
+            <w:pPr>
+              <w:pStyle w:val="user2"/>
+              <w:spacing w:lineRule="auto" w:line="240" w:before="57" w:after="57"/>
+              <w:ind w:hanging="0"/>
+              <w:jc w:val="center"/>
+              <w:rPr>
+                <w:sz w:val="16"/>
+                <w:szCs w:val="16"/>
+              </w:rPr>
+            </w:pPr>
+            <w:r>
+              <w:rPr>
+                <w:sz w:val="16"/>
+                <w:szCs w:val="16"/>
+              </w:rPr>
+            </w:r>
+          </w:p>
+        </w:tc>
+        <w:tc>
+          <w:tcPr>
+            <w:tcW w:w="737" w:type="dxa"/>
+            <w:tcBorders>
+              <w:left w:val="single" w:sz="4" w:space="0" w:color="000000"/>
+              <w:bottom w:val="single" w:sz="4" w:space="0" w:color="000000"/>
+            </w:tcBorders>
+            <w:vAlign w:val="center"/>
+          </w:tcPr>
+          <w:p>
+            <w:pPr>
+              <w:pStyle w:val="user2"/>
+              <w:spacing w:lineRule="auto" w:line="240" w:before="57" w:after="57"/>
+              <w:ind w:hanging="0"/>
+              <w:jc w:val="center"/>
               <w:rPr/>
-            </w:r>
-          </w:p>
-        </w:tc>
-        <w:tc>
-          <w:tcPr>
-            <w:tcW w:w="748" w:type="dxa"/>
-            <w:tcBorders>
-              <w:left w:val="single" w:sz="4" w:space="0" w:color="000000"/>
-              <w:bottom w:val="single" w:sz="4" w:space="0" w:color="000000"/>
-            </w:tcBorders>
-            <w:vAlign w:val="center"/>
-          </w:tcPr>
-          <w:p>
-            <w:pPr>
-              <w:pStyle w:val="user2"/>
-              <w:spacing w:lineRule="auto" w:line="240" w:before="57" w:after="57"/>
-              <w:ind w:hanging="0"/>
-              <w:rPr>
-                <w:sz w:val="16"/>
-                <w:szCs w:val="16"/>
-              </w:rPr>
-            </w:pPr>
-            <w:r>
-              <w:rPr>
-                <w:sz w:val="16"/>
-                <w:szCs w:val="16"/>
-              </w:rPr>
-            </w:r>
-          </w:p>
-        </w:tc>
-        <w:tc>
-          <w:tcPr>
-            <w:tcW w:w="737" w:type="dxa"/>
-            <w:tcBorders>
-              <w:left w:val="single" w:sz="4" w:space="0" w:color="000000"/>
-              <w:bottom w:val="single" w:sz="4" w:space="0" w:color="000000"/>
-            </w:tcBorders>
-            <w:vAlign w:val="center"/>
-          </w:tcPr>
-          <w:p>
-            <w:pPr>
-              <w:pStyle w:val="user2"/>
-              <w:spacing w:lineRule="auto" w:line="240" w:before="57" w:after="57"/>
-              <w:ind w:hanging="0"/>
-              <w:rPr>
-                <w:sz w:val="16"/>
-                <w:szCs w:val="16"/>
-              </w:rPr>
             </w:pPr>
             <w:r>
               <w:rPr/>
@@ -5153,13 +5199,15 @@
               <w:pStyle w:val="user2"/>
               <w:spacing w:lineRule="auto" w:line="240" w:before="57" w:after="57"/>
               <w:ind w:hanging="0"/>
-              <w:rPr>
-                <w:sz w:val="16"/>
-                <w:szCs w:val="16"/>
-              </w:rPr>
-            </w:pPr>
-            <w:r>
+              <w:jc w:val="center"/>
               <w:rPr/>
+            </w:pPr>
+            <w:r>
+              <w:rPr>
+                <w:sz w:val="16"/>
+                <w:szCs w:val="16"/>
+              </w:rPr>
+              <w:t>+</w:t>
             </w:r>
           </w:p>
         </w:tc>
@@ -5243,7 +5291,7 @@
                 <w:sz w:val="16"/>
                 <w:szCs w:val="16"/>
               </w:rPr>
-              <w:t>Заповнення щоденника</w:t>
+              <w:t>Надіслати щоденник та звіт компанії для отримання підписів</w:t>
             </w:r>
           </w:p>
         </w:tc>
@@ -5261,13 +5309,11 @@
               <w:pStyle w:val="user2"/>
               <w:spacing w:lineRule="auto" w:line="240" w:before="57" w:after="57"/>
               <w:ind w:hanging="0"/>
-              <w:rPr>
-                <w:sz w:val="16"/>
-                <w:szCs w:val="16"/>
-              </w:rPr>
-            </w:pPr>
-            <w:r>
+              <w:jc w:val="center"/>
               <w:rPr/>
+            </w:pPr>
+            <w:r>
+              <w:rPr/>
             </w:r>
           </w:p>
         </w:tc>
@@ -5285,13 +5331,11 @@
               <w:pStyle w:val="user2"/>
               <w:spacing w:lineRule="auto" w:line="240" w:before="57" w:after="57"/>
               <w:ind w:hanging="0"/>
-              <w:rPr>
-                <w:sz w:val="16"/>
-                <w:szCs w:val="16"/>
-              </w:rPr>
-            </w:pPr>
-            <w:r>
+              <w:jc w:val="center"/>
               <w:rPr/>
+            </w:pPr>
+            <w:r>
+              <w:rPr/>
             </w:r>
           </w:p>
         </w:tc>
@@ -5309,13 +5353,15 @@
               <w:pStyle w:val="user2"/>
               <w:spacing w:lineRule="auto" w:line="240" w:before="57" w:after="57"/>
               <w:ind w:hanging="0"/>
-              <w:rPr>
-                <w:sz w:val="16"/>
-                <w:szCs w:val="16"/>
-              </w:rPr>
-            </w:pPr>
-            <w:r>
+              <w:jc w:val="center"/>
               <w:rPr/>
+            </w:pPr>
+            <w:r>
+              <w:rPr>
+                <w:sz w:val="16"/>
+                <w:szCs w:val="16"/>
+              </w:rPr>
+              <w:t>+</w:t>
             </w:r>
           </w:p>
         </w:tc>
@@ -5367,11 +5413,7 @@
               </w:rPr>
             </w:pPr>
             <w:r>
-              <w:rPr>
-                <w:sz w:val="16"/>
-                <w:szCs w:val="16"/>
-              </w:rPr>
-              <w:t>10</w:t>
+              <w:rPr/>
             </w:r>
           </w:p>
         </w:tc>
@@ -5395,11 +5437,7 @@
               </w:rPr>
             </w:pPr>
             <w:r>
-              <w:rPr>
-                <w:sz w:val="16"/>
-                <w:szCs w:val="16"/>
-              </w:rPr>
-              <w:t>Написання звіту</w:t>
+              <w:rPr/>
             </w:r>
           </w:p>
         </w:tc>
@@ -5417,6 +5455,7 @@
               <w:pStyle w:val="user2"/>
               <w:spacing w:lineRule="auto" w:line="240" w:before="57" w:after="57"/>
               <w:ind w:hanging="0"/>
+              <w:jc w:val="center"/>
               <w:rPr>
                 <w:sz w:val="16"/>
                 <w:szCs w:val="16"/>
@@ -5444,6 +5483,7 @@
               <w:pStyle w:val="user2"/>
               <w:spacing w:lineRule="auto" w:line="240" w:before="57" w:after="57"/>
               <w:ind w:hanging="0"/>
+              <w:jc w:val="center"/>
               <w:rPr>
                 <w:sz w:val="16"/>
                 <w:szCs w:val="16"/>
@@ -5471,10 +5511,8 @@
               <w:pStyle w:val="user2"/>
               <w:spacing w:lineRule="auto" w:line="240" w:before="57" w:after="57"/>
               <w:ind w:hanging="0"/>
-              <w:rPr>
-                <w:sz w:val="16"/>
-                <w:szCs w:val="16"/>
-              </w:rPr>
+              <w:jc w:val="center"/>
+              <w:rPr/>
             </w:pPr>
             <w:r>
               <w:rPr/>
@@ -5532,11 +5570,7 @@
               </w:rPr>
             </w:pPr>
             <w:r>
-              <w:rPr>
-                <w:sz w:val="16"/>
-                <w:szCs w:val="16"/>
-              </w:rPr>
-              <w:t>11</w:t>
+              <w:rPr/>
             </w:r>
           </w:p>
         </w:tc>
@@ -5560,11 +5594,7 @@
               </w:rPr>
             </w:pPr>
             <w:r>
-              <w:rPr>
-                <w:sz w:val="16"/>
-                <w:szCs w:val="16"/>
-              </w:rPr>
-              <w:t>Надіслати щоденник на перевірку керівнику від університету</w:t>
+              <w:rPr/>
             </w:r>
           </w:p>
         </w:tc>
@@ -5582,6 +5612,7 @@
               <w:pStyle w:val="user2"/>
               <w:spacing w:lineRule="auto" w:line="240" w:before="57" w:after="57"/>
               <w:ind w:hanging="0"/>
+              <w:jc w:val="center"/>
               <w:rPr>
                 <w:sz w:val="16"/>
                 <w:szCs w:val="16"/>
@@ -5609,6 +5640,7 @@
               <w:pStyle w:val="user2"/>
               <w:spacing w:lineRule="auto" w:line="240" w:before="57" w:after="57"/>
               <w:ind w:hanging="0"/>
+              <w:jc w:val="center"/>
               <w:rPr>
                 <w:sz w:val="16"/>
                 <w:szCs w:val="16"/>
@@ -5636,10 +5668,8 @@
               <w:pStyle w:val="user2"/>
               <w:spacing w:lineRule="auto" w:line="240" w:before="57" w:after="57"/>
               <w:ind w:hanging="0"/>
-              <w:rPr>
-                <w:sz w:val="16"/>
-                <w:szCs w:val="16"/>
-              </w:rPr>
+              <w:jc w:val="center"/>
+              <w:rPr/>
             </w:pPr>
             <w:r>
               <w:rPr/>
@@ -5697,11 +5727,7 @@
               </w:rPr>
             </w:pPr>
             <w:r>
-              <w:rPr>
-                <w:sz w:val="16"/>
-                <w:szCs w:val="16"/>
-              </w:rPr>
-              <w:t>12</w:t>
+              <w:rPr/>
             </w:r>
           </w:p>
         </w:tc>
@@ -5725,11 +5751,7 @@
               </w:rPr>
             </w:pPr>
             <w:r>
-              <w:rPr>
-                <w:sz w:val="16"/>
-                <w:szCs w:val="16"/>
-              </w:rPr>
-              <w:t>Надіслати щоденник та звіт компанії для отримання підписів</w:t>
+              <w:rPr/>
             </w:r>
           </w:p>
         </w:tc>
@@ -5747,6 +5769,7 @@
               <w:pStyle w:val="user2"/>
               <w:spacing w:lineRule="auto" w:line="240" w:before="57" w:after="57"/>
               <w:ind w:hanging="0"/>
+              <w:jc w:val="center"/>
               <w:rPr>
                 <w:sz w:val="16"/>
                 <w:szCs w:val="16"/>
@@ -5774,6 +5797,7 @@
               <w:pStyle w:val="user2"/>
               <w:spacing w:lineRule="auto" w:line="240" w:before="57" w:after="57"/>
               <w:ind w:hanging="0"/>
+              <w:jc w:val="center"/>
               <w:rPr>
                 <w:sz w:val="16"/>
                 <w:szCs w:val="16"/>
@@ -5801,13 +5825,11 @@
               <w:pStyle w:val="user2"/>
               <w:spacing w:lineRule="auto" w:line="240" w:before="57" w:after="57"/>
               <w:ind w:hanging="0"/>
-              <w:rPr>
-                <w:sz w:val="16"/>
-                <w:szCs w:val="16"/>
-              </w:rPr>
-            </w:pPr>
-            <w:r>
+              <w:jc w:val="center"/>
               <w:rPr/>
+            </w:pPr>
+            <w:r>
+              <w:rPr/>
             </w:r>
           </w:p>
         </w:tc>
@@ -5826,335 +5848,6 @@
               <w:pStyle w:val="user2"/>
               <w:spacing w:lineRule="auto" w:line="240" w:before="57" w:after="57"/>
               <w:ind w:hanging="0"/>
-              <w:rPr>
-                <w:sz w:val="16"/>
-                <w:szCs w:val="16"/>
-              </w:rPr>
-            </w:pPr>
-            <w:r>
-              <w:rPr>
-                <w:sz w:val="16"/>
-                <w:szCs w:val="16"/>
-              </w:rPr>
-            </w:r>
-          </w:p>
-        </w:tc>
-      </w:tr>
-      <w:tr>
-        <w:trPr/>
-        <w:tc>
-          <w:tcPr>
-            <w:tcW w:w="516" w:type="dxa"/>
-            <w:tcBorders>
-              <w:left w:val="single" w:sz="4" w:space="0" w:color="000000"/>
-              <w:bottom w:val="single" w:sz="4" w:space="0" w:color="000000"/>
-            </w:tcBorders>
-            <w:vAlign w:val="center"/>
-          </w:tcPr>
-          <w:p>
-            <w:pPr>
-              <w:pStyle w:val="user2"/>
-              <w:spacing w:lineRule="auto" w:line="240" w:before="57" w:after="57"/>
-              <w:ind w:hanging="0"/>
-              <w:rPr>
-                <w:sz w:val="16"/>
-                <w:szCs w:val="16"/>
-              </w:rPr>
-            </w:pPr>
-            <w:r>
-              <w:rPr>
-                <w:sz w:val="16"/>
-                <w:szCs w:val="16"/>
-              </w:rPr>
-            </w:r>
-          </w:p>
-        </w:tc>
-        <w:tc>
-          <w:tcPr>
-            <w:tcW w:w="3780" w:type="dxa"/>
-            <w:tcBorders>
-              <w:left w:val="single" w:sz="4" w:space="0" w:color="000000"/>
-              <w:bottom w:val="single" w:sz="4" w:space="0" w:color="000000"/>
-            </w:tcBorders>
-            <w:vAlign w:val="center"/>
-          </w:tcPr>
-          <w:p>
-            <w:pPr>
-              <w:pStyle w:val="user2"/>
-              <w:spacing w:lineRule="auto" w:line="240" w:before="57" w:after="57"/>
-              <w:ind w:hanging="0"/>
-              <w:rPr>
-                <w:sz w:val="16"/>
-                <w:szCs w:val="16"/>
-              </w:rPr>
-            </w:pPr>
-            <w:r>
-              <w:rPr>
-                <w:sz w:val="16"/>
-                <w:szCs w:val="16"/>
-              </w:rPr>
-            </w:r>
-          </w:p>
-        </w:tc>
-        <w:tc>
-          <w:tcPr>
-            <w:tcW w:w="748" w:type="dxa"/>
-            <w:tcBorders>
-              <w:left w:val="single" w:sz="4" w:space="0" w:color="000000"/>
-              <w:bottom w:val="single" w:sz="4" w:space="0" w:color="000000"/>
-            </w:tcBorders>
-            <w:vAlign w:val="center"/>
-          </w:tcPr>
-          <w:p>
-            <w:pPr>
-              <w:pStyle w:val="user2"/>
-              <w:spacing w:lineRule="auto" w:line="240" w:before="57" w:after="57"/>
-              <w:ind w:hanging="0"/>
-              <w:rPr>
-                <w:sz w:val="16"/>
-                <w:szCs w:val="16"/>
-              </w:rPr>
-            </w:pPr>
-            <w:r>
-              <w:rPr>
-                <w:sz w:val="16"/>
-                <w:szCs w:val="16"/>
-              </w:rPr>
-            </w:r>
-          </w:p>
-        </w:tc>
-        <w:tc>
-          <w:tcPr>
-            <w:tcW w:w="737" w:type="dxa"/>
-            <w:tcBorders>
-              <w:left w:val="single" w:sz="4" w:space="0" w:color="000000"/>
-              <w:bottom w:val="single" w:sz="4" w:space="0" w:color="000000"/>
-            </w:tcBorders>
-            <w:vAlign w:val="center"/>
-          </w:tcPr>
-          <w:p>
-            <w:pPr>
-              <w:pStyle w:val="user2"/>
-              <w:spacing w:lineRule="auto" w:line="240" w:before="57" w:after="57"/>
-              <w:ind w:hanging="0"/>
-              <w:rPr>
-                <w:sz w:val="16"/>
-                <w:szCs w:val="16"/>
-              </w:rPr>
-            </w:pPr>
-            <w:r>
-              <w:rPr>
-                <w:sz w:val="16"/>
-                <w:szCs w:val="16"/>
-              </w:rPr>
-            </w:r>
-          </w:p>
-        </w:tc>
-        <w:tc>
-          <w:tcPr>
-            <w:tcW w:w="695" w:type="dxa"/>
-            <w:tcBorders>
-              <w:left w:val="single" w:sz="4" w:space="0" w:color="000000"/>
-              <w:bottom w:val="single" w:sz="4" w:space="0" w:color="000000"/>
-            </w:tcBorders>
-            <w:vAlign w:val="center"/>
-          </w:tcPr>
-          <w:p>
-            <w:pPr>
-              <w:pStyle w:val="user2"/>
-              <w:spacing w:lineRule="auto" w:line="240" w:before="57" w:after="57"/>
-              <w:ind w:hanging="0"/>
-              <w:rPr>
-                <w:sz w:val="16"/>
-                <w:szCs w:val="16"/>
-              </w:rPr>
-            </w:pPr>
-            <w:r>
-              <w:rPr>
-                <w:sz w:val="16"/>
-                <w:szCs w:val="16"/>
-              </w:rPr>
-            </w:r>
-          </w:p>
-        </w:tc>
-        <w:tc>
-          <w:tcPr>
-            <w:tcW w:w="1295" w:type="dxa"/>
-            <w:tcBorders>
-              <w:left w:val="single" w:sz="4" w:space="0" w:color="000000"/>
-              <w:bottom w:val="single" w:sz="4" w:space="0" w:color="000000"/>
-              <w:right w:val="single" w:sz="4" w:space="0" w:color="000000"/>
-            </w:tcBorders>
-            <w:vAlign w:val="center"/>
-          </w:tcPr>
-          <w:p>
-            <w:pPr>
-              <w:pStyle w:val="user2"/>
-              <w:spacing w:lineRule="auto" w:line="240" w:before="57" w:after="57"/>
-              <w:ind w:hanging="0"/>
-              <w:rPr>
-                <w:sz w:val="16"/>
-                <w:szCs w:val="16"/>
-              </w:rPr>
-            </w:pPr>
-            <w:r>
-              <w:rPr>
-                <w:sz w:val="16"/>
-                <w:szCs w:val="16"/>
-              </w:rPr>
-            </w:r>
-          </w:p>
-        </w:tc>
-      </w:tr>
-      <w:tr>
-        <w:trPr/>
-        <w:tc>
-          <w:tcPr>
-            <w:tcW w:w="516" w:type="dxa"/>
-            <w:tcBorders>
-              <w:left w:val="single" w:sz="4" w:space="0" w:color="000000"/>
-              <w:bottom w:val="single" w:sz="4" w:space="0" w:color="000000"/>
-            </w:tcBorders>
-            <w:vAlign w:val="center"/>
-          </w:tcPr>
-          <w:p>
-            <w:pPr>
-              <w:pStyle w:val="user2"/>
-              <w:spacing w:lineRule="auto" w:line="240" w:before="57" w:after="57"/>
-              <w:ind w:hanging="0"/>
-              <w:rPr>
-                <w:sz w:val="16"/>
-                <w:szCs w:val="16"/>
-              </w:rPr>
-            </w:pPr>
-            <w:r>
-              <w:rPr>
-                <w:sz w:val="16"/>
-                <w:szCs w:val="16"/>
-              </w:rPr>
-            </w:r>
-          </w:p>
-        </w:tc>
-        <w:tc>
-          <w:tcPr>
-            <w:tcW w:w="3780" w:type="dxa"/>
-            <w:tcBorders>
-              <w:left w:val="single" w:sz="4" w:space="0" w:color="000000"/>
-              <w:bottom w:val="single" w:sz="4" w:space="0" w:color="000000"/>
-            </w:tcBorders>
-            <w:vAlign w:val="center"/>
-          </w:tcPr>
-          <w:p>
-            <w:pPr>
-              <w:pStyle w:val="user2"/>
-              <w:spacing w:lineRule="auto" w:line="240" w:before="57" w:after="57"/>
-              <w:ind w:hanging="0"/>
-              <w:rPr>
-                <w:sz w:val="16"/>
-                <w:szCs w:val="16"/>
-              </w:rPr>
-            </w:pPr>
-            <w:r>
-              <w:rPr>
-                <w:sz w:val="16"/>
-                <w:szCs w:val="16"/>
-              </w:rPr>
-            </w:r>
-          </w:p>
-        </w:tc>
-        <w:tc>
-          <w:tcPr>
-            <w:tcW w:w="748" w:type="dxa"/>
-            <w:tcBorders>
-              <w:left w:val="single" w:sz="4" w:space="0" w:color="000000"/>
-              <w:bottom w:val="single" w:sz="4" w:space="0" w:color="000000"/>
-            </w:tcBorders>
-            <w:vAlign w:val="center"/>
-          </w:tcPr>
-          <w:p>
-            <w:pPr>
-              <w:pStyle w:val="user2"/>
-              <w:spacing w:lineRule="auto" w:line="240" w:before="57" w:after="57"/>
-              <w:ind w:hanging="0"/>
-              <w:rPr>
-                <w:sz w:val="16"/>
-                <w:szCs w:val="16"/>
-              </w:rPr>
-            </w:pPr>
-            <w:r>
-              <w:rPr>
-                <w:sz w:val="16"/>
-                <w:szCs w:val="16"/>
-              </w:rPr>
-            </w:r>
-          </w:p>
-        </w:tc>
-        <w:tc>
-          <w:tcPr>
-            <w:tcW w:w="737" w:type="dxa"/>
-            <w:tcBorders>
-              <w:left w:val="single" w:sz="4" w:space="0" w:color="000000"/>
-              <w:bottom w:val="single" w:sz="4" w:space="0" w:color="000000"/>
-            </w:tcBorders>
-            <w:vAlign w:val="center"/>
-          </w:tcPr>
-          <w:p>
-            <w:pPr>
-              <w:pStyle w:val="user2"/>
-              <w:spacing w:lineRule="auto" w:line="240" w:before="57" w:after="57"/>
-              <w:rPr>
-                <w:sz w:val="16"/>
-                <w:szCs w:val="16"/>
-              </w:rPr>
-            </w:pPr>
-            <w:r>
-              <w:rPr>
-                <w:sz w:val="16"/>
-                <w:szCs w:val="16"/>
-              </w:rPr>
-            </w:r>
-          </w:p>
-        </w:tc>
-        <w:tc>
-          <w:tcPr>
-            <w:tcW w:w="695" w:type="dxa"/>
-            <w:tcBorders>
-              <w:left w:val="single" w:sz="4" w:space="0" w:color="000000"/>
-              <w:bottom w:val="single" w:sz="4" w:space="0" w:color="000000"/>
-            </w:tcBorders>
-            <w:vAlign w:val="center"/>
-          </w:tcPr>
-          <w:p>
-            <w:pPr>
-              <w:pStyle w:val="user2"/>
-              <w:spacing w:lineRule="auto" w:line="240" w:before="57" w:after="57"/>
-              <w:rPr>
-                <w:sz w:val="16"/>
-                <w:szCs w:val="16"/>
-              </w:rPr>
-            </w:pPr>
-            <w:r>
-              <w:rPr>
-                <w:sz w:val="16"/>
-                <w:szCs w:val="16"/>
-              </w:rPr>
-            </w:r>
-          </w:p>
-        </w:tc>
-        <w:tc>
-          <w:tcPr>
-            <w:tcW w:w="1295" w:type="dxa"/>
-            <w:tcBorders>
-              <w:left w:val="single" w:sz="4" w:space="0" w:color="000000"/>
-              <w:bottom w:val="single" w:sz="4" w:space="0" w:color="000000"/>
-              <w:right w:val="single" w:sz="4" w:space="0" w:color="000000"/>
-            </w:tcBorders>
-            <w:vAlign w:val="center"/>
-          </w:tcPr>
-          <w:p>
-            <w:pPr>
-              <w:pStyle w:val="user2"/>
-              <w:spacing w:lineRule="auto" w:line="240" w:before="57" w:after="57"/>
               <w:rPr>
                 <w:sz w:val="16"/>
                 <w:szCs w:val="16"/>
@@ -7232,7 +6925,30 @@
     </w:pPr>
     <w:rPr/>
   </w:style>
-  <w:style w:type="numbering" w:styleId="Style14">
+  <w:style w:type="paragraph" w:styleId="Style14">
+    <w:name w:val="Вміст таблиці"/>
+    <w:basedOn w:val="Normal"/>
+    <w:qFormat/>
+    <w:pPr>
+      <w:widowControl w:val="false"/>
+      <w:suppressLineNumbers/>
+    </w:pPr>
+    <w:rPr/>
+  </w:style>
+  <w:style w:type="paragraph" w:styleId="Style15">
+    <w:name w:val="Заголовок таблиці"/>
+    <w:basedOn w:val="Style14"/>
+    <w:qFormat/>
+    <w:pPr>
+      <w:suppressLineNumbers/>
+      <w:jc w:val="center"/>
+    </w:pPr>
+    <w:rPr>
+      <w:b/>
+      <w:bCs/>
+    </w:rPr>
+  </w:style>
+  <w:style w:type="numbering" w:styleId="Style16">
     <w:name w:val="Без маркерів"/>
     <w:qFormat/>
   </w:style>

</xml_diff>

<commit_message>
feat -- Practice: filing in the diary
</commit_message>
<xml_diff>
--- a/42P Praktyka/Щоденник.docx
+++ b/42P Praktyka/Щоденник.docx
@@ -5291,7 +5291,21 @@
                 <w:sz w:val="16"/>
                 <w:szCs w:val="16"/>
               </w:rPr>
-              <w:t>Надіслати щоденник та звіт компанії для отримання підписів</w:t>
+              <w:t xml:space="preserve">Надіслати щоденник та звіт </w:t>
+            </w:r>
+            <w:r>
+              <w:rPr>
+                <w:sz w:val="16"/>
+                <w:szCs w:val="16"/>
+              </w:rPr>
+              <w:t xml:space="preserve">до </w:t>
+            </w:r>
+            <w:r>
+              <w:rPr>
+                <w:sz w:val="16"/>
+                <w:szCs w:val="16"/>
+              </w:rPr>
+              <w:t>компанії для отримання підписів</w:t>
             </w:r>
           </w:p>
         </w:tc>
@@ -6207,8 +6221,57 @@
           <w:szCs w:val="20"/>
           <w:u w:val="none"/>
         </w:rPr>
-        <w:tab/>
-        <w:t>Спершу зв’язався з ментором від компанії. Сказали використовувати застосунок диплому для практики.</w:t>
+        <w:t>Спершу зв’язався з ментором від компанії. Сказали використовувати застосунок диплому для проходження практики.</w:t>
+      </w:r>
+    </w:p>
+    <w:p>
+      <w:pPr>
+        <w:pStyle w:val="Normal"/>
+        <w:widowControl/>
+        <w:suppressAutoHyphens w:val="true"/>
+        <w:bidi w:val="0"/>
+        <w:spacing w:lineRule="auto" w:line="360" w:before="0" w:after="0"/>
+        <w:ind w:hanging="0" w:left="0" w:right="0"/>
+        <w:contextualSpacing/>
+        <w:jc w:val="left"/>
+        <w:rPr>
+          <w:sz w:val="20"/>
+          <w:szCs w:val="20"/>
+          <w:u w:val="none"/>
+        </w:rPr>
+      </w:pPr>
+      <w:r>
+        <w:rPr>
+          <w:sz w:val="20"/>
+          <w:szCs w:val="20"/>
+          <w:u w:val="none"/>
+        </w:rPr>
+        <w:t>Потім було з’ясовано чим заповнити звіт з практики.</w:t>
+      </w:r>
+    </w:p>
+    <w:p>
+      <w:pPr>
+        <w:pStyle w:val="Normal"/>
+        <w:widowControl/>
+        <w:suppressAutoHyphens w:val="true"/>
+        <w:bidi w:val="0"/>
+        <w:spacing w:lineRule="auto" w:line="360" w:before="0" w:after="0"/>
+        <w:ind w:hanging="0" w:left="0" w:right="0"/>
+        <w:contextualSpacing/>
+        <w:jc w:val="left"/>
+        <w:rPr>
+          <w:sz w:val="20"/>
+          <w:szCs w:val="20"/>
+          <w:u w:val="none"/>
+        </w:rPr>
+      </w:pPr>
+      <w:r>
+        <w:rPr>
+          <w:sz w:val="20"/>
+          <w:szCs w:val="20"/>
+          <w:u w:val="none"/>
+        </w:rPr>
+        <w:t>Далі було надіслано перелік помилок для полагодження.</w:t>
       </w:r>
     </w:p>
     <w:sectPr>

</xml_diff>

<commit_message>
docs -- NI: preparing for the exam more
</commit_message>
<xml_diff>
--- a/42P Praktyka/Щоденник.docx
+++ b/42P Praktyka/Щоденник.docx
@@ -2594,23 +2594,7 @@
         </w:rPr>
         <w:tab/>
         <w:tab/>
-        <w:t>ТОВ «</w:t>
-      </w:r>
-      <w:r>
-        <w:rPr>
-          <w:sz w:val="20"/>
-          <w:szCs w:val="20"/>
-          <w:u w:val="single"/>
-        </w:rPr>
-        <w:t>Інфоком ЛТД</w:t>
-      </w:r>
-      <w:r>
-        <w:rPr>
-          <w:sz w:val="20"/>
-          <w:szCs w:val="20"/>
-          <w:u w:val="single"/>
-        </w:rPr>
-        <w:t>»</w:t>
+        <w:t>ТОВ «Інфоком ЛТД»</w:t>
         <w:tab/>
         <w:tab/>
       </w:r>
@@ -2679,15 +2663,7 @@
           <w:szCs w:val="20"/>
           <w:u w:val="none"/>
         </w:rPr>
-        <w:t xml:space="preserve">Студент Онищенко Олег Антонович проходив переддипломну практику у ТОВ «Інфоком ЛТД» з 13 квітня по 3 травня. Студент отримав від керівника практики наступне завдання: доопрацювати створений дипломний застосунок онлайн магазину купівлі вантажівок. Студент виконав поставлене перед ним завдання з дотриманням всіх термінів відповідно до запланованого графіку. Етапи роботи над проєктом включали в себе: </w:t>
-      </w:r>
-      <w:r>
-        <w:rPr>
-          <w:sz w:val="20"/>
-          <w:szCs w:val="20"/>
-          <w:u w:val="none"/>
-        </w:rPr>
-        <w:t>виправлення знайдених моментів. Під час виконання завдання студент отримав незначні зауваження та швидко виправив їх, тим самим продемонстрував достатній рівень професійної та технічної підготовки, різносторонню обізнаність по запропонованим технологіям. Загалом роботу студента над поставленим перед ним в межах виробничої практики завдання можна оцінити на «відмінно». Керівник практики від компанії ТОВ «Інфоком ЛТД» інженер-програміст 2ї кат. Никонова К.В.</w:t>
+        <w:t>Студент Онищенко Олег Антонович проходив переддипломну практику у ТОВ «Інфоком ЛТД» з 13 квітня по 3 травня. Студент отримав від керівника практики наступне завдання: доопрацювати створений дипломний застосунок онлайн магазину купівлі вантажівок. Студент виконав поставлене перед ним завдання з дотриманням всіх термінів відповідно до запланованого графіку. Етапи роботи над проєктом включали в себе: виправлення знайдених моментів. Під час виконання завдання студент отримав незначні зауваження та швидко виправив їх, тим самим продемонстрував достатній рівень професійної та технічної підготовки, різносторонню обізнаність по запропонованим технологіям. Загалом роботу студента над поставленим перед ним в межах виробничої практики завдання можна оцінити на «відмінно». Керівник практики від компанії ТОВ «Інфоком ЛТД» інженер-програміст 2ї кат. Никонова К.В.</w:t>
       </w:r>
     </w:p>
     <w:p>
@@ -3187,7 +3163,7 @@
           </w:tcPr>
           <w:p>
             <w:pPr>
-              <w:pStyle w:val="Style14"/>
+              <w:pStyle w:val="user2"/>
               <w:spacing w:lineRule="auto" w:line="240" w:before="57" w:after="57"/>
               <w:ind w:hanging="0"/>
               <w:jc w:val="center"/>
@@ -3225,7 +3201,7 @@
           </w:tcPr>
           <w:p>
             <w:pPr>
-              <w:pStyle w:val="Style14"/>
+              <w:pStyle w:val="user2"/>
               <w:spacing w:lineRule="auto" w:line="240" w:before="57" w:after="57"/>
               <w:ind w:hanging="0"/>
               <w:jc w:val="center"/>
@@ -3256,7 +3232,7 @@
           </w:tcPr>
           <w:p>
             <w:pPr>
-              <w:pStyle w:val="Style14"/>
+              <w:pStyle w:val="user2"/>
               <w:spacing w:lineRule="auto" w:line="240" w:before="57" w:after="57"/>
               <w:ind w:hanging="0"/>
               <w:jc w:val="center"/>
@@ -3288,7 +3264,7 @@
           </w:tcPr>
           <w:p>
             <w:pPr>
-              <w:pStyle w:val="Style14"/>
+              <w:pStyle w:val="user2"/>
               <w:spacing w:lineRule="auto" w:line="240" w:before="57" w:after="57"/>
               <w:ind w:hanging="0"/>
               <w:jc w:val="center"/>
@@ -3374,7 +3350,7 @@
           </w:tcPr>
           <w:p>
             <w:pPr>
-              <w:pStyle w:val="Style14"/>
+              <w:pStyle w:val="user2"/>
               <w:spacing w:lineRule="auto" w:line="240" w:before="57" w:after="57"/>
               <w:ind w:hanging="0"/>
               <w:jc w:val="center"/>
@@ -3403,7 +3379,7 @@
           </w:tcPr>
           <w:p>
             <w:pPr>
-              <w:pStyle w:val="Style14"/>
+              <w:pStyle w:val="user2"/>
               <w:spacing w:lineRule="auto" w:line="240" w:before="57" w:after="57"/>
               <w:ind w:hanging="0"/>
               <w:jc w:val="center"/>
@@ -3432,7 +3408,7 @@
           </w:tcPr>
           <w:p>
             <w:pPr>
-              <w:pStyle w:val="Style14"/>
+              <w:pStyle w:val="user2"/>
               <w:spacing w:lineRule="auto" w:line="240" w:before="57" w:after="57"/>
               <w:ind w:hanging="0"/>
               <w:jc w:val="center"/>
@@ -3492,7 +3468,7 @@
           </w:tcPr>
           <w:p>
             <w:pPr>
-              <w:pStyle w:val="Style14"/>
+              <w:pStyle w:val="user2"/>
               <w:spacing w:lineRule="auto" w:line="240" w:before="57" w:after="57"/>
               <w:ind w:hanging="0"/>
               <w:rPr>
@@ -3520,7 +3496,7 @@
           </w:tcPr>
           <w:p>
             <w:pPr>
-              <w:pStyle w:val="Style14"/>
+              <w:pStyle w:val="user2"/>
               <w:spacing w:lineRule="auto" w:line="240" w:before="57" w:after="57"/>
               <w:ind w:hanging="0"/>
               <w:rPr>
@@ -3550,7 +3526,7 @@
           </w:tcPr>
           <w:p>
             <w:pPr>
-              <w:pStyle w:val="Style14"/>
+              <w:pStyle w:val="user2"/>
               <w:spacing w:lineRule="auto" w:line="240" w:before="57" w:after="57"/>
               <w:ind w:hanging="0"/>
               <w:jc w:val="center"/>
@@ -3576,7 +3552,7 @@
           </w:tcPr>
           <w:p>
             <w:pPr>
-              <w:pStyle w:val="Style14"/>
+              <w:pStyle w:val="user2"/>
               <w:spacing w:lineRule="auto" w:line="240" w:before="57" w:after="57"/>
               <w:ind w:hanging="0"/>
               <w:jc w:val="center"/>
@@ -3604,7 +3580,7 @@
           </w:tcPr>
           <w:p>
             <w:pPr>
-              <w:pStyle w:val="Style14"/>
+              <w:pStyle w:val="user2"/>
               <w:spacing w:lineRule="auto" w:line="240" w:before="57" w:after="57"/>
               <w:ind w:hanging="0"/>
               <w:jc w:val="center"/>
@@ -3633,7 +3609,7 @@
           </w:tcPr>
           <w:p>
             <w:pPr>
-              <w:pStyle w:val="Style14"/>
+              <w:pStyle w:val="user2"/>
               <w:spacing w:lineRule="auto" w:line="240" w:before="57" w:after="57"/>
               <w:ind w:hanging="0"/>
               <w:rPr>
@@ -3663,7 +3639,7 @@
           </w:tcPr>
           <w:p>
             <w:pPr>
-              <w:pStyle w:val="Style14"/>
+              <w:pStyle w:val="user2"/>
               <w:spacing w:lineRule="auto" w:line="240" w:before="57" w:after="57"/>
               <w:ind w:hanging="0"/>
               <w:rPr>
@@ -3691,7 +3667,7 @@
           </w:tcPr>
           <w:p>
             <w:pPr>
-              <w:pStyle w:val="Style14"/>
+              <w:pStyle w:val="user2"/>
               <w:spacing w:lineRule="auto" w:line="240" w:before="57" w:after="57"/>
               <w:ind w:hanging="0"/>
               <w:rPr>
@@ -3719,7 +3695,7 @@
           </w:tcPr>
           <w:p>
             <w:pPr>
-              <w:pStyle w:val="Style14"/>
+              <w:pStyle w:val="user2"/>
               <w:spacing w:lineRule="auto" w:line="240" w:before="57" w:after="57"/>
               <w:ind w:hanging="0"/>
               <w:jc w:val="center"/>
@@ -3745,7 +3721,7 @@
           </w:tcPr>
           <w:p>
             <w:pPr>
-              <w:pStyle w:val="Style14"/>
+              <w:pStyle w:val="user2"/>
               <w:spacing w:lineRule="auto" w:line="240" w:before="57" w:after="57"/>
               <w:ind w:hanging="0"/>
               <w:jc w:val="center"/>
@@ -3773,7 +3749,7 @@
           </w:tcPr>
           <w:p>
             <w:pPr>
-              <w:pStyle w:val="Style14"/>
+              <w:pStyle w:val="user2"/>
               <w:spacing w:lineRule="auto" w:line="240" w:before="57" w:after="57"/>
               <w:ind w:hanging="0"/>
               <w:jc w:val="center"/>
@@ -3802,7 +3778,7 @@
           </w:tcPr>
           <w:p>
             <w:pPr>
-              <w:pStyle w:val="Style14"/>
+              <w:pStyle w:val="user2"/>
               <w:spacing w:lineRule="auto" w:line="240" w:before="57" w:after="57"/>
               <w:ind w:hanging="0"/>
               <w:rPr>
@@ -3832,7 +3808,7 @@
           </w:tcPr>
           <w:p>
             <w:pPr>
-              <w:pStyle w:val="Style14"/>
+              <w:pStyle w:val="user2"/>
               <w:spacing w:lineRule="auto" w:line="240" w:before="57" w:after="57"/>
               <w:ind w:hanging="0"/>
               <w:rPr>
@@ -3860,7 +3836,7 @@
           </w:tcPr>
           <w:p>
             <w:pPr>
-              <w:pStyle w:val="Style14"/>
+              <w:pStyle w:val="user2"/>
               <w:spacing w:lineRule="auto" w:line="240" w:before="57" w:after="57"/>
               <w:ind w:hanging="0"/>
               <w:rPr>
@@ -3888,7 +3864,7 @@
           </w:tcPr>
           <w:p>
             <w:pPr>
-              <w:pStyle w:val="Style14"/>
+              <w:pStyle w:val="user2"/>
               <w:spacing w:lineRule="auto" w:line="240" w:before="57" w:after="57"/>
               <w:ind w:hanging="0"/>
               <w:jc w:val="center"/>
@@ -3914,7 +3890,7 @@
           </w:tcPr>
           <w:p>
             <w:pPr>
-              <w:pStyle w:val="Style14"/>
+              <w:pStyle w:val="user2"/>
               <w:spacing w:lineRule="auto" w:line="240" w:before="57" w:after="57"/>
               <w:ind w:hanging="0"/>
               <w:jc w:val="center"/>
@@ -3942,7 +3918,7 @@
           </w:tcPr>
           <w:p>
             <w:pPr>
-              <w:pStyle w:val="Style14"/>
+              <w:pStyle w:val="user2"/>
               <w:spacing w:lineRule="auto" w:line="240" w:before="57" w:after="57"/>
               <w:ind w:hanging="0"/>
               <w:jc w:val="center"/>
@@ -3971,7 +3947,7 @@
           </w:tcPr>
           <w:p>
             <w:pPr>
-              <w:pStyle w:val="Style14"/>
+              <w:pStyle w:val="user2"/>
               <w:spacing w:lineRule="auto" w:line="240" w:before="57" w:after="57"/>
               <w:ind w:hanging="0"/>
               <w:rPr>
@@ -4001,7 +3977,7 @@
           </w:tcPr>
           <w:p>
             <w:pPr>
-              <w:pStyle w:val="Style14"/>
+              <w:pStyle w:val="user2"/>
               <w:spacing w:lineRule="auto" w:line="240" w:before="57" w:after="57"/>
               <w:ind w:hanging="0"/>
               <w:rPr>
@@ -4029,7 +4005,7 @@
           </w:tcPr>
           <w:p>
             <w:pPr>
-              <w:pStyle w:val="Style14"/>
+              <w:pStyle w:val="user2"/>
               <w:spacing w:lineRule="auto" w:line="240" w:before="57" w:after="57"/>
               <w:ind w:hanging="0"/>
               <w:rPr>
@@ -4057,7 +4033,7 @@
           </w:tcPr>
           <w:p>
             <w:pPr>
-              <w:pStyle w:val="Style14"/>
+              <w:pStyle w:val="user2"/>
               <w:spacing w:lineRule="auto" w:line="240" w:before="57" w:after="57"/>
               <w:ind w:hanging="0"/>
               <w:jc w:val="center"/>
@@ -4083,7 +4059,7 @@
           </w:tcPr>
           <w:p>
             <w:pPr>
-              <w:pStyle w:val="Style14"/>
+              <w:pStyle w:val="user2"/>
               <w:spacing w:lineRule="auto" w:line="240" w:before="57" w:after="57"/>
               <w:ind w:hanging="0"/>
               <w:jc w:val="center"/>
@@ -4112,7 +4088,7 @@
           </w:tcPr>
           <w:p>
             <w:pPr>
-              <w:pStyle w:val="Style14"/>
+              <w:pStyle w:val="user2"/>
               <w:spacing w:lineRule="auto" w:line="240" w:before="57" w:after="57"/>
               <w:ind w:hanging="0"/>
               <w:jc w:val="center"/>
@@ -4141,7 +4117,7 @@
           </w:tcPr>
           <w:p>
             <w:pPr>
-              <w:pStyle w:val="Style14"/>
+              <w:pStyle w:val="user2"/>
               <w:spacing w:lineRule="auto" w:line="240" w:before="57" w:after="57"/>
               <w:ind w:hanging="0"/>
               <w:rPr>
@@ -4171,7 +4147,7 @@
           </w:tcPr>
           <w:p>
             <w:pPr>
-              <w:pStyle w:val="Style14"/>
+              <w:pStyle w:val="user2"/>
               <w:spacing w:lineRule="auto" w:line="240" w:before="57" w:after="57"/>
               <w:ind w:hanging="0"/>
               <w:rPr>
@@ -4199,7 +4175,7 @@
           </w:tcPr>
           <w:p>
             <w:pPr>
-              <w:pStyle w:val="Style14"/>
+              <w:pStyle w:val="user2"/>
               <w:spacing w:lineRule="auto" w:line="240" w:before="57" w:after="57"/>
               <w:ind w:hanging="0"/>
               <w:rPr>
@@ -4227,7 +4203,7 @@
           </w:tcPr>
           <w:p>
             <w:pPr>
-              <w:pStyle w:val="Style14"/>
+              <w:pStyle w:val="user2"/>
               <w:spacing w:lineRule="auto" w:line="240" w:before="57" w:after="57"/>
               <w:ind w:hanging="0"/>
               <w:jc w:val="center"/>
@@ -4249,7 +4225,7 @@
           </w:tcPr>
           <w:p>
             <w:pPr>
-              <w:pStyle w:val="Style14"/>
+              <w:pStyle w:val="user2"/>
               <w:spacing w:lineRule="auto" w:line="240" w:before="57" w:after="57"/>
               <w:ind w:hanging="0"/>
               <w:jc w:val="center"/>
@@ -4275,7 +4251,7 @@
           </w:tcPr>
           <w:p>
             <w:pPr>
-              <w:pStyle w:val="Style14"/>
+              <w:pStyle w:val="user2"/>
               <w:spacing w:lineRule="auto" w:line="240" w:before="57" w:after="57"/>
               <w:ind w:hanging="0"/>
               <w:jc w:val="center"/>
@@ -4302,7 +4278,7 @@
           </w:tcPr>
           <w:p>
             <w:pPr>
-              <w:pStyle w:val="Style14"/>
+              <w:pStyle w:val="user2"/>
               <w:spacing w:lineRule="auto" w:line="240" w:before="57" w:after="57"/>
               <w:ind w:hanging="0"/>
               <w:rPr>
@@ -4332,7 +4308,7 @@
           </w:tcPr>
           <w:p>
             <w:pPr>
-              <w:pStyle w:val="Style14"/>
+              <w:pStyle w:val="user2"/>
               <w:spacing w:lineRule="auto" w:line="240" w:before="57" w:after="57"/>
               <w:ind w:hanging="0"/>
               <w:rPr>
@@ -4360,7 +4336,7 @@
           </w:tcPr>
           <w:p>
             <w:pPr>
-              <w:pStyle w:val="Style14"/>
+              <w:pStyle w:val="user2"/>
               <w:spacing w:lineRule="auto" w:line="240" w:before="57" w:after="57"/>
               <w:ind w:hanging="0"/>
               <w:rPr>
@@ -4388,7 +4364,7 @@
           </w:tcPr>
           <w:p>
             <w:pPr>
-              <w:pStyle w:val="Style14"/>
+              <w:pStyle w:val="user2"/>
               <w:spacing w:lineRule="auto" w:line="240" w:before="57" w:after="57"/>
               <w:ind w:hanging="0"/>
               <w:jc w:val="center"/>
@@ -4417,7 +4393,7 @@
           </w:tcPr>
           <w:p>
             <w:pPr>
-              <w:pStyle w:val="Style14"/>
+              <w:pStyle w:val="user2"/>
               <w:spacing w:lineRule="auto" w:line="240" w:before="57" w:after="57"/>
               <w:ind w:hanging="0"/>
               <w:jc w:val="center"/>
@@ -4443,7 +4419,7 @@
           </w:tcPr>
           <w:p>
             <w:pPr>
-              <w:pStyle w:val="Style14"/>
+              <w:pStyle w:val="user2"/>
               <w:spacing w:lineRule="auto" w:line="240" w:before="57" w:after="57"/>
               <w:ind w:hanging="0"/>
               <w:jc w:val="center"/>
@@ -4470,7 +4446,7 @@
           </w:tcPr>
           <w:p>
             <w:pPr>
-              <w:pStyle w:val="Style14"/>
+              <w:pStyle w:val="user2"/>
               <w:spacing w:lineRule="auto" w:line="240" w:before="57" w:after="57"/>
               <w:ind w:hanging="0"/>
               <w:rPr>
@@ -4500,7 +4476,7 @@
           </w:tcPr>
           <w:p>
             <w:pPr>
-              <w:pStyle w:val="Style14"/>
+              <w:pStyle w:val="user2"/>
               <w:spacing w:lineRule="auto" w:line="240" w:before="57" w:after="57"/>
               <w:ind w:hanging="0"/>
               <w:rPr>
@@ -4528,7 +4504,7 @@
           </w:tcPr>
           <w:p>
             <w:pPr>
-              <w:pStyle w:val="Style14"/>
+              <w:pStyle w:val="user2"/>
               <w:spacing w:lineRule="auto" w:line="240" w:before="57" w:after="57"/>
               <w:ind w:hanging="0"/>
               <w:rPr>
@@ -4556,7 +4532,7 @@
           </w:tcPr>
           <w:p>
             <w:pPr>
-              <w:pStyle w:val="Style14"/>
+              <w:pStyle w:val="user2"/>
               <w:spacing w:lineRule="auto" w:line="240" w:before="57" w:after="57"/>
               <w:ind w:hanging="0"/>
               <w:jc w:val="center"/>
@@ -4582,7 +4558,7 @@
           </w:tcPr>
           <w:p>
             <w:pPr>
-              <w:pStyle w:val="Style14"/>
+              <w:pStyle w:val="user2"/>
               <w:spacing w:lineRule="auto" w:line="240" w:before="57" w:after="57"/>
               <w:ind w:hanging="0"/>
               <w:jc w:val="center"/>
@@ -4608,7 +4584,7 @@
           </w:tcPr>
           <w:p>
             <w:pPr>
-              <w:pStyle w:val="Style14"/>
+              <w:pStyle w:val="user2"/>
               <w:spacing w:lineRule="auto" w:line="240" w:before="57" w:after="57"/>
               <w:ind w:hanging="0"/>
               <w:jc w:val="center"/>
@@ -4635,7 +4611,7 @@
           </w:tcPr>
           <w:p>
             <w:pPr>
-              <w:pStyle w:val="Style14"/>
+              <w:pStyle w:val="user2"/>
               <w:spacing w:lineRule="auto" w:line="240" w:before="57" w:after="57"/>
               <w:ind w:hanging="0"/>
               <w:rPr>
@@ -4665,7 +4641,7 @@
           </w:tcPr>
           <w:p>
             <w:pPr>
-              <w:pStyle w:val="Style14"/>
+              <w:pStyle w:val="user2"/>
               <w:spacing w:lineRule="auto" w:line="240" w:before="57" w:after="57"/>
               <w:ind w:hanging="0"/>
               <w:rPr>
@@ -4693,7 +4669,7 @@
           </w:tcPr>
           <w:p>
             <w:pPr>
-              <w:pStyle w:val="Style14"/>
+              <w:pStyle w:val="user2"/>
               <w:spacing w:lineRule="auto" w:line="240" w:before="57" w:after="57"/>
               <w:ind w:hanging="0"/>
               <w:rPr>
@@ -4721,7 +4697,7 @@
           </w:tcPr>
           <w:p>
             <w:pPr>
-              <w:pStyle w:val="Style14"/>
+              <w:pStyle w:val="user2"/>
               <w:spacing w:lineRule="auto" w:line="240" w:before="57" w:after="57"/>
               <w:ind w:hanging="0"/>
               <w:jc w:val="center"/>
@@ -4749,7 +4725,7 @@
           </w:tcPr>
           <w:p>
             <w:pPr>
-              <w:pStyle w:val="Style14"/>
+              <w:pStyle w:val="user2"/>
               <w:spacing w:lineRule="auto" w:line="240" w:before="57" w:after="57"/>
               <w:ind w:hanging="0"/>
               <w:jc w:val="center"/>
@@ -4771,7 +4747,7 @@
           </w:tcPr>
           <w:p>
             <w:pPr>
-              <w:pStyle w:val="Style14"/>
+              <w:pStyle w:val="user2"/>
               <w:spacing w:lineRule="auto" w:line="240" w:before="57" w:after="57"/>
               <w:ind w:hanging="0"/>
               <w:jc w:val="center"/>
@@ -4798,7 +4774,7 @@
           </w:tcPr>
           <w:p>
             <w:pPr>
-              <w:pStyle w:val="Style14"/>
+              <w:pStyle w:val="user2"/>
               <w:spacing w:lineRule="auto" w:line="240" w:before="57" w:after="57"/>
               <w:ind w:hanging="0"/>
               <w:rPr>
@@ -4828,7 +4804,7 @@
           </w:tcPr>
           <w:p>
             <w:pPr>
-              <w:pStyle w:val="Style14"/>
+              <w:pStyle w:val="user2"/>
               <w:spacing w:lineRule="auto" w:line="240" w:before="57" w:after="57"/>
               <w:ind w:hanging="0"/>
               <w:rPr>
@@ -4856,7 +4832,7 @@
           </w:tcPr>
           <w:p>
             <w:pPr>
-              <w:pStyle w:val="Style14"/>
+              <w:pStyle w:val="user2"/>
               <w:spacing w:lineRule="auto" w:line="240" w:before="57" w:after="57"/>
               <w:ind w:hanging="0"/>
               <w:rPr>
@@ -4884,7 +4860,7 @@
           </w:tcPr>
           <w:p>
             <w:pPr>
-              <w:pStyle w:val="Style14"/>
+              <w:pStyle w:val="user2"/>
               <w:spacing w:lineRule="auto" w:line="240" w:before="57" w:after="57"/>
               <w:ind w:hanging="0"/>
               <w:jc w:val="center"/>
@@ -4906,7 +4882,7 @@
           </w:tcPr>
           <w:p>
             <w:pPr>
-              <w:pStyle w:val="Style14"/>
+              <w:pStyle w:val="user2"/>
               <w:spacing w:lineRule="auto" w:line="240" w:before="57" w:after="57"/>
               <w:ind w:hanging="0"/>
               <w:jc w:val="center"/>
@@ -4928,7 +4904,7 @@
           </w:tcPr>
           <w:p>
             <w:pPr>
-              <w:pStyle w:val="Style14"/>
+              <w:pStyle w:val="user2"/>
               <w:spacing w:lineRule="auto" w:line="240" w:before="57" w:after="57"/>
               <w:ind w:hanging="0"/>
               <w:jc w:val="center"/>
@@ -4955,7 +4931,7 @@
           </w:tcPr>
           <w:p>
             <w:pPr>
-              <w:pStyle w:val="Style14"/>
+              <w:pStyle w:val="user2"/>
               <w:spacing w:lineRule="auto" w:line="240" w:before="57" w:after="57"/>
               <w:ind w:hanging="0"/>
               <w:rPr>
@@ -4985,7 +4961,7 @@
           </w:tcPr>
           <w:p>
             <w:pPr>
-              <w:pStyle w:val="Style14"/>
+              <w:pStyle w:val="user2"/>
               <w:spacing w:lineRule="auto" w:line="240" w:before="57" w:after="57"/>
               <w:ind w:hanging="0"/>
               <w:rPr>
@@ -5012,7 +4988,7 @@
           </w:tcPr>
           <w:p>
             <w:pPr>
-              <w:pStyle w:val="Style14"/>
+              <w:pStyle w:val="user2"/>
               <w:spacing w:lineRule="auto" w:line="240" w:before="57" w:after="57"/>
               <w:ind w:hanging="0"/>
               <w:rPr>
@@ -5039,7 +5015,7 @@
           </w:tcPr>
           <w:p>
             <w:pPr>
-              <w:pStyle w:val="Style14"/>
+              <w:pStyle w:val="user2"/>
               <w:spacing w:lineRule="auto" w:line="240" w:before="57" w:after="57"/>
               <w:ind w:hanging="0"/>
               <w:jc w:val="center"/>
@@ -5067,7 +5043,7 @@
           </w:tcPr>
           <w:p>
             <w:pPr>
-              <w:pStyle w:val="Style14"/>
+              <w:pStyle w:val="user2"/>
               <w:spacing w:lineRule="auto" w:line="240" w:before="57" w:after="57"/>
               <w:ind w:hanging="0"/>
               <w:jc w:val="center"/>
@@ -5095,7 +5071,7 @@
           </w:tcPr>
           <w:p>
             <w:pPr>
-              <w:pStyle w:val="Style14"/>
+              <w:pStyle w:val="user2"/>
               <w:spacing w:lineRule="auto" w:line="240" w:before="57" w:after="57"/>
               <w:ind w:hanging="0"/>
               <w:jc w:val="center"/>
@@ -5118,7 +5094,7 @@
           </w:tcPr>
           <w:p>
             <w:pPr>
-              <w:pStyle w:val="Style14"/>
+              <w:pStyle w:val="user2"/>
               <w:spacing w:lineRule="auto" w:line="240" w:before="57" w:after="57"/>
               <w:ind w:hanging="0"/>
               <w:rPr>
@@ -5148,7 +5124,7 @@
           </w:tcPr>
           <w:p>
             <w:pPr>
-              <w:pStyle w:val="Style14"/>
+              <w:pStyle w:val="user2"/>
               <w:spacing w:lineRule="auto" w:line="240" w:before="57" w:after="57"/>
               <w:ind w:hanging="0"/>
               <w:rPr>
@@ -5175,7 +5151,7 @@
           </w:tcPr>
           <w:p>
             <w:pPr>
-              <w:pStyle w:val="Style14"/>
+              <w:pStyle w:val="user2"/>
               <w:spacing w:lineRule="auto" w:line="240" w:before="57" w:after="57"/>
               <w:ind w:hanging="0"/>
               <w:rPr>
@@ -5202,7 +5178,7 @@
           </w:tcPr>
           <w:p>
             <w:pPr>
-              <w:pStyle w:val="Style14"/>
+              <w:pStyle w:val="user2"/>
               <w:spacing w:lineRule="auto" w:line="240" w:before="57" w:after="57"/>
               <w:ind w:hanging="0"/>
               <w:jc w:val="center"/>
@@ -5230,7 +5206,7 @@
           </w:tcPr>
           <w:p>
             <w:pPr>
-              <w:pStyle w:val="Style14"/>
+              <w:pStyle w:val="user2"/>
               <w:spacing w:lineRule="auto" w:line="240" w:before="57" w:after="57"/>
               <w:ind w:hanging="0"/>
               <w:jc w:val="center"/>
@@ -5258,7 +5234,7 @@
           </w:tcPr>
           <w:p>
             <w:pPr>
-              <w:pStyle w:val="Style14"/>
+              <w:pStyle w:val="user2"/>
               <w:spacing w:lineRule="auto" w:line="240" w:before="57" w:after="57"/>
               <w:ind w:hanging="0"/>
               <w:jc w:val="center"/>
@@ -5281,7 +5257,7 @@
           </w:tcPr>
           <w:p>
             <w:pPr>
-              <w:pStyle w:val="Style14"/>
+              <w:pStyle w:val="user2"/>
               <w:spacing w:lineRule="auto" w:line="240" w:before="57" w:after="57"/>
               <w:ind w:hanging="0"/>
               <w:rPr>
@@ -5311,7 +5287,7 @@
           </w:tcPr>
           <w:p>
             <w:pPr>
-              <w:pStyle w:val="Style14"/>
+              <w:pStyle w:val="user2"/>
               <w:spacing w:lineRule="auto" w:line="240" w:before="57" w:after="57"/>
               <w:ind w:hanging="0"/>
               <w:rPr>
@@ -5338,7 +5314,7 @@
           </w:tcPr>
           <w:p>
             <w:pPr>
-              <w:pStyle w:val="Style14"/>
+              <w:pStyle w:val="user2"/>
               <w:spacing w:lineRule="auto" w:line="240" w:before="57" w:after="57"/>
               <w:ind w:hanging="0"/>
               <w:rPr>
@@ -5365,7 +5341,7 @@
           </w:tcPr>
           <w:p>
             <w:pPr>
-              <w:pStyle w:val="Style14"/>
+              <w:pStyle w:val="user2"/>
               <w:spacing w:lineRule="auto" w:line="240" w:before="57" w:after="57"/>
               <w:ind w:hanging="0"/>
               <w:jc w:val="center"/>
@@ -5393,7 +5369,7 @@
           </w:tcPr>
           <w:p>
             <w:pPr>
-              <w:pStyle w:val="Style14"/>
+              <w:pStyle w:val="user2"/>
               <w:spacing w:lineRule="auto" w:line="240" w:before="57" w:after="57"/>
               <w:ind w:hanging="0"/>
               <w:jc w:val="center"/>
@@ -5421,7 +5397,7 @@
           </w:tcPr>
           <w:p>
             <w:pPr>
-              <w:pStyle w:val="Style14"/>
+              <w:pStyle w:val="user2"/>
               <w:spacing w:lineRule="auto" w:line="240" w:before="57" w:after="57"/>
               <w:ind w:hanging="0"/>
               <w:jc w:val="center"/>
@@ -5444,7 +5420,7 @@
           </w:tcPr>
           <w:p>
             <w:pPr>
-              <w:pStyle w:val="Style14"/>
+              <w:pStyle w:val="user2"/>
               <w:spacing w:lineRule="auto" w:line="240" w:before="57" w:after="57"/>
               <w:ind w:hanging="0"/>
               <w:rPr>
@@ -5884,7 +5860,7 @@
     <w:pPr>
       <w:widowControl/>
       <w:suppressAutoHyphens w:val="true"/>
-      <w:overflowPunct w:val="true"/>
+      <w:overflowPunct w:val="false"/>
       <w:bidi w:val="0"/>
       <w:spacing w:lineRule="auto" w:line="360" w:before="0" w:after="0"/>
       <w:ind w:firstLine="851"/>
@@ -6311,7 +6287,7 @@
   </w:style>
   <w:style w:type="paragraph" w:styleId="IndexHeading">
     <w:name w:val="index heading"/>
-    <w:basedOn w:val="user"/>
+    <w:basedOn w:val="Style12"/>
     <w:pPr/>
     <w:rPr/>
   </w:style>
@@ -6552,6 +6528,16 @@
       <w:lang w:val="en-US"/>
     </w:rPr>
   </w:style>
+  <w:style w:type="paragraph" w:styleId="user2">
+    <w:name w:val="Вміст таблиці (user)"/>
+    <w:basedOn w:val="Normal"/>
+    <w:qFormat/>
+    <w:pPr>
+      <w:widowControl w:val="false"/>
+      <w:suppressLineNumbers/>
+    </w:pPr>
+    <w:rPr/>
+  </w:style>
   <w:style w:type="paragraph" w:styleId="Style14">
     <w:name w:val="Вміст таблиці"/>
     <w:basedOn w:val="Normal"/>
@@ -6562,19 +6548,9 @@
     </w:pPr>
     <w:rPr/>
   </w:style>
-  <w:style w:type="paragraph" w:styleId="user2">
-    <w:name w:val="Вміст таблиці (user)"/>
-    <w:basedOn w:val="Normal"/>
-    <w:qFormat/>
-    <w:pPr>
-      <w:widowControl w:val="false"/>
-      <w:suppressLineNumbers/>
-    </w:pPr>
-    <w:rPr/>
-  </w:style>
-  <w:style w:type="paragraph" w:styleId="user3">
-    <w:name w:val="Заголовок таблиці (user)"/>
-    <w:basedOn w:val="user2"/>
+  <w:style w:type="paragraph" w:styleId="Style15">
+    <w:name w:val="Заголовок таблиці"/>
+    <w:basedOn w:val="Style14"/>
     <w:qFormat/>
     <w:pPr>
       <w:suppressLineNumbers/>
@@ -6585,8 +6561,8 @@
       <w:bCs/>
     </w:rPr>
   </w:style>
-  <w:style w:type="numbering" w:styleId="user4">
-    <w:name w:val="Без маркерів (user)"/>
+  <w:style w:type="numbering" w:styleId="Style16">
+    <w:name w:val="Без маркерів"/>
     <w:qFormat/>
   </w:style>
 </w:styles>

</xml_diff>

<commit_message>
feat -- P: add the signed docs
</commit_message>
<xml_diff>
--- a/42P Praktyka/Щоденник.docx
+++ b/42P Praktyka/Щоденник.docx
@@ -3163,7 +3163,7 @@
           </w:tcPr>
           <w:p>
             <w:pPr>
-              <w:pStyle w:val="Style14"/>
+              <w:pStyle w:val="user2"/>
               <w:spacing w:lineRule="auto" w:line="240" w:before="57" w:after="57"/>
               <w:ind w:hanging="0"/>
               <w:jc w:val="center"/>
@@ -3201,7 +3201,7 @@
           </w:tcPr>
           <w:p>
             <w:pPr>
-              <w:pStyle w:val="Style14"/>
+              <w:pStyle w:val="user2"/>
               <w:spacing w:lineRule="auto" w:line="240" w:before="57" w:after="57"/>
               <w:ind w:hanging="0"/>
               <w:jc w:val="center"/>
@@ -3232,7 +3232,7 @@
           </w:tcPr>
           <w:p>
             <w:pPr>
-              <w:pStyle w:val="Style14"/>
+              <w:pStyle w:val="user2"/>
               <w:spacing w:lineRule="auto" w:line="240" w:before="57" w:after="57"/>
               <w:ind w:hanging="0"/>
               <w:jc w:val="center"/>
@@ -3264,7 +3264,7 @@
           </w:tcPr>
           <w:p>
             <w:pPr>
-              <w:pStyle w:val="Style14"/>
+              <w:pStyle w:val="user2"/>
               <w:spacing w:lineRule="auto" w:line="240" w:before="57" w:after="57"/>
               <w:ind w:hanging="0"/>
               <w:jc w:val="center"/>
@@ -3350,7 +3350,7 @@
           </w:tcPr>
           <w:p>
             <w:pPr>
-              <w:pStyle w:val="Style14"/>
+              <w:pStyle w:val="user2"/>
               <w:spacing w:lineRule="auto" w:line="240" w:before="57" w:after="57"/>
               <w:ind w:hanging="0"/>
               <w:jc w:val="center"/>
@@ -3379,7 +3379,7 @@
           </w:tcPr>
           <w:p>
             <w:pPr>
-              <w:pStyle w:val="Style14"/>
+              <w:pStyle w:val="user2"/>
               <w:spacing w:lineRule="auto" w:line="240" w:before="57" w:after="57"/>
               <w:ind w:hanging="0"/>
               <w:jc w:val="center"/>
@@ -3408,7 +3408,7 @@
           </w:tcPr>
           <w:p>
             <w:pPr>
-              <w:pStyle w:val="Style14"/>
+              <w:pStyle w:val="user2"/>
               <w:spacing w:lineRule="auto" w:line="240" w:before="57" w:after="57"/>
               <w:ind w:hanging="0"/>
               <w:jc w:val="center"/>
@@ -3468,7 +3468,7 @@
           </w:tcPr>
           <w:p>
             <w:pPr>
-              <w:pStyle w:val="Style14"/>
+              <w:pStyle w:val="user2"/>
               <w:spacing w:lineRule="auto" w:line="240" w:before="57" w:after="57"/>
               <w:ind w:hanging="0"/>
               <w:rPr>
@@ -3496,7 +3496,7 @@
           </w:tcPr>
           <w:p>
             <w:pPr>
-              <w:pStyle w:val="Style14"/>
+              <w:pStyle w:val="user2"/>
               <w:spacing w:lineRule="auto" w:line="240" w:before="57" w:after="57"/>
               <w:ind w:hanging="0"/>
               <w:rPr>
@@ -3526,7 +3526,7 @@
           </w:tcPr>
           <w:p>
             <w:pPr>
-              <w:pStyle w:val="Style14"/>
+              <w:pStyle w:val="user2"/>
               <w:spacing w:lineRule="auto" w:line="240" w:before="57" w:after="57"/>
               <w:ind w:hanging="0"/>
               <w:jc w:val="center"/>
@@ -3552,7 +3552,7 @@
           </w:tcPr>
           <w:p>
             <w:pPr>
-              <w:pStyle w:val="Style14"/>
+              <w:pStyle w:val="user2"/>
               <w:spacing w:lineRule="auto" w:line="240" w:before="57" w:after="57"/>
               <w:ind w:hanging="0"/>
               <w:jc w:val="center"/>
@@ -3580,7 +3580,7 @@
           </w:tcPr>
           <w:p>
             <w:pPr>
-              <w:pStyle w:val="Style14"/>
+              <w:pStyle w:val="user2"/>
               <w:spacing w:lineRule="auto" w:line="240" w:before="57" w:after="57"/>
               <w:ind w:hanging="0"/>
               <w:jc w:val="center"/>
@@ -3609,7 +3609,7 @@
           </w:tcPr>
           <w:p>
             <w:pPr>
-              <w:pStyle w:val="Style14"/>
+              <w:pStyle w:val="user2"/>
               <w:spacing w:lineRule="auto" w:line="240" w:before="57" w:after="57"/>
               <w:ind w:hanging="0"/>
               <w:rPr>
@@ -3639,7 +3639,7 @@
           </w:tcPr>
           <w:p>
             <w:pPr>
-              <w:pStyle w:val="Style14"/>
+              <w:pStyle w:val="user2"/>
               <w:spacing w:lineRule="auto" w:line="240" w:before="57" w:after="57"/>
               <w:ind w:hanging="0"/>
               <w:rPr>
@@ -3667,7 +3667,7 @@
           </w:tcPr>
           <w:p>
             <w:pPr>
-              <w:pStyle w:val="Style14"/>
+              <w:pStyle w:val="user2"/>
               <w:spacing w:lineRule="auto" w:line="240" w:before="57" w:after="57"/>
               <w:ind w:hanging="0"/>
               <w:rPr>
@@ -3695,7 +3695,7 @@
           </w:tcPr>
           <w:p>
             <w:pPr>
-              <w:pStyle w:val="Style14"/>
+              <w:pStyle w:val="user2"/>
               <w:spacing w:lineRule="auto" w:line="240" w:before="57" w:after="57"/>
               <w:ind w:hanging="0"/>
               <w:jc w:val="center"/>
@@ -3721,7 +3721,7 @@
           </w:tcPr>
           <w:p>
             <w:pPr>
-              <w:pStyle w:val="Style14"/>
+              <w:pStyle w:val="user2"/>
               <w:spacing w:lineRule="auto" w:line="240" w:before="57" w:after="57"/>
               <w:ind w:hanging="0"/>
               <w:jc w:val="center"/>
@@ -3749,7 +3749,7 @@
           </w:tcPr>
           <w:p>
             <w:pPr>
-              <w:pStyle w:val="Style14"/>
+              <w:pStyle w:val="user2"/>
               <w:spacing w:lineRule="auto" w:line="240" w:before="57" w:after="57"/>
               <w:ind w:hanging="0"/>
               <w:jc w:val="center"/>
@@ -3778,7 +3778,7 @@
           </w:tcPr>
           <w:p>
             <w:pPr>
-              <w:pStyle w:val="Style14"/>
+              <w:pStyle w:val="user2"/>
               <w:spacing w:lineRule="auto" w:line="240" w:before="57" w:after="57"/>
               <w:ind w:hanging="0"/>
               <w:rPr>
@@ -3808,7 +3808,7 @@
           </w:tcPr>
           <w:p>
             <w:pPr>
-              <w:pStyle w:val="Style14"/>
+              <w:pStyle w:val="user2"/>
               <w:spacing w:lineRule="auto" w:line="240" w:before="57" w:after="57"/>
               <w:ind w:hanging="0"/>
               <w:rPr>
@@ -3836,7 +3836,7 @@
           </w:tcPr>
           <w:p>
             <w:pPr>
-              <w:pStyle w:val="Style14"/>
+              <w:pStyle w:val="user2"/>
               <w:spacing w:lineRule="auto" w:line="240" w:before="57" w:after="57"/>
               <w:ind w:hanging="0"/>
               <w:rPr>
@@ -3864,7 +3864,7 @@
           </w:tcPr>
           <w:p>
             <w:pPr>
-              <w:pStyle w:val="Style14"/>
+              <w:pStyle w:val="user2"/>
               <w:spacing w:lineRule="auto" w:line="240" w:before="57" w:after="57"/>
               <w:ind w:hanging="0"/>
               <w:jc w:val="center"/>
@@ -3890,7 +3890,7 @@
           </w:tcPr>
           <w:p>
             <w:pPr>
-              <w:pStyle w:val="Style14"/>
+              <w:pStyle w:val="user2"/>
               <w:spacing w:lineRule="auto" w:line="240" w:before="57" w:after="57"/>
               <w:ind w:hanging="0"/>
               <w:jc w:val="center"/>
@@ -3918,7 +3918,7 @@
           </w:tcPr>
           <w:p>
             <w:pPr>
-              <w:pStyle w:val="Style14"/>
+              <w:pStyle w:val="user2"/>
               <w:spacing w:lineRule="auto" w:line="240" w:before="57" w:after="57"/>
               <w:ind w:hanging="0"/>
               <w:jc w:val="center"/>
@@ -3947,7 +3947,7 @@
           </w:tcPr>
           <w:p>
             <w:pPr>
-              <w:pStyle w:val="Style14"/>
+              <w:pStyle w:val="user2"/>
               <w:spacing w:lineRule="auto" w:line="240" w:before="57" w:after="57"/>
               <w:ind w:hanging="0"/>
               <w:rPr>
@@ -3977,7 +3977,7 @@
           </w:tcPr>
           <w:p>
             <w:pPr>
-              <w:pStyle w:val="Style14"/>
+              <w:pStyle w:val="user2"/>
               <w:spacing w:lineRule="auto" w:line="240" w:before="57" w:after="57"/>
               <w:ind w:hanging="0"/>
               <w:rPr>
@@ -4005,7 +4005,7 @@
           </w:tcPr>
           <w:p>
             <w:pPr>
-              <w:pStyle w:val="Style14"/>
+              <w:pStyle w:val="user2"/>
               <w:spacing w:lineRule="auto" w:line="240" w:before="57" w:after="57"/>
               <w:ind w:hanging="0"/>
               <w:rPr>
@@ -4033,7 +4033,7 @@
           </w:tcPr>
           <w:p>
             <w:pPr>
-              <w:pStyle w:val="Style14"/>
+              <w:pStyle w:val="user2"/>
               <w:spacing w:lineRule="auto" w:line="240" w:before="57" w:after="57"/>
               <w:ind w:hanging="0"/>
               <w:jc w:val="center"/>
@@ -4059,7 +4059,7 @@
           </w:tcPr>
           <w:p>
             <w:pPr>
-              <w:pStyle w:val="Style14"/>
+              <w:pStyle w:val="user2"/>
               <w:spacing w:lineRule="auto" w:line="240" w:before="57" w:after="57"/>
               <w:ind w:hanging="0"/>
               <w:jc w:val="center"/>
@@ -4088,7 +4088,7 @@
           </w:tcPr>
           <w:p>
             <w:pPr>
-              <w:pStyle w:val="Style14"/>
+              <w:pStyle w:val="user2"/>
               <w:spacing w:lineRule="auto" w:line="240" w:before="57" w:after="57"/>
               <w:ind w:hanging="0"/>
               <w:jc w:val="center"/>
@@ -4117,7 +4117,7 @@
           </w:tcPr>
           <w:p>
             <w:pPr>
-              <w:pStyle w:val="Style14"/>
+              <w:pStyle w:val="user2"/>
               <w:spacing w:lineRule="auto" w:line="240" w:before="57" w:after="57"/>
               <w:ind w:hanging="0"/>
               <w:rPr>
@@ -4147,7 +4147,7 @@
           </w:tcPr>
           <w:p>
             <w:pPr>
-              <w:pStyle w:val="Style14"/>
+              <w:pStyle w:val="user2"/>
               <w:spacing w:lineRule="auto" w:line="240" w:before="57" w:after="57"/>
               <w:ind w:hanging="0"/>
               <w:rPr>
@@ -4175,7 +4175,7 @@
           </w:tcPr>
           <w:p>
             <w:pPr>
-              <w:pStyle w:val="Style14"/>
+              <w:pStyle w:val="user2"/>
               <w:spacing w:lineRule="auto" w:line="240" w:before="57" w:after="57"/>
               <w:ind w:hanging="0"/>
               <w:rPr>
@@ -4203,7 +4203,7 @@
           </w:tcPr>
           <w:p>
             <w:pPr>
-              <w:pStyle w:val="Style14"/>
+              <w:pStyle w:val="user2"/>
               <w:spacing w:lineRule="auto" w:line="240" w:before="57" w:after="57"/>
               <w:ind w:hanging="0"/>
               <w:jc w:val="center"/>
@@ -4225,7 +4225,7 @@
           </w:tcPr>
           <w:p>
             <w:pPr>
-              <w:pStyle w:val="Style14"/>
+              <w:pStyle w:val="user2"/>
               <w:spacing w:lineRule="auto" w:line="240" w:before="57" w:after="57"/>
               <w:ind w:hanging="0"/>
               <w:jc w:val="center"/>
@@ -4251,7 +4251,7 @@
           </w:tcPr>
           <w:p>
             <w:pPr>
-              <w:pStyle w:val="Style14"/>
+              <w:pStyle w:val="user2"/>
               <w:spacing w:lineRule="auto" w:line="240" w:before="57" w:after="57"/>
               <w:ind w:hanging="0"/>
               <w:jc w:val="center"/>
@@ -4278,7 +4278,7 @@
           </w:tcPr>
           <w:p>
             <w:pPr>
-              <w:pStyle w:val="Style14"/>
+              <w:pStyle w:val="user2"/>
               <w:spacing w:lineRule="auto" w:line="240" w:before="57" w:after="57"/>
               <w:ind w:hanging="0"/>
               <w:rPr>
@@ -4308,7 +4308,7 @@
           </w:tcPr>
           <w:p>
             <w:pPr>
-              <w:pStyle w:val="Style14"/>
+              <w:pStyle w:val="user2"/>
               <w:spacing w:lineRule="auto" w:line="240" w:before="57" w:after="57"/>
               <w:ind w:hanging="0"/>
               <w:rPr>
@@ -4336,7 +4336,7 @@
           </w:tcPr>
           <w:p>
             <w:pPr>
-              <w:pStyle w:val="Style14"/>
+              <w:pStyle w:val="user2"/>
               <w:spacing w:lineRule="auto" w:line="240" w:before="57" w:after="57"/>
               <w:ind w:hanging="0"/>
               <w:rPr>
@@ -4364,7 +4364,7 @@
           </w:tcPr>
           <w:p>
             <w:pPr>
-              <w:pStyle w:val="Style14"/>
+              <w:pStyle w:val="user2"/>
               <w:spacing w:lineRule="auto" w:line="240" w:before="57" w:after="57"/>
               <w:ind w:hanging="0"/>
               <w:jc w:val="center"/>
@@ -4393,7 +4393,7 @@
           </w:tcPr>
           <w:p>
             <w:pPr>
-              <w:pStyle w:val="Style14"/>
+              <w:pStyle w:val="user2"/>
               <w:spacing w:lineRule="auto" w:line="240" w:before="57" w:after="57"/>
               <w:ind w:hanging="0"/>
               <w:jc w:val="center"/>
@@ -4419,7 +4419,7 @@
           </w:tcPr>
           <w:p>
             <w:pPr>
-              <w:pStyle w:val="Style14"/>
+              <w:pStyle w:val="user2"/>
               <w:spacing w:lineRule="auto" w:line="240" w:before="57" w:after="57"/>
               <w:ind w:hanging="0"/>
               <w:jc w:val="center"/>
@@ -4446,7 +4446,7 @@
           </w:tcPr>
           <w:p>
             <w:pPr>
-              <w:pStyle w:val="Style14"/>
+              <w:pStyle w:val="user2"/>
               <w:spacing w:lineRule="auto" w:line="240" w:before="57" w:after="57"/>
               <w:ind w:hanging="0"/>
               <w:rPr>
@@ -4476,7 +4476,7 @@
           </w:tcPr>
           <w:p>
             <w:pPr>
-              <w:pStyle w:val="Style14"/>
+              <w:pStyle w:val="user2"/>
               <w:spacing w:lineRule="auto" w:line="240" w:before="57" w:after="57"/>
               <w:ind w:hanging="0"/>
               <w:rPr>
@@ -4504,7 +4504,7 @@
           </w:tcPr>
           <w:p>
             <w:pPr>
-              <w:pStyle w:val="Style14"/>
+              <w:pStyle w:val="user2"/>
               <w:spacing w:lineRule="auto" w:line="240" w:before="57" w:after="57"/>
               <w:ind w:hanging="0"/>
               <w:rPr>
@@ -4532,7 +4532,7 @@
           </w:tcPr>
           <w:p>
             <w:pPr>
-              <w:pStyle w:val="Style14"/>
+              <w:pStyle w:val="user2"/>
               <w:spacing w:lineRule="auto" w:line="240" w:before="57" w:after="57"/>
               <w:ind w:hanging="0"/>
               <w:jc w:val="center"/>
@@ -4558,7 +4558,7 @@
           </w:tcPr>
           <w:p>
             <w:pPr>
-              <w:pStyle w:val="Style14"/>
+              <w:pStyle w:val="user2"/>
               <w:spacing w:lineRule="auto" w:line="240" w:before="57" w:after="57"/>
               <w:ind w:hanging="0"/>
               <w:jc w:val="center"/>
@@ -4584,7 +4584,7 @@
           </w:tcPr>
           <w:p>
             <w:pPr>
-              <w:pStyle w:val="Style14"/>
+              <w:pStyle w:val="user2"/>
               <w:spacing w:lineRule="auto" w:line="240" w:before="57" w:after="57"/>
               <w:ind w:hanging="0"/>
               <w:jc w:val="center"/>
@@ -4611,7 +4611,7 @@
           </w:tcPr>
           <w:p>
             <w:pPr>
-              <w:pStyle w:val="Style14"/>
+              <w:pStyle w:val="user2"/>
               <w:spacing w:lineRule="auto" w:line="240" w:before="57" w:after="57"/>
               <w:ind w:hanging="0"/>
               <w:rPr>
@@ -4641,7 +4641,7 @@
           </w:tcPr>
           <w:p>
             <w:pPr>
-              <w:pStyle w:val="Style14"/>
+              <w:pStyle w:val="user2"/>
               <w:spacing w:lineRule="auto" w:line="240" w:before="57" w:after="57"/>
               <w:ind w:hanging="0"/>
               <w:rPr>
@@ -4669,7 +4669,7 @@
           </w:tcPr>
           <w:p>
             <w:pPr>
-              <w:pStyle w:val="Style14"/>
+              <w:pStyle w:val="user2"/>
               <w:spacing w:lineRule="auto" w:line="240" w:before="57" w:after="57"/>
               <w:ind w:hanging="0"/>
               <w:rPr>
@@ -4697,7 +4697,7 @@
           </w:tcPr>
           <w:p>
             <w:pPr>
-              <w:pStyle w:val="Style14"/>
+              <w:pStyle w:val="user2"/>
               <w:spacing w:lineRule="auto" w:line="240" w:before="57" w:after="57"/>
               <w:ind w:hanging="0"/>
               <w:jc w:val="center"/>
@@ -4725,7 +4725,7 @@
           </w:tcPr>
           <w:p>
             <w:pPr>
-              <w:pStyle w:val="Style14"/>
+              <w:pStyle w:val="user2"/>
               <w:spacing w:lineRule="auto" w:line="240" w:before="57" w:after="57"/>
               <w:ind w:hanging="0"/>
               <w:jc w:val="center"/>
@@ -4747,7 +4747,7 @@
           </w:tcPr>
           <w:p>
             <w:pPr>
-              <w:pStyle w:val="Style14"/>
+              <w:pStyle w:val="user2"/>
               <w:spacing w:lineRule="auto" w:line="240" w:before="57" w:after="57"/>
               <w:ind w:hanging="0"/>
               <w:jc w:val="center"/>
@@ -4774,7 +4774,7 @@
           </w:tcPr>
           <w:p>
             <w:pPr>
-              <w:pStyle w:val="Style14"/>
+              <w:pStyle w:val="user2"/>
               <w:spacing w:lineRule="auto" w:line="240" w:before="57" w:after="57"/>
               <w:ind w:hanging="0"/>
               <w:rPr>
@@ -4804,7 +4804,7 @@
           </w:tcPr>
           <w:p>
             <w:pPr>
-              <w:pStyle w:val="Style14"/>
+              <w:pStyle w:val="user2"/>
               <w:spacing w:lineRule="auto" w:line="240" w:before="57" w:after="57"/>
               <w:ind w:hanging="0"/>
               <w:rPr>
@@ -4832,7 +4832,7 @@
           </w:tcPr>
           <w:p>
             <w:pPr>
-              <w:pStyle w:val="Style14"/>
+              <w:pStyle w:val="user2"/>
               <w:spacing w:lineRule="auto" w:line="240" w:before="57" w:after="57"/>
               <w:ind w:hanging="0"/>
               <w:rPr>
@@ -4860,7 +4860,7 @@
           </w:tcPr>
           <w:p>
             <w:pPr>
-              <w:pStyle w:val="Style14"/>
+              <w:pStyle w:val="user2"/>
               <w:spacing w:lineRule="auto" w:line="240" w:before="57" w:after="57"/>
               <w:ind w:hanging="0"/>
               <w:jc w:val="center"/>
@@ -4882,7 +4882,7 @@
           </w:tcPr>
           <w:p>
             <w:pPr>
-              <w:pStyle w:val="Style14"/>
+              <w:pStyle w:val="user2"/>
               <w:spacing w:lineRule="auto" w:line="240" w:before="57" w:after="57"/>
               <w:ind w:hanging="0"/>
               <w:jc w:val="center"/>
@@ -4904,7 +4904,7 @@
           </w:tcPr>
           <w:p>
             <w:pPr>
-              <w:pStyle w:val="Style14"/>
+              <w:pStyle w:val="user2"/>
               <w:spacing w:lineRule="auto" w:line="240" w:before="57" w:after="57"/>
               <w:ind w:hanging="0"/>
               <w:jc w:val="center"/>
@@ -4931,7 +4931,7 @@
           </w:tcPr>
           <w:p>
             <w:pPr>
-              <w:pStyle w:val="Style14"/>
+              <w:pStyle w:val="user2"/>
               <w:spacing w:lineRule="auto" w:line="240" w:before="57" w:after="57"/>
               <w:ind w:hanging="0"/>
               <w:rPr>
@@ -4961,7 +4961,7 @@
           </w:tcPr>
           <w:p>
             <w:pPr>
-              <w:pStyle w:val="Style14"/>
+              <w:pStyle w:val="user2"/>
               <w:spacing w:lineRule="auto" w:line="240" w:before="57" w:after="57"/>
               <w:ind w:hanging="0"/>
               <w:rPr>
@@ -4988,7 +4988,7 @@
           </w:tcPr>
           <w:p>
             <w:pPr>
-              <w:pStyle w:val="Style14"/>
+              <w:pStyle w:val="user2"/>
               <w:spacing w:lineRule="auto" w:line="240" w:before="57" w:after="57"/>
               <w:ind w:hanging="0"/>
               <w:rPr>
@@ -5015,7 +5015,7 @@
           </w:tcPr>
           <w:p>
             <w:pPr>
-              <w:pStyle w:val="Style14"/>
+              <w:pStyle w:val="user2"/>
               <w:spacing w:lineRule="auto" w:line="240" w:before="57" w:after="57"/>
               <w:ind w:hanging="0"/>
               <w:jc w:val="center"/>
@@ -5043,7 +5043,7 @@
           </w:tcPr>
           <w:p>
             <w:pPr>
-              <w:pStyle w:val="Style14"/>
+              <w:pStyle w:val="user2"/>
               <w:spacing w:lineRule="auto" w:line="240" w:before="57" w:after="57"/>
               <w:ind w:hanging="0"/>
               <w:jc w:val="center"/>
@@ -5071,7 +5071,7 @@
           </w:tcPr>
           <w:p>
             <w:pPr>
-              <w:pStyle w:val="Style14"/>
+              <w:pStyle w:val="user2"/>
               <w:spacing w:lineRule="auto" w:line="240" w:before="57" w:after="57"/>
               <w:ind w:hanging="0"/>
               <w:jc w:val="center"/>
@@ -5094,7 +5094,7 @@
           </w:tcPr>
           <w:p>
             <w:pPr>
-              <w:pStyle w:val="Style14"/>
+              <w:pStyle w:val="user2"/>
               <w:spacing w:lineRule="auto" w:line="240" w:before="57" w:after="57"/>
               <w:ind w:hanging="0"/>
               <w:rPr>
@@ -5124,7 +5124,7 @@
           </w:tcPr>
           <w:p>
             <w:pPr>
-              <w:pStyle w:val="Style14"/>
+              <w:pStyle w:val="user2"/>
               <w:spacing w:lineRule="auto" w:line="240" w:before="57" w:after="57"/>
               <w:ind w:hanging="0"/>
               <w:rPr>
@@ -5151,7 +5151,7 @@
           </w:tcPr>
           <w:p>
             <w:pPr>
-              <w:pStyle w:val="Style14"/>
+              <w:pStyle w:val="user2"/>
               <w:spacing w:lineRule="auto" w:line="240" w:before="57" w:after="57"/>
               <w:ind w:hanging="0"/>
               <w:rPr>
@@ -5178,7 +5178,7 @@
           </w:tcPr>
           <w:p>
             <w:pPr>
-              <w:pStyle w:val="Style14"/>
+              <w:pStyle w:val="user2"/>
               <w:spacing w:lineRule="auto" w:line="240" w:before="57" w:after="57"/>
               <w:ind w:hanging="0"/>
               <w:jc w:val="center"/>
@@ -5206,7 +5206,7 @@
           </w:tcPr>
           <w:p>
             <w:pPr>
-              <w:pStyle w:val="Style14"/>
+              <w:pStyle w:val="user2"/>
               <w:spacing w:lineRule="auto" w:line="240" w:before="57" w:after="57"/>
               <w:ind w:hanging="0"/>
               <w:jc w:val="center"/>
@@ -5234,7 +5234,7 @@
           </w:tcPr>
           <w:p>
             <w:pPr>
-              <w:pStyle w:val="Style14"/>
+              <w:pStyle w:val="user2"/>
               <w:spacing w:lineRule="auto" w:line="240" w:before="57" w:after="57"/>
               <w:ind w:hanging="0"/>
               <w:jc w:val="center"/>
@@ -5257,7 +5257,7 @@
           </w:tcPr>
           <w:p>
             <w:pPr>
-              <w:pStyle w:val="Style14"/>
+              <w:pStyle w:val="user2"/>
               <w:spacing w:lineRule="auto" w:line="240" w:before="57" w:after="57"/>
               <w:ind w:hanging="0"/>
               <w:rPr>
@@ -5287,7 +5287,7 @@
           </w:tcPr>
           <w:p>
             <w:pPr>
-              <w:pStyle w:val="Style14"/>
+              <w:pStyle w:val="user2"/>
               <w:spacing w:lineRule="auto" w:line="240" w:before="57" w:after="57"/>
               <w:ind w:hanging="0"/>
               <w:rPr>
@@ -5314,7 +5314,7 @@
           </w:tcPr>
           <w:p>
             <w:pPr>
-              <w:pStyle w:val="Style14"/>
+              <w:pStyle w:val="user2"/>
               <w:spacing w:lineRule="auto" w:line="240" w:before="57" w:after="57"/>
               <w:ind w:hanging="0"/>
               <w:rPr>
@@ -5341,7 +5341,7 @@
           </w:tcPr>
           <w:p>
             <w:pPr>
-              <w:pStyle w:val="Style14"/>
+              <w:pStyle w:val="user2"/>
               <w:spacing w:lineRule="auto" w:line="240" w:before="57" w:after="57"/>
               <w:ind w:hanging="0"/>
               <w:jc w:val="center"/>
@@ -5369,7 +5369,7 @@
           </w:tcPr>
           <w:p>
             <w:pPr>
-              <w:pStyle w:val="Style14"/>
+              <w:pStyle w:val="user2"/>
               <w:spacing w:lineRule="auto" w:line="240" w:before="57" w:after="57"/>
               <w:ind w:hanging="0"/>
               <w:jc w:val="center"/>
@@ -5397,7 +5397,7 @@
           </w:tcPr>
           <w:p>
             <w:pPr>
-              <w:pStyle w:val="Style14"/>
+              <w:pStyle w:val="user2"/>
               <w:spacing w:lineRule="auto" w:line="240" w:before="57" w:after="57"/>
               <w:ind w:hanging="0"/>
               <w:jc w:val="center"/>
@@ -5420,7 +5420,7 @@
           </w:tcPr>
           <w:p>
             <w:pPr>
-              <w:pStyle w:val="Style14"/>
+              <w:pStyle w:val="user2"/>
               <w:spacing w:lineRule="auto" w:line="240" w:before="57" w:after="57"/>
               <w:ind w:hanging="0"/>
               <w:rPr>
@@ -5873,13 +5873,6 @@
           <w:u w:val="none"/>
         </w:rPr>
         <w:tab/>
-      </w:r>
-      <w:r>
-        <w:rPr>
-          <w:sz w:val="20"/>
-          <w:szCs w:val="20"/>
-          <w:u w:val="none"/>
-        </w:rPr>
         <w:t>Помилки виправлено, звіт заповнено.</w:t>
       </w:r>
     </w:p>
@@ -5919,7 +5912,7 @@
     <w:pPr>
       <w:widowControl/>
       <w:suppressAutoHyphens w:val="true"/>
-      <w:overflowPunct w:val="true"/>
+      <w:overflowPunct w:val="false"/>
       <w:bidi w:val="0"/>
       <w:spacing w:lineRule="auto" w:line="360" w:before="0" w:after="0"/>
       <w:ind w:firstLine="851"/>
@@ -6032,7 +6025,7 @@
       <w:b/>
       <w:bCs/>
       <w:smallCaps/>
-      <w:color w:themeColor="text1" w:val="000000"/>
+      <w:color w:themeColor="dark1" w:val="000000"/>
       <w:sz w:val="28"/>
       <w:szCs w:val="28"/>
       <w:lang w:eastAsia="uk-UA"/>
@@ -6047,7 +6040,7 @@
       <w:rFonts w:ascii="Times New Roman" w:hAnsi="Times New Roman" w:eastAsia="Calibri" w:cs="Times New Roman"/>
       <w:b/>
       <w:bCs/>
-      <w:color w:themeColor="text1" w:val="000000"/>
+      <w:color w:themeColor="dark1" w:val="000000"/>
       <w:sz w:val="28"/>
       <w:szCs w:val="26"/>
       <w:lang w:eastAsia="uk-UA"/>
@@ -6098,7 +6091,7 @@
       <w:rFonts w:ascii="Times New Roman" w:hAnsi="Times New Roman" w:eastAsia="Times New Roman" w:cs="Times New Roman"/>
       <w:i/>
       <w:iCs/>
-      <w:color w:themeColor="text1" w:themeTint="bf" w:val="404040"/>
+      <w:color w:themeColor="dark1" w:themeTint="bf" w:val="404040"/>
       <w:sz w:val="28"/>
       <w:szCs w:val="28"/>
       <w:lang w:eastAsia="uk-UA"/>
@@ -6123,7 +6116,7 @@
       <w:b/>
       <w:bCs/>
       <w:i/>
-      <w:color w:themeColor="text1" w:val="000000"/>
+      <w:color w:themeColor="dark1" w:val="000000"/>
       <w:sz w:val="28"/>
       <w:szCs w:val="24"/>
       <w:lang w:eastAsia="uk-UA"/>
@@ -6222,7 +6215,7 @@
       <w:bCs/>
       <w:i/>
       <w:smallCaps/>
-      <w:color w:themeColor="text1" w:val="000000"/>
+      <w:color w:themeColor="dark1" w:val="000000"/>
       <w:sz w:val="28"/>
       <w:szCs w:val="24"/>
       <w:lang w:eastAsia="uk-UA"/>
@@ -6346,7 +6339,7 @@
   </w:style>
   <w:style w:type="paragraph" w:styleId="IndexHeading">
     <w:name w:val="index heading"/>
-    <w:basedOn w:val="user"/>
+    <w:basedOn w:val="Style12"/>
     <w:pPr/>
     <w:rPr/>
   </w:style>
@@ -6420,7 +6413,7 @@
       <w:b/>
       <w:bCs/>
       <w:smallCaps/>
-      <w:color w:themeColor="text1" w:val="000000"/>
+      <w:color w:themeColor="dark1" w:val="000000"/>
       <w:sz w:val="28"/>
       <w:szCs w:val="28"/>
     </w:rPr>
@@ -6436,7 +6429,7 @@
       <w:rFonts w:ascii="Times New Roman" w:hAnsi="Times New Roman" w:cs="Times New Roman"/>
       <w:b/>
       <w:bCs/>
-      <w:color w:themeColor="text1" w:val="000000"/>
+      <w:color w:themeColor="dark1" w:val="000000"/>
       <w:sz w:val="28"/>
     </w:rPr>
   </w:style>
@@ -6480,7 +6473,7 @@
     <w:rPr>
       <w:i/>
       <w:iCs/>
-      <w:color w:themeColor="text1" w:themeTint="bf" w:val="404040"/>
+      <w:color w:themeColor="dark1" w:themeTint="bf" w:val="404040"/>
     </w:rPr>
   </w:style>
   <w:style w:type="paragraph" w:styleId="H41">
@@ -6587,6 +6580,16 @@
       <w:lang w:val="en-US"/>
     </w:rPr>
   </w:style>
+  <w:style w:type="paragraph" w:styleId="user2">
+    <w:name w:val="Вміст таблиці (user)"/>
+    <w:basedOn w:val="Normal"/>
+    <w:qFormat/>
+    <w:pPr>
+      <w:widowControl w:val="false"/>
+      <w:suppressLineNumbers/>
+    </w:pPr>
+    <w:rPr/>
+  </w:style>
   <w:style w:type="paragraph" w:styleId="Style14">
     <w:name w:val="Вміст таблиці"/>
     <w:basedOn w:val="Normal"/>
@@ -6597,19 +6600,9 @@
     </w:pPr>
     <w:rPr/>
   </w:style>
-  <w:style w:type="paragraph" w:styleId="user2">
-    <w:name w:val="Вміст таблиці (user)"/>
-    <w:basedOn w:val="Normal"/>
-    <w:qFormat/>
-    <w:pPr>
-      <w:widowControl w:val="false"/>
-      <w:suppressLineNumbers/>
-    </w:pPr>
-    <w:rPr/>
-  </w:style>
-  <w:style w:type="paragraph" w:styleId="user3">
-    <w:name w:val="Заголовок таблиці (user)"/>
-    <w:basedOn w:val="user2"/>
+  <w:style w:type="paragraph" w:styleId="Style15">
+    <w:name w:val="Заголовок таблиці"/>
+    <w:basedOn w:val="Style14"/>
     <w:qFormat/>
     <w:pPr>
       <w:suppressLineNumbers/>
@@ -6620,8 +6613,8 @@
       <w:bCs/>
     </w:rPr>
   </w:style>
-  <w:style w:type="numbering" w:styleId="user4">
-    <w:name w:val="Без маркерів (user)"/>
+  <w:style w:type="numbering" w:styleId="Style16">
+    <w:name w:val="Без маркерів"/>
     <w:qFormat/>
   </w:style>
 </w:styles>

</xml_diff>